<commit_message>
docs(manuscript): re-render applications_note.docx from updated md
Regenerate the docx so it carries the refreshed Figure 1 caption and
drafting-notes entry from cec0ba1.

Co-Authored-By: Claude Opus 4.7 <noreply@anthropic.com>
</commit_message>
<xml_diff>
--- a/docs/manuscript/applications_note.docx
+++ b/docs/manuscript/applications_note.docx
@@ -2,7 +2,7 @@
 <file path=word/document.xml><?xml version="1.0" encoding="utf-8"?>
 <w:document xmlns:w="http://schemas.openxmlformats.org/wordprocessingml/2006/main" xmlns:m="http://schemas.openxmlformats.org/officeDocument/2006/math" xmlns:r="http://schemas.openxmlformats.org/officeDocument/2006/relationships" xmlns:o="urn:schemas-microsoft-com:office:office" xmlns:v="urn:schemas-microsoft-com:vml" xmlns:w10="urn:schemas-microsoft-com:office:word" xmlns:a="http://schemas.openxmlformats.org/drawingml/2006/main" xmlns:pic="http://schemas.openxmlformats.org/drawingml/2006/picture" xmlns:wp="http://schemas.openxmlformats.org/drawingml/2006/wordprocessingDrawing">
   <w:body>
-    <w:bookmarkStart w:id="25" w:name="X822feaed4f496dfea8882c0da3780afe58aebf4"/>
+    <w:bookmarkStart w:id="36" w:name="X822feaed4f496dfea8882c0da3780afe58aebf4"/>
     <w:p>
       <w:pPr>
         <w:pStyle w:val="Heading1"/>
@@ -127,7 +127,7 @@
       <w:r>
         <w:t xml:space="preserve"> </w:t>
       </w:r>
-      <w:hyperlink r:id="rId9">
+      <w:hyperlink r:id="rId20">
         <w:r>
           <w:rPr>
             <w:rStyle w:val="Hyperlink"/>
@@ -151,7 +151,7 @@
         </w:pict>
       </w:r>
     </w:p>
-    <w:bookmarkStart w:id="11" w:name="abstract"/>
+    <w:bookmarkStart w:id="22" w:name="abstract"/>
     <w:p>
       <w:pPr>
         <w:pStyle w:val="Heading2"/>
@@ -231,7 +231,7 @@
       <w:r>
         <w:t xml:space="preserve"> </w:t>
       </w:r>
-      <w:hyperlink r:id="rId10">
+      <w:hyperlink r:id="rId21">
         <w:r>
           <w:rPr>
             <w:rStyle w:val="Hyperlink"/>
@@ -287,7 +287,7 @@
       <w:r>
         <w:t xml:space="preserve"> </w:t>
       </w:r>
-      <w:hyperlink r:id="rId9">
+      <w:hyperlink r:id="rId20">
         <w:r>
           <w:rPr>
             <w:rStyle w:val="Hyperlink"/>
@@ -303,8 +303,8 @@
         </w:pict>
       </w:r>
     </w:p>
-    <w:bookmarkEnd w:id="11"/>
-    <w:bookmarkStart w:id="12" w:name="Xe3d0fc0bea9a42ce7605565d0964033d7f6ee47"/>
+    <w:bookmarkEnd w:id="22"/>
+    <w:bookmarkStart w:id="23" w:name="Xe3d0fc0bea9a42ce7605565d0964033d7f6ee47"/>
     <w:p>
       <w:pPr>
         <w:pStyle w:val="Heading2"/>
@@ -346,8 +346,8 @@
         <w:t xml:space="preserve">We present an early-stage R workflow that fills this gap. The tool is in active development; this note describes its design, current scope, and the real-data validation strategy we are using to harden each stage.</w:t>
       </w:r>
     </w:p>
-    <w:bookmarkEnd w:id="12"/>
-    <w:bookmarkStart w:id="16" w:name="Xfab522e0c411179c01dd3c9a2a01395ade9eb38"/>
+    <w:bookmarkEnd w:id="23"/>
+    <w:bookmarkStart w:id="27" w:name="Xfab522e0c411179c01dd3c9a2a01395ade9eb38"/>
     <w:p>
       <w:pPr>
         <w:pStyle w:val="Heading2"/>
@@ -430,18 +430,18 @@
           <wp:inline>
             <wp:extent cx="5302908" cy="5620960"/>
             <wp:effectExtent b="0" l="0" r="0" t="0"/>
-            <wp:docPr descr="Figure 1. Metagenomics Pipeline Automation workflow. A single config.yaml parameterises a study and drives fifteen ordered R modules (R/00–R/14) consuming upstream outputs (Kraken2/Bracken, ABRicate, Re-centrifuge) plus sample metadata. After setup, input loading and decontamination (R/00–R/02), community analyses (R/04–R/08) and functional profiling against CARD, VFDB and PlasmidFinder (TPM normalisation in R/03 and per-domain analyses in R/09–R/11; alpha/beta diversity and ALDEx2 DAA shared between the two columns) feed a tripartite sample × taxon × gene network with companion chord and Sankey diagrams (R/12). R/12 then fans out to two output columns: a Quarto dashboard (templates/report.qmd, HTML with per-domain panels) and a publication-panels stage (R/14, composite figures plus supplementary_tables.xlsx), whose PNG/TIFF panels and tables workbook are the publication-ready outputs. R/13 finally writes manifest.json (contract v1.2; kind-tagged figure and table catalogue), cataloguing the dashboard, the R/14 panels and every intermediate artefact. Source: generate_figure1.py." title="" id="14" name="Picture"/>
+            <wp:docPr descr="Figure 1. Metagenomics Pipeline Automation workflow. A single config.yaml parameterises a study and drives fifteen ordered R modules (R/00–R/14) consuming upstream outputs (Kraken2/Bracken, ABRicate, Re-centrifuge) plus sample metadata. After setup, input loading and decontamination (R/00–R/02), community analyses (R/04–R/08) and functional profiling against CARD, VFDB and PlasmidFinder (TPM normalisation in R/03 and per-domain analyses in R/09–R/11; alpha/beta diversity and ALDEx2 DAA shared between the two columns) feed a tripartite sample × taxon × gene network with companion chord and Sankey diagrams (R/12). R/12 then fans out to two output columns: a Quarto dashboard (templates/report.qmd, HTML with per-domain panels) and a publication-panels stage (R/14, composite figures plus supplementary_tables.xlsx), whose PNG/TIFF panels and tables workbook are the publication-ready outputs. R/13 finally writes manifest.json (contract v1.2; kind-tagged figure and table catalogue), cataloguing the dashboard, the R/14 panels and every intermediate artefact. Source: generate_figure1.py." title="" id="25" name="Picture"/>
             <a:graphic>
               <a:graphicData uri="http://schemas.openxmlformats.org/drawingml/2006/picture">
                 <pic:pic>
                   <pic:nvPicPr>
-                    <pic:cNvPr descr="figure1_pipeline_schematic.png" id="15" name="Picture"/>
+                    <pic:cNvPr descr="figure1_pipeline_schematic.png" id="26" name="Picture"/>
                     <pic:cNvPicPr>
                       <a:picLocks noChangeArrowheads="1" noChangeAspect="1"/>
                     </pic:cNvPicPr>
                   </pic:nvPicPr>
                   <pic:blipFill>
-                    <a:blip r:embed="rId13"/>
+                    <a:blip r:embed="rId24"/>
                     <a:stretch>
                       <a:fillRect/>
                     </a:stretch>
@@ -858,8 +858,8 @@
         <w:t xml:space="preserve">and the project requires R ≥ 4.5; external command-line tools (Kraken2, Bracken, ABRicate, Re-centrifuge) are assumed to have been run upstream.</w:t>
       </w:r>
     </w:p>
-    <w:bookmarkEnd w:id="16"/>
-    <w:bookmarkStart w:id="17" w:name="Xe535e7deb3457bf6891dfc100ac742aa591bc31"/>
+    <w:bookmarkEnd w:id="27"/>
+    <w:bookmarkStart w:id="28" w:name="Xe535e7deb3457bf6891dfc100ac742aa591bc31"/>
     <w:p>
       <w:pPr>
         <w:pStyle w:val="Heading2"/>
@@ -1086,6 +1086,7 @@
           <w:p>
             <w:pPr>
               <w:pStyle w:val="Compact"/>
+              <w:jc w:val="left"/>
             </w:pPr>
             <w:r>
               <w:t xml:space="preserve">Stage</w:t>
@@ -1097,6 +1098,7 @@
           <w:p>
             <w:pPr>
               <w:pStyle w:val="Compact"/>
+              <w:jc w:val="left"/>
             </w:pPr>
             <w:r>
               <w:t xml:space="preserve">B1 runtime</w:t>
@@ -1108,6 +1110,7 @@
           <w:p>
             <w:pPr>
               <w:pStyle w:val="Compact"/>
+              <w:jc w:val="left"/>
             </w:pPr>
             <w:r>
               <w:t xml:space="preserve">B1 primary output</w:t>
@@ -1119,6 +1122,7 @@
           <w:p>
             <w:pPr>
               <w:pStyle w:val="Compact"/>
+              <w:jc w:val="left"/>
             </w:pPr>
             <w:r>
               <w:t xml:space="preserve">B2 runtime</w:t>
@@ -1130,6 +1134,7 @@
           <w:p>
             <w:pPr>
               <w:pStyle w:val="Compact"/>
+              <w:jc w:val="left"/>
             </w:pPr>
             <w:r>
               <w:t xml:space="preserve">B2 primary output</w:t>
@@ -1143,6 +1148,7 @@
           <w:p>
             <w:pPr>
               <w:pStyle w:val="Compact"/>
+              <w:jc w:val="left"/>
             </w:pPr>
             <w:r>
               <w:t xml:space="preserve">load_inputs</w:t>
@@ -1154,6 +1160,7 @@
           <w:p>
             <w:pPr>
               <w:pStyle w:val="Compact"/>
+              <w:jc w:val="left"/>
             </w:pPr>
             <w:r>
               <w:t xml:space="preserve">0.8 s</w:t>
@@ -1165,6 +1172,7 @@
           <w:p>
             <w:pPr>
               <w:pStyle w:val="Compact"/>
+              <w:jc w:val="left"/>
             </w:pPr>
             <w:r>
               <w:t xml:space="preserve">5 upstream tables parsed</w:t>
@@ -1176,6 +1184,7 @@
           <w:p>
             <w:pPr>
               <w:pStyle w:val="Compact"/>
+              <w:jc w:val="left"/>
             </w:pPr>
             <w:r>
               <w:t xml:space="preserve">1.7 s</w:t>
@@ -1187,6 +1196,7 @@
           <w:p>
             <w:pPr>
               <w:pStyle w:val="Compact"/>
+              <w:jc w:val="left"/>
             </w:pPr>
             <w:r>
               <w:t xml:space="preserve">5 upstream tables parsed</w:t>
@@ -1200,6 +1210,7 @@
           <w:p>
             <w:pPr>
               <w:pStyle w:val="Compact"/>
+              <w:jc w:val="left"/>
             </w:pPr>
             <w:r>
               <w:t xml:space="preserve">clean_data</w:t>
@@ -1211,6 +1222,7 @@
           <w:p>
             <w:pPr>
               <w:pStyle w:val="Compact"/>
+              <w:jc w:val="left"/>
             </w:pPr>
             <w:r>
               <w:t xml:space="preserve">2.0 s</w:t>
@@ -1222,6 +1234,7 @@
           <w:p>
             <w:pPr>
               <w:pStyle w:val="Compact"/>
+              <w:jc w:val="left"/>
             </w:pPr>
             <w:r>
               <w:rPr>
@@ -1242,6 +1255,7 @@
           <w:p>
             <w:pPr>
               <w:pStyle w:val="Compact"/>
+              <w:jc w:val="left"/>
             </w:pPr>
             <w:r>
               <w:t xml:space="preserve">6.0 s</w:t>
@@ -1253,6 +1267,7 @@
           <w:p>
             <w:pPr>
               <w:pStyle w:val="Compact"/>
+              <w:jc w:val="left"/>
             </w:pPr>
             <w:r>
               <w:t xml:space="preserve">no</w:t>
@@ -1278,6 +1293,7 @@
           <w:p>
             <w:pPr>
               <w:pStyle w:val="Compact"/>
+              <w:jc w:val="left"/>
             </w:pPr>
             <w:r>
               <w:t xml:space="preserve">normalisation</w:t>
@@ -1289,6 +1305,7 @@
           <w:p>
             <w:pPr>
               <w:pStyle w:val="Compact"/>
+              <w:jc w:val="left"/>
             </w:pPr>
             <w:r>
               <w:t xml:space="preserve">0.2 s</w:t>
@@ -1300,6 +1317,7 @@
           <w:p>
             <w:pPr>
               <w:pStyle w:val="Compact"/>
+              <w:jc w:val="left"/>
             </w:pPr>
             <w:r>
               <w:t xml:space="preserve">gene-element TPM table written</w:t>
@@ -1311,6 +1329,7 @@
           <w:p>
             <w:pPr>
               <w:pStyle w:val="Compact"/>
+              <w:jc w:val="left"/>
             </w:pPr>
             <w:r>
               <w:t xml:space="preserve">0.3 s</w:t>
@@ -1322,6 +1341,7 @@
           <w:p>
             <w:pPr>
               <w:pStyle w:val="Compact"/>
+              <w:jc w:val="left"/>
             </w:pPr>
             <w:r>
               <w:t xml:space="preserve">gene-element TPM table written</w:t>
@@ -1335,6 +1355,7 @@
           <w:p>
             <w:pPr>
               <w:pStyle w:val="Compact"/>
+              <w:jc w:val="left"/>
             </w:pPr>
             <w:r>
               <w:t xml:space="preserve">taxonomy</w:t>
@@ -1346,6 +1367,7 @@
           <w:p>
             <w:pPr>
               <w:pStyle w:val="Compact"/>
+              <w:jc w:val="left"/>
             </w:pPr>
             <w:r>
               <w:t xml:space="preserve">2.7 s</w:t>
@@ -1357,6 +1379,7 @@
           <w:p>
             <w:pPr>
               <w:pStyle w:val="Compact"/>
+              <w:jc w:val="left"/>
             </w:pPr>
             <w:r>
               <w:t xml:space="preserve">2,971 / 11,196 (taxon, sample) rows kept (count ≥ 5)</w:t>
@@ -1368,6 +1391,7 @@
           <w:p>
             <w:pPr>
               <w:pStyle w:val="Compact"/>
+              <w:jc w:val="left"/>
             </w:pPr>
             <w:r>
               <w:t xml:space="preserve">3.1 s</w:t>
@@ -1379,6 +1403,7 @@
           <w:p>
             <w:pPr>
               <w:pStyle w:val="Compact"/>
+              <w:jc w:val="left"/>
             </w:pPr>
             <w:r>
               <w:t xml:space="preserve">5,570 / 6,549 (taxon, sample) rows kept</w:t>
@@ -1392,6 +1417,7 @@
           <w:p>
             <w:pPr>
               <w:pStyle w:val="Compact"/>
+              <w:jc w:val="left"/>
             </w:pPr>
             <w:r>
               <w:t xml:space="preserve">relative_abundance</w:t>
@@ -1403,6 +1429,7 @@
           <w:p>
             <w:pPr>
               <w:pStyle w:val="Compact"/>
+              <w:jc w:val="left"/>
             </w:pPr>
             <w:r>
               <w:t xml:space="preserve">6.5 s</w:t>
@@ -1414,6 +1441,7 @@
           <w:p>
             <w:pPr>
               <w:pStyle w:val="Compact"/>
+              <w:jc w:val="left"/>
             </w:pPr>
             <w:r>
               <w:t xml:space="preserve">1,700 / 72,152 rows kept (count &gt; 17); top-50 + Others</w:t>
@@ -1425,6 +1453,7 @@
           <w:p>
             <w:pPr>
               <w:pStyle w:val="Compact"/>
+              <w:jc w:val="left"/>
             </w:pPr>
             <w:r>
               <w:t xml:space="preserve">10.9 s</w:t>
@@ -1436,6 +1465,7 @@
           <w:p>
             <w:pPr>
               <w:pStyle w:val="Compact"/>
+              <w:jc w:val="left"/>
             </w:pPr>
             <w:r>
               <w:t xml:space="preserve">7,557 / 18,073 rows kept; top-50 + Others</w:t>
@@ -1449,6 +1479,7 @@
           <w:p>
             <w:pPr>
               <w:pStyle w:val="Compact"/>
+              <w:jc w:val="left"/>
             </w:pPr>
             <w:r>
               <w:t xml:space="preserve">alpha_diversity</w:t>
@@ -1460,6 +1491,7 @@
           <w:p>
             <w:pPr>
               <w:pStyle w:val="Compact"/>
+              <w:jc w:val="left"/>
             </w:pPr>
             <w:r>
               <w:t xml:space="preserve">12.1 s</w:t>
@@ -1471,6 +1503,7 @@
           <w:p>
             <w:pPr>
               <w:pStyle w:val="Compact"/>
+              <w:jc w:val="left"/>
             </w:pPr>
             <w:r>
               <w:t xml:space="preserve">9 metrics × 18 samples; KW per metric</w:t>
@@ -1482,6 +1515,7 @@
           <w:p>
             <w:pPr>
               <w:pStyle w:val="Compact"/>
+              <w:jc w:val="left"/>
             </w:pPr>
             <w:r>
               <w:t xml:space="preserve">19.8 s</w:t>
@@ -1493,6 +1527,7 @@
           <w:p>
             <w:pPr>
               <w:pStyle w:val="Compact"/>
+              <w:jc w:val="left"/>
             </w:pPr>
             <w:r>
               <w:t xml:space="preserve">9 metrics × 32 samples; KW per metric</w:t>
@@ -1506,6 +1541,7 @@
           <w:p>
             <w:pPr>
               <w:pStyle w:val="Compact"/>
+              <w:jc w:val="left"/>
             </w:pPr>
             <w:r>
               <w:t xml:space="preserve">beta_diversity</w:t>
@@ -1517,6 +1553,7 @@
           <w:p>
             <w:pPr>
               <w:pStyle w:val="Compact"/>
+              <w:jc w:val="left"/>
             </w:pPr>
             <w:r>
               <w:t xml:space="preserve">3.5 s</w:t>
@@ -1528,6 +1565,7 @@
           <w:p>
             <w:pPr>
               <w:pStyle w:val="Compact"/>
+              <w:jc w:val="left"/>
             </w:pPr>
             <w:r>
               <w:t xml:space="preserve">PERMANOVA R² = 0.145, p = 0.22; PERMDISP p = 0.028</w:t>
@@ -1539,6 +1577,7 @@
           <w:p>
             <w:pPr>
               <w:pStyle w:val="Compact"/>
+              <w:jc w:val="left"/>
             </w:pPr>
             <w:r>
               <w:t xml:space="preserve">5.1 s</w:t>
@@ -1550,6 +1589,7 @@
           <w:p>
             <w:pPr>
               <w:pStyle w:val="Compact"/>
+              <w:jc w:val="left"/>
             </w:pPr>
             <w:r>
               <w:t xml:space="preserve">PERMANOVA R² = 0.121, p = 0.15; PERMDISP p = 0.056</w:t>
@@ -1563,6 +1603,7 @@
           <w:p>
             <w:pPr>
               <w:pStyle w:val="Compact"/>
+              <w:jc w:val="left"/>
             </w:pPr>
             <w:r>
               <w:t xml:space="preserve">differential_abundance</w:t>
@@ -1574,6 +1615,7 @@
           <w:p>
             <w:pPr>
               <w:pStyle w:val="Compact"/>
+              <w:jc w:val="left"/>
             </w:pPr>
             <w:r>
               <w:t xml:space="preserve">1m 54s</w:t>
@@ -1585,6 +1627,7 @@
           <w:p>
             <w:pPr>
               <w:pStyle w:val="Compact"/>
+              <w:jc w:val="left"/>
             </w:pPr>
             <w:r>
               <w:t xml:space="preserve">31 taxa + 157 gene features; 3 pairwise contrasts</w:t>
@@ -1596,6 +1639,7 @@
           <w:p>
             <w:pPr>
               <w:pStyle w:val="Compact"/>
+              <w:jc w:val="left"/>
             </w:pPr>
             <w:r>
               <w:t xml:space="preserve">3m 27s</w:t>
@@ -1607,6 +1651,7 @@
           <w:p>
             <w:pPr>
               <w:pStyle w:val="Compact"/>
+              <w:jc w:val="left"/>
             </w:pPr>
             <w:r>
               <w:t xml:space="preserve">53 taxa + 221 gene features; 6 pairwise contrasts</w:t>
@@ -1620,6 +1665,7 @@
           <w:p>
             <w:pPr>
               <w:pStyle w:val="Compact"/>
+              <w:jc w:val="left"/>
             </w:pPr>
             <w:r>
               <w:t xml:space="preserve">resistome (CARD)</w:t>
@@ -1631,6 +1677,7 @@
           <w:p>
             <w:pPr>
               <w:pStyle w:val="Compact"/>
+              <w:jc w:val="left"/>
             </w:pPr>
             <w:r>
               <w:t xml:space="preserve">9.0 s</w:t>
@@ -1642,6 +1689,7 @@
           <w:p>
             <w:pPr>
               <w:pStyle w:val="Compact"/>
+              <w:jc w:val="left"/>
             </w:pPr>
             <w:r>
               <w:t xml:space="preserve">348 rows / 85 genes / 18 drug classes</w:t>
@@ -1653,6 +1701,7 @@
           <w:p>
             <w:pPr>
               <w:pStyle w:val="Compact"/>
+              <w:jc w:val="left"/>
             </w:pPr>
             <w:r>
               <w:t xml:space="preserve">10.1 s</w:t>
@@ -1664,6 +1713,7 @@
           <w:p>
             <w:pPr>
               <w:pStyle w:val="Compact"/>
+              <w:jc w:val="left"/>
             </w:pPr>
             <w:r>
               <w:t xml:space="preserve">648 rows / 99 genes / 20 drug classes</w:t>
@@ -1677,6 +1727,7 @@
           <w:p>
             <w:pPr>
               <w:pStyle w:val="Compact"/>
+              <w:jc w:val="left"/>
             </w:pPr>
             <w:r>
               <w:t xml:space="preserve">virulome (VFDB)</w:t>
@@ -1688,6 +1739,7 @@
           <w:p>
             <w:pPr>
               <w:pStyle w:val="Compact"/>
+              <w:jc w:val="left"/>
             </w:pPr>
             <w:r>
               <w:t xml:space="preserve">8.0 s</w:t>
@@ -1699,6 +1751,7 @@
           <w:p>
             <w:pPr>
               <w:pStyle w:val="Compact"/>
+              <w:jc w:val="left"/>
             </w:pPr>
             <w:r>
               <w:t xml:space="preserve">320 rows / 140 genes / 6 VF functions (17 / 18 samples)</w:t>
@@ -1710,6 +1763,7 @@
           <w:p>
             <w:pPr>
               <w:pStyle w:val="Compact"/>
+              <w:jc w:val="left"/>
             </w:pPr>
             <w:r>
               <w:t xml:space="preserve">9.7 s</w:t>
@@ -1721,6 +1775,7 @@
           <w:p>
             <w:pPr>
               <w:pStyle w:val="Compact"/>
+              <w:jc w:val="left"/>
             </w:pPr>
             <w:r>
               <w:t xml:space="preserve">492 rows / 156 genes / 8 VF functions (26 / 32 samples)</w:t>
@@ -1734,6 +1789,7 @@
           <w:p>
             <w:pPr>
               <w:pStyle w:val="Compact"/>
+              <w:jc w:val="left"/>
             </w:pPr>
             <w:r>
               <w:t xml:space="preserve">mobilome (PlasmidFinder)</w:t>
@@ -1745,6 +1801,7 @@
           <w:p>
             <w:pPr>
               <w:pStyle w:val="Compact"/>
+              <w:jc w:val="left"/>
             </w:pPr>
             <w:r>
               <w:t xml:space="preserve">7.7 s</w:t>
@@ -1756,6 +1813,7 @@
           <w:p>
             <w:pPr>
               <w:pStyle w:val="Compact"/>
+              <w:jc w:val="left"/>
             </w:pPr>
             <w:r>
               <w:t xml:space="preserve">65 rows / 10 replicons / 3 families</w:t>
@@ -1767,6 +1825,7 @@
           <w:p>
             <w:pPr>
               <w:pStyle w:val="Compact"/>
+              <w:jc w:val="left"/>
             </w:pPr>
             <w:r>
               <w:t xml:space="preserve">10.1 s</w:t>
@@ -1778,6 +1837,7 @@
           <w:p>
             <w:pPr>
               <w:pStyle w:val="Compact"/>
+              <w:jc w:val="left"/>
             </w:pPr>
             <w:r>
               <w:t xml:space="preserve">137 rows / 25 replicons / 5 families</w:t>
@@ -1791,6 +1851,7 @@
           <w:p>
             <w:pPr>
               <w:pStyle w:val="Compact"/>
+              <w:jc w:val="left"/>
             </w:pPr>
             <w:r>
               <w:t xml:space="preserve">network</w:t>
@@ -1802,6 +1863,7 @@
           <w:p>
             <w:pPr>
               <w:pStyle w:val="Compact"/>
+              <w:jc w:val="left"/>
             </w:pPr>
             <w:r>
               <w:t xml:space="preserve">33.4 s</w:t>
@@ -1813,6 +1875,7 @@
           <w:p>
             <w:pPr>
               <w:pStyle w:val="Compact"/>
+              <w:jc w:val="left"/>
             </w:pPr>
             <w:r>
               <w:t xml:space="preserve">247 edges, 100 nodes (18 + 42 + 40); modularity = 0.30</w:t>
@@ -1824,6 +1887,7 @@
           <w:p>
             <w:pPr>
               <w:pStyle w:val="Compact"/>
+              <w:jc w:val="left"/>
             </w:pPr>
             <w:r>
               <w:t xml:space="preserve">1m 7s</w:t>
@@ -1835,6 +1899,7 @@
           <w:p>
             <w:pPr>
               <w:pStyle w:val="Compact"/>
+              <w:jc w:val="left"/>
             </w:pPr>
             <w:r>
               <w:t xml:space="preserve">576 edges, 210 nodes (32 + 77 + 101); modularity = 0.40</w:t>
@@ -1848,6 +1913,7 @@
           <w:p>
             <w:pPr>
               <w:pStyle w:val="Compact"/>
+              <w:jc w:val="left"/>
             </w:pPr>
             <w:r>
               <w:t xml:space="preserve">panels (R/14)</w:t>
@@ -1859,6 +1925,7 @@
           <w:p>
             <w:pPr>
               <w:pStyle w:val="Compact"/>
+              <w:jc w:val="left"/>
             </w:pPr>
             <w:r>
               <w:t xml:space="preserve">{{TODO: re-run}}</w:t>
@@ -1870,6 +1937,7 @@
           <w:p>
             <w:pPr>
               <w:pStyle w:val="Compact"/>
+              <w:jc w:val="left"/>
             </w:pPr>
             <w:r>
               <w:t xml:space="preserve">main + supplementary composite figures (PNG / TIFF) +</w:t>
@@ -1890,6 +1958,7 @@
           <w:p>
             <w:pPr>
               <w:pStyle w:val="Compact"/>
+              <w:jc w:val="left"/>
             </w:pPr>
             <w:r>
               <w:t xml:space="preserve">{{TODO: re-run}}</w:t>
@@ -1901,6 +1970,7 @@
           <w:p>
             <w:pPr>
               <w:pStyle w:val="Compact"/>
+              <w:jc w:val="left"/>
             </w:pPr>
             <w:r>
               <w:t xml:space="preserve">main + supplementary composite figures (PNG / TIFF) +</w:t>
@@ -1923,6 +1993,7 @@
           <w:p>
             <w:pPr>
               <w:pStyle w:val="Compact"/>
+              <w:jc w:val="left"/>
             </w:pPr>
             <w:r>
               <w:t xml:space="preserve">manifest</w:t>
@@ -1934,6 +2005,7 @@
           <w:p>
             <w:pPr>
               <w:pStyle w:val="Compact"/>
+              <w:jc w:val="left"/>
             </w:pPr>
             <w:r>
               <w:t xml:space="preserve">0.5 s</w:t>
@@ -1945,6 +2017,7 @@
           <w:p>
             <w:pPr>
               <w:pStyle w:val="Compact"/>
+              <w:jc w:val="left"/>
             </w:pPr>
             <w:r>
               <w:rPr>
@@ -1965,6 +2038,7 @@
           <w:p>
             <w:pPr>
               <w:pStyle w:val="Compact"/>
+              <w:jc w:val="left"/>
             </w:pPr>
             <w:r>
               <w:t xml:space="preserve">0.4 s</w:t>
@@ -1976,6 +2050,7 @@
           <w:p>
             <w:pPr>
               <w:pStyle w:val="Compact"/>
+              <w:jc w:val="left"/>
             </w:pPr>
             <w:r>
               <w:rPr>
@@ -1998,6 +2073,7 @@
           <w:p>
             <w:pPr>
               <w:pStyle w:val="Compact"/>
+              <w:jc w:val="left"/>
             </w:pPr>
             <w:r>
               <w:t xml:space="preserve">report</w:t>
@@ -2009,6 +2085,7 @@
           <w:p>
             <w:pPr>
               <w:pStyle w:val="Compact"/>
+              <w:jc w:val="left"/>
             </w:pPr>
             <w:r>
               <w:t xml:space="preserve">25.1 s</w:t>
@@ -2020,6 +2097,7 @@
           <w:p>
             <w:pPr>
               <w:pStyle w:val="Compact"/>
+              <w:jc w:val="left"/>
             </w:pPr>
             <w:r>
               <w:t xml:space="preserve">Quarto dashboard HTML (~14 MB)</w:t>
@@ -2031,6 +2109,7 @@
           <w:p>
             <w:pPr>
               <w:pStyle w:val="Compact"/>
+              <w:jc w:val="left"/>
             </w:pPr>
             <w:r>
               <w:t xml:space="preserve">40.5 s</w:t>
@@ -2042,6 +2121,7 @@
           <w:p>
             <w:pPr>
               <w:pStyle w:val="Compact"/>
+              <w:jc w:val="left"/>
             </w:pPr>
             <w:r>
               <w:t xml:space="preserve">Quarto dashboard HTML (~18 MB)</w:t>
@@ -2055,6 +2135,7 @@
           <w:p>
             <w:pPr>
               <w:pStyle w:val="Compact"/>
+              <w:jc w:val="left"/>
             </w:pPr>
             <w:r>
               <w:rPr>
@@ -2070,6 +2151,7 @@
           <w:p>
             <w:pPr>
               <w:pStyle w:val="Compact"/>
+              <w:jc w:val="left"/>
             </w:pPr>
             <w:r>
               <w:rPr>
@@ -2085,6 +2167,7 @@
           <w:p>
             <w:pPr>
               <w:pStyle w:val="Compact"/>
+              <w:jc w:val="left"/>
             </w:pPr>
             <w:r>
               <w:t xml:space="preserve">—</w:t>
@@ -2096,6 +2179,7 @@
           <w:p>
             <w:pPr>
               <w:pStyle w:val="Compact"/>
+              <w:jc w:val="left"/>
             </w:pPr>
             <w:r>
               <w:rPr>
@@ -2111,6 +2195,7 @@
           <w:p>
             <w:pPr>
               <w:pStyle w:val="Compact"/>
+              <w:jc w:val="left"/>
             </w:pPr>
             <w:r>
               <w:t xml:space="preserve">—</w:t>
@@ -2162,8 +2247,8 @@
         <w:t xml:space="preserve">mis-parses taxids carrying variant suffixes, dropping the corresponding ABRicate rows. R/02 fixes this parsing bug, so the pipeline retains approximately {{TODO: confirm exact count from a fresh validation run}} additional (sample, GENE) rows relative to the hand-edited output. We treat this as a correctness improvement rather than a failure to reproduce, and the validation log flags it accordingly. The Re-centrifuge column-slicing heuristic in R/02 is acknowledged as still coarse and is queued for rework; Table 1 will be re-derived once that change lands.</w:t>
       </w:r>
     </w:p>
-    <w:bookmarkEnd w:id="17"/>
-    <w:bookmarkStart w:id="18" w:name="X50c7748aa6d421f569a5daf2425c9e7043a6cad"/>
+    <w:bookmarkEnd w:id="28"/>
+    <w:bookmarkStart w:id="29" w:name="X50c7748aa6d421f569a5daf2425c9e7043a6cad"/>
     <w:p>
       <w:pPr>
         <w:pStyle w:val="Heading2"/>
@@ -2263,8 +2348,8 @@
         </w:pict>
       </w:r>
     </w:p>
-    <w:bookmarkEnd w:id="18"/>
-    <w:bookmarkStart w:id="23" w:name="references"/>
+    <w:bookmarkEnd w:id="29"/>
+    <w:bookmarkStart w:id="34" w:name="references"/>
     <w:p>
       <w:pPr>
         <w:pStyle w:val="Heading2"/>
@@ -2387,7 +2472,7 @@
       <w:r>
         <w:t xml:space="preserve"> </w:t>
       </w:r>
-      <w:hyperlink r:id="rId19">
+      <w:hyperlink r:id="rId30">
         <w:r>
           <w:rPr>
             <w:rStyle w:val="Hyperlink"/>
@@ -2621,7 +2706,7 @@
       <w:r>
         <w:t xml:space="preserve"> </w:t>
       </w:r>
-      <w:hyperlink r:id="rId20">
+      <w:hyperlink r:id="rId31">
         <w:r>
           <w:rPr>
             <w:rStyle w:val="Hyperlink"/>
@@ -2647,7 +2732,7 @@
       <w:r>
         <w:t xml:space="preserve"> </w:t>
       </w:r>
-      <w:hyperlink r:id="rId21">
+      <w:hyperlink r:id="rId32">
         <w:r>
           <w:rPr>
             <w:rStyle w:val="Hyperlink"/>
@@ -2713,7 +2798,7 @@
       <w:r>
         <w:t xml:space="preserve"> </w:t>
       </w:r>
-      <w:hyperlink r:id="rId22">
+      <w:hyperlink r:id="rId33">
         <w:r>
           <w:rPr>
             <w:rStyle w:val="Hyperlink"/>
@@ -2768,8 +2853,8 @@
         </w:pict>
       </w:r>
     </w:p>
-    <w:bookmarkEnd w:id="23"/>
-    <w:bookmarkStart w:id="24" w:name="drafting-notes"/>
+    <w:bookmarkEnd w:id="34"/>
+    <w:bookmarkStart w:id="35" w:name="drafting-notes"/>
     <w:p>
       <w:pPr>
         <w:pStyle w:val="Heading2"/>
@@ -2817,7 +2902,7 @@
       <w:r>
         <w:t xml:space="preserve">GitHub URL — filled (</w:t>
       </w:r>
-      <w:hyperlink r:id="rId10">
+      <w:hyperlink r:id="rId21">
         <w:r>
           <w:rPr>
             <w:rStyle w:val="Hyperlink"/>
@@ -3950,13 +4035,9 @@
         <w:t xml:space="preserve">The phrase "approximately 46 hand-edited R scripts" follows the memory snapshot ("~46"); confirm the exact figure before submission.</w:t>
       </w:r>
     </w:p>
-    <w:bookmarkEnd w:id="24"/>
-    <w:bookmarkEnd w:id="25"/>
-    <w:sectPr>
-      <w:footnotePr>
-        <w:numRestart w:val="eachSect"/>
-      </w:footnotePr>
-    </w:sectPr>
+    <w:bookmarkEnd w:id="35"/>
+    <w:bookmarkEnd w:id="36"/>
+    <w:sectPr/>
   </w:body>
 </w:document>
 </file>
@@ -4303,10 +4384,10 @@
   <w:docDefaults>
     <w:rPrDefault>
       <w:rPr>
-        <w:rFonts w:asciiTheme="minorHAnsi" w:cstheme="minorBidi" w:eastAsiaTheme="minorEastAsia" w:hAnsiTheme="minorHAnsi"/>
+        <w:rFonts w:asciiTheme="minorHAnsi" w:cstheme="minorBidi" w:eastAsiaTheme="minorHAnsi" w:hAnsiTheme="minorHAnsi"/>
         <w:sz w:val="24"/>
         <w:szCs w:val="24"/>
-        <w:lang w:bidi="ar-SA" w:eastAsia="zh-CN" w:val="en-US"/>
+        <w:lang w:bidi="ar-SA" w:eastAsia="en-US" w:val="en-US"/>
       </w:rPr>
     </w:rPrDefault>
     <w:pPrDefault>
@@ -4358,6 +4439,8 @@
     </w:pPr>
     <w:rPr>
       <w:rFonts w:asciiTheme="majorHAnsi" w:cstheme="majorBidi" w:eastAsiaTheme="majorEastAsia" w:hAnsiTheme="majorHAnsi"/>
+      <w:spacing w:val="-10"/>
+      <w:kern w:val="28"/>
       <w:sz w:val="56"/>
       <w:szCs w:val="56"/>
     </w:rPr>
@@ -4370,13 +4453,15 @@
     <w:rsid w:val="00A10FD9"/>
     <w:rPr>
       <w:rFonts w:asciiTheme="majorHAnsi" w:cstheme="majorBidi" w:eastAsiaTheme="majorEastAsia" w:hAnsiTheme="majorHAnsi"/>
+      <w:spacing w:val="-10"/>
+      <w:kern w:val="28"/>
       <w:sz w:val="56"/>
       <w:szCs w:val="56"/>
     </w:rPr>
   </w:style>
   <w:style w:styleId="Subtitle" w:type="paragraph">
     <w:name w:val="Subtitle"/>
-    <w:basedOn w:val="Title"/>
+    <w:basedOn w:val="Normal"/>
     <w:next w:val="BodyText"/>
     <w:link w:val="SubtitleChar"/>
     <w:uiPriority w:val="11"/>
@@ -4389,6 +4474,7 @@
     </w:pPr>
     <w:rPr>
       <w:rFonts w:cstheme="majorBidi" w:eastAsiaTheme="majorEastAsia"/>
+      <w:color w:themeColor="text1" w:themeTint="A6" w:val="595959"/>
       <w:spacing w:val="15"/>
       <w:sz w:val="28"/>
       <w:szCs w:val="28"/>
@@ -4410,31 +4496,23 @@
   </w:style>
   <w:style w:customStyle="1" w:styleId="Author" w:type="paragraph">
     <w:name w:val="Author"/>
-    <w:basedOn w:val="Title"/>
     <w:next w:val="BodyText"/>
     <w:qFormat/>
     <w:pPr>
       <w:keepNext/>
       <w:keepLines/>
+      <w:jc w:val="center"/>
     </w:pPr>
-    <w:rPr>
-      <w:sz w:val="24"/>
-      <w:szCs w:val="24"/>
-    </w:rPr>
   </w:style>
   <w:style w:styleId="Date" w:type="paragraph">
     <w:name w:val="Date"/>
-    <w:basedOn w:val="Title"/>
     <w:next w:val="BodyText"/>
     <w:qFormat/>
     <w:pPr>
       <w:keepNext/>
       <w:keepLines/>
+      <w:jc w:val="center"/>
     </w:pPr>
-    <w:rPr>
-      <w:sz w:val="24"/>
-      <w:szCs w:val="24"/>
-    </w:rPr>
   </w:style>
   <w:style w:customStyle="1" w:styleId="AbstractTitle" w:type="paragraph">
     <w:name w:val="Abstract Title"/>
@@ -4449,6 +4527,7 @@
     </w:pPr>
     <w:rPr>
       <w:b/>
+      <w:color w:val="345A8A"/>
       <w:sz w:val="20"/>
       <w:szCs w:val="20"/>
     </w:rPr>
@@ -4847,6 +4926,13 @@
       </w:tblCellMar>
     </w:tblPr>
     <w:tblStylePr w:type="firstRow">
+      <w:tblPr>
+        <w:jc w:val="left"/>
+        <w:tblInd w:type="dxa" w:w="0"/>
+      </w:tblPr>
+      <w:trPr>
+        <w:jc w:val="left"/>
+      </w:trPr>
       <w:tcPr>
         <w:tcBorders>
           <w:bottom w:val="single"/>

</xml_diff>

<commit_message>
docs(manuscript): draft acknowledgements with editable placeholders
Replace the {{TODO: acknowledgements}} marker with a three-clause default
covering the experimental-data collaborators, pre-release testers, and
optional compute providers. Each clause carries a bracketed placeholder
so the corresponding author can fill names in or strip the clause if not
applicable. Re-render docx so the Word deliverable carries the same text.

Co-Authored-By: Claude Opus 4.7 <noreply@anthropic.com>
</commit_message>
<xml_diff>
--- a/docs/manuscript/applications_note.docx
+++ b/docs/manuscript/applications_note.docx
@@ -2760,7 +2760,49 @@
         <w:t xml:space="preserve"> </w:t>
       </w:r>
       <w:r>
-        <w:t xml:space="preserve">{{TODO: acknowledgements — collaborators, reviewers, compute providers}}</w:t>
+        <w:t xml:space="preserve">The authors thank the</w:t>
+      </w:r>
+      <w:r>
+        <w:t xml:space="preserve"> </w:t>
+      </w:r>
+      <w:r>
+        <w:rPr>
+          <w:b/>
+          <w:bCs/>
+        </w:rPr>
+        <w:t xml:space="preserve">[clinical / experimental collaborators]</w:t>
+      </w:r>
+      <w:r>
+        <w:t xml:space="preserve"> </w:t>
+      </w:r>
+      <w:r>
+        <w:t xml:space="preserve">who generated the chicken caecum metagenomics datasets used to develop and validate the pipeline. We are grateful to</w:t>
+      </w:r>
+      <w:r>
+        <w:t xml:space="preserve"> </w:t>
+      </w:r>
+      <w:r>
+        <w:rPr>
+          <w:b/>
+          <w:bCs/>
+        </w:rPr>
+        <w:t xml:space="preserve">[early-tester names / labs]</w:t>
+      </w:r>
+      <w:r>
+        <w:t xml:space="preserve"> </w:t>
+      </w:r>
+      <w:r>
+        <w:t xml:space="preserve">for feedback on the configuration interface and Quarto report layout, and to the School of Biomedical Science at the University of West London for hosting the project.</w:t>
+      </w:r>
+      <w:r>
+        <w:t xml:space="preserve"> </w:t>
+      </w:r>
+      <w:r>
+        <w:rPr>
+          <w:b/>
+          <w:bCs/>
+        </w:rPr>
+        <w:t xml:space="preserve">[Optional: compute providers — e.g. UWL / UCL HPC, cloud credits.]</w:t>
       </w:r>
     </w:p>
     <w:p>

</xml_diff>

<commit_message>
docs(manuscript): re-render applications_note.docx with Figure 2
Refresh from the updated applications_note.md so the docx carries the
new Figure 2 (pipeline performance) image and caption, and reflects the
drafting-notes section having moved out to drafting_notes.md.

Co-Authored-By: Claude Opus 4.7 <noreply@anthropic.com>
</commit_message>
<xml_diff>
--- a/docs/manuscript/applications_note.docx
+++ b/docs/manuscript/applications_note.docx
@@ -2,7 +2,7 @@
 <file path=word/document.xml><?xml version="1.0" encoding="utf-8"?>
 <w:document xmlns:w="http://schemas.openxmlformats.org/wordprocessingml/2006/main" xmlns:m="http://schemas.openxmlformats.org/officeDocument/2006/math" xmlns:r="http://schemas.openxmlformats.org/officeDocument/2006/relationships" xmlns:o="urn:schemas-microsoft-com:office:office" xmlns:v="urn:schemas-microsoft-com:vml" xmlns:w10="urn:schemas-microsoft-com:office:word" xmlns:a="http://schemas.openxmlformats.org/drawingml/2006/main" xmlns:pic="http://schemas.openxmlformats.org/drawingml/2006/picture" xmlns:wp="http://schemas.openxmlformats.org/drawingml/2006/wordprocessingDrawing">
   <w:body>
-    <w:bookmarkStart w:id="19" w:name="X84d9e160d30b1cd211371155645e81ef50bd748"/>
+    <w:bookmarkStart w:id="21" w:name="X84d9e160d30b1cd211371155645e81ef50bd748"/>
     <w:p>
       <w:pPr>
         <w:pStyle w:val="Heading1"/>
@@ -918,7 +918,7 @@
       </w:r>
     </w:p>
     <w:bookmarkEnd w:id="14"/>
-    <w:bookmarkStart w:id="15" w:name="application-and-validation"/>
+    <w:bookmarkStart w:id="18" w:name="application-and-validation"/>
     <w:p>
       <w:pPr>
         <w:pStyle w:val="Heading2"/>
@@ -2652,7 +2652,138 @@
         <w:t xml:space="preserve"> </w:t>
       </w:r>
       <w:r>
-        <w:t xml:space="preserve">stage’s peak is comparatively modest (~0.6 GB) because the heavy lifting is delegated to the external Quarto process and is therefore not captured by the in-process gc() instrumentation. Tabulated PERMANOVA and PERMDISP statistics for the per-domain stages (resistome, virulome, mobilome), per-metric KW p-values for alpha diversity, and all DAA per-pair feature tables are surfaced in the Quarto dashboard rather than reproduced here.</w:t>
+        <w:t xml:space="preserve">stage’s peak is comparatively modest (~0.6 GB) because the heavy lifting is delegated to the external Quarto process and is therefore not captured by the in-process gc() instrumentation. Figure 2 visualises the same numbers: panels A and B give the per-stage wall time and peak heap as paired bars (stages sorted by B2 runtime), and panels C and D show the cumulative trajectories in pipeline order, making the ALDEx2 inflection and the R/14 memory peak readable at a glance. Tabulated PERMANOVA and PERMDISP statistics for the per-domain stages (resistome, virulome, mobilome), per-metric KW p-values for alpha diversity, and all DAA per-pair feature tables are surfaced in the Quarto dashboard rather than reproduced here.</w:t>
+      </w:r>
+    </w:p>
+    <w:p>
+      <w:pPr>
+        <w:pStyle w:val="CaptionedFigure"/>
+      </w:pPr>
+      <w:r>
+        <w:drawing>
+          <wp:inline>
+            <wp:extent cx="5334000" cy="5614486"/>
+            <wp:effectExtent b="0" l="0" r="0" t="0"/>
+            <wp:docPr descr="Figure 2. Pipeline performance on the two validation cohorts. (A) Per-stage wall time (log scale) and (B) peak R-process heap, both with stages sorted by B2 runtime. (C) Cumulative wall time and (D) running peak memory across the 15 stages in pipeline order. Numbers reproduce Table 1; both runs used identical pipeline commit eee122c, R 4.5.0 single thread, PERMANOVA 9999 permutations, ALDEx2 mc.samples = 128. B1 = chicken_batch1 (PC_JC_2024-11-29; n=18; 3 dietary groups). B2 = chicken_batch2 (JC_FL_2025-05-20; n=32; 4-level Treatment_Bird, block random effect, two declared negative controls). Source: generate_figure2.R." title="" id="16" name="Picture"/>
+            <a:graphic>
+              <a:graphicData uri="http://schemas.openxmlformats.org/drawingml/2006/picture">
+                <pic:pic>
+                  <pic:nvPicPr>
+                    <pic:cNvPr descr="figure2_pipeline_performance.png" id="17" name="Picture"/>
+                    <pic:cNvPicPr>
+                      <a:picLocks noChangeArrowheads="1" noChangeAspect="1"/>
+                    </pic:cNvPicPr>
+                  </pic:nvPicPr>
+                  <pic:blipFill>
+                    <a:blip r:embed="rId15"/>
+                    <a:stretch>
+                      <a:fillRect/>
+                    </a:stretch>
+                  </pic:blipFill>
+                  <pic:spPr bwMode="auto">
+                    <a:xfrm>
+                      <a:off x="0" y="0"/>
+                      <a:ext cx="5334000" cy="5614486"/>
+                    </a:xfrm>
+                    <a:prstGeom prst="rect">
+                      <a:avLst/>
+                    </a:prstGeom>
+                    <a:noFill/>
+                    <a:ln w="9525">
+                      <a:noFill/>
+                      <a:headEnd/>
+                      <a:tailEnd/>
+                    </a:ln>
+                  </pic:spPr>
+                </pic:pic>
+              </a:graphicData>
+            </a:graphic>
+          </wp:inline>
+        </w:drawing>
+      </w:r>
+    </w:p>
+    <w:p>
+      <w:pPr>
+        <w:pStyle w:val="ImageCaption"/>
+      </w:pPr>
+      <w:r>
+        <w:rPr>
+          <w:b/>
+          <w:bCs/>
+        </w:rPr>
+        <w:t xml:space="preserve">Figure 2.</w:t>
+      </w:r>
+      <w:r>
+        <w:t xml:space="preserve"> </w:t>
+      </w:r>
+      <w:r>
+        <w:t xml:space="preserve">Pipeline performance on the two validation cohorts. (A) Per-stage wall time (log scale) and (B) peak R-process heap, both with stages sorted by B2 runtime. (C) Cumulative wall time and (D) running peak memory across the 15 stages in pipeline order. Numbers reproduce Table 1; both runs used identical pipeline commit</w:t>
+      </w:r>
+      <w:r>
+        <w:t xml:space="preserve"> </w:t>
+      </w:r>
+      <w:r>
+        <w:rPr>
+          <w:rStyle w:val="VerbatimChar"/>
+        </w:rPr>
+        <w:t xml:space="preserve">eee122c</w:t>
+      </w:r>
+      <w:r>
+        <w:t xml:space="preserve">, R 4.5.0 single thread, PERMANOVA 9999 permutations, ALDEx2</w:t>
+      </w:r>
+      <w:r>
+        <w:t xml:space="preserve"> </w:t>
+      </w:r>
+      <w:r>
+        <w:rPr>
+          <w:rStyle w:val="VerbatimChar"/>
+        </w:rPr>
+        <w:t xml:space="preserve">mc.samples</w:t>
+      </w:r>
+      <w:r>
+        <w:t xml:space="preserve"> </w:t>
+      </w:r>
+      <w:r>
+        <w:t xml:space="preserve">= 128. B1 = chicken_batch1 (PC_JC_2024-11-29; n=18; 3 dietary groups). B2 = chicken_batch2 (JC_FL_2025-05-20; n=32; 4-level</w:t>
+      </w:r>
+      <w:r>
+        <w:t xml:space="preserve"> </w:t>
+      </w:r>
+      <w:r>
+        <w:rPr>
+          <w:rStyle w:val="VerbatimChar"/>
+        </w:rPr>
+        <w:t xml:space="preserve">Treatment_Bird</w:t>
+      </w:r>
+      <w:r>
+        <w:t xml:space="preserve">,</w:t>
+      </w:r>
+      <w:r>
+        <w:t xml:space="preserve"> </w:t>
+      </w:r>
+      <w:r>
+        <w:rPr>
+          <w:rStyle w:val="VerbatimChar"/>
+        </w:rPr>
+        <w:t xml:space="preserve">block</w:t>
+      </w:r>
+      <w:r>
+        <w:t xml:space="preserve"> </w:t>
+      </w:r>
+      <w:r>
+        <w:t xml:space="preserve">random effect, two declared negative controls). Source:</w:t>
+      </w:r>
+      <w:r>
+        <w:t xml:space="preserve"> </w:t>
+      </w:r>
+      <w:r>
+        <w:rPr>
+          <w:rStyle w:val="VerbatimChar"/>
+        </w:rPr>
+        <w:t xml:space="preserve">generate_figure2.R</w:t>
+      </w:r>
+      <w:r>
+        <w:t xml:space="preserve">.</w:t>
       </w:r>
     </w:p>
     <w:p>
@@ -2705,8 +2836,8 @@
         <w:t xml:space="preserve">key set is 0.82. Across the other stages with directly comparable ground-truth artefacts, sample-set agreement is exact on alpha diversity (18 / 18), and Jaccard on the network gephi exports against the most-recent hand-edited snapshot is 0.85 (nodes) and 0.87 (edges); per-stage agreement against the remaining hand-edited artefacts (taxonomy, beta diversity, differential abundance) is deferred to a separate validation effort. The Re-centrifuge column-slicing heuristic in R/02 is acknowledged as still coarse and is queued for rework; Table 1 will be re-derived once that change lands.</w:t>
       </w:r>
     </w:p>
-    <w:bookmarkEnd w:id="15"/>
-    <w:bookmarkStart w:id="16" w:name="conclusion"/>
+    <w:bookmarkEnd w:id="18"/>
+    <w:bookmarkStart w:id="19" w:name="conclusion"/>
     <w:p>
       <w:pPr>
         <w:pStyle w:val="Heading2"/>
@@ -2848,8 +2979,8 @@
         </w:pict>
       </w:r>
     </w:p>
-    <w:bookmarkEnd w:id="16"/>
-    <w:bookmarkStart w:id="17" w:name="references"/>
+    <w:bookmarkEnd w:id="19"/>
+    <w:bookmarkStart w:id="20" w:name="references"/>
     <w:p>
       <w:pPr>
         <w:pStyle w:val="Heading2"/>
@@ -3254,1531 +3385,8 @@
         <w:t xml:space="preserve">Allaire JJ, Gandrud C, Russell K, Yetman C. networkD3: D3 JavaScript Network Graphs from R. R package version 0.4.1, 2025. doi:10.32614/CRAN.package.networkD3.</w:t>
       </w:r>
     </w:p>
-    <w:p>
-      <w:r>
-        <w:pict>
-          <v:rect style="width:0;height:1.5pt" o:hralign="center" o:hrstd="t" o:hr="t"/>
-        </w:pict>
-      </w:r>
-    </w:p>
-    <w:bookmarkEnd w:id="17"/>
-    <w:bookmarkStart w:id="18" w:name="drafting-notes"/>
-    <w:p>
-      <w:pPr>
-        <w:pStyle w:val="Heading2"/>
-      </w:pPr>
-      <w:r>
-        <w:t xml:space="preserve">Drafting notes</w:t>
-      </w:r>
-    </w:p>
-    <w:p>
-      <w:pPr>
-        <w:pStyle w:val="FirstParagraph"/>
-      </w:pPr>
-      <w:r>
-        <w:t xml:space="preserve">Placeholders inserted, and the data needed to fill each one:</w:t>
-      </w:r>
-    </w:p>
-    <w:p>
-      <w:pPr>
-        <w:pStyle w:val="BodyText"/>
-      </w:pPr>
-      <w:r>
-        <w:t xml:space="preserve">Resolved since first draft:</w:t>
-      </w:r>
-    </w:p>
-    <w:p>
-      <w:pPr>
-        <w:pStyle w:val="Compact"/>
-        <w:numPr>
-          <w:ilvl w:val="0"/>
-          <w:numId w:val="1003"/>
-        </w:numPr>
-      </w:pPr>
-      <w:r>
-        <w:rPr>
-          <w:b/>
-          <w:bCs/>
-        </w:rPr>
-        <w:t xml:space="preserve">Pipeline rename to MERIDIAN</w:t>
-      </w:r>
-      <w:r>
-        <w:t xml:space="preserve"> </w:t>
-      </w:r>
-      <w:r>
-        <w:t xml:space="preserve">(commit 8f5fb3f, 2026-06-23) — manuscript title now leads with</w:t>
-      </w:r>
-      <w:r>
-        <w:t xml:space="preserve"> </w:t>
-      </w:r>
-      <w:r>
-        <w:t xml:space="preserve">“MERIDIAN:”</w:t>
-      </w:r>
-      <w:r>
-        <w:t xml:space="preserve">; first mention in Abstract Results introduces the expanded form (</w:t>
-      </w:r>
-      <w:r>
-        <w:rPr>
-          <w:i/>
-          <w:iCs/>
-        </w:rPr>
-        <w:t xml:space="preserve">Metagenomic Evaluation of Resistance, Identity &amp; Diversity through Integrated Analysis of Nanopore sequencing</w:t>
-      </w:r>
-      <w:r>
-        <w:t xml:space="preserve">); Figure 1 caption and §4 Conclusion follow.</w:t>
-      </w:r>
-      <w:r>
-        <w:t xml:space="preserve"> </w:t>
-      </w:r>
-      <w:r>
-        <w:rPr>
-          <w:rStyle w:val="VerbatimChar"/>
-        </w:rPr>
-        <w:t xml:space="preserve">generate_figure1.py</w:t>
-      </w:r>
-      <w:r>
-        <w:t xml:space="preserve"> </w:t>
-      </w:r>
-      <w:r>
-        <w:t xml:space="preserve">docstring banner and the orphaned</w:t>
-      </w:r>
-      <w:r>
-        <w:t xml:space="preserve"> </w:t>
-      </w:r>
-      <w:r>
-        <w:rPr>
-          <w:rStyle w:val="VerbatimChar"/>
-        </w:rPr>
-        <w:t xml:space="preserve">figure1_pipeline_schematic.mmd</w:t>
-      </w:r>
-      <w:r>
-        <w:t xml:space="preserve"> </w:t>
-      </w:r>
-      <w:r>
-        <w:t xml:space="preserve">header updated for consistency;</w:t>
-      </w:r>
-      <w:r>
-        <w:t xml:space="preserve"> </w:t>
-      </w:r>
-      <w:r>
-        <w:rPr>
-          <w:rStyle w:val="VerbatimChar"/>
-        </w:rPr>
-        <w:t xml:space="preserve">pipeline_facts.md</w:t>
-      </w:r>
-      <w:r>
-        <w:t xml:space="preserve"> </w:t>
-      </w:r>
-      <w:r>
-        <w:t xml:space="preserve">“What the tool is”</w:t>
-      </w:r>
-      <w:r>
-        <w:t xml:space="preserve"> </w:t>
-      </w:r>
-      <w:r>
-        <w:t xml:space="preserve">entry renamed. Figure 1 PNG/SVG do not need re-rendering — the pipeline name does not appear on the rendered figure itself.</w:t>
-      </w:r>
-    </w:p>
-    <w:p>
-      <w:pPr>
-        <w:pStyle w:val="Compact"/>
-        <w:numPr>
-          <w:ilvl w:val="0"/>
-          <w:numId w:val="1003"/>
-        </w:numPr>
-      </w:pPr>
-      <w:r>
-        <w:t xml:space="preserve">Author block, affiliations, corresponding author and email — filled.</w:t>
-      </w:r>
-    </w:p>
-    <w:p>
-      <w:pPr>
-        <w:pStyle w:val="Compact"/>
-        <w:numPr>
-          <w:ilvl w:val="0"/>
-          <w:numId w:val="1003"/>
-        </w:numPr>
-      </w:pPr>
-      <w:r>
-        <w:t xml:space="preserve">GitHub URL — filled (https://github.com/Julio92-C/Metagenomics_pipeline_automation).</w:t>
-      </w:r>
-    </w:p>
-    <w:p>
-      <w:pPr>
-        <w:pStyle w:val="Compact"/>
-        <w:numPr>
-          <w:ilvl w:val="0"/>
-          <w:numId w:val="1003"/>
-        </w:numPr>
-      </w:pPr>
-      <w:r>
-        <w:t xml:space="preserve">Figure 1 — canonical source is</w:t>
-      </w:r>
-      <w:r>
-        <w:t xml:space="preserve"> </w:t>
-      </w:r>
-      <w:r>
-        <w:rPr>
-          <w:rStyle w:val="VerbatimChar"/>
-        </w:rPr>
-        <w:t xml:space="preserve">generate_figure1.py</w:t>
-      </w:r>
-      <w:r>
-        <w:t xml:space="preserve"> </w:t>
-      </w:r>
-      <w:r>
-        <w:t xml:space="preserve">(matplotlib, 300 DPI, custom colour-coded layout), added in the</w:t>
-      </w:r>
-      <w:r>
-        <w:t xml:space="preserve"> </w:t>
-      </w:r>
-      <w:r>
-        <w:t xml:space="preserve">“polish Figure 1”</w:t>
-      </w:r>
-      <w:r>
-        <w:t xml:space="preserve"> </w:t>
-      </w:r>
-      <w:r>
-        <w:t xml:space="preserve">pass to replace the original Mermaid render. Regenerate via</w:t>
-      </w:r>
-      <w:r>
-        <w:t xml:space="preserve"> </w:t>
-      </w:r>
-      <w:r>
-        <w:rPr>
-          <w:rStyle w:val="VerbatimChar"/>
-        </w:rPr>
-        <w:t xml:space="preserve">&amp; "C:\Users\julio\AppData\Local\Programs\Python\Python313\python.exe" generate_figure1.py</w:t>
-      </w:r>
-      <w:r>
-        <w:t xml:space="preserve"> </w:t>
-      </w:r>
-      <w:r>
-        <w:t xml:space="preserve">(plain</w:t>
-      </w:r>
-      <w:r>
-        <w:t xml:space="preserve"> </w:t>
-      </w:r>
-      <w:r>
-        <w:rPr>
-          <w:rStyle w:val="VerbatimChar"/>
-        </w:rPr>
-        <w:t xml:space="preserve">python</w:t>
-      </w:r>
-      <w:r>
-        <w:t xml:space="preserve"> </w:t>
-      </w:r>
-      <w:r>
-        <w:t xml:space="preserve">resolves to Inkscape’s interpreter and lacks matplotlib) — writes both</w:t>
-      </w:r>
-      <w:r>
-        <w:t xml:space="preserve"> </w:t>
-      </w:r>
-      <w:r>
-        <w:rPr>
-          <w:rStyle w:val="VerbatimChar"/>
-        </w:rPr>
-        <w:t xml:space="preserve">figure1_pipeline_schematic.png</w:t>
-      </w:r>
-      <w:r>
-        <w:t xml:space="preserve"> </w:t>
-      </w:r>
-      <w:r>
-        <w:t xml:space="preserve">and</w:t>
-      </w:r>
-      <w:r>
-        <w:t xml:space="preserve"> </w:t>
-      </w:r>
-      <w:r>
-        <w:rPr>
-          <w:rStyle w:val="VerbatimChar"/>
-        </w:rPr>
-        <w:t xml:space="preserve">.svg</w:t>
-      </w:r>
-      <w:r>
-        <w:t xml:space="preserve">. The old</w:t>
-      </w:r>
-      <w:r>
-        <w:t xml:space="preserve"> </w:t>
-      </w:r>
-      <w:r>
-        <w:rPr>
-          <w:rStyle w:val="VerbatimChar"/>
-        </w:rPr>
-        <w:t xml:space="preserve">figure1_pipeline_schematic.mmd</w:t>
-      </w:r>
-      <w:r>
-        <w:t xml:space="preserve"> </w:t>
-      </w:r>
-      <w:r>
-        <w:t xml:space="preserve">is legacy/orphaned: do not re-render it with</w:t>
-      </w:r>
-      <w:r>
-        <w:t xml:space="preserve"> </w:t>
-      </w:r>
-      <w:r>
-        <w:rPr>
-          <w:rStyle w:val="VerbatimChar"/>
-        </w:rPr>
-        <w:t xml:space="preserve">mmdc</w:t>
-      </w:r>
-      <w:r>
-        <w:t xml:space="preserve">, that overwrites the polished figure with the plain Mermaid style. Layout refreshed on 2026-06-19: R/12 now fans out to a two-column output row (Quarto dashboard + R/13 manifest on the left, R/14 panels + Publication outputs on the right), with a dotted cross-feed from R/14 panels into R/13 manifest. Caption updated in lockstep.</w:t>
-      </w:r>
-    </w:p>
-    <w:p>
-      <w:pPr>
-        <w:pStyle w:val="Compact"/>
-        <w:numPr>
-          <w:ilvl w:val="0"/>
-          <w:numId w:val="1003"/>
-        </w:numPr>
-      </w:pPr>
-      <w:r>
-        <w:t xml:space="preserve">R/11 mobilome database — confirmed as PlasmidFinder (reference 7).</w:t>
-      </w:r>
-    </w:p>
-    <w:p>
-      <w:pPr>
-        <w:pStyle w:val="Compact"/>
-        <w:numPr>
-          <w:ilvl w:val="0"/>
-          <w:numId w:val="1003"/>
-        </w:numPr>
-      </w:pPr>
-      <w:r>
-        <w:t xml:space="preserve">Module count refreshed to fifteen (R/00–R/14); R/13 manifest stage + new R/14 publication-panels stage +</w:t>
-      </w:r>
-      <w:r>
-        <w:t xml:space="preserve"> </w:t>
-      </w:r>
-      <w:r>
-        <w:rPr>
-          <w:rStyle w:val="VerbatimChar"/>
-        </w:rPr>
-        <w:t xml:space="preserve">manifest.json</w:t>
-      </w:r>
-      <w:r>
-        <w:t xml:space="preserve"> </w:t>
-      </w:r>
-      <w:r>
-        <w:t xml:space="preserve">(contract v1.2) added across Abstract, §1, §2, Figure 1.</w:t>
-      </w:r>
-    </w:p>
-    <w:p>
-      <w:pPr>
-        <w:pStyle w:val="Compact"/>
-        <w:numPr>
-          <w:ilvl w:val="0"/>
-          <w:numId w:val="1003"/>
-        </w:numPr>
-      </w:pPr>
-      <w:r>
-        <w:t xml:space="preserve">§1 ¶1 rewritten with One Health framing; new ref [1] Al-Khalaifah et al. 2025 inserted; refs 2–17 renumbered accordingly.</w:t>
-      </w:r>
-    </w:p>
-    <w:p>
-      <w:pPr>
-        <w:pStyle w:val="Compact"/>
-        <w:numPr>
-          <w:ilvl w:val="0"/>
-          <w:numId w:val="1003"/>
-        </w:numPr>
-      </w:pPr>
-      <w:r>
-        <w:t xml:space="preserve">§1 ¶2 limitations made concrete (comment #33 / #34 from 2026-06-15 DOCX review): removed the vague</w:t>
-      </w:r>
-      <w:r>
-        <w:t xml:space="preserve"> </w:t>
-      </w:r>
-      <w:r>
-        <w:t xml:space="preserve">“30–50 scripts”</w:t>
-      </w:r>
-      <w:r>
-        <w:t xml:space="preserve"> </w:t>
-      </w:r>
-      <w:r>
-        <w:t xml:space="preserve">anchor, named the symptoms (drift across script copies; no machine-readable artefact catalogue; cross-study comparisons reconcile code as well as data), and anchored the script-count claim on the concrete</w:t>
-      </w:r>
-      <w:r>
-        <w:t xml:space="preserve"> </w:t>
-      </w:r>
-      <w:r>
-        <w:rPr>
-          <w:rStyle w:val="VerbatimChar"/>
-        </w:rPr>
-        <w:t xml:space="preserve">chicken_batch1</w:t>
-      </w:r>
-      <w:r>
-        <w:t xml:space="preserve"> </w:t>
-      </w:r>
-      <w:r>
-        <w:t xml:space="preserve">~46-script baseline.</w:t>
-      </w:r>
-    </w:p>
-    <w:p>
-      <w:pPr>
-        <w:pStyle w:val="Compact"/>
-        <w:numPr>
-          <w:ilvl w:val="0"/>
-          <w:numId w:val="1003"/>
-        </w:numPr>
-      </w:pPr>
-      <w:r>
-        <w:t xml:space="preserve">§2</w:t>
-      </w:r>
-      <w:r>
-        <w:t xml:space="preserve"> </w:t>
-      </w:r>
-      <w:r>
-        <w:t xml:space="preserve">“Module code is never edited”</w:t>
-      </w:r>
-      <w:r>
-        <w:t xml:space="preserve"> </w:t>
-      </w:r>
-      <w:r>
-        <w:t xml:space="preserve">softened (comment #38) →</w:t>
-      </w:r>
-      <w:r>
-        <w:t xml:space="preserve"> </w:t>
-      </w:r>
-      <w:r>
-        <w:t xml:space="preserve">“Module code is not edited per-project; dataset-specific adjustments live in</w:t>
-      </w:r>
-      <w:r>
-        <w:t xml:space="preserve"> </w:t>
-      </w:r>
-      <w:r>
-        <w:rPr>
-          <w:rStyle w:val="VerbatimChar"/>
-        </w:rPr>
-        <w:t xml:space="preserve">config.yaml</w:t>
-      </w:r>
-      <w:r>
-        <w:t xml:space="preserve"> </w:t>
-      </w:r>
-      <w:r>
-        <w:t xml:space="preserve">or in the structured fix tables it references.”</w:t>
-      </w:r>
-    </w:p>
-    <w:p>
-      <w:pPr>
-        <w:pStyle w:val="Compact"/>
-        <w:numPr>
-          <w:ilvl w:val="0"/>
-          <w:numId w:val="1003"/>
-        </w:numPr>
-      </w:pPr>
-      <w:r>
-        <w:t xml:space="preserve">§2</w:t>
-      </w:r>
-      <w:r>
-        <w:t xml:space="preserve"> </w:t>
-      </w:r>
-      <w:r>
-        <w:rPr>
-          <w:rStyle w:val="VerbatimChar"/>
-        </w:rPr>
-        <w:t xml:space="preserve">taxid_fixes.csv</w:t>
-      </w:r>
-      <w:r>
-        <w:t xml:space="preserve"> </w:t>
-      </w:r>
-      <w:r>
-        <w:t xml:space="preserve">description reframed (comment #41) → optional capability (</w:t>
-      </w:r>
-      <w:r>
-        <w:t xml:space="preserve">“when needed”</w:t>
-      </w:r>
-      <w:r>
-        <w:t xml:space="preserve">) rather than a core stage feature.</w:t>
-      </w:r>
-    </w:p>
-    <w:p>
-      <w:pPr>
-        <w:pStyle w:val="Compact"/>
-        <w:numPr>
-          <w:ilvl w:val="0"/>
-          <w:numId w:val="1003"/>
-        </w:numPr>
-      </w:pPr>
-      <w:r>
-        <w:t xml:space="preserve">§2 Stages paragraph rewritten (comment #42) into five conceptual blocks — ingest &amp; cleaning / gene-element normalisation / community analyses / functional profiling / integration, reporting and manifest — with module IDs in parentheses rather than as the spine.</w:t>
-      </w:r>
-    </w:p>
-    <w:p>
-      <w:pPr>
-        <w:pStyle w:val="Compact"/>
-        <w:numPr>
-          <w:ilvl w:val="0"/>
-          <w:numId w:val="1003"/>
-        </w:numPr>
-      </w:pPr>
-      <w:r>
-        <w:t xml:space="preserve">§2 dependency line corrected: TPM normalisation (R/03) and gene-element stages (R/09–R/11) now stated as requiring</w:t>
-      </w:r>
-      <w:r>
-        <w:t xml:space="preserve"> </w:t>
-      </w:r>
-      <w:r>
-        <w:rPr>
-          <w:b/>
-          <w:bCs/>
-        </w:rPr>
-        <w:t xml:space="preserve">ABRicate</w:t>
-      </w:r>
-      <w:r>
-        <w:t xml:space="preserve"> </w:t>
-      </w:r>
-      <w:r>
-        <w:t xml:space="preserve">outputs (not Bracken). R/03 operates on per-(sample, GENE) ABRicate hits with</w:t>
-      </w:r>
-      <w:r>
-        <w:t xml:space="preserve"> </w:t>
-      </w:r>
-      <w:r>
-        <w:rPr>
-          <w:rStyle w:val="VerbatimChar"/>
-        </w:rPr>
-        <w:t xml:space="preserve">GENE</w:t>
-      </w:r>
-      <w:r>
-        <w:t xml:space="preserve">/</w:t>
-      </w:r>
-      <w:r>
-        <w:rPr>
-          <w:rStyle w:val="VerbatimChar"/>
-        </w:rPr>
-        <w:t xml:space="preserve">START</w:t>
-      </w:r>
-      <w:r>
-        <w:t xml:space="preserve">/</w:t>
-      </w:r>
-      <w:r>
-        <w:rPr>
-          <w:rStyle w:val="VerbatimChar"/>
-        </w:rPr>
-        <w:t xml:space="preserve">END</w:t>
-      </w:r>
-      <w:r>
-        <w:t xml:space="preserve"> </w:t>
-      </w:r>
-      <w:r>
-        <w:t xml:space="preserve">columns; Bracken contributes via the R/02 merge but is not the carrier for the TPM math.</w:t>
-      </w:r>
-    </w:p>
-    <w:p>
-      <w:pPr>
-        <w:pStyle w:val="Compact"/>
-        <w:numPr>
-          <w:ilvl w:val="0"/>
-          <w:numId w:val="1003"/>
-        </w:numPr>
-      </w:pPr>
-      <w:r>
-        <w:t xml:space="preserve">§2</w:t>
-      </w:r>
-      <w:r>
-        <w:t xml:space="preserve"> </w:t>
-      </w:r>
-      <w:r>
-        <w:t xml:space="preserve">“resistome–virulome–mobilome triad”</w:t>
-      </w:r>
-      <w:r>
-        <w:t xml:space="preserve"> </w:t>
-      </w:r>
-      <w:r>
-        <w:t xml:space="preserve">→</w:t>
-      </w:r>
-      <w:r>
-        <w:t xml:space="preserve"> </w:t>
-      </w:r>
-      <w:r>
-        <w:t xml:space="preserve">“profiling”</w:t>
-      </w:r>
-      <w:r>
-        <w:t xml:space="preserve">.</w:t>
-      </w:r>
-    </w:p>
-    <w:p>
-      <w:pPr>
-        <w:pStyle w:val="Compact"/>
-        <w:numPr>
-          <w:ilvl w:val="0"/>
-          <w:numId w:val="1003"/>
-        </w:numPr>
-      </w:pPr>
-      <w:r>
-        <w:t xml:space="preserve">§2 utilities sentence deleted;</w:t>
-      </w:r>
-      <w:r>
-        <w:t xml:space="preserve"> </w:t>
-      </w:r>
-      <w:r>
-        <w:t xml:space="preserve">“Shared utilities and Reporting”</w:t>
-      </w:r>
-      <w:r>
-        <w:t xml:space="preserve"> </w:t>
-      </w:r>
-      <w:r>
-        <w:t xml:space="preserve">→</w:t>
-      </w:r>
-      <w:r>
-        <w:t xml:space="preserve"> </w:t>
-      </w:r>
-      <w:r>
-        <w:t xml:space="preserve">“Reporting”</w:t>
-      </w:r>
-      <w:r>
-        <w:t xml:space="preserve">.</w:t>
-      </w:r>
-    </w:p>
-    <w:p>
-      <w:pPr>
-        <w:pStyle w:val="Compact"/>
-        <w:numPr>
-          <w:ilvl w:val="0"/>
-          <w:numId w:val="1003"/>
-        </w:numPr>
-      </w:pPr>
-      <w:r>
-        <w:t xml:space="preserve">§2 new sentence on</w:t>
-      </w:r>
-      <w:r>
-        <w:t xml:space="preserve"> </w:t>
-      </w:r>
-      <w:r>
-        <w:rPr>
-          <w:rStyle w:val="VerbatimChar"/>
-        </w:rPr>
-        <w:t xml:space="preserve">cfg$stats$padjust_method</w:t>
-      </w:r>
-      <w:r>
-        <w:t xml:space="preserve"> </w:t>
-      </w:r>
-      <w:r>
-        <w:t xml:space="preserve">knob (Benjamini-Hochberg default; full list in</w:t>
-      </w:r>
-      <w:r>
-        <w:t xml:space="preserve"> </w:t>
-      </w:r>
-      <w:r>
-        <w:rPr>
-          <w:rStyle w:val="VerbatimChar"/>
-        </w:rPr>
-        <w:t xml:space="preserve">docs/STATISTICS.md</w:t>
-      </w:r>
-      <w:r>
-        <w:t xml:space="preserve">).</w:t>
-      </w:r>
-    </w:p>
-    <w:p>
-      <w:pPr>
-        <w:pStyle w:val="Compact"/>
-        <w:numPr>
-          <w:ilvl w:val="0"/>
-          <w:numId w:val="1003"/>
-        </w:numPr>
-      </w:pPr>
-      <w:r>
-        <w:t xml:space="preserve">Quarto deliverable corrected from</w:t>
-      </w:r>
-      <w:r>
-        <w:t xml:space="preserve"> </w:t>
-      </w:r>
-      <w:r>
-        <w:t xml:space="preserve">“HTML report”</w:t>
-      </w:r>
-      <w:r>
-        <w:t xml:space="preserve"> </w:t>
-      </w:r>
-      <w:r>
-        <w:t xml:space="preserve">to</w:t>
-      </w:r>
-      <w:r>
-        <w:t xml:space="preserve"> </w:t>
-      </w:r>
-      <w:r>
-        <w:t xml:space="preserve">“dashboard with per-domain panels”</w:t>
-      </w:r>
-      <w:r>
-        <w:t xml:space="preserve">.</w:t>
-      </w:r>
-    </w:p>
-    <w:p>
-      <w:pPr>
-        <w:pStyle w:val="Compact"/>
-        <w:numPr>
-          <w:ilvl w:val="0"/>
-          <w:numId w:val="1003"/>
-        </w:numPr>
-      </w:pPr>
-      <w:r>
-        <w:t xml:space="preserve">§3 validation: auto-instrumented per-stage runtime +</w:t>
-      </w:r>
-      <w:r>
-        <w:t xml:space="preserve"> </w:t>
-      </w:r>
-      <w:r>
-        <w:rPr>
-          <w:rStyle w:val="VerbatimChar"/>
-        </w:rPr>
-        <w:t xml:space="preserve">scripts/diff_normdata.R</w:t>
-      </w:r>
-      <w:r>
-        <w:t xml:space="preserve"> </w:t>
-      </w:r>
-      <w:r>
-        <w:t xml:space="preserve">+</w:t>
-      </w:r>
-      <w:r>
-        <w:t xml:space="preserve"> </w:t>
-      </w:r>
-      <w:r>
-        <w:rPr>
-          <w:rStyle w:val="VerbatimChar"/>
-        </w:rPr>
-        <w:t xml:space="preserve">scripts/probe_taxid_parse.R</w:t>
-      </w:r>
-      <w:r>
-        <w:t xml:space="preserve"> </w:t>
-      </w:r>
-      <w:r>
-        <w:t xml:space="preserve">now cited; Re-centrifuge column-slicing caveat noted.</w:t>
-      </w:r>
-    </w:p>
-    <w:p>
-      <w:pPr>
-        <w:pStyle w:val="Compact"/>
-        <w:numPr>
-          <w:ilvl w:val="0"/>
-          <w:numId w:val="1003"/>
-        </w:numPr>
-      </w:pPr>
-      <w:r>
-        <w:t xml:space="preserve">§3 Table 1 populated from the 2026-05-31 pipeline.log on both validation cohorts (chicken_batch1 PC_JC_2024-11-29 = 3m 46s; chicken_batch2 JC_FL_2025-05-20 = 6m 32s). Two-batch scaling table chosen over ground-truth-agreement table; agreement column deferred. Memory column intentionally omitted — instrumentation pending.</w:t>
-      </w:r>
-    </w:p>
-    <w:p>
-      <w:pPr>
-        <w:pStyle w:val="Compact"/>
-        <w:numPr>
-          <w:ilvl w:val="0"/>
-          <w:numId w:val="1003"/>
-        </w:numPr>
-      </w:pPr>
-      <w:r>
-        <w:t xml:space="preserve">§3 Table 1 R/14 panels row added as</w:t>
-      </w:r>
-      <w:r>
-        <w:t xml:space="preserve"> </w:t>
-      </w:r>
-      <w:r>
-        <w:rPr>
-          <w:rStyle w:val="VerbatimChar"/>
-        </w:rPr>
-        <w:t xml:space="preserve">{{TODO: re-run}}</w:t>
-      </w:r>
-      <w:r>
-        <w:t xml:space="preserve">; pre-R/14 caveat added to caption.</w:t>
-      </w:r>
-    </w:p>
-    <w:p>
-      <w:pPr>
-        <w:pStyle w:val="Compact"/>
-        <w:numPr>
-          <w:ilvl w:val="0"/>
-          <w:numId w:val="1003"/>
-        </w:numPr>
-      </w:pPr>
-      <w:r>
-        <w:t xml:space="preserve">Funding (Vice-Chancellor scholarship, University of West London) and Conflict of Interest (none declared) filled.</w:t>
-      </w:r>
-    </w:p>
-    <w:p>
-      <w:pPr>
-        <w:pStyle w:val="Compact"/>
-        <w:numPr>
-          <w:ilvl w:val="0"/>
-          <w:numId w:val="1003"/>
-        </w:numPr>
-      </w:pPr>
-      <w:r>
-        <w:t xml:space="preserve">Software references (4, 9, 13, 14, 15, 16, 17) pinned and verified on 2026-06-23 via</w:t>
-      </w:r>
-      <w:r>
-        <w:t xml:space="preserve"> </w:t>
-      </w:r>
-      <w:r>
-        <w:rPr>
-          <w:rStyle w:val="VerbatimChar"/>
-        </w:rPr>
-        <w:t xml:space="preserve">scripts/_collect_citations.R</w:t>
-      </w:r>
-      <w:r>
-        <w:t xml:space="preserve"> </w:t>
-      </w:r>
-      <w:r>
-        <w:t xml:space="preserve">(runs</w:t>
-      </w:r>
-      <w:r>
-        <w:t xml:space="preserve"> </w:t>
-      </w:r>
-      <w:r>
-        <w:rPr>
-          <w:rStyle w:val="VerbatimChar"/>
-        </w:rPr>
-        <w:t xml:space="preserve">citation()</w:t>
-      </w:r>
-      <w:r>
-        <w:t xml:space="preserve"> </w:t>
-      </w:r>
-      <w:r>
-        <w:t xml:space="preserve">under the project renv). vegan 2.7-3, ggraph 2.2.2, igraph 2.3.1, networkD3 0.4.1, R 4.5.0. ABRicate (4) and Quarto (13) carry</w:t>
-      </w:r>
-      <w:r>
-        <w:t xml:space="preserve"> </w:t>
-      </w:r>
-      <w:r>
-        <w:rPr>
-          <w:rStyle w:val="VerbatimChar"/>
-        </w:rPr>
-        <w:t xml:space="preserve">(accessed 2026-06-23)</w:t>
-      </w:r>
-      <w:r>
-        <w:t xml:space="preserve"> </w:t>
-      </w:r>
-      <w:r>
-        <w:t xml:space="preserve">since both are software with no DOI. Re-run the helper before submission to refresh access dates and catch any post-update version drift.</w:t>
-      </w:r>
-    </w:p>
-    <w:p>
-      <w:pPr>
-        <w:pStyle w:val="Compact"/>
-        <w:numPr>
-          <w:ilvl w:val="0"/>
-          <w:numId w:val="1003"/>
-        </w:numPr>
-      </w:pPr>
-      <w:r>
-        <w:t xml:space="preserve">Peak-memory instrumentation added to</w:t>
-      </w:r>
-      <w:r>
-        <w:t xml:space="preserve"> </w:t>
-      </w:r>
-      <w:r>
-        <w:rPr>
-          <w:rStyle w:val="VerbatimChar"/>
-        </w:rPr>
-        <w:t xml:space="preserve">run_pipeline.R</w:t>
-      </w:r>
-      <w:r>
-        <w:t xml:space="preserve"> </w:t>
-      </w:r>
-      <w:r>
-        <w:t xml:space="preserve">on 2026-06-23 (gc()-based — same methodology peakRAM uses internally, no extra dep). Each stage now logs</w:t>
-      </w:r>
-      <w:r>
-        <w:t xml:space="preserve"> </w:t>
-      </w:r>
-      <w:r>
-        <w:rPr>
-          <w:rStyle w:val="VerbatimChar"/>
-        </w:rPr>
-        <w:t xml:space="preserve">peak %.0f MB</w:t>
-      </w:r>
-      <w:r>
-        <w:t xml:space="preserve"> </w:t>
-      </w:r>
-      <w:r>
-        <w:t xml:space="preserve">on completion and the slowest-first breakdown gains a peak-MB column. Caveat: only R-managed allocation is captured, so the</w:t>
-      </w:r>
-      <w:r>
-        <w:t xml:space="preserve"> </w:t>
-      </w:r>
-      <w:r>
-        <w:rPr>
-          <w:rStyle w:val="VerbatimChar"/>
-        </w:rPr>
-        <w:t xml:space="preserve">report</w:t>
-      </w:r>
-      <w:r>
-        <w:t xml:space="preserve"> </w:t>
-      </w:r>
-      <w:r>
-        <w:t xml:space="preserve">stage (which shells out to Quarto) under-reports.</w:t>
-      </w:r>
-    </w:p>
-    <w:p>
-      <w:pPr>
-        <w:pStyle w:val="Compact"/>
-        <w:numPr>
-          <w:ilvl w:val="0"/>
-          <w:numId w:val="1003"/>
-        </w:numPr>
-      </w:pPr>
-      <w:r>
-        <w:rPr>
-          <w:b/>
-          <w:bCs/>
-        </w:rPr>
-        <w:t xml:space="preserve">Table 1 fully refreshed 2026-06-23</w:t>
-      </w:r>
-      <w:r>
-        <w:t xml:space="preserve"> </w:t>
-      </w:r>
-      <w:r>
-        <w:t xml:space="preserve">from a single sequential B1+B2 run on the post-instrumentation build (commit</w:t>
-      </w:r>
-      <w:r>
-        <w:t xml:space="preserve"> </w:t>
-      </w:r>
-      <w:r>
-        <w:rPr>
-          <w:rStyle w:val="VerbatimChar"/>
-        </w:rPr>
-        <w:t xml:space="preserve">eee122c</w:t>
-      </w:r>
-      <w:r>
-        <w:t xml:space="preserve">, with</w:t>
-      </w:r>
-      <w:r>
-        <w:t xml:space="preserve"> </w:t>
-      </w:r>
-      <w:r>
-        <w:rPr>
-          <w:rStyle w:val="VerbatimChar"/>
-        </w:rPr>
-        <w:t xml:space="preserve">magick</w:t>
-      </w:r>
-      <w:r>
-        <w:t xml:space="preserve">/</w:t>
-      </w:r>
-      <w:r>
-        <w:rPr>
-          <w:rStyle w:val="VerbatimChar"/>
-        </w:rPr>
-        <w:t xml:space="preserve">openxlsx</w:t>
-      </w:r>
-      <w:r>
-        <w:t xml:space="preserve">/</w:t>
-      </w:r>
-      <w:r>
-        <w:rPr>
-          <w:rStyle w:val="VerbatimChar"/>
-        </w:rPr>
-        <w:t xml:space="preserve">zip</w:t>
-      </w:r>
-      <w:r>
-        <w:t xml:space="preserve"> </w:t>
-      </w:r>
-      <w:r>
-        <w:t xml:space="preserve">newly pinned in</w:t>
-      </w:r>
-      <w:r>
-        <w:t xml:space="preserve"> </w:t>
-      </w:r>
-      <w:r>
-        <w:rPr>
-          <w:rStyle w:val="VerbatimChar"/>
-        </w:rPr>
-        <w:t xml:space="preserve">renv.lock</w:t>
-      </w:r>
-      <w:r>
-        <w:t xml:space="preserve">). B1 = 6m 41s / 1330 MB peak, B2 = 8m 19s / 1505 MB peak; all 15/15 stages complete on both cohorts in one pass each. Restructured the table to 7 columns (Stage | B1 runtime | B1 peak MB | B1 primary output | B2 …); panels (R/14) row and Total row now populated for both cohorts; manifest sizes refreshed (85 kB / 80 kB — the v1.2 contract now catalogues R/14 outputs); narrative paragraph rewritten to cover both percentages (DA 32 % / 40 %, network 13–17 %), the +24 % B1→B2 scaling figure, and the peak-memory profile (gene-element plateau ~1 GB; panels peak at the run maximum; report’s modest 0.6 GB reflects the Quarto subprocess being invisible to in-process gc()). Raw logs at</w:t>
-      </w:r>
-      <w:r>
-        <w:t xml:space="preserve"> </w:t>
-      </w:r>
-      <w:r>
-        <w:rPr>
-          <w:rStyle w:val="VerbatimChar"/>
-        </w:rPr>
-        <w:t xml:space="preserve">scripts/_table1_b1_20260623_182351.log</w:t>
-      </w:r>
-      <w:r>
-        <w:t xml:space="preserve"> </w:t>
-      </w:r>
-      <w:r>
-        <w:t xml:space="preserve">and</w:t>
-      </w:r>
-      <w:r>
-        <w:t xml:space="preserve"> </w:t>
-      </w:r>
-      <w:r>
-        <w:rPr>
-          <w:rStyle w:val="VerbatimChar"/>
-        </w:rPr>
-        <w:t xml:space="preserve">scripts/_table1_b2_20260623_182351.log</w:t>
-      </w:r>
-      <w:r>
-        <w:t xml:space="preserve">.</w:t>
-      </w:r>
-    </w:p>
-    <w:p>
-      <w:pPr>
-        <w:pStyle w:val="Compact"/>
-        <w:numPr>
-          <w:ilvl w:val="0"/>
-          <w:numId w:val="1003"/>
-        </w:numPr>
-      </w:pPr>
-      <w:r>
-        <w:rPr>
-          <w:b/>
-          <w:bCs/>
-        </w:rPr>
-        <w:t xml:space="preserve">Resistome (sample, GENE) row delta confirmed</w:t>
-      </w:r>
-      <w:r>
-        <w:t xml:space="preserve"> </w:t>
-      </w:r>
-      <w:r>
-        <w:t xml:space="preserve">on 2026-06-23 via</w:t>
-      </w:r>
-      <w:r>
-        <w:t xml:space="preserve"> </w:t>
-      </w:r>
-      <w:r>
-        <w:rPr>
-          <w:rStyle w:val="VerbatimChar"/>
-        </w:rPr>
-        <w:t xml:space="preserve">scripts/diff_normdata.R</w:t>
-      </w:r>
-      <w:r>
-        <w:t xml:space="preserve"> </w:t>
-      </w:r>
-      <w:r>
-        <w:t xml:space="preserve">(path fix: hardcoded</w:t>
-      </w:r>
-      <w:r>
-        <w:t xml:space="preserve"> </w:t>
-      </w:r>
-      <w:r>
-        <w:rPr>
-          <w:rStyle w:val="VerbatimChar"/>
-        </w:rPr>
-        <w:t xml:space="preserve">OneDrive/Desktop</w:t>
-      </w:r>
-      <w:r>
-        <w:t xml:space="preserve"> </w:t>
-      </w:r>
-      <w:r>
-        <w:t xml:space="preserve">→</w:t>
-      </w:r>
-      <w:r>
-        <w:t xml:space="preserve"> </w:t>
-      </w:r>
-      <w:r>
-        <w:rPr>
-          <w:rStyle w:val="VerbatimChar"/>
-        </w:rPr>
-        <w:t xml:space="preserve">Desktop</w:t>
-      </w:r>
-      <w:r>
-        <w:t xml:space="preserve">). Pipeline = 733 rows, ground truth = 623, net +110; decomposed as 121 rows gained by the R/02 taxid-fix and 11 rows present in the ground truth that the pipeline currently drops (concentrated in plasmid replicons and accessory resistance genes —</w:t>
-      </w:r>
-      <w:r>
-        <w:t xml:space="preserve"> </w:t>
-      </w:r>
-      <w:r>
-        <w:rPr>
-          <w:rStyle w:val="VerbatimChar"/>
-        </w:rPr>
-        <w:t xml:space="preserve">kps*</w:t>
-      </w:r>
-      <w:r>
-        <w:t xml:space="preserve"> </w:t>
-      </w:r>
-      <w:r>
-        <w:t xml:space="preserve">cluster on D21,</w:t>
-      </w:r>
-      <w:r>
-        <w:t xml:space="preserve"> </w:t>
-      </w:r>
-      <w:r>
-        <w:rPr>
-          <w:rStyle w:val="VerbatimChar"/>
-        </w:rPr>
-        <w:t xml:space="preserve">tet(32)</w:t>
-      </w:r>
-      <w:r>
-        <w:t xml:space="preserve">,</w:t>
-      </w:r>
-      <w:r>
-        <w:t xml:space="preserve"> </w:t>
-      </w:r>
-      <w:r>
-        <w:rPr>
-          <w:rStyle w:val="VerbatimChar"/>
-        </w:rPr>
-        <w:t xml:space="preserve">ErmG</w:t>
-      </w:r>
-      <w:r>
-        <w:t xml:space="preserve">,</w:t>
-      </w:r>
-      <w:r>
-        <w:t xml:space="preserve"> </w:t>
-      </w:r>
-      <w:r>
-        <w:rPr>
-          <w:rStyle w:val="VerbatimChar"/>
-        </w:rPr>
-        <w:t xml:space="preserve">Col156_1</w:t>
-      </w:r>
-      <w:r>
-        <w:t xml:space="preserve">,</w:t>
-      </w:r>
-      <w:r>
-        <w:t xml:space="preserve"> </w:t>
-      </w:r>
-      <w:r>
-        <w:rPr>
-          <w:rStyle w:val="VerbatimChar"/>
-        </w:rPr>
-        <w:t xml:space="preserve">mel</w:t>
-      </w:r>
-      <w:r>
-        <w:t xml:space="preserve">,</w:t>
-      </w:r>
-      <w:r>
-        <w:t xml:space="preserve"> </w:t>
-      </w:r>
-      <w:r>
-        <w:rPr>
-          <w:rStyle w:val="VerbatimChar"/>
-        </w:rPr>
-        <w:t xml:space="preserve">senB</w:t>
-      </w:r>
-      <w:r>
-        <w:t xml:space="preserve">, etc.). Jaccard on the</w:t>
-      </w:r>
-      <w:r>
-        <w:t xml:space="preserve"> </w:t>
-      </w:r>
-      <w:r>
-        <w:rPr>
-          <w:rStyle w:val="VerbatimChar"/>
-        </w:rPr>
-        <w:t xml:space="preserve">(sample, GENE)</w:t>
-      </w:r>
-      <w:r>
-        <w:t xml:space="preserve"> </w:t>
-      </w:r>
-      <w:r>
-        <w:t xml:space="preserve">key set = 0.82. The lossy 11 rows are queued for inspection separately — the §3 prose now discloses them honestly rather than claiming a strict superset relationship.</w:t>
-      </w:r>
-    </w:p>
-    <w:p>
-      <w:pPr>
-        <w:pStyle w:val="Compact"/>
-        <w:numPr>
-          <w:ilvl w:val="0"/>
-          <w:numId w:val="1003"/>
-        </w:numPr>
-      </w:pPr>
-      <w:r>
-        <w:rPr>
-          <w:b/>
-          <w:bCs/>
-        </w:rPr>
-        <w:t xml:space="preserve">Partial ground-truth agreement scoped</w:t>
-      </w:r>
-      <w:r>
-        <w:t xml:space="preserve"> </w:t>
-      </w:r>
-      <w:r>
-        <w:t xml:space="preserve">on 2026-06-23 via</w:t>
-      </w:r>
-      <w:r>
-        <w:t xml:space="preserve"> </w:t>
-      </w:r>
-      <w:r>
-        <w:rPr>
-          <w:rStyle w:val="VerbatimChar"/>
-        </w:rPr>
-        <w:t xml:space="preserve">scripts/_gt_agreement_probe.R</w:t>
-      </w:r>
-      <w:r>
-        <w:t xml:space="preserve">. The stages with a directly comparable hand-edited artefact and a single-cell agreement metric: clean_data (Jaccard 0.83), resistome (0.82), network gephi nodes/edges vs the most-recent baseline</w:t>
-      </w:r>
-      <w:r>
-        <w:t xml:space="preserve"> </w:t>
-      </w:r>
-      <w:r>
-        <w:rPr>
-          <w:rStyle w:val="VerbatimChar"/>
-        </w:rPr>
-        <w:t xml:space="preserve">gephi_nodes3</w:t>
-      </w:r>
-      <w:r>
-        <w:t xml:space="preserve"> </w:t>
-      </w:r>
-      <w:r>
-        <w:t xml:space="preserve">/</w:t>
-      </w:r>
-      <w:r>
-        <w:t xml:space="preserve"> </w:t>
-      </w:r>
-      <w:r>
-        <w:rPr>
-          <w:rStyle w:val="VerbatimChar"/>
-        </w:rPr>
-        <w:t xml:space="preserve">gephi_edges3</w:t>
-      </w:r>
-      <w:r>
-        <w:t xml:space="preserve"> </w:t>
-      </w:r>
-      <w:r>
-        <w:t xml:space="preserve">(0.85 / 0.87), alpha_diversity sample-set (1.00). Not enough single-cell metrics to justify a dedicated Table 1 column (load_inputs / normalisation / panels / manifest / report are intermediate-or-new; virulome / mobilome have no GT file); reported inline in the §3 expected-divergence paragraph instead. Per-stage figure-by-figure identity (the third metric the original open item listed) is still open.</w:t>
-      </w:r>
-    </w:p>
-    <w:p>
-      <w:pPr>
-        <w:pStyle w:val="FirstParagraph"/>
-      </w:pPr>
-      <w:r>
-        <w:t xml:space="preserve">Still open:</w:t>
-      </w:r>
-    </w:p>
-    <w:p>
-      <w:pPr>
-        <w:pStyle w:val="Compact"/>
-        <w:numPr>
-          <w:ilvl w:val="0"/>
-          <w:numId w:val="1004"/>
-        </w:numPr>
-      </w:pPr>
-      <w:r>
-        <w:rPr>
-          <w:rStyle w:val="VerbatimChar"/>
-        </w:rPr>
-        <w:t xml:space="preserve">{{TODO: ORCIDs for all authors}}</w:t>
-      </w:r>
-      <w:r>
-        <w:t xml:space="preserve"> </w:t>
-      </w:r>
-      <w:r>
-        <w:t xml:space="preserve">— eight ORCIDs to collect.</w:t>
-      </w:r>
-    </w:p>
-    <w:p>
-      <w:pPr>
-        <w:pStyle w:val="Compact"/>
-        <w:numPr>
-          <w:ilvl w:val="0"/>
-          <w:numId w:val="1004"/>
-        </w:numPr>
-      </w:pPr>
-      <w:r>
-        <w:rPr>
-          <w:b/>
-          <w:bCs/>
-        </w:rPr>
-        <w:t xml:space="preserve">Lossy 11</w:t>
-      </w:r>
-      <w:r>
-        <w:rPr>
-          <w:b/>
-          <w:bCs/>
-        </w:rPr>
-        <w:t xml:space="preserve"> </w:t>
-      </w:r>
-      <w:r>
-        <w:rPr>
-          <w:rStyle w:val="VerbatimChar"/>
-          <w:b/>
-          <w:bCs/>
-        </w:rPr>
-        <w:t xml:space="preserve">(sample, GENE)</w:t>
-      </w:r>
-      <w:r>
-        <w:rPr>
-          <w:b/>
-          <w:bCs/>
-        </w:rPr>
-        <w:t xml:space="preserve"> </w:t>
-      </w:r>
-      <w:r>
-        <w:rPr>
-          <w:b/>
-          <w:bCs/>
-        </w:rPr>
-        <w:t xml:space="preserve">rows in the resistome diff</w:t>
-      </w:r>
-      <w:r>
-        <w:t xml:space="preserve"> </w:t>
-      </w:r>
-      <w:r>
-        <w:t xml:space="preserve">— small but real asymmetry where the ground-truth retained calls the pipeline currently drops. Worth a separate investigation pass (check coverage / identity thresholds in R/02, verify the PlasmidFinder Col-family suffix handling). Not a release blocker but should be characterised before submission.</w:t>
-      </w:r>
-    </w:p>
-    <w:p>
-      <w:pPr>
-        <w:pStyle w:val="Compact"/>
-        <w:numPr>
-          <w:ilvl w:val="0"/>
-          <w:numId w:val="1004"/>
-        </w:numPr>
-      </w:pPr>
-      <w:r>
-        <w:t xml:space="preserve">Per-stage figure-by-figure identity check against the hand-edited PNG/PDFs (the third agreement metric the original open item listed) — needs a separate image-diff pass.</w:t>
-      </w:r>
-    </w:p>
-    <w:p>
-      <w:pPr>
-        <w:pStyle w:val="Compact"/>
-        <w:numPr>
-          <w:ilvl w:val="0"/>
-          <w:numId w:val="1004"/>
-        </w:numPr>
-      </w:pPr>
-      <w:r>
-        <w:rPr>
-          <w:rStyle w:val="VerbatimChar"/>
-        </w:rPr>
-        <w:t xml:space="preserve">{{TODO: acknowledgements}}</w:t>
-      </w:r>
-      <w:r>
-        <w:t xml:space="preserve">.</w:t>
-      </w:r>
-    </w:p>
-    <w:p>
-      <w:pPr>
-        <w:pStyle w:val="Compact"/>
-        <w:numPr>
-          <w:ilvl w:val="0"/>
-          <w:numId w:val="1004"/>
-        </w:numPr>
-      </w:pPr>
-      <w:r>
-        <w:t xml:space="preserve">Ref 6b (VFDB foundational citation): optional — if the 2005 founding paper is also desired, add as 6b alongside the current 2022 update.</w:t>
-      </w:r>
-    </w:p>
-    <w:p>
-      <w:pPr>
-        <w:pStyle w:val="FirstParagraph"/>
-      </w:pPr>
-      <w:r>
-        <w:t xml:space="preserve">Factual claims I was not fully certain about:</w:t>
-      </w:r>
-    </w:p>
-    <w:p>
-      <w:pPr>
-        <w:pStyle w:val="Compact"/>
-        <w:numPr>
-          <w:ilvl w:val="0"/>
-          <w:numId w:val="1005"/>
-        </w:numPr>
-      </w:pPr>
-      <w:r>
-        <w:t xml:space="preserve">The exact upstream tool list cited above (Kraken2 + Bracken + ABRicate + Re-centrifuge + ALDEx2 + vegan + Quarto + R) matches the brief verbatim; CARD, VFDB and PlasmidFinder are pulled from</w:t>
-      </w:r>
-      <w:r>
-        <w:t xml:space="preserve"> </w:t>
-      </w:r>
-      <w:r>
-        <w:rPr>
-          <w:rStyle w:val="VerbatimChar"/>
-        </w:rPr>
-        <w:t xml:space="preserve">pipeline_facts.md</w:t>
-      </w:r>
-      <w:r>
-        <w:t xml:space="preserve"> </w:t>
-      </w:r>
-      <w:r>
-        <w:t xml:space="preserve">and cited because they are the databases the ABRicate stage targets.</w:t>
-      </w:r>
-    </w:p>
-    <w:p>
-      <w:pPr>
-        <w:pStyle w:val="Compact"/>
-        <w:numPr>
-          <w:ilvl w:val="0"/>
-          <w:numId w:val="1005"/>
-        </w:numPr>
-      </w:pPr>
-      <w:r>
-        <w:t xml:space="preserve">The pipeline description states</w:t>
-      </w:r>
-      <w:r>
-        <w:t xml:space="preserve"> </w:t>
-      </w:r>
-      <w:r>
-        <w:t xml:space="preserve">“fifteen ordered modules (R/00 through R/14)”</w:t>
-      </w:r>
-      <w:r>
-        <w:t xml:space="preserve"> </w:t>
-      </w:r>
-      <w:r>
-        <w:t xml:space="preserve">— verified against</w:t>
-      </w:r>
-      <w:r>
-        <w:t xml:space="preserve"> </w:t>
-      </w:r>
-      <w:r>
-        <w:rPr>
-          <w:rStyle w:val="VerbatimChar"/>
-        </w:rPr>
-        <w:t xml:space="preserve">R/</w:t>
-      </w:r>
-      <w:r>
-        <w:t xml:space="preserve"> </w:t>
-      </w:r>
-      <w:r>
-        <w:t xml:space="preserve">listing (00–14 inclusive plus six</w:t>
-      </w:r>
-      <w:r>
-        <w:t xml:space="preserve"> </w:t>
-      </w:r>
-      <w:r>
-        <w:rPr>
-          <w:rStyle w:val="VerbatimChar"/>
-        </w:rPr>
-        <w:t xml:space="preserve">utils_*</w:t>
-      </w:r>
-      <w:r>
-        <w:t xml:space="preserve"> </w:t>
-      </w:r>
-      <w:r>
-        <w:t xml:space="preserve">helpers).</w:t>
-      </w:r>
-    </w:p>
-    <w:p>
-      <w:pPr>
-        <w:pStyle w:val="Compact"/>
-        <w:numPr>
-          <w:ilvl w:val="0"/>
-          <w:numId w:val="1005"/>
-        </w:numPr>
-      </w:pPr>
-      <w:r>
-        <w:t xml:space="preserve">R/11 mobilome stage uses</w:t>
-      </w:r>
-      <w:r>
-        <w:t xml:space="preserve"> </w:t>
-      </w:r>
-      <w:r>
-        <w:rPr>
-          <w:b/>
-          <w:bCs/>
-        </w:rPr>
-        <w:t xml:space="preserve">PlasmidFinder</w:t>
-      </w:r>
-      <w:r>
-        <w:t xml:space="preserve"> </w:t>
-      </w:r>
-      <w:r>
-        <w:t xml:space="preserve">(confirmed by author). Cited as reference 7 (Carattoli et al. 2014, AAC).</w:t>
-      </w:r>
-    </w:p>
-    <w:p>
-      <w:pPr>
-        <w:pStyle w:val="Compact"/>
-        <w:numPr>
-          <w:ilvl w:val="0"/>
-          <w:numId w:val="1005"/>
-        </w:numPr>
-      </w:pPr>
-      <w:r>
-        <w:t xml:space="preserve">Runtime and peak-memory characteristics refreshed 2026-06-23 from a single sequential B1+B2 run on the post-instrumentation build (commit</w:t>
-      </w:r>
-      <w:r>
-        <w:t xml:space="preserve"> </w:t>
-      </w:r>
-      <w:r>
-        <w:rPr>
-          <w:rStyle w:val="VerbatimChar"/>
-        </w:rPr>
-        <w:t xml:space="preserve">eee122c</w:t>
-      </w:r>
-      <w:r>
-        <w:t xml:space="preserve">); raw logs at</w:t>
-      </w:r>
-      <w:r>
-        <w:t xml:space="preserve"> </w:t>
-      </w:r>
-      <w:r>
-        <w:rPr>
-          <w:rStyle w:val="VerbatimChar"/>
-        </w:rPr>
-        <w:t xml:space="preserve">scripts/_table1_b{1,2}_20260623_182351.log</w:t>
-      </w:r>
-      <w:r>
-        <w:t xml:space="preserve">.</w:t>
-      </w:r>
-    </w:p>
-    <w:p>
-      <w:pPr>
-        <w:pStyle w:val="Compact"/>
-        <w:numPr>
-          <w:ilvl w:val="0"/>
-          <w:numId w:val="1005"/>
-        </w:numPr>
-      </w:pPr>
-      <w:r>
-        <w:t xml:space="preserve">The TPM-normalisation choice is taken from</w:t>
-      </w:r>
-      <w:r>
-        <w:t xml:space="preserve"> </w:t>
-      </w:r>
-      <w:r>
-        <w:rPr>
-          <w:rStyle w:val="VerbatimChar"/>
-        </w:rPr>
-        <w:t xml:space="preserve">pipeline_facts.md</w:t>
-      </w:r>
-      <w:r>
-        <w:t xml:space="preserve"> </w:t>
-      </w:r>
-      <w:r>
-        <w:t xml:space="preserve">Stage 03 and confirmed against</w:t>
-      </w:r>
-      <w:r>
-        <w:t xml:space="preserve"> </w:t>
-      </w:r>
-      <w:r>
-        <w:rPr>
-          <w:rStyle w:val="VerbatimChar"/>
-        </w:rPr>
-        <w:t xml:space="preserve">R/03_normalisation.R</w:t>
-      </w:r>
-      <w:r>
-        <w:t xml:space="preserve">: TPM is computed per (sample, GENE) over ABRicate hits, so the dependency is ABRicate (not Bracken as the first draft asserted).</w:t>
-      </w:r>
-    </w:p>
-    <w:p>
-      <w:pPr>
-        <w:pStyle w:val="Compact"/>
-        <w:numPr>
-          <w:ilvl w:val="0"/>
-          <w:numId w:val="1005"/>
-        </w:numPr>
-      </w:pPr>
-      <w:r>
-        <w:t xml:space="preserve">The phrase</w:t>
-      </w:r>
-      <w:r>
-        <w:t xml:space="preserve"> </w:t>
-      </w:r>
-      <w:r>
-        <w:t xml:space="preserve">“approximately 46 hand-edited R scripts”</w:t>
-      </w:r>
-      <w:r>
-        <w:t xml:space="preserve"> </w:t>
-      </w:r>
-      <w:r>
-        <w:t xml:space="preserve">follows the memory snapshot (</w:t>
-      </w:r>
-      <w:r>
-        <w:t xml:space="preserve">“~46”</w:t>
-      </w:r>
-      <w:r>
-        <w:t xml:space="preserve">); confirm the exact figure before submission.</w:t>
-      </w:r>
-    </w:p>
-    <w:bookmarkEnd w:id="18"/>
-    <w:bookmarkEnd w:id="19"/>
+    <w:bookmarkEnd w:id="20"/>
+    <w:bookmarkEnd w:id="21"/>
     <w:sectPr>
       <w:footnotePr>
         <w:numRestart w:val="eachSect"/>
@@ -5057,109 +3665,6 @@
       <w:pPr>
         <w:ind w:left="6480" w:hanging="360"/>
       </w:pPr>
-    </w:lvl>
-  </w:abstractNum>
-  <w:abstractNum w:abstractNumId="991">
-    <w:nsid w:val="0000A991"/>
-    <w:multiLevelType w:val="multilevel"/>
-    <w:lvl w:ilvl="0">
-      <w:numFmt w:val="bullet"/>
-      <w:lvlText w:val=""/>
-      <w:lvlJc w:val="left"/>
-      <w:pPr>
-        <w:ind w:left="720" w:hanging="360"/>
-      </w:pPr>
-      <w:rPr>
-        <w:rFonts w:ascii="Symbol" w:hAnsi="Symbol" w:cs="Symbol" w:hint="default"/>
-      </w:rPr>
-    </w:lvl>
-    <w:lvl w:ilvl="1">
-      <w:numFmt w:val="bullet"/>
-      <w:lvlText w:val="o"/>
-      <w:lvlJc w:val="left"/>
-      <w:pPr>
-        <w:ind w:left="1440" w:hanging="360"/>
-      </w:pPr>
-      <w:rPr>
-        <w:rFonts w:ascii="Courier New" w:hAnsi="Courier New" w:cs="Courier New" w:hint="default"/>
-      </w:rPr>
-    </w:lvl>
-    <w:lvl w:ilvl="2">
-      <w:numFmt w:val="bullet"/>
-      <w:lvlText w:val=""/>
-      <w:lvlJc w:val="left"/>
-      <w:pPr>
-        <w:ind w:left="2160" w:hanging="360"/>
-      </w:pPr>
-      <w:rPr>
-        <w:rFonts w:ascii="Wingdings" w:hAnsi="Wingdings" w:cs="Wingdings" w:hint="default"/>
-      </w:rPr>
-    </w:lvl>
-    <w:lvl w:ilvl="3">
-      <w:numFmt w:val="bullet"/>
-      <w:lvlText w:val=""/>
-      <w:lvlJc w:val="left"/>
-      <w:pPr>
-        <w:ind w:left="2880" w:hanging="360"/>
-      </w:pPr>
-      <w:rPr>
-        <w:rFonts w:ascii="Symbol" w:hAnsi="Symbol" w:cs="Symbol" w:hint="default"/>
-      </w:rPr>
-    </w:lvl>
-    <w:lvl w:ilvl="4">
-      <w:numFmt w:val="bullet"/>
-      <w:lvlText w:val="o"/>
-      <w:lvlJc w:val="left"/>
-      <w:pPr>
-        <w:ind w:left="3600" w:hanging="360"/>
-      </w:pPr>
-      <w:rPr>
-        <w:rFonts w:ascii="Courier New" w:hAnsi="Courier New" w:cs="Courier New" w:hint="default"/>
-      </w:rPr>
-    </w:lvl>
-    <w:lvl w:ilvl="5">
-      <w:numFmt w:val="bullet"/>
-      <w:lvlText w:val=""/>
-      <w:lvlJc w:val="left"/>
-      <w:pPr>
-        <w:ind w:left="4320" w:hanging="360"/>
-      </w:pPr>
-      <w:rPr>
-        <w:rFonts w:ascii="Wingdings" w:hAnsi="Wingdings" w:cs="Wingdings" w:hint="default"/>
-      </w:rPr>
-    </w:lvl>
-    <w:lvl w:ilvl="6">
-      <w:numFmt w:val="bullet"/>
-      <w:lvlText w:val=""/>
-      <w:lvlJc w:val="left"/>
-      <w:pPr>
-        <w:ind w:left="5040" w:hanging="360"/>
-      </w:pPr>
-      <w:rPr>
-        <w:rFonts w:ascii="Symbol" w:hAnsi="Symbol" w:cs="Symbol" w:hint="default"/>
-      </w:rPr>
-    </w:lvl>
-    <w:lvl w:ilvl="7">
-      <w:numFmt w:val="bullet"/>
-      <w:lvlText w:val="o"/>
-      <w:lvlJc w:val="left"/>
-      <w:pPr>
-        <w:ind w:left="5760" w:hanging="360"/>
-      </w:pPr>
-      <w:rPr>
-        <w:rFonts w:ascii="Courier New" w:hAnsi="Courier New" w:cs="Courier New" w:hint="default"/>
-      </w:rPr>
-    </w:lvl>
-    <w:lvl w:ilvl="8">
-      <w:numFmt w:val="bullet"/>
-      <w:lvlText w:val=""/>
-      <w:lvlJc w:val="left"/>
-      <w:pPr>
-        <w:ind w:left="6480" w:hanging="360"/>
-      </w:pPr>
-      <w:rPr>
-        <w:rFonts w:ascii="Wingdings" w:hAnsi="Wingdings" w:cs="Wingdings" w:hint="default"/>
-      </w:rPr>
     </w:lvl>
   </w:abstractNum>
   <w:num w:numId="1000">
@@ -5224,15 +3729,6 @@
     <w:lvlOverride w:ilvl="8">
       <w:startOverride w:val="1"/>
     </w:lvlOverride>
-  </w:num>
-  <w:num w:numId="1003">
-    <w:abstractNumId w:val="991"/>
-  </w:num>
-  <w:num w:numId="1004">
-    <w:abstractNumId w:val="991"/>
-  </w:num>
-  <w:num w:numId="1005">
-    <w:abstractNumId w:val="991"/>
   </w:num>
 </w:numbering>
 </file>

</xml_diff>

<commit_message>
docs(manuscript): apply 18 reviewer findings, overlay tracked changes on .docx
Review_log.md catalogues the 18 findings from a reviewer-style pass
(length overrun, Dulce->Dulse typo, module-order confusion, Kraken/Kraken2
ref split, etc.). applications_note.md carries the edits; applications_note.docx
re-renders that .md and additionally has the <w:ins>/<w:del> markers injected
inline so co-authors can review revisions directly in Word with the full
manuscript format intact (figures, styles, table).

Co-Authored-By: Claude Opus 4.7 <noreply@anthropic.com>
</commit_message>
<xml_diff>
--- a/docs/manuscript/applications_note.docx
+++ b/docs/manuscript/applications_note.docx
@@ -2,7 +2,7 @@
 <file path=word/document.xml><?xml version="1.0" encoding="utf-8"?>
 <w:document xmlns:w="http://schemas.openxmlformats.org/wordprocessingml/2006/main" xmlns:m="http://schemas.openxmlformats.org/officeDocument/2006/math" xmlns:r="http://schemas.openxmlformats.org/officeDocument/2006/relationships" xmlns:o="urn:schemas-microsoft-com:office:office" xmlns:v="urn:schemas-microsoft-com:vml" xmlns:w10="urn:schemas-microsoft-com:office:word" xmlns:a="http://schemas.openxmlformats.org/drawingml/2006/main" xmlns:pic="http://schemas.openxmlformats.org/drawingml/2006/picture" xmlns:wp="http://schemas.openxmlformats.org/drawingml/2006/wordprocessingDrawing">
   <w:body>
-    <w:bookmarkStart w:id="21" w:name="X84d9e160d30b1cd211371155645e81ef50bd748"/>
+    <w:bookmarkStart w:id="27" w:name="X84d9e160d30b1cd211371155645e81ef50bd748"/>
     <w:p>
       <w:pPr>
         <w:pStyle w:val="Heading1"/>
@@ -122,8 +122,19 @@
         <w:t xml:space="preserve">*</w:t>
       </w:r>
       <w:r>
-        <w:t xml:space="preserve">Correspondence: Hermine Mkrtchyan — Hermine.Mkrtchyan@uwl.ac.uk</w:t>
-      </w:r>
+        <w:t xml:space="preserve">Correspondence: Hermine Mkrtchyan —</w:t>
+      </w:r>
+      <w:r>
+        <w:t xml:space="preserve"> </w:t>
+      </w:r>
+      <w:hyperlink r:id="rId9">
+        <w:r>
+          <w:rPr>
+            <w:rStyle w:val="Hyperlink"/>
+          </w:rPr>
+          <w:t xml:space="preserve">Hermine.Mkrtchyan@uwl.ac.uk</w:t>
+        </w:r>
+      </w:hyperlink>
     </w:p>
     <w:p>
       <w:pPr>
@@ -140,7 +151,7 @@
         </w:pict>
       </w:r>
     </w:p>
-    <w:bookmarkStart w:id="9" w:name="abstract"/>
+    <w:bookmarkStart w:id="11" w:name="abstract"/>
     <w:p>
       <w:pPr>
         <w:pStyle w:val="Heading2"/>
@@ -164,7 +175,7 @@
         <w:t xml:space="preserve"> </w:t>
       </w:r>
       <w:r>
-        <w:t xml:space="preserve">Long-read shotgun metagenomics studies are typically analysed by hand-editing dozens of R scripts per project — pasting sample identifiers, patching taxonomy strings and copying chunks between studies. Existing R workflows largely target short-read amplicon data or a single analysis (e.g. resistome risk scoring), leaving long-read shotgun studies without an integrated, configuration-driven option.</w:t>
+        <w:t xml:space="preserve">Long-read shotgun metagenomics studies are typically analysed by hand-editing dozens of R scripts per project — pasting sample identifiers, patching taxonomy strings and copying chunks between studies. Existing R workflows largely target short-read amplicon data or a single analysis (e.g. resistome risk scoring), leaving long-read shotgun studies without an integrated, configuration-driven option.</w:t>
       </w:r>
     </w:p>
     <w:p>
@@ -179,13 +190,7 @@
         <w:t xml:space="preserve">Results.</w:t>
       </w:r>
       <w:r>
-        <w:t xml:space="preserve"> </w:t>
-      </w:r>
-      <w:r>
-        <w:t xml:space="preserve">We present</w:t>
-      </w:r>
-      <w:r>
-        <w:t xml:space="preserve"> </w:t>
+        <w:t xml:space="preserve"> We present </w:t>
       </w:r>
       <w:r>
         <w:rPr>
@@ -195,10 +200,7 @@
         <w:t xml:space="preserve">MERIDIAN</w:t>
       </w:r>
       <w:r>
-        <w:t xml:space="preserve"> </w:t>
-      </w:r>
-      <w:r>
-        <w:t xml:space="preserve">(</w:t>
+        <w:t xml:space="preserve"> (</w:t>
       </w:r>
       <w:r>
         <w:rPr>
@@ -208,10 +210,49 @@
         <w:t xml:space="preserve">Metagenomic Evaluation of Resistance, Identity &amp; Diversity through Integrated Analysis of Nanopore sequencing</w:t>
       </w:r>
       <w:r>
-        <w:t xml:space="preserve">), an alpha-stage modular R workflow that consumes Kraken2, Bracken, ABRicate and Re-centrifuge outputs and produces a single Quarto HTML dashboard together with a set of publication-ready composite figures (PNG and TIFF) and a supplementary tables workbook. The workflow covers decontamination, TPM normalisation, taxonomy, alpha/beta diversity with PERMANOVA, two-level ALDEx2 differential abundance, and resistome/virulome/mobilome profiling joined by a tripartite sample × taxon × gene network with companion chord and Sankey diagrams. A study is parameterised by one YAML file; module code is not edited per-project, and every run emits a</w:t>
-      </w:r>
-      <w:r>
-        <w:t xml:space="preserve"> </w:t>
+        <w:t xml:space="preserve">), </w:t>
+      </w:r>
+      <w:del w:id="100001" w:author="Reviewer" w:date="2026-06-25T17:36:12Z">
+        <w:r>
+          <w:delText xml:space="preserve">an alpha-stage</w:delText>
+        </w:r>
+      </w:del>
+      <w:ins w:id="100002" w:author="Reviewer" w:date="2026-06-25T17:36:12Z">
+        <w:r>
+          <w:t xml:space="preserve">a</w:t>
+        </w:r>
+      </w:ins>
+      <w:r>
+        <w:t xml:space="preserve"> modular R workflow that consumes Kraken2, Bracken, ABRicate and Re-centrifuge outputs and produces a single Quarto HTML </w:t>
+      </w:r>
+      <w:del w:id="100003" w:author="Reviewer" w:date="2026-06-25T17:36:12Z">
+        <w:r>
+          <w:delText xml:space="preserve">dashboard together with a set of</w:delText>
+        </w:r>
+      </w:del>
+      <w:ins w:id="100004" w:author="Reviewer" w:date="2026-06-25T17:36:12Z">
+        <w:r>
+          <w:t xml:space="preserve">dashboard,</w:t>
+        </w:r>
+      </w:ins>
+      <w:r>
+        <w:t xml:space="preserve"> publication-ready composite figures</w:t>
+      </w:r>
+      <w:del w:id="100005" w:author="Reviewer" w:date="2026-06-25T17:36:12Z">
+        <w:r>
+          <w:delText xml:space="preserve"> (PNG and TIFF)</w:delText>
+        </w:r>
+      </w:del>
+      <w:r>
+        <w:t xml:space="preserve"> and a supplementary tables workbook. The workflow covers decontamination, TPM normalisation, taxonomy, alpha/beta diversity with PERMANOVA, two-level ALDEx2 differential abundance, and resistome/virulome/mobilome profiling joined by a tripartite sample × taxon × gene network with </w:t>
+      </w:r>
+      <w:del w:id="100006" w:author="Reviewer" w:date="2026-06-25T17:36:12Z">
+        <w:r>
+          <w:delText xml:space="preserve">companion </w:delText>
+        </w:r>
+      </w:del>
+      <w:r>
+        <w:t xml:space="preserve">chord and Sankey diagrams. A study is parameterised by one YAML file; module code is not edited per-project, and every run emits a </w:t>
       </w:r>
       <w:r>
         <w:rPr>
@@ -222,9 +263,24 @@
       <w:r>
         <w:t xml:space="preserve"> </w:t>
       </w:r>
-      <w:r>
-        <w:t xml:space="preserve">(contract v1.2) artefact catalogue tagging every figure and table by kind for downstream tooling.</w:t>
-      </w:r>
+      <w:del w:id="100007" w:author="Reviewer" w:date="2026-06-25T17:36:12Z">
+        <w:r>
+          <w:delText xml:space="preserve">(contract v1.2) </w:delText>
+        </w:r>
+      </w:del>
+      <w:r>
+        <w:t xml:space="preserve">artefact </w:t>
+      </w:r>
+      <w:del w:id="100008" w:author="Reviewer" w:date="2026-06-25T17:36:12Z">
+        <w:r>
+          <w:delText xml:space="preserve">catalogue tagging every figure and table by kind for downstream tooling.</w:delText>
+        </w:r>
+      </w:del>
+      <w:ins w:id="100009" w:author="Reviewer" w:date="2026-06-25T17:36:12Z">
+        <w:r>
+          <w:t xml:space="preserve">catalogue.</w:t>
+        </w:r>
+      </w:ins>
     </w:p>
     <w:p>
       <w:pPr>
@@ -241,7 +297,24 @@
         <w:t xml:space="preserve"> </w:t>
       </w:r>
       <w:r>
-        <w:t xml:space="preserve">Source at https://github.com/Julio92-C/Metagenomics_pipeline_automation (MIT). Run with</w:t>
+        <w:t xml:space="preserve">Source at</w:t>
+      </w:r>
+      <w:r>
+        <w:t xml:space="preserve"> </w:t>
+      </w:r>
+      <w:hyperlink r:id="rId10">
+        <w:r>
+          <w:rPr>
+            <w:rStyle w:val="Hyperlink"/>
+          </w:rPr>
+          <w:t xml:space="preserve">https://github.com/Julio92-C/Metagenomics_pipeline_automation</w:t>
+        </w:r>
+      </w:hyperlink>
+      <w:r>
+        <w:t xml:space="preserve"> </w:t>
+      </w:r>
+      <w:r>
+        <w:t xml:space="preserve">(MIT). Run with</w:t>
       </w:r>
       <w:r>
         <w:t xml:space="preserve"> </w:t>
@@ -285,9 +358,14 @@
       <w:r>
         <w:t xml:space="preserve"> </w:t>
       </w:r>
-      <w:r>
-        <w:t xml:space="preserve">Hermine.Mkrtchyan@uwl.ac.uk</w:t>
-      </w:r>
+      <w:hyperlink r:id="rId9">
+        <w:r>
+          <w:rPr>
+            <w:rStyle w:val="Hyperlink"/>
+          </w:rPr>
+          <w:t xml:space="preserve">Hermine.Mkrtchyan@uwl.ac.uk</w:t>
+        </w:r>
+      </w:hyperlink>
     </w:p>
     <w:p>
       <w:r>
@@ -296,8 +374,8 @@
         </w:pict>
       </w:r>
     </w:p>
-    <w:bookmarkEnd w:id="9"/>
-    <w:bookmarkStart w:id="10" w:name="introduction"/>
+    <w:bookmarkEnd w:id="11"/>
+    <w:bookmarkStart w:id="12" w:name="Xe3d0fc0bea9a42ce7605565d0964033d7f6ee47"/>
     <w:p>
       <w:pPr>
         <w:pStyle w:val="Heading2"/>
@@ -310,8 +388,84 @@
       <w:pPr>
         <w:pStyle w:val="FirstParagraph"/>
       </w:pPr>
-      <w:r>
-        <w:t xml:space="preserve">By simultaneously profiling microbial communities and their functional genetic elements across environmental, clinical, and veterinary or livestock matrices, long-read shotgun metagenomics (Oxford Nanopore, PacBio) serves as a powerful One Health tool for tracking health threats that intersect humans, animals, and ecosystems [1]. The downstream analysis stack is well established — Kraken2 [2] and Bracken [3] for taxonomic assignment and abundance estimation, ABRicate [4] against CARD [5], VFDB [6] and PlasmidFinder [7] for antimicrobial resistance genes (ARGs), virulence factors, and mobile genetic elements (MGEs) gene screening, Re-centrifuge [8] for contamination filtering, and R packages such as vegan [9] and ALDEx2 [10] for ecological and differential analyses — but the integration between them is not.</w:t>
+      <w:ins w:id="100010" w:author="Reviewer" w:date="2026-06-25T17:36:12Z">
+        <w:r>
+          <w:t xml:space="preserve">Long-read shotgun metagenomics (Oxford Nanopore, PacBio) is increasingly central to One Health surveillance, where threats intersect humans, animals and ecosystems [1]. </w:t>
+        </w:r>
+      </w:ins>
+      <w:r>
+        <w:t xml:space="preserve">By</w:t>
+      </w:r>
+      <w:del w:id="100011" w:author="Reviewer" w:date="2026-06-25T17:36:12Z">
+        <w:r>
+          <w:delText xml:space="preserve"> simultaneously</w:delText>
+        </w:r>
+      </w:del>
+      <w:r>
+        <w:t xml:space="preserve"> profiling microbial communities and their functional genetic elements </w:t>
+      </w:r>
+      <w:ins w:id="100012" w:author="Reviewer" w:date="2026-06-25T17:36:12Z">
+        <w:r>
+          <w:t xml:space="preserve">in a single experiment, it ties taxonomic identity to resistance, virulence and mobility determinants </w:t>
+        </w:r>
+      </w:ins>
+      <w:r>
+        <w:t xml:space="preserve">across environmental, </w:t>
+      </w:r>
+      <w:del w:id="100013" w:author="Reviewer" w:date="2026-06-25T17:36:12Z">
+        <w:r>
+          <w:delText xml:space="preserve">clinical,</w:delText>
+        </w:r>
+      </w:del>
+      <w:ins w:id="100014" w:author="Reviewer" w:date="2026-06-25T17:36:12Z">
+        <w:r>
+          <w:t xml:space="preserve">clinical</w:t>
+        </w:r>
+      </w:ins>
+      <w:r>
+        <w:t xml:space="preserve"> and </w:t>
+      </w:r>
+      <w:del w:id="100015" w:author="Reviewer" w:date="2026-06-25T17:36:12Z">
+        <w:r>
+          <w:delText xml:space="preserve">veterinary or </w:delText>
+        </w:r>
+      </w:del>
+      <w:r>
+        <w:t xml:space="preserve">livestock </w:t>
+      </w:r>
+      <w:del w:id="100016" w:author="Reviewer" w:date="2026-06-25T17:36:12Z">
+        <w:r>
+          <w:delText xml:space="preserve">matrices, long-read shotgun metagenomics (Oxford Nanopore, PacBio) serves as a powerful One Health tool for tracking health threats that intersect humans, animals, and ecosystems [1].</w:delText>
+        </w:r>
+      </w:del>
+      <w:ins w:id="100017" w:author="Reviewer" w:date="2026-06-25T17:36:12Z">
+        <w:r>
+          <w:t xml:space="preserve">matrices.</w:t>
+        </w:r>
+      </w:ins>
+      <w:r>
+        <w:t xml:space="preserve"> The downstream analysis stack is well established — Kraken2 [2] and Bracken [3] for taxonomic assignment and abundance estimation, ABRicate [4] </w:t>
+      </w:r>
+      <w:ins w:id="100018" w:author="Reviewer" w:date="2026-06-25T17:36:12Z">
+        <w:r>
+          <w:t xml:space="preserve">for screening antimicrobial resistance genes (ARGs), virulence factors and mobile genetic elements (MGEs) </w:t>
+        </w:r>
+      </w:ins>
+      <w:r>
+        <w:t xml:space="preserve">against CARD [5], VFDB [6] and PlasmidFinder </w:t>
+      </w:r>
+      <w:del w:id="100019" w:author="Reviewer" w:date="2026-06-25T17:36:12Z">
+        <w:r>
+          <w:delText xml:space="preserve">[7] for antimicrobial resistance genes (ARGs), virulence factors, and mobile genetic elements (MGEs) gene screening,</w:delText>
+        </w:r>
+      </w:del>
+      <w:ins w:id="100020" w:author="Reviewer" w:date="2026-06-25T17:36:12Z">
+        <w:r>
+          <w:t xml:space="preserve">[7],</w:t>
+        </w:r>
+      </w:ins>
+      <w:r>
+        <w:t xml:space="preserve"> Re-centrifuge [8] for contamination filtering, and R packages such as vegan [9] and ALDEx2 [10] for ecological and differential analyses — but the integration between them is not.</w:t>
       </w:r>
     </w:p>
     <w:p>
@@ -336,11 +490,24 @@
         <w:pStyle w:val="BodyText"/>
       </w:pPr>
       <w:r>
-        <w:t xml:space="preserve">We present an early-stage R workflow that fills this gap. The tool is in active development; this note describes its design, current scope, and the real-data validation strategy we are using to harden each stage.</w:t>
-      </w:r>
-    </w:p>
-    <w:bookmarkEnd w:id="10"/>
-    <w:bookmarkStart w:id="14" w:name="implementation"/>
+        <w:t xml:space="preserve">We present an </w:t>
+      </w:r>
+      <w:del w:id="100021" w:author="Reviewer" w:date="2026-06-25T17:36:12Z">
+        <w:r>
+          <w:delText xml:space="preserve">early-stage</w:delText>
+        </w:r>
+      </w:del>
+      <w:ins w:id="100022" w:author="Reviewer" w:date="2026-06-25T17:36:12Z">
+        <w:r>
+          <w:t xml:space="preserve">alpha-stage</w:t>
+        </w:r>
+      </w:ins>
+      <w:r>
+        <w:t xml:space="preserve"> R workflow that fills this gap. The tool is in active development; this note describes its design, current scope, and the real-data validation strategy we are using to harden each stage.</w:t>
+      </w:r>
+    </w:p>
+    <w:bookmarkEnd w:id="12"/>
+    <w:bookmarkStart w:id="16" w:name="Xfab522e0c411179c01dd3c9a2a01395ade9eb38"/>
     <w:p>
       <w:pPr>
         <w:pStyle w:val="Heading2"/>
@@ -363,7 +530,15 @@
         <w:t xml:space="preserve">run_pipeline.R</w:t>
       </w:r>
       <w:r>
-        <w:t xml:space="preserve">) consumes one YAML configuration file per study and dispatches to fifteen ordered modules (</w:t>
+        <w:t xml:space="preserve">) consumes one YAML configuration file per study and dispatches to fifteen </w:t>
+      </w:r>
+      <w:del w:id="100023" w:author="Reviewer" w:date="2026-06-25T17:36:12Z">
+        <w:r>
+          <w:delText xml:space="preserve">ordered </w:delText>
+        </w:r>
+      </w:del>
+      <w:r>
+        <w:t xml:space="preserve">modules (</w:t>
       </w:r>
       <w:r>
         <w:rPr>
@@ -372,13 +547,7 @@
         <w:t xml:space="preserve">R/00_setup.R</w:t>
       </w:r>
       <w:r>
-        <w:t xml:space="preserve"> </w:t>
-      </w:r>
-      <w:r>
-        <w:t xml:space="preserve">through</w:t>
-      </w:r>
-      <w:r>
-        <w:t xml:space="preserve"> </w:t>
+        <w:t xml:space="preserve"> through </w:t>
       </w:r>
       <w:r>
         <w:rPr>
@@ -386,8 +555,44 @@
         </w:rPr>
         <w:t xml:space="preserve">R/14_panels.R</w:t>
       </w:r>
-      <w:r>
-        <w:t xml:space="preserve">); a Quarto dashboard template (</w:t>
+      <w:del w:id="100024" w:author="Reviewer" w:date="2026-06-25T17:36:12Z">
+        <w:r>
+          <w:delText xml:space="preserve">);</w:delText>
+        </w:r>
+      </w:del>
+      <w:ins w:id="100025" w:author="Reviewer" w:date="2026-06-25T17:36:12Z">
+        <w:r>
+          <w:t xml:space="preserve">; the manifest stage </w:t>
+        </w:r>
+      </w:ins>
+      <w:ins w:id="100026" w:author="Reviewer" w:date="2026-06-25T17:36:12Z">
+        <w:r>
+          <w:rPr>
+            <w:rStyle w:val="VerbatimChar"/>
+          </w:rPr>
+          <w:t xml:space="preserve">R/13</w:t>
+        </w:r>
+      </w:ins>
+      <w:ins w:id="100027" w:author="Reviewer" w:date="2026-06-25T17:36:12Z">
+        <w:r>
+          <w:t xml:space="preserve"> runs last, after </w:t>
+        </w:r>
+      </w:ins>
+      <w:ins w:id="100028" w:author="Reviewer" w:date="2026-06-25T17:36:12Z">
+        <w:r>
+          <w:rPr>
+            <w:rStyle w:val="VerbatimChar"/>
+          </w:rPr>
+          <w:t xml:space="preserve">R/14</w:t>
+        </w:r>
+      </w:ins>
+      <w:ins w:id="100029" w:author="Reviewer" w:date="2026-06-25T17:36:12Z">
+        <w:r>
+          <w:t xml:space="preserve"> panel assembly);</w:t>
+        </w:r>
+      </w:ins>
+      <w:r>
+        <w:t xml:space="preserve"> a Quarto dashboard template (</w:t>
       </w:r>
       <w:r>
         <w:rPr>
@@ -396,10 +601,7 @@
         <w:t xml:space="preserve">templates/report.qmd</w:t>
       </w:r>
       <w:r>
-        <w:t xml:space="preserve">) renders all outputs into a single multi-page HTML deliverable, a publication-panels stage assembles main and supplementary composite figures plus a supplementary tables workbook, and a final manifest stage emits</w:t>
-      </w:r>
-      <w:r>
-        <w:t xml:space="preserve"> </w:t>
+        <w:t xml:space="preserve">) renders all outputs into a single multi-page HTML deliverable, a publication-panels stage assembles main and supplementary composite figures plus a supplementary tables workbook, and a final manifest stage emits </w:t>
       </w:r>
       <w:r>
         <w:rPr>
@@ -408,33 +610,30 @@
         <w:t xml:space="preserve">manifest.json</w:t>
       </w:r>
       <w:r>
-        <w:t xml:space="preserve"> </w:t>
-      </w:r>
-      <w:r>
-        <w:t xml:space="preserve">describing every artefact produced (Figure 1).</w:t>
-      </w:r>
-    </w:p>
-    <w:p>
-      <w:pPr>
-        <w:pStyle w:val="CaptionedFigure"/>
+        <w:t xml:space="preserve"> describing every artefact produced (Figure 1).</w:t>
+      </w:r>
+    </w:p>
+    <w:p>
+      <w:pPr>
+        <w:pStyle w:val="BodyText"/>
       </w:pPr>
       <w:r>
         <w:drawing>
           <wp:inline>
             <wp:extent cx="5302908" cy="5620960"/>
             <wp:effectExtent b="0" l="0" r="0" t="0"/>
-            <wp:docPr descr="Figure 1. MERIDIAN workflow. A single config.yaml parameterises a study and drives fifteen ordered R modules (R/00–R/14) consuming upstream outputs (Kraken2/Bracken, ABRicate, Re-centrifuge) plus sample metadata. After setup, input loading and decontamination (R/00–R/02), community analyses (R/04–R/08) and functional profiling against CARD, VFDB and PlasmidFinder (TPM normalisation in R/03 and per-domain analyses in R/09–R/11; alpha/beta diversity and ALDEx2 DAA shared between the two columns) feed a tripartite sample × taxon × gene network with companion chord and Sankey diagrams (R/12). R/12 then fans out to two output columns: a Quarto dashboard (templates/report.qmd, HTML with per-domain panels) and a publication-panels stage (R/14, composite figures plus supplementary_tables.xlsx), whose PNG/TIFF panels and tables workbook are the publication-ready outputs. R/13 finally writes manifest.json (contract v1.2; kind-tagged figure and table catalogue), cataloguing the dashboard, the R/14 panels and every intermediate artefact. Source: generate_figure1.py." title="" id="12" name="Picture"/>
+            <wp:docPr descr="Figure 1. MERIDIAN workflow. A single config.yaml parameterises a study and drives fifteen ordered R modules (R/00–R/14) consuming upstream outputs (Kraken2/Bracken, ABRicate, Re-centrifuge) plus sample metadata. After setup, input loading and decontamination (R/00–R/02), community analyses (R/04–R/08) and functional profiling against CARD, VFDB and PlasmidFinder (TPM normalisation in R/03 and per-domain analyses in R/09–R/11; alpha/beta diversity and ALDEx2 DAA shared between the two columns) feed a tripartite sample × taxon × gene network with companion chord and Sankey diagrams (R/12). R/12 then fans out to two output columns: a Quarto dashboard (templates/report.qmd, HTML with per-domain panels) and a publication-panels stage (R/14, composite figures plus supplementary_tables.xlsx), whose PNG/TIFF panels and tables workbook are the publication-ready outputs. R/13 finally writes manifest.json (contract v1.2; kind-tagged figure and table catalogue), cataloguing the dashboard, the R/14 panels and every intermediate artefact. Source: generate_figure1.py." title="" id="14" name="Picture"/>
             <a:graphic>
               <a:graphicData uri="http://schemas.openxmlformats.org/drawingml/2006/picture">
                 <pic:pic>
                   <pic:nvPicPr>
-                    <pic:cNvPr descr="figure1_pipeline_schematic.png" id="13" name="Picture"/>
+                    <pic:cNvPr descr="figure1_pipeline_schematic.png" id="15" name="Picture"/>
                     <pic:cNvPicPr>
                       <a:picLocks noChangeArrowheads="1" noChangeAspect="1"/>
                     </pic:cNvPicPr>
                   </pic:nvPicPr>
                   <pic:blipFill>
-                    <a:blip r:embed="rId11"/>
+                    <a:blip r:embed="rId13"/>
                     <a:stretch>
                       <a:fillRect/>
                     </a:stretch>
@@ -463,20 +662,20 @@
     </w:p>
     <w:p>
       <w:pPr>
-        <w:pStyle w:val="ImageCaption"/>
+        <w:pStyle w:val="BodyText"/>
       </w:pPr>
       <w:r>
         <w:rPr>
           <w:b/>
           <w:bCs/>
         </w:rPr>
-        <w:t xml:space="preserve">Figure 1.</w:t>
-      </w:r>
-      <w:r>
-        <w:t xml:space="preserve"> </w:t>
-      </w:r>
-      <w:r>
-        <w:t xml:space="preserve">MERIDIAN workflow. A single</w:t>
+        <w:t xml:space="preserve">Configuration-driven.</w:t>
+      </w:r>
+      <w:r>
+        <w:t xml:space="preserve"> </w:t>
+      </w:r>
+      <w:r>
+        <w:t xml:space="preserve">Everything that varies between studies — metadata file path, grouping columns, negative-control identifiers, abundance thresholds, sample selection — is declared in</w:t>
       </w:r>
       <w:r>
         <w:t xml:space="preserve"> </w:t>
@@ -488,19 +687,22 @@
         <w:t xml:space="preserve">config.yaml</w:t>
       </w:r>
       <w:r>
-        <w:t xml:space="preserve"> </w:t>
-      </w:r>
-      <w:r>
-        <w:t xml:space="preserve">parameterises a study and drives fifteen ordered R modules (R/00–R/14) consuming upstream outputs (Kraken2/Bracken, ABRicate, Re-centrifuge) plus sample metadata. After setup, input loading and decontamination (R/00–R/02), community analyses (R/04–R/08) and functional profiling against CARD, VFDB and PlasmidFinder (TPM normalisation in R/03 and per-domain analyses in R/09–R/11; alpha/beta diversity and ALDEx2 DAA shared between the two columns) feed a tripartite sample × taxon × gene network with companion chord and Sankey diagrams (R/12). R/12 then fans out to two output columns: a Quarto dashboard (</w:t>
+        <w:t xml:space="preserve">. Module code is not edited per-project; dataset-specific adjustments live in</w:t>
+      </w:r>
+      <w:r>
+        <w:t xml:space="preserve"> </w:t>
       </w:r>
       <w:r>
         <w:rPr>
           <w:rStyle w:val="VerbatimChar"/>
         </w:rPr>
-        <w:t xml:space="preserve">templates/report.qmd</w:t>
-      </w:r>
-      <w:r>
-        <w:t xml:space="preserve">, HTML with per-domain panels) and a publication-panels stage (R/14, composite figures plus</w:t>
+        <w:t xml:space="preserve">config.yaml</w:t>
+      </w:r>
+      <w:r>
+        <w:t xml:space="preserve"> </w:t>
+      </w:r>
+      <w:r>
+        <w:t xml:space="preserve">or in the structured fix tables it references. R/00 (setup) and R/01 (input loading) always run; every subsequent stage can be toggled via</w:t>
       </w:r>
       <w:r>
         <w:t xml:space="preserve"> </w:t>
@@ -509,10 +711,13 @@
         <w:rPr>
           <w:rStyle w:val="VerbatimChar"/>
         </w:rPr>
-        <w:t xml:space="preserve">supplementary_tables.xlsx</w:t>
-      </w:r>
-      <w:r>
-        <w:t xml:space="preserve">), whose PNG/TIFF panels and tables workbook are the publication-ready outputs. R/13 finally writes</w:t>
+        <w:t xml:space="preserve">cfg$stages$*</w:t>
+      </w:r>
+      <w:r>
+        <w:t xml:space="preserve"> </w:t>
+      </w:r>
+      <w:r>
+        <w:t xml:space="preserve">flags so a user can, for example, re-run only the resistome modules after revising thresholds. TPM normalisation (R/03) and all gene-element stages (R/09–R/11) require ABRicate outputs and are skipped otherwise. Per-study NCBI taxonomy fixes, when needed, are declared in a structured</w:t>
       </w:r>
       <w:r>
         <w:t xml:space="preserve"> </w:t>
@@ -521,13 +726,13 @@
         <w:rPr>
           <w:rStyle w:val="VerbatimChar"/>
         </w:rPr>
-        <w:t xml:space="preserve">manifest.json</w:t>
-      </w:r>
-      <w:r>
-        <w:t xml:space="preserve"> </w:t>
-      </w:r>
-      <w:r>
-        <w:t xml:space="preserve">(contract v1.2; kind-tagged figure and table catalogue), cataloguing the dashboard, the R/14 panels and every intermediate artefact. Source:</w:t>
+        <w:t xml:space="preserve">taxid_fixes.csv</w:t>
+      </w:r>
+      <w:r>
+        <w:t xml:space="preserve"> </w:t>
+      </w:r>
+      <w:r>
+        <w:t xml:space="preserve">rather than as row-index edits. A single</w:t>
       </w:r>
       <w:r>
         <w:t xml:space="preserve"> </w:t>
@@ -536,10 +741,25 @@
         <w:rPr>
           <w:rStyle w:val="VerbatimChar"/>
         </w:rPr>
-        <w:t xml:space="preserve">generate_figure1.py</w:t>
-      </w:r>
-      <w:r>
-        <w:t xml:space="preserve">.</w:t>
+        <w:t xml:space="preserve">cfg$stats$padjust_method</w:t>
+      </w:r>
+      <w:r>
+        <w:t xml:space="preserve"> </w:t>
+      </w:r>
+      <w:r>
+        <w:t xml:space="preserve">knob (Benjamini-Hochberg by default; full list in</w:t>
+      </w:r>
+      <w:r>
+        <w:t xml:space="preserve"> </w:t>
+      </w:r>
+      <w:r>
+        <w:rPr>
+          <w:rStyle w:val="VerbatimChar"/>
+        </w:rPr>
+        <w:t xml:space="preserve">docs/STATISTICS.md</w:t>
+      </w:r>
+      <w:r>
+        <w:t xml:space="preserve">) routes every multiple-testing correction across the pipeline.</w:t>
       </w:r>
     </w:p>
     <w:p>
@@ -551,13 +771,37 @@
           <w:b/>
           <w:bCs/>
         </w:rPr>
-        <w:t xml:space="preserve">Configuration-driven.</w:t>
-      </w:r>
-      <w:r>
-        <w:t xml:space="preserve"> </w:t>
-      </w:r>
-      <w:r>
-        <w:t xml:space="preserve">Everything that varies between studies — metadata file path, grouping columns, negative-control identifiers, abundance thresholds, sample selection — is declared in</w:t>
+        <w:t xml:space="preserve">Stages.</w:t>
+      </w:r>
+      <w:r>
+        <w:t xml:space="preserve"> </w:t>
+      </w:r>
+      <w:r>
+        <w:t xml:space="preserve">The pipeline organises its work into five conceptual blocks.</w:t>
+      </w:r>
+    </w:p>
+    <w:p>
+      <w:pPr>
+        <w:pStyle w:val="BodyText"/>
+      </w:pPr>
+      <w:r>
+        <w:t xml:space="preserve">(1)</w:t>
+      </w:r>
+      <w:r>
+        <w:t xml:space="preserve"> </w:t>
+      </w:r>
+      <w:r>
+        <w:rPr>
+          <w:i/>
+          <w:iCs/>
+        </w:rPr>
+        <w:t xml:space="preserve">Ingest and cleaning</w:t>
+      </w:r>
+      <w:r>
+        <w:t xml:space="preserve"> </w:t>
+      </w:r>
+      <w:r>
+        <w:t xml:space="preserve">(R/00–R/02) load upstream tables — Kraken2/Bracken, ABRicate, Re-centrifuge contamination tags, study metadata — accommodating per-project input shapes rather than assuming a fixed column layout, apply optional negative-control subtraction, merge Bracken counts with the metadata covariates declared in</w:t>
       </w:r>
       <w:r>
         <w:t xml:space="preserve"> </w:t>
@@ -566,10 +810,13 @@
         <w:rPr>
           <w:rStyle w:val="VerbatimChar"/>
         </w:rPr>
-        <w:t xml:space="preserve">config.yaml</w:t>
-      </w:r>
-      <w:r>
-        <w:t xml:space="preserve">. Module code is not edited per-project; dataset-specific adjustments live in</w:t>
+        <w:t xml:space="preserve">cfg$metadata$fixed_effects</w:t>
+      </w:r>
+      <w:r>
+        <w:t xml:space="preserve"> </w:t>
+      </w:r>
+      <w:r>
+        <w:t xml:space="preserve">/</w:t>
       </w:r>
       <w:r>
         <w:t xml:space="preserve"> </w:t>
@@ -578,13 +825,10 @@
         <w:rPr>
           <w:rStyle w:val="VerbatimChar"/>
         </w:rPr>
-        <w:t xml:space="preserve">config.yaml</w:t>
-      </w:r>
-      <w:r>
-        <w:t xml:space="preserve"> </w:t>
-      </w:r>
-      <w:r>
-        <w:t xml:space="preserve">or in the structured fix tables it references. R/00 (setup) and R/01 (input loading) always run; every subsequent stage can be toggled via</w:t>
+        <w:t xml:space="preserve">random_effect</w:t>
+      </w:r>
+      <w:r>
+        <w:t xml:space="preserve">, and link ABRicate calls to taxonomic assignments. Per-study taxonomy patches are applied from</w:t>
       </w:r>
       <w:r>
         <w:t xml:space="preserve"> </w:t>
@@ -593,56 +837,390 @@
         <w:rPr>
           <w:rStyle w:val="VerbatimChar"/>
         </w:rPr>
-        <w:t xml:space="preserve">cfg$stages$*</w:t>
-      </w:r>
-      <w:r>
-        <w:t xml:space="preserve"> </w:t>
-      </w:r>
-      <w:r>
-        <w:t xml:space="preserve">flags so a user can, for example, re-run only the resistome modules after revising thresholds. TPM normalisation (R/03) and all gene-element stages (R/09–R/11) require ABRicate outputs and are skipped otherwise. Per-study NCBI taxonomy fixes, when needed, are declared in a structured</w:t>
-      </w:r>
-      <w:r>
-        <w:t xml:space="preserve"> </w:t>
+        <w:t xml:space="preserve">taxid_fixes.csv</w:t>
+      </w:r>
+      <w:r>
+        <w:t xml:space="preserve"> </w:t>
+      </w:r>
+      <w:r>
+        <w:t xml:space="preserve">when supplied.</w:t>
+      </w:r>
+    </w:p>
+    <w:p>
+      <w:pPr>
+        <w:pStyle w:val="BodyText"/>
+      </w:pPr>
+      <w:r>
+        <w:t xml:space="preserve">(2)</w:t>
+      </w:r>
+      <w:r>
+        <w:t xml:space="preserve"> </w:t>
+      </w:r>
+      <w:r>
+        <w:rPr>
+          <w:i/>
+          <w:iCs/>
+        </w:rPr>
+        <w:t xml:space="preserve">Gene-element normalisation</w:t>
+      </w:r>
+      <w:r>
+        <w:t xml:space="preserve"> </w:t>
+      </w:r>
+      <w:r>
+        <w:t xml:space="preserve">(R/03) computes per-(sample, GENE) TPM from ABRicate hits and gene lengths.</w:t>
+      </w:r>
+    </w:p>
+    <w:p>
+      <w:pPr>
+        <w:pStyle w:val="BodyText"/>
+      </w:pPr>
+      <w:r>
+        <w:t xml:space="preserve">(3) </w:t>
+      </w:r>
+      <w:r>
+        <w:rPr>
+          <w:i/>
+          <w:iCs/>
+        </w:rPr>
+        <w:t xml:space="preserve">Community analyses</w:t>
+      </w:r>
+      <w:r>
+        <w:t xml:space="preserve"> (R/04–R/08) cover the standard taxonomic </w:t>
+      </w:r>
+      <w:del w:id="100030" w:author="Reviewer" w:date="2026-06-25T17:36:12Z">
+        <w:r>
+          <w:delText xml:space="preserve">toolkit:</w:delText>
+        </w:r>
+      </w:del>
+      <w:ins w:id="100031" w:author="Reviewer" w:date="2026-06-25T17:36:12Z">
+        <w:r>
+          <w:t xml:space="preserve">toolkit. R/04–R/05 produce</w:t>
+        </w:r>
+      </w:ins>
+      <w:r>
+        <w:t xml:space="preserve"> Venn diagrams and annotated heatmaps after a shared taxa-name </w:t>
+      </w:r>
+      <w:del w:id="100032" w:author="Reviewer" w:date="2026-06-25T17:36:12Z">
+        <w:r>
+          <w:delText xml:space="preserve">cleanup;</w:delText>
+        </w:r>
+      </w:del>
+      <w:ins w:id="100033" w:author="Reviewer" w:date="2026-06-25T17:36:12Z">
+        <w:r>
+          <w:t xml:space="preserve">cleanup, plus</w:t>
+        </w:r>
+      </w:ins>
+      <w:r>
+        <w:t xml:space="preserve"> top-N stacked-bar relative-abundance plots (static PNG and interactive plotly HTML) with paired total-count and sample-prevalence </w:t>
+      </w:r>
+      <w:del w:id="100034" w:author="Reviewer" w:date="2026-06-25T17:36:12Z">
+        <w:r>
+          <w:delText xml:space="preserve">panels;</w:delText>
+        </w:r>
+      </w:del>
+      <w:ins w:id="100035" w:author="Reviewer" w:date="2026-06-25T17:36:12Z">
+        <w:r>
+          <w:t xml:space="preserve">panels.</w:t>
+        </w:r>
+      </w:ins>
+      <w:r>
+        <w:t xml:space="preserve"> </w:t>
+      </w:r>
+      <w:del w:id="100036" w:author="Reviewer" w:date="2026-06-25T17:36:12Z">
+        <w:r>
+          <w:delText xml:space="preserve">alpha</w:delText>
+        </w:r>
+      </w:del>
+      <w:ins w:id="100037" w:author="Reviewer" w:date="2026-06-25T17:36:12Z">
+        <w:r>
+          <w:t xml:space="preserve">R/06</w:t>
+        </w:r>
+      </w:ins>
+      <w:r>
+        <w:t xml:space="preserve"> </w:t>
+      </w:r>
+      <w:del w:id="100038" w:author="Reviewer" w:date="2026-06-25T17:36:12Z">
+        <w:r>
+          <w:delText xml:space="preserve">diversity reporting</w:delText>
+        </w:r>
+      </w:del>
+      <w:ins w:id="100039" w:author="Reviewer" w:date="2026-06-25T17:36:12Z">
+        <w:r>
+          <w:t xml:space="preserve">reports</w:t>
+        </w:r>
+      </w:ins>
+      <w:r>
+        <w:t xml:space="preserve"> Shannon, Simpson, richness, Pielou and Fisher metrics with Kruskal-Wallis tests and violin/bar plots, preferring a pre-computed indices CSV (e.g. Oxford Nanopore wf-metagenomics output) and falling back to </w:t>
+      </w:r>
+      <w:del w:id="100040" w:author="Reviewer" w:date="2026-06-25T17:36:12Z">
+        <w:r>
+          <w:delText xml:space="preserve">vegan;</w:delText>
+        </w:r>
+      </w:del>
+      <w:ins w:id="100041" w:author="Reviewer" w:date="2026-06-25T17:36:12Z">
+        <w:r>
+          <w:t xml:space="preserve">vegan. R/07 computes</w:t>
+        </w:r>
+      </w:ins>
+      <w:r>
+        <w:t xml:space="preserve"> PCoA on Hellinger-transformed Bray-Curtis distances with PERMANOVA (</w:t>
       </w:r>
       <w:r>
         <w:rPr>
           <w:rStyle w:val="VerbatimChar"/>
         </w:rPr>
-        <w:t xml:space="preserve">taxid_fixes.csv</w:t>
-      </w:r>
-      <w:r>
-        <w:t xml:space="preserve"> </w:t>
-      </w:r>
-      <w:r>
-        <w:t xml:space="preserve">rather than as row-index edits. A single</w:t>
-      </w:r>
-      <w:r>
-        <w:t xml:space="preserve"> </w:t>
+        <w:t xml:space="preserve">adonis2</w:t>
+      </w:r>
+      <w:r>
+        <w:t xml:space="preserve">, 9999 permutations) and PERMDISP (</w:t>
       </w:r>
       <w:r>
         <w:rPr>
           <w:rStyle w:val="VerbatimChar"/>
         </w:rPr>
-        <w:t xml:space="preserve">cfg$stats$padjust_method</w:t>
-      </w:r>
-      <w:r>
-        <w:t xml:space="preserve"> </w:t>
-      </w:r>
-      <w:r>
-        <w:t xml:space="preserve">knob (Benjamini-Hochberg by default; full list in</w:t>
-      </w:r>
-      <w:r>
-        <w:t xml:space="preserve"> </w:t>
+        <w:t xml:space="preserve">betadisper</w:t>
+      </w:r>
+      <w:r>
+        <w:t xml:space="preserve">) overlaid on the </w:t>
+      </w:r>
+      <w:del w:id="100042" w:author="Reviewer" w:date="2026-06-25T17:36:12Z">
+        <w:r>
+          <w:delText xml:space="preserve">ordination;</w:delText>
+        </w:r>
+      </w:del>
+      <w:ins w:id="100043" w:author="Reviewer" w:date="2026-06-25T17:36:12Z">
+        <w:r>
+          <w:t xml:space="preserve">ordination.</w:t>
+        </w:r>
+      </w:ins>
+      <w:r>
+        <w:t xml:space="preserve"> </w:t>
+      </w:r>
+      <w:del w:id="100044" w:author="Reviewer" w:date="2026-06-25T17:36:12Z">
+        <w:r>
+          <w:delText xml:space="preserve">and</w:delText>
+        </w:r>
+      </w:del>
+      <w:ins w:id="100045" w:author="Reviewer" w:date="2026-06-25T17:36:12Z">
+        <w:r>
+          <w:t xml:space="preserve">R/08 runs</w:t>
+        </w:r>
+      </w:ins>
+      <w:r>
+        <w:t xml:space="preserve"> ALDEx2 differential abundance at two levels — taxa (Bracken counts) and genes (ABRicate contig hits per (sample, GENE)) — combining an omnibus Kruskal-Wallis with pairwise Welch's t tests, with an optional </w:t>
       </w:r>
       <w:r>
         <w:rPr>
           <w:rStyle w:val="VerbatimChar"/>
         </w:rPr>
-        <w:t xml:space="preserve">docs/STATISTICS.md</w:t>
-      </w:r>
-      <w:r>
-        <w:t xml:space="preserve">) routes every multiple-testing correction across the pipeline.</w:t>
-      </w:r>
+        <w:t xml:space="preserve">aldex.glm</w:t>
+      </w:r>
+      <w:r>
+        <w:t xml:space="preserve"> design path for covariate-adjusted models.</w:t>
+      </w:r>
+    </w:p>
+    <w:p>
+      <w:pPr>
+        <w:pStyle w:val="BodyText"/>
+      </w:pPr>
+      <w:r>
+        <w:t xml:space="preserve">(4)</w:t>
+      </w:r>
+      <w:r>
+        <w:t xml:space="preserve"> </w:t>
+      </w:r>
+      <w:r>
+        <w:rPr>
+          <w:i/>
+          <w:iCs/>
+        </w:rPr>
+        <w:t xml:space="preserve">Functional profiling</w:t>
+      </w:r>
+      <w:r>
+        <w:t xml:space="preserve"> </w:t>
+      </w:r>
+      <w:r>
+        <w:t xml:space="preserve">(R/09–R/11) runs a shared analysis engine three times against domain-specific databases: the resistome (ABRicate/CARD, with drug-class classification and a macrolide-lincosamide-streptogramin rollup), the virulome (VFDB, with functional categories extracted from the ABRicate</w:t>
+      </w:r>
+      <w:r>
+        <w:t xml:space="preserve"> </w:t>
+      </w:r>
+      <w:r>
+        <w:rPr>
+          <w:rStyle w:val="VerbatimChar"/>
+        </w:rPr>
+        <w:t xml:space="preserve">PRODUCT</w:t>
+      </w:r>
+      <w:r>
+        <w:t xml:space="preserve"> </w:t>
+      </w:r>
+      <w:r>
+        <w:t xml:space="preserve">field) and the mobilome (PlasmidFinder, with configurable replicon-family classification — Col-like, IncF, IncX, other Inc). Each domain emits its own alpha diversity, Venn diagram, gene- and category-level heatmaps, relative-abundance and total-count panels, and a PCoA + PERMANOVA + PERMDISP suite.</w:t>
+      </w:r>
+    </w:p>
+    <w:p>
+      <w:pPr>
+        <w:pStyle w:val="BodyText"/>
+      </w:pPr>
+      <w:r>
+        <w:t xml:space="preserve">(5) </w:t>
+      </w:r>
+      <w:r>
+        <w:rPr>
+          <w:i/>
+          <w:iCs/>
+        </w:rPr>
+        <w:t xml:space="preserve">Integration, reporting and manifest</w:t>
+      </w:r>
+      <w:r>
+        <w:t xml:space="preserve"> </w:t>
+      </w:r>
+      <w:del w:id="100046" w:author="Reviewer" w:date="2026-06-25T17:36:12Z">
+        <w:r>
+          <w:delText xml:space="preserve">(R/12–R/14).</w:delText>
+        </w:r>
+      </w:del>
+      <w:ins w:id="100047" w:author="Reviewer" w:date="2026-06-25T17:36:12Z">
+        <w:r>
+          <w:t xml:space="preserve">(R/12, then R/14, then R/13).</w:t>
+        </w:r>
+      </w:ins>
+      <w:r>
+        <w:t xml:space="preserve"> R/12</w:t>
+      </w:r>
+      <w:del w:id="100048" w:author="Reviewer" w:date="2026-06-25T17:36:12Z">
+        <w:r>
+          <w:delText xml:space="preserve"> assembles a tripartite ggraph network of sample × taxon × gene plus chord diagrams (overall and per group) and four-tier networkD3 Sankey diagrams, exports Gephi-compatible node/edge tables, and</w:delText>
+        </w:r>
+      </w:del>
+      <w:r>
+        <w:t xml:space="preserve"> reports igraph topology metrics (degree, betweenness, Louvain modularity) and Bray-Curtis sample </w:t>
+      </w:r>
+      <w:del w:id="100049" w:author="Reviewer" w:date="2026-06-25T17:36:12Z">
+        <w:r>
+          <w:delText xml:space="preserve">clusters.</w:delText>
+        </w:r>
+      </w:del>
+      <w:ins w:id="100050" w:author="Reviewer" w:date="2026-06-25T17:36:12Z">
+        <w:r>
+          <w:t xml:space="preserve">clusters alongside its network, chord and Sankey outputs, and exports Gephi-compatible node/edge tables.</w:t>
+        </w:r>
+      </w:ins>
+      <w:r>
+        <w:t xml:space="preserve"> R/14 assembles</w:t>
+      </w:r>
+      <w:del w:id="100051" w:author="Reviewer" w:date="2026-06-25T17:36:12Z">
+        <w:r>
+          <w:delText xml:space="preserve"> publication-ready</w:delText>
+        </w:r>
+      </w:del>
+      <w:r>
+        <w:t xml:space="preserve"> main and supplementary composite figures (PNG and TIFF </w:t>
+      </w:r>
+      <w:del w:id="100052" w:author="Reviewer" w:date="2026-06-25T17:36:12Z">
+        <w:r>
+          <w:delText xml:space="preserve">outputs are </w:delText>
+        </w:r>
+      </w:del>
+      <w:r>
+        <w:t xml:space="preserve">independently toggleable) driven by a </w:t>
+      </w:r>
+      <w:del w:id="100053" w:author="Reviewer" w:date="2026-06-25T17:36:12Z">
+        <w:r>
+          <w:delText xml:space="preserve">Frontiers</w:delText>
+        </w:r>
+      </w:del>
+      <w:ins w:id="100054" w:author="Reviewer" w:date="2026-06-25T17:36:12Z">
+        <w:r>
+          <w:t xml:space="preserve">slot-YAML</w:t>
+        </w:r>
+      </w:ins>
+      <w:r>
+        <w:t xml:space="preserve"> </w:t>
+      </w:r>
+      <w:del w:id="100055" w:author="Reviewer" w:date="2026-06-25T17:36:12Z">
+        <w:r>
+          <w:delText xml:space="preserve">slot</w:delText>
+        </w:r>
+      </w:del>
+      <w:ins w:id="100056" w:author="Reviewer" w:date="2026-06-25T17:36:12Z">
+        <w:r>
+          <w:t xml:space="preserve">layout,</w:t>
+        </w:r>
+      </w:ins>
+      <w:r>
+        <w:t xml:space="preserve"> </w:t>
+      </w:r>
+      <w:del w:id="100057" w:author="Reviewer" w:date="2026-06-25T17:36:12Z">
+        <w:r>
+          <w:delText xml:space="preserve">YAML, alongside</w:delText>
+        </w:r>
+      </w:del>
+      <w:ins w:id="100058" w:author="Reviewer" w:date="2026-06-25T17:36:12Z">
+        <w:r>
+          <w:t xml:space="preserve">plus</w:t>
+        </w:r>
+      </w:ins>
+      <w:r>
+        <w:t xml:space="preserve"> </w:t>
+      </w:r>
+      <w:r>
+        <w:rPr>
+          <w:rStyle w:val="VerbatimChar"/>
+        </w:rPr>
+        <w:t xml:space="preserve">supplementary_tables.xlsx</w:t>
+      </w:r>
+      <w:r>
+        <w:t xml:space="preserve">. R/13</w:t>
+      </w:r>
+      <w:del w:id="100059" w:author="Reviewer" w:date="2026-06-25T17:36:12Z">
+        <w:r>
+          <w:delText xml:space="preserve"> finally</w:delText>
+        </w:r>
+      </w:del>
+      <w:r>
+        <w:t xml:space="preserve"> writes </w:t>
+      </w:r>
+      <w:r>
+        <w:rPr>
+          <w:rStyle w:val="VerbatimChar"/>
+        </w:rPr>
+        <w:t xml:space="preserve">manifest.json</w:t>
+      </w:r>
+      <w:r>
+        <w:t xml:space="preserve"> (contract v1.2), a kind-tagged catalogue of every figure, table and intermediate artefact the run produced, providing a stable </w:t>
+      </w:r>
+      <w:del w:id="100060" w:author="Reviewer" w:date="2026-06-25T17:36:12Z">
+        <w:r>
+          <w:delText xml:space="preserve">JSON </w:delText>
+        </w:r>
+      </w:del>
+      <w:r>
+        <w:t xml:space="preserve">contract </w:t>
+      </w:r>
+      <w:del w:id="100061" w:author="Reviewer" w:date="2026-06-25T17:36:12Z">
+        <w:r>
+          <w:delText xml:space="preserve">that decouples the pipeline from</w:delText>
+        </w:r>
+      </w:del>
+      <w:ins w:id="100062" w:author="Reviewer" w:date="2026-06-25T17:36:12Z">
+        <w:r>
+          <w:t xml:space="preserve">for</w:t>
+        </w:r>
+      </w:ins>
+      <w:r>
+        <w:t xml:space="preserve"> downstream </w:t>
+      </w:r>
+      <w:del w:id="100063" w:author="Reviewer" w:date="2026-06-25T17:36:12Z">
+        <w:r>
+          <w:delText xml:space="preserve">report consumers and manuscript-drafting tools.</w:delText>
+        </w:r>
+      </w:del>
+      <w:ins w:id="100064" w:author="Reviewer" w:date="2026-06-25T17:36:12Z">
+        <w:r>
+          <w:t xml:space="preserve">consumers.</w:t>
+        </w:r>
+      </w:ins>
     </w:p>
     <w:p>
       <w:pPr>
@@ -653,34 +1231,13 @@
           <w:b/>
           <w:bCs/>
         </w:rPr>
-        <w:t xml:space="preserve">Stages.</w:t>
-      </w:r>
-      <w:r>
-        <w:t xml:space="preserve"> </w:t>
-      </w:r>
-      <w:r>
-        <w:t xml:space="preserve">The pipeline organises its work into five conceptual blocks.</w:t>
-      </w:r>
-    </w:p>
-    <w:p>
-      <w:pPr>
-        <w:numPr>
-          <w:ilvl w:val="0"/>
-          <w:numId w:val="1001"/>
-        </w:numPr>
-      </w:pPr>
-      <w:r>
-        <w:rPr>
-          <w:i/>
-          <w:iCs/>
-        </w:rPr>
-        <w:t xml:space="preserve">Ingest and cleaning</w:t>
-      </w:r>
-      <w:r>
-        <w:t xml:space="preserve"> </w:t>
-      </w:r>
-      <w:r>
-        <w:t xml:space="preserve">(R/00–R/02) load upstream tables — Kraken2/Bracken, ABRicate, Re-centrifuge contamination tags, study metadata — accommodating per-project input shapes rather than assuming a fixed column layout, apply optional negative-control subtraction, merge Bracken counts with the metadata covariates declared in</w:t>
+        <w:t xml:space="preserve">Reporting.</w:t>
+      </w:r>
+      <w:r>
+        <w:t xml:space="preserve"> </w:t>
+      </w:r>
+      <w:r>
+        <w:t xml:space="preserve">The Quarto template renders all outputs as a multi-page HTML dashboard with per-domain panels (taxonomy, diversity, differential abundance, resistome, virulome, mobilome, network) and embedded download links. Dependencies are pinned via</w:t>
       </w:r>
       <w:r>
         <w:t xml:space="preserve"> </w:t>
@@ -689,497 +1246,714 @@
         <w:rPr>
           <w:rStyle w:val="VerbatimChar"/>
         </w:rPr>
-        <w:t xml:space="preserve">cfg$metadata$fixed_effects</w:t>
-      </w:r>
-      <w:r>
-        <w:t xml:space="preserve"> </w:t>
-      </w:r>
-      <w:r>
-        <w:t xml:space="preserve">/</w:t>
-      </w:r>
-      <w:r>
-        <w:t xml:space="preserve"> </w:t>
-      </w:r>
+        <w:t xml:space="preserve">renv</w:t>
+      </w:r>
+      <w:r>
+        <w:t xml:space="preserve"> </w:t>
+      </w:r>
+      <w:r>
+        <w:t xml:space="preserve">and the project requires R ≥ 4.5; external command-line tools (Kraken2, Bracken, ABRicate, Re-centrifuge) are assumed to have been run upstream.</w:t>
+      </w:r>
+    </w:p>
+    <w:bookmarkEnd w:id="16"/>
+    <w:bookmarkStart w:id="20" w:name="Xe535e7deb3457bf6891dfc100ac742aa591bc31"/>
+    <w:p>
+      <w:pPr>
+        <w:pStyle w:val="Heading2"/>
+      </w:pPr>
+      <w:r>
+        <w:t xml:space="preserve">3 Application and Validation</w:t>
+      </w:r>
+    </w:p>
+    <w:p>
+      <w:pPr>
+        <w:pStyle w:val="FirstParagraph"/>
+      </w:pPr>
+      <w:r>
+        <w:t xml:space="preserve">We are validating the pipeline against two real long-read chicken caecum metagenomics studies. </w:t>
+      </w:r>
+      <w:ins w:id="100065" w:author="Reviewer" w:date="2026-06-25T17:36:12Z">
+        <w:r>
+          <w:t xml:space="preserve">The reference cohort (</w:t>
+        </w:r>
+      </w:ins>
       <w:r>
         <w:rPr>
           <w:rStyle w:val="VerbatimChar"/>
         </w:rPr>
-        <w:t xml:space="preserve">random_effect</w:t>
-      </w:r>
-      <w:r>
-        <w:t xml:space="preserve">, and link ABRicate calls to taxonomic assignments. Per-study taxonomy patches are applied from</w:t>
-      </w:r>
-      <w:r>
-        <w:t xml:space="preserve"> </w:t>
-      </w:r>
+        <w:t xml:space="preserve">chicken_batch1</w:t>
+      </w:r>
+      <w:ins w:id="100066" w:author="Reviewer" w:date="2026-06-25T17:36:12Z">
+        <w:r>
+          <w:t xml:space="preserve">,</w:t>
+        </w:r>
+      </w:ins>
+      <w:r>
+        <w:t xml:space="preserve"> </w:t>
+      </w:r>
+      <w:del w:id="100067" w:author="Reviewer" w:date="2026-06-25T17:36:12Z">
+        <w:r>
+          <w:delText xml:space="preserve">(PC_JC_2024-11-29;</w:delText>
+        </w:r>
+      </w:del>
+      <w:ins w:id="100068" w:author="Reviewer" w:date="2026-06-25T17:36:12Z">
+        <w:r>
+          <w:t xml:space="preserve">PC_JC_2024-11-29;</w:t>
+        </w:r>
+      </w:ins>
+      <w:r>
+        <w:t xml:space="preserve"> 18 samples; 3 dietary groups — </w:t>
+      </w:r>
+      <w:del w:id="100069" w:author="Reviewer" w:date="2026-06-25T17:36:12Z">
+        <w:r>
+          <w:delText xml:space="preserve">Dulce,</w:delText>
+        </w:r>
+      </w:del>
+      <w:ins w:id="100070" w:author="Reviewer" w:date="2026-06-25T17:36:12Z">
+        <w:r>
+          <w:t xml:space="preserve">Dulse,</w:t>
+        </w:r>
+      </w:ins>
+      <w:r>
+        <w:t xml:space="preserve"> Reference diet, Soyabean meal) </w:t>
+      </w:r>
+      <w:del w:id="100071" w:author="Reviewer" w:date="2026-06-25T17:36:12Z">
+        <w:r>
+          <w:delText xml:space="preserve">is the reference cohort:</w:delText>
+        </w:r>
+      </w:del>
+      <w:ins w:id="100072" w:author="Reviewer" w:date="2026-06-25T17:36:12Z">
+        <w:r>
+          <w:t xml:space="preserve">has</w:t>
+        </w:r>
+      </w:ins>
+      <w:r>
+        <w:t xml:space="preserve"> approximately 46 hand-edited R scripts and known-good figures and tables already </w:t>
+      </w:r>
+      <w:del w:id="100073" w:author="Reviewer" w:date="2026-06-25T17:36:12Z">
+        <w:r>
+          <w:delText xml:space="preserve">exist</w:delText>
+        </w:r>
+      </w:del>
+      <w:ins w:id="100074" w:author="Reviewer" w:date="2026-06-25T17:36:12Z">
+        <w:r>
+          <w:t xml:space="preserve">in</w:t>
+        </w:r>
+      </w:ins>
+      <w:r>
+        <w:t xml:space="preserve"> </w:t>
+      </w:r>
+      <w:del w:id="100075" w:author="Reviewer" w:date="2026-06-25T17:36:12Z">
+        <w:r>
+          <w:delText xml:space="preserve">for it,</w:delText>
+        </w:r>
+      </w:del>
+      <w:ins w:id="100076" w:author="Reviewer" w:date="2026-06-25T17:36:12Z">
+        <w:r>
+          <w:t xml:space="preserve">place,</w:t>
+        </w:r>
+      </w:ins>
+      <w:r>
+        <w:t xml:space="preserve"> so each stage can be compared output-for-output against the corresponding ground-truth artefact. </w:t>
+      </w:r>
+      <w:ins w:id="100077" w:author="Reviewer" w:date="2026-06-25T17:36:12Z">
+        <w:r>
+          <w:t xml:space="preserve">The scaling and feature-coverage cohort (</w:t>
+        </w:r>
+      </w:ins>
       <w:r>
         <w:rPr>
           <w:rStyle w:val="VerbatimChar"/>
         </w:rPr>
-        <w:t xml:space="preserve">taxid_fixes.csv</w:t>
-      </w:r>
-      <w:r>
-        <w:t xml:space="preserve"> </w:t>
-      </w:r>
-      <w:r>
-        <w:t xml:space="preserve">when supplied.</w:t>
-      </w:r>
-    </w:p>
-    <w:p>
-      <w:pPr>
-        <w:numPr>
-          <w:ilvl w:val="0"/>
-          <w:numId w:val="1001"/>
-        </w:numPr>
-      </w:pPr>
-      <w:r>
-        <w:rPr>
-          <w:i/>
-          <w:iCs/>
-        </w:rPr>
-        <w:t xml:space="preserve">Gene-element normalisation</w:t>
-      </w:r>
-      <w:r>
-        <w:t xml:space="preserve"> </w:t>
-      </w:r>
-      <w:r>
-        <w:t xml:space="preserve">(R/03) computes per-(sample, GENE) TPM from ABRicate hits and gene lengths.</w:t>
-      </w:r>
-    </w:p>
-    <w:p>
-      <w:pPr>
-        <w:numPr>
-          <w:ilvl w:val="0"/>
-          <w:numId w:val="1001"/>
-        </w:numPr>
-      </w:pPr>
-      <w:r>
-        <w:rPr>
-          <w:i/>
-          <w:iCs/>
-        </w:rPr>
-        <w:t xml:space="preserve">Community analyses</w:t>
-      </w:r>
-      <w:r>
-        <w:t xml:space="preserve"> </w:t>
-      </w:r>
-      <w:r>
-        <w:t xml:space="preserve">(R/04–R/08) cover the standard taxonomic toolkit: Venn diagrams and annotated heatmaps after a shared taxa-name cleanup; top-N stacked-bar relative-abundance plots (static PNG and interactive plotly HTML) with paired total-count and sample-prevalence panels; alpha diversity reporting Shannon, Simpson, richness, Pielou and Fisher metrics with Kruskal-Wallis tests and violin/bar plots, preferring a pre-computed indices CSV (e.g. Oxford Nanopore wf-metagenomics output) and falling back to vegan; PCoA on Hellinger-transformed Bray-Curtis distances with PERMANOVA (</w:t>
+        <w:t xml:space="preserve">chicken_batch2</w:t>
+      </w:r>
+      <w:ins w:id="100078" w:author="Reviewer" w:date="2026-06-25T17:36:12Z">
+        <w:r>
+          <w:t xml:space="preserve">,</w:t>
+        </w:r>
+      </w:ins>
+      <w:r>
+        <w:t xml:space="preserve"> </w:t>
+      </w:r>
+      <w:del w:id="100079" w:author="Reviewer" w:date="2026-06-25T17:36:12Z">
+        <w:r>
+          <w:delText xml:space="preserve">(JC_FL_2025-05-20;</w:delText>
+        </w:r>
+      </w:del>
+      <w:ins w:id="100080" w:author="Reviewer" w:date="2026-06-25T17:36:12Z">
+        <w:r>
+          <w:t xml:space="preserve">JC_FL_2025-05-20;</w:t>
+        </w:r>
+      </w:ins>
+      <w:r>
+        <w:t xml:space="preserve"> 32 samples; 4-level composite </w:t>
       </w:r>
       <w:r>
         <w:rPr>
           <w:rStyle w:val="VerbatimChar"/>
         </w:rPr>
-        <w:t xml:space="preserve">adonis2</w:t>
-      </w:r>
-      <w:r>
-        <w:t xml:space="preserve">, 9999 permutations) and PERMDISP (</w:t>
+        <w:t xml:space="preserve">Treatment_Bird</w:t>
+      </w:r>
+      <w:r>
+        <w:t xml:space="preserve"> grouping — Control_W4, Control_W5, Dulse_W4, Dulse_W5)</w:t>
+      </w:r>
+      <w:del w:id="100081" w:author="Reviewer" w:date="2026-06-25T17:36:12Z">
+        <w:r>
+          <w:delText xml:space="preserve"> is a scaling and feature-coverage cohort: it</w:delText>
+        </w:r>
+      </w:del>
+      <w:r>
+        <w:t xml:space="preserve"> exercises a random effect (</w:t>
       </w:r>
       <w:r>
         <w:rPr>
           <w:rStyle w:val="VerbatimChar"/>
         </w:rPr>
-        <w:t xml:space="preserve">betadisper</w:t>
-      </w:r>
-      <w:r>
-        <w:t xml:space="preserve">) overlaid on the ordination; and ALDEx2 differential abundance at two levels — taxa (Bracken counts) and genes (ABRicate contig hits per (sample, GENE)) — combining an omnibus Kruskal-Wallis with pairwise Welch’s t tests, with an optional</w:t>
-      </w:r>
-      <w:r>
-        <w:t xml:space="preserve"> </w:t>
+        <w:t xml:space="preserve">block</w:t>
+      </w:r>
+      <w:r>
+        <w:t xml:space="preserve">, pens 1–8), two declared negative controls (CTRL1, CTRL2) subtracted in R/02, and a larger per-stage feature load. Two purpose-built validation scripts (</w:t>
       </w:r>
       <w:r>
         <w:rPr>
           <w:rStyle w:val="VerbatimChar"/>
         </w:rPr>
-        <w:t xml:space="preserve">aldex.glm</w:t>
-      </w:r>
-      <w:r>
-        <w:t xml:space="preserve"> </w:t>
-      </w:r>
-      <w:r>
-        <w:t xml:space="preserve">design path for covariate-adjusted models.</w:t>
-      </w:r>
-    </w:p>
-    <w:p>
-      <w:pPr>
-        <w:numPr>
-          <w:ilvl w:val="0"/>
-          <w:numId w:val="1001"/>
-        </w:numPr>
-      </w:pPr>
-      <w:r>
-        <w:rPr>
-          <w:i/>
-          <w:iCs/>
-        </w:rPr>
-        <w:t xml:space="preserve">Functional profiling</w:t>
-      </w:r>
-      <w:r>
-        <w:t xml:space="preserve"> </w:t>
-      </w:r>
-      <w:r>
-        <w:t xml:space="preserve">(R/09–R/11) runs a shared analysis engine three times against domain-specific databases: the resistome (ABRicate/CARD, with drug-class classification and a macrolide-lincosamide-streptogramin rollup), the virulome (VFDB, with functional categories extracted from the ABRicate</w:t>
-      </w:r>
-      <w:r>
-        <w:t xml:space="preserve"> </w:t>
+        <w:t xml:space="preserve">scripts/diff_normdata.R</w:t>
+      </w:r>
+      <w:r>
+        <w:t xml:space="preserve"> and </w:t>
       </w:r>
       <w:r>
         <w:rPr>
           <w:rStyle w:val="VerbatimChar"/>
         </w:rPr>
-        <w:t xml:space="preserve">PRODUCT</w:t>
-      </w:r>
-      <w:r>
-        <w:t xml:space="preserve"> </w:t>
-      </w:r>
-      <w:r>
-        <w:t xml:space="preserve">field) and the mobilome (PlasmidFinder, with configurable replicon-family classification — Col-like, IncF, IncX, other Inc). Each domain emits its own alpha diversity, Venn diagram, gene- and category-level heatmaps, relative-abundance and total-count panels, and a PCoA + PERMANOVA + PERMDISP suite.</w:t>
-      </w:r>
-    </w:p>
-    <w:p>
-      <w:pPr>
-        <w:numPr>
-          <w:ilvl w:val="0"/>
-          <w:numId w:val="1001"/>
-        </w:numPr>
-      </w:pPr>
-      <w:r>
-        <w:rPr>
-          <w:i/>
-          <w:iCs/>
-        </w:rPr>
-        <w:t xml:space="preserve">Integration, reporting and manifest</w:t>
-      </w:r>
-      <w:r>
-        <w:t xml:space="preserve"> </w:t>
-      </w:r>
-      <w:r>
-        <w:t xml:space="preserve">(R/12–R/14). R/12 assembles a tripartite ggraph network of sample × taxon × gene plus chord diagrams (overall and per group) and four-tier networkD3 Sankey diagrams, exports Gephi-compatible node/edge tables, and reports igraph topology metrics (degree, betweenness, Louvain modularity) and Bray-Curtis sample clusters. R/14 assembles publication-ready main and supplementary composite figures (PNG and TIFF outputs are independently toggleable) driven by a Frontiers slot YAML, alongside</w:t>
-      </w:r>
-      <w:r>
-        <w:t xml:space="preserve"> </w:t>
+        <w:t xml:space="preserve">scripts/probe_taxid_parse.R</w:t>
+      </w:r>
+      <w:r>
+        <w:t xml:space="preserve">) provide numerical-diff and regression checks on the most error-prone intermediates, and </w:t>
       </w:r>
       <w:r>
         <w:rPr>
           <w:rStyle w:val="VerbatimChar"/>
         </w:rPr>
-        <w:t xml:space="preserve">supplementary_tables.xlsx</w:t>
-      </w:r>
-      <w:r>
-        <w:t xml:space="preserve">. R/13 finally writes</w:t>
-      </w:r>
-      <w:r>
-        <w:t xml:space="preserve"> </w:t>
+        <w:t xml:space="preserve">run_pipeline.R</w:t>
+      </w:r>
+      <w:r>
+        <w:t xml:space="preserve"> auto-instruments per-stage wall time and peak R-process memory (via a </w:t>
       </w:r>
       <w:r>
         <w:rPr>
           <w:rStyle w:val="VerbatimChar"/>
         </w:rPr>
-        <w:t xml:space="preserve">manifest.json</w:t>
-      </w:r>
-      <w:r>
-        <w:t xml:space="preserve"> </w:t>
-      </w:r>
-      <w:r>
-        <w:t xml:space="preserve">(contract v1.2), a kind-tagged catalogue of every figure, table and intermediate artefact the run produced, providing a stable JSON contract that decouples the pipeline from downstream report consumers and manuscript-drafting tools.</w:t>
-      </w:r>
-    </w:p>
-    <w:p>
-      <w:pPr>
-        <w:pStyle w:val="FirstParagraph"/>
+        <w:t xml:space="preserve">gc()</w:t>
+      </w:r>
+      <w:r>
+        <w:t xml:space="preserve">-bracketed wrapper equivalent to the </w:t>
+      </w:r>
+      <w:r>
+        <w:rPr>
+          <w:rStyle w:val="VerbatimChar"/>
+        </w:rPr>
+        <w:t xml:space="preserve">peakRAM</w:t>
+      </w:r>
+      <w:r>
+        <w:t xml:space="preserve"> methodology) and prints a slowest-first breakdown to the run </w:t>
+      </w:r>
+      <w:del w:id="100082" w:author="Reviewer" w:date="2026-06-25T17:36:12Z">
+        <w:r>
+          <w:delText xml:space="preserve">log,</w:delText>
+        </w:r>
+      </w:del>
+      <w:ins w:id="100083" w:author="Reviewer" w:date="2026-06-25T17:36:12Z">
+        <w:r>
+          <w:t xml:space="preserve">log;</w:t>
+        </w:r>
+      </w:ins>
+      <w:r>
+        <w:t xml:space="preserve"> </w:t>
+      </w:r>
+      <w:del w:id="100084" w:author="Reviewer" w:date="2026-06-25T17:36:12Z">
+        <w:r>
+          <w:delText xml:space="preserve">mechanically</w:delText>
+        </w:r>
+      </w:del>
+      <w:ins w:id="100085" w:author="Reviewer" w:date="2026-06-25T17:36:12Z">
+        <w:r>
+          <w:t xml:space="preserve">these</w:t>
+        </w:r>
+      </w:ins>
+      <w:r>
+        <w:t xml:space="preserve"> </w:t>
+      </w:r>
+      <w:del w:id="100086" w:author="Reviewer" w:date="2026-06-25T17:36:12Z">
+        <w:r>
+          <w:delText xml:space="preserve">populating</w:delText>
+        </w:r>
+      </w:del>
+      <w:ins w:id="100087" w:author="Reviewer" w:date="2026-06-25T17:36:12Z">
+        <w:r>
+          <w:t xml:space="preserve">feed</w:t>
+        </w:r>
+      </w:ins>
+      <w:r>
+        <w:t xml:space="preserve"> </w:t>
+      </w:r>
+      <w:del w:id="100088" w:author="Reviewer" w:date="2026-06-25T17:36:12Z">
+        <w:r>
+          <w:delText xml:space="preserve">both</w:delText>
+        </w:r>
+      </w:del>
+      <w:ins w:id="100089" w:author="Reviewer" w:date="2026-06-25T17:36:12Z">
+        <w:r>
+          <w:t xml:space="preserve">Figure</w:t>
+        </w:r>
+      </w:ins>
+      <w:r>
+        <w:t xml:space="preserve"> </w:t>
+      </w:r>
+      <w:del w:id="100090" w:author="Reviewer" w:date="2026-06-25T17:36:12Z">
+        <w:r>
+          <w:delText xml:space="preserve">the runtime and peak-MB columns of Table 1.</w:delText>
+        </w:r>
+      </w:del>
+      <w:ins w:id="100091" w:author="Reviewer" w:date="2026-06-25T17:36:12Z">
+        <w:r>
+          <w:t xml:space="preserve">2.</w:t>
+        </w:r>
+      </w:ins>
+    </w:p>
+    <w:p>
+      <w:pPr>
+        <w:pStyle w:val="BodyText"/>
       </w:pPr>
       <w:r>
         <w:rPr>
           <w:b/>
           <w:bCs/>
         </w:rPr>
-        <w:t xml:space="preserve">Reporting.</w:t>
-      </w:r>
-      <w:r>
-        <w:t xml:space="preserve"> </w:t>
-      </w:r>
-      <w:r>
-        <w:t xml:space="preserve">The Quarto template renders all outputs as a multi-page HTML dashboard with per-domain panels (taxonomy, diversity, differential abundance, resistome, virulome, mobilome, network) and embedded download links. Dependencies are pinned via</w:t>
-      </w:r>
-      <w:r>
-        <w:t xml:space="preserve"> </w:t>
+        <w:t xml:space="preserve">Table 1.</w:t>
+      </w:r>
+      <w:r>
+        <w:t xml:space="preserve"> Per-stage </w:t>
+      </w:r>
+      <w:del w:id="100092" w:author="Reviewer" w:date="2026-06-25T17:36:12Z">
+        <w:r>
+          <w:delText xml:space="preserve">wall time, peak R-process memory and </w:delText>
+        </w:r>
+      </w:del>
+      <w:r>
+        <w:t xml:space="preserve">primary output </w:t>
+      </w:r>
+      <w:del w:id="100093" w:author="Reviewer" w:date="2026-06-25T17:36:12Z">
+        <w:r>
+          <w:delText xml:space="preserve">for</w:delText>
+        </w:r>
+      </w:del>
+      <w:ins w:id="100094" w:author="Reviewer" w:date="2026-06-25T17:36:12Z">
+        <w:r>
+          <w:t xml:space="preserve">on</w:t>
+        </w:r>
+      </w:ins>
+      <w:r>
+        <w:t xml:space="preserve"> </w:t>
+      </w:r>
+      <w:del w:id="100095" w:author="Reviewer" w:date="2026-06-25T17:36:12Z">
+        <w:r>
+          <w:delText xml:space="preserve">both</w:delText>
+        </w:r>
+      </w:del>
+      <w:ins w:id="100096" w:author="Reviewer" w:date="2026-06-25T17:36:12Z">
+        <w:r>
+          <w:t xml:space="preserve">the two</w:t>
+        </w:r>
+      </w:ins>
+      <w:r>
+        <w:t xml:space="preserve"> validation cohorts </w:t>
+      </w:r>
+      <w:del w:id="100097" w:author="Reviewer" w:date="2026-06-25T17:36:12Z">
+        <w:r>
+          <w:delText xml:space="preserve">on</w:delText>
+        </w:r>
+      </w:del>
+      <w:ins w:id="100098" w:author="Reviewer" w:date="2026-06-25T17:36:12Z">
+        <w:r>
+          <w:t xml:space="preserve">(B1</w:t>
+        </w:r>
+      </w:ins>
+      <w:r>
+        <w:t xml:space="preserve"> </w:t>
+      </w:r>
+      <w:del w:id="100099" w:author="Reviewer" w:date="2026-06-25T17:36:12Z">
+        <w:r>
+          <w:delText xml:space="preserve">the</w:delText>
+        </w:r>
+      </w:del>
+      <w:ins w:id="100100" w:author="Reviewer" w:date="2026-06-25T17:36:12Z">
+        <w:r>
+          <w:t xml:space="preserve">=</w:t>
+        </w:r>
+      </w:ins>
+      <w:r>
+        <w:t xml:space="preserve"> </w:t>
+      </w:r>
+      <w:del w:id="100101" w:author="Reviewer" w:date="2026-06-25T17:36:12Z">
+        <w:r>
+          <w:delText xml:space="preserve">same</w:delText>
+        </w:r>
+      </w:del>
+      <w:ins w:id="100102" w:author="Reviewer" w:date="2026-06-25T17:36:12Z">
+        <w:r>
+          <w:t xml:space="preserve">chicken_batch1,</w:t>
+        </w:r>
+      </w:ins>
+      <w:r>
+        <w:t xml:space="preserve"> </w:t>
+      </w:r>
+      <w:del w:id="100103" w:author="Reviewer" w:date="2026-06-25T17:36:12Z">
+        <w:r>
+          <w:delText xml:space="preserve">workstation</w:delText>
+        </w:r>
+      </w:del>
+      <w:ins w:id="100104" w:author="Reviewer" w:date="2026-06-25T17:36:12Z">
+        <w:r>
+          <w:t xml:space="preserve">n=18;</w:t>
+        </w:r>
+      </w:ins>
+      <w:r>
+        <w:t xml:space="preserve"> </w:t>
+      </w:r>
+      <w:del w:id="100105" w:author="Reviewer" w:date="2026-06-25T17:36:12Z">
+        <w:r>
+          <w:delText xml:space="preserve">(Windows</w:delText>
+        </w:r>
+      </w:del>
+      <w:ins w:id="100106" w:author="Reviewer" w:date="2026-06-25T17:36:12Z">
+        <w:r>
+          <w:t xml:space="preserve">B2</w:t>
+        </w:r>
+      </w:ins>
+      <w:r>
+        <w:t xml:space="preserve"> </w:t>
+      </w:r>
+      <w:del w:id="100107" w:author="Reviewer" w:date="2026-06-25T17:36:12Z">
+        <w:r>
+          <w:delText xml:space="preserve">11,</w:delText>
+        </w:r>
+      </w:del>
+      <w:ins w:id="100108" w:author="Reviewer" w:date="2026-06-25T17:36:12Z">
+        <w:r>
+          <w:t xml:space="preserve">=</w:t>
+        </w:r>
+      </w:ins>
+      <w:r>
+        <w:t xml:space="preserve"> </w:t>
+      </w:r>
+      <w:del w:id="100109" w:author="Reviewer" w:date="2026-06-25T17:36:12Z">
+        <w:r>
+          <w:delText xml:space="preserve">R</w:delText>
+        </w:r>
+      </w:del>
+      <w:ins w:id="100110" w:author="Reviewer" w:date="2026-06-25T17:36:12Z">
+        <w:r>
+          <w:t xml:space="preserve">chicken_batch2,</w:t>
+        </w:r>
+      </w:ins>
+      <w:r>
+        <w:t xml:space="preserve"> </w:t>
+      </w:r>
+      <w:del w:id="100111" w:author="Reviewer" w:date="2026-06-25T17:36:12Z">
+        <w:r>
+          <w:delText xml:space="preserve">4.5,</w:delText>
+        </w:r>
+      </w:del>
+      <w:ins w:id="100112" w:author="Reviewer" w:date="2026-06-25T17:36:12Z">
+        <w:r>
+          <w:t xml:space="preserve">n=32).</w:t>
+        </w:r>
+      </w:ins>
+      <w:r>
+        <w:t xml:space="preserve"> </w:t>
+      </w:r>
+      <w:del w:id="100113" w:author="Reviewer" w:date="2026-06-25T17:36:12Z">
+        <w:r>
+          <w:delText xml:space="preserve">single thread); identical</w:delText>
+        </w:r>
+      </w:del>
+      <w:ins w:id="100114" w:author="Reviewer" w:date="2026-06-25T17:36:12Z">
+        <w:r>
+          <w:t xml:space="preserve">Same</w:t>
+        </w:r>
+      </w:ins>
+      <w:r>
+        <w:t xml:space="preserve"> pipeline commit and</w:t>
+      </w:r>
+      <w:del w:id="100115" w:author="Reviewer" w:date="2026-06-25T17:36:12Z">
+        <w:r>
+          <w:delText xml:space="preserve"> identical</w:delText>
+        </w:r>
+      </w:del>
+      <w:r>
+        <w:t xml:space="preserve"> statistical settings (PERMANOVA 9999 </w:t>
+      </w:r>
+      <w:del w:id="100116" w:author="Reviewer" w:date="2026-06-25T17:36:12Z">
+        <w:r>
+          <w:delText xml:space="preserve">permutations;</w:delText>
+        </w:r>
+      </w:del>
+      <w:ins w:id="100117" w:author="Reviewer" w:date="2026-06-25T17:36:12Z">
+        <w:r>
+          <w:t xml:space="preserve">permutations,</w:t>
+        </w:r>
+      </w:ins>
+      <w:r>
+        <w:t xml:space="preserve"> ALDEx2 </w:t>
       </w:r>
       <w:r>
         <w:rPr>
           <w:rStyle w:val="VerbatimChar"/>
         </w:rPr>
-        <w:t xml:space="preserve">renv</w:t>
-      </w:r>
-      <w:r>
-        <w:t xml:space="preserve"> </w:t>
-      </w:r>
-      <w:r>
-        <w:t xml:space="preserve">and the project requires R ≥ 4.5; external command-line tools (Kraken2, Bracken, ABRicate, Re-centrifuge) are assumed to have been run upstream.</w:t>
-      </w:r>
-    </w:p>
-    <w:bookmarkEnd w:id="14"/>
-    <w:bookmarkStart w:id="18" w:name="application-and-validation"/>
-    <w:p>
-      <w:pPr>
-        <w:pStyle w:val="Heading2"/>
-      </w:pPr>
-      <w:r>
-        <w:t xml:space="preserve">3 Application and Validation</w:t>
-      </w:r>
-    </w:p>
-    <w:p>
-      <w:pPr>
-        <w:pStyle w:val="FirstParagraph"/>
-      </w:pPr>
-      <w:r>
-        <w:t xml:space="preserve">We are validating the pipeline against two real long-read chicken caecum metagenomics studies.</w:t>
-      </w:r>
-      <w:r>
-        <w:t xml:space="preserve"> </w:t>
-      </w:r>
-      <w:r>
-        <w:rPr>
-          <w:rStyle w:val="VerbatimChar"/>
-        </w:rPr>
-        <w:t xml:space="preserve">chicken_batch1</w:t>
-      </w:r>
-      <w:r>
-        <w:t xml:space="preserve"> </w:t>
-      </w:r>
-      <w:r>
-        <w:t xml:space="preserve">(PC_JC_2024-11-29; 18 samples; 3 dietary groups — Dulce, Reference diet, Soyabean meal) is the reference cohort: approximately 46 hand-edited R scripts and known-good figures and tables already exist for it, so each stage can be compared output-for-output against the corresponding ground-truth artefact.</w:t>
-      </w:r>
-      <w:r>
-        <w:t xml:space="preserve"> </w:t>
-      </w:r>
-      <w:r>
-        <w:rPr>
-          <w:rStyle w:val="VerbatimChar"/>
-        </w:rPr>
-        <w:t xml:space="preserve">chicken_batch2</w:t>
-      </w:r>
-      <w:r>
-        <w:t xml:space="preserve"> </w:t>
-      </w:r>
-      <w:r>
-        <w:t xml:space="preserve">(JC_FL_2025-05-20; 32 samples; 4-level composite</w:t>
-      </w:r>
-      <w:r>
-        <w:t xml:space="preserve"> </w:t>
-      </w:r>
-      <w:r>
-        <w:rPr>
-          <w:rStyle w:val="VerbatimChar"/>
-        </w:rPr>
-        <w:t xml:space="preserve">Treatment_Bird</w:t>
-      </w:r>
-      <w:r>
-        <w:t xml:space="preserve"> </w:t>
-      </w:r>
-      <w:r>
-        <w:t xml:space="preserve">grouping — Control_W4, Control_W5, Dulse_W4, Dulse_W5) is a scaling and feature-coverage cohort: it exercises a random effect (</w:t>
-      </w:r>
-      <w:r>
-        <w:rPr>
-          <w:rStyle w:val="VerbatimChar"/>
-        </w:rPr>
-        <w:t xml:space="preserve">block</w:t>
-      </w:r>
-      <w:r>
-        <w:t xml:space="preserve">, pens 1–8), two declared negative controls (CTRL1, CTRL2) subtracted in R/02, and a larger per-stage feature load. Two purpose-built validation scripts (</w:t>
-      </w:r>
-      <w:r>
-        <w:rPr>
-          <w:rStyle w:val="VerbatimChar"/>
-        </w:rPr>
-        <w:t xml:space="preserve">scripts/diff_normdata.R</w:t>
-      </w:r>
-      <w:r>
-        <w:t xml:space="preserve"> </w:t>
-      </w:r>
-      <w:r>
-        <w:t xml:space="preserve">and</w:t>
-      </w:r>
-      <w:r>
-        <w:t xml:space="preserve"> </w:t>
-      </w:r>
-      <w:r>
-        <w:rPr>
-          <w:rStyle w:val="VerbatimChar"/>
-        </w:rPr>
-        <w:t xml:space="preserve">scripts/probe_taxid_parse.R</w:t>
-      </w:r>
-      <w:r>
-        <w:t xml:space="preserve">) provide numerical-diff and regression checks on the most error-prone intermediates, and</w:t>
-      </w:r>
-      <w:r>
-        <w:t xml:space="preserve"> </w:t>
-      </w:r>
-      <w:r>
-        <w:rPr>
-          <w:rStyle w:val="VerbatimChar"/>
-        </w:rPr>
-        <w:t xml:space="preserve">run_pipeline.R</w:t>
-      </w:r>
-      <w:r>
-        <w:t xml:space="preserve"> </w:t>
-      </w:r>
-      <w:r>
-        <w:t xml:space="preserve">auto-instruments per-stage wall time and peak R-process memory (via a</w:t>
-      </w:r>
-      <w:r>
-        <w:t xml:space="preserve"> </w:t>
-      </w:r>
-      <w:r>
-        <w:rPr>
-          <w:rStyle w:val="VerbatimChar"/>
-        </w:rPr>
-        <w:t xml:space="preserve">gc()</w:t>
-      </w:r>
-      <w:r>
-        <w:t xml:space="preserve">-bracketed wrapper equivalent to the</w:t>
-      </w:r>
-      <w:r>
-        <w:t xml:space="preserve"> </w:t>
-      </w:r>
-      <w:r>
-        <w:rPr>
-          <w:rStyle w:val="VerbatimChar"/>
-        </w:rPr>
-        <w:t xml:space="preserve">peakRAM</w:t>
-      </w:r>
-      <w:r>
-        <w:t xml:space="preserve"> </w:t>
-      </w:r>
-      <w:r>
-        <w:t xml:space="preserve">methodology) and prints a slowest-first breakdown to the run log, mechanically populating both the runtime and peak-MB columns of Table 1.</w:t>
-      </w:r>
-    </w:p>
-    <w:p>
-      <w:pPr>
-        <w:pStyle w:val="BodyText"/>
-      </w:pPr>
-      <w:r>
-        <w:rPr>
-          <w:b/>
-          <w:bCs/>
-        </w:rPr>
-        <w:t xml:space="preserve">Table 1.</w:t>
-      </w:r>
-      <w:r>
-        <w:t xml:space="preserve"> </w:t>
-      </w:r>
-      <w:r>
-        <w:t xml:space="preserve">Per-stage wall time, peak R-process memory and primary output for both validation cohorts on the same workstation (Windows 11, R 4.5, single thread); identical pipeline commit and identical statistical settings (PERMANOVA 9999 permutations; ALDEx2</w:t>
-      </w:r>
-      <w:r>
-        <w:t xml:space="preserve"> </w:t>
-      </w:r>
-      <w:r>
-        <w:rPr>
-          <w:rStyle w:val="VerbatimChar"/>
-        </w:rPr>
         <w:t xml:space="preserve">mc.samples</w:t>
       </w:r>
       <w:r>
-        <w:t xml:space="preserve"> </w:t>
-      </w:r>
-      <w:r>
-        <w:t xml:space="preserve">= 128).</w:t>
-      </w:r>
-      <w:r>
-        <w:t xml:space="preserve"> </w:t>
-      </w:r>
-      <w:r>
-        <w:rPr>
-          <w:b/>
-          <w:bCs/>
-        </w:rPr>
-        <w:t xml:space="preserve">B1</w:t>
-      </w:r>
-      <w:r>
-        <w:t xml:space="preserve"> </w:t>
-      </w:r>
-      <w:r>
-        <w:t xml:space="preserve">= chicken_batch1 (PC_JC_2024-11-29; n=18; 3 dietary groups).</w:t>
-      </w:r>
-      <w:r>
-        <w:t xml:space="preserve"> </w:t>
-      </w:r>
-      <w:r>
-        <w:rPr>
-          <w:b/>
-          <w:bCs/>
-        </w:rPr>
-        <w:t xml:space="preserve">B2</w:t>
-      </w:r>
-      <w:r>
-        <w:t xml:space="preserve"> </w:t>
-      </w:r>
-      <w:r>
-        <w:t xml:space="preserve">= chicken_batch2 (JC_FL_2025-05-20; n=32; 4-level</w:t>
-      </w:r>
-      <w:r>
-        <w:t xml:space="preserve"> </w:t>
-      </w:r>
-      <w:r>
-        <w:rPr>
-          <w:rStyle w:val="VerbatimChar"/>
-        </w:rPr>
-        <w:t xml:space="preserve">Treatment_Bird</w:t>
-      </w:r>
-      <w:r>
-        <w:t xml:space="preserve"> </w:t>
-      </w:r>
-      <w:r>
-        <w:t xml:space="preserve">grouping,</w:t>
-      </w:r>
-      <w:r>
-        <w:t xml:space="preserve"> </w:t>
-      </w:r>
-      <w:r>
-        <w:rPr>
-          <w:rStyle w:val="VerbatimChar"/>
-        </w:rPr>
-        <w:t xml:space="preserve">block</w:t>
-      </w:r>
-      <w:r>
-        <w:t xml:space="preserve"> </w:t>
-      </w:r>
-      <w:r>
-        <w:t xml:space="preserve">random effect, two declared negative controls). Sample sizes shown in some output cells refer to samples with non-zero hits at that stage. Runtimes and peak-MB are from the same 2026-06-23 sequential run (B1 = 6m 41s, B2 = 8m 19s; 15/15 stages each) on the post-instrumentation build; the peak-MB column reports the gc()-tracked maximum used heap for each stage (equivalent to</w:t>
-      </w:r>
-      <w:r>
-        <w:t xml:space="preserve"> </w:t>
-      </w:r>
-      <w:r>
-        <w:rPr>
-          <w:rStyle w:val="VerbatimChar"/>
-        </w:rPr>
-        <w:t xml:space="preserve">peakRAM</w:t>
-      </w:r>
-      <w:r>
-        <w:t xml:space="preserve"> </w:t>
-      </w:r>
-      <w:r>
-        <w:t xml:space="preserve">methodology) and the Total row shows the overall maximum across the run.</w:t>
-      </w:r>
+        <w:t xml:space="preserve"> = </w:t>
+      </w:r>
+      <w:del w:id="100118" w:author="Reviewer" w:date="2026-06-25T17:36:12Z">
+        <w:r>
+          <w:delText xml:space="preserve">128).</w:delText>
+        </w:r>
+      </w:del>
+      <w:ins w:id="100119" w:author="Reviewer" w:date="2026-06-25T17:36:12Z">
+        <w:r>
+          <w:t xml:space="preserve">128);</w:t>
+        </w:r>
+      </w:ins>
+      <w:r>
+        <w:t xml:space="preserve"> </w:t>
+      </w:r>
+      <w:del w:id="100120" w:author="Reviewer" w:date="2026-06-25T17:36:12Z">
+        <w:r>
+          <w:rPr>
+            <w:b/>
+            <w:bCs/>
+          </w:rPr>
+          <w:delText xml:space="preserve">B1</w:delText>
+        </w:r>
+      </w:del>
+      <w:ins w:id="100121" w:author="Reviewer" w:date="2026-06-25T17:36:12Z">
+        <w:r>
+          <w:t xml:space="preserve">2026-06-23</w:t>
+        </w:r>
+      </w:ins>
+      <w:r>
+        <w:t xml:space="preserve"> </w:t>
+      </w:r>
+      <w:del w:id="100122" w:author="Reviewer" w:date="2026-06-25T17:36:12Z">
+        <w:r>
+          <w:delText xml:space="preserve">=</w:delText>
+        </w:r>
+      </w:del>
+      <w:ins w:id="100123" w:author="Reviewer" w:date="2026-06-25T17:36:12Z">
+        <w:r>
+          <w:t xml:space="preserve">sequential</w:t>
+        </w:r>
+      </w:ins>
+      <w:r>
+        <w:t xml:space="preserve"> </w:t>
+      </w:r>
+      <w:del w:id="100124" w:author="Reviewer" w:date="2026-06-25T17:36:12Z">
+        <w:r>
+          <w:delText xml:space="preserve">chicken_batch1</w:delText>
+        </w:r>
+      </w:del>
+      <w:ins w:id="100125" w:author="Reviewer" w:date="2026-06-25T17:36:12Z">
+        <w:r>
+          <w:t xml:space="preserve">run.</w:t>
+        </w:r>
+      </w:ins>
+      <w:r>
+        <w:t xml:space="preserve"> </w:t>
+      </w:r>
+      <w:del w:id="100126" w:author="Reviewer" w:date="2026-06-25T17:36:12Z">
+        <w:r>
+          <w:delText xml:space="preserve">(PC_JC_2024-11-29;</w:delText>
+        </w:r>
+      </w:del>
+      <w:ins w:id="100127" w:author="Reviewer" w:date="2026-06-25T17:36:12Z">
+        <w:r>
+          <w:t xml:space="preserve">Per-stage</w:t>
+        </w:r>
+      </w:ins>
+      <w:r>
+        <w:t xml:space="preserve"> </w:t>
+      </w:r>
+      <w:del w:id="100128" w:author="Reviewer" w:date="2026-06-25T17:36:12Z">
+        <w:r>
+          <w:delText xml:space="preserve">n=18;</w:delText>
+        </w:r>
+      </w:del>
+      <w:ins w:id="100129" w:author="Reviewer" w:date="2026-06-25T17:36:12Z">
+        <w:r>
+          <w:t xml:space="preserve">wall</w:t>
+        </w:r>
+      </w:ins>
+      <w:r>
+        <w:t xml:space="preserve"> </w:t>
+      </w:r>
+      <w:del w:id="100130" w:author="Reviewer" w:date="2026-06-25T17:36:12Z">
+        <w:r>
+          <w:delText xml:space="preserve">3</w:delText>
+        </w:r>
+      </w:del>
+      <w:ins w:id="100131" w:author="Reviewer" w:date="2026-06-25T17:36:12Z">
+        <w:r>
+          <w:t xml:space="preserve">time</w:t>
+        </w:r>
+      </w:ins>
+      <w:r>
+        <w:t xml:space="preserve"> </w:t>
+      </w:r>
+      <w:del w:id="100132" w:author="Reviewer" w:date="2026-06-25T17:36:12Z">
+        <w:r>
+          <w:delText xml:space="preserve">dietary</w:delText>
+        </w:r>
+      </w:del>
+      <w:ins w:id="100133" w:author="Reviewer" w:date="2026-06-25T17:36:12Z">
+        <w:r>
+          <w:t xml:space="preserve">and</w:t>
+        </w:r>
+      </w:ins>
+      <w:r>
+        <w:t xml:space="preserve"> </w:t>
+      </w:r>
+      <w:del w:id="100134" w:author="Reviewer" w:date="2026-06-25T17:36:12Z">
+        <w:r>
+          <w:delText xml:space="preserve">groups).</w:delText>
+        </w:r>
+      </w:del>
+      <w:ins w:id="100135" w:author="Reviewer" w:date="2026-06-25T17:36:12Z">
+        <w:r>
+          <w:t xml:space="preserve">peak</w:t>
+        </w:r>
+      </w:ins>
+      <w:r>
+        <w:t xml:space="preserve"> </w:t>
+      </w:r>
+      <w:del w:id="100136" w:author="Reviewer" w:date="2026-06-25T17:36:12Z">
+        <w:r>
+          <w:rPr>
+            <w:b/>
+            <w:bCs/>
+          </w:rPr>
+          <w:delText xml:space="preserve">B2</w:delText>
+        </w:r>
+      </w:del>
+      <w:ins w:id="100137" w:author="Reviewer" w:date="2026-06-25T17:36:12Z">
+        <w:r>
+          <w:t xml:space="preserve">R-process</w:t>
+        </w:r>
+      </w:ins>
+      <w:r>
+        <w:t xml:space="preserve"> </w:t>
+      </w:r>
+      <w:del w:id="100138" w:author="Reviewer" w:date="2026-06-25T17:36:12Z">
+        <w:r>
+          <w:delText xml:space="preserve">=</w:delText>
+        </w:r>
+      </w:del>
+      <w:ins w:id="100139" w:author="Reviewer" w:date="2026-06-25T17:36:12Z">
+        <w:r>
+          <w:t xml:space="preserve">memory</w:t>
+        </w:r>
+      </w:ins>
+      <w:r>
+        <w:t xml:space="preserve"> </w:t>
+      </w:r>
+      <w:del w:id="100140" w:author="Reviewer" w:date="2026-06-25T17:36:12Z">
+        <w:r>
+          <w:delText xml:space="preserve">chicken_batch2 (JC_FL_2025-05-20; n=32; 4-level </w:delText>
+        </w:r>
+      </w:del>
+      <w:del w:id="100141" w:author="Reviewer" w:date="2026-06-25T17:36:12Z">
+        <w:r>
+          <w:rPr>
+            <w:rStyle w:val="VerbatimChar"/>
+          </w:rPr>
+          <w:delText xml:space="preserve">Treatment_Bird</w:delText>
+        </w:r>
+      </w:del>
+      <w:del w:id="100142" w:author="Reviewer" w:date="2026-06-25T17:36:12Z">
+        <w:r>
+          <w:delText xml:space="preserve"> grouping, </w:delText>
+        </w:r>
+      </w:del>
+      <w:del w:id="100143" w:author="Reviewer" w:date="2026-06-25T17:36:12Z">
+        <w:r>
+          <w:rPr>
+            <w:rStyle w:val="VerbatimChar"/>
+          </w:rPr>
+          <w:delText xml:space="preserve">block</w:delText>
+        </w:r>
+      </w:del>
+      <w:del w:id="100144" w:author="Reviewer" w:date="2026-06-25T17:36:12Z">
+        <w:r>
+          <w:delText xml:space="preserve"> random effect, two declared negative controls). Sample sizes</w:delText>
+        </w:r>
+      </w:del>
+      <w:ins w:id="100145" w:author="Reviewer" w:date="2026-06-25T17:36:12Z">
+        <w:r>
+          <w:t xml:space="preserve">are</w:t>
+        </w:r>
+      </w:ins>
+      <w:r>
+        <w:t xml:space="preserve"> shown in </w:t>
+      </w:r>
+      <w:del w:id="100146" w:author="Reviewer" w:date="2026-06-25T17:36:12Z">
+        <w:r>
+          <w:delText xml:space="preserve">some</w:delText>
+        </w:r>
+      </w:del>
+      <w:ins w:id="100147" w:author="Reviewer" w:date="2026-06-25T17:36:12Z">
+        <w:r>
+          <w:t xml:space="preserve">Figure</w:t>
+        </w:r>
+      </w:ins>
+      <w:r>
+        <w:t xml:space="preserve"> </w:t>
+      </w:r>
+      <w:del w:id="100148" w:author="Reviewer" w:date="2026-06-25T17:36:12Z">
+        <w:r>
+          <w:delText xml:space="preserve">output cells refer to samples with non-zero hits at that stage. Runtimes and peak-MB are from the same 2026-06-23 sequential run (B1 = 6m 41s, B2 = 8m 19s; 15/15 stages each) on the post-instrumentation build; the peak-MB column reports the gc()-tracked maximum used heap for each stage (equivalent to </w:delText>
+        </w:r>
+      </w:del>
+      <w:del w:id="100149" w:author="Reviewer" w:date="2026-06-25T17:36:12Z">
+        <w:r>
+          <w:rPr>
+            <w:rStyle w:val="VerbatimChar"/>
+          </w:rPr>
+          <w:delText xml:space="preserve">peakRAM</w:delText>
+        </w:r>
+      </w:del>
+      <w:del w:id="100150" w:author="Reviewer" w:date="2026-06-25T17:36:12Z">
+        <w:r>
+          <w:delText xml:space="preserve"> methodology) and the Total row shows the overall maximum across the run.</w:delText>
+        </w:r>
+      </w:del>
+      <w:ins w:id="100151" w:author="Reviewer" w:date="2026-06-25T17:36:12Z">
+        <w:r>
+          <w:t xml:space="preserve">2.</w:t>
+        </w:r>
+      </w:ins>
     </w:p>
     <w:tbl>
       <w:tblPr>
         <w:tblStyle w:val="Table"/>
-        <w:tblW w:type="pct" w:w="5000"/>
-        <w:tblLayout w:type="fixed"/>
+        <w:tblW w:type="auto" w:w="0"/>
         <w:tblLook w:firstRow="1" w:lastRow="0" w:firstColumn="0" w:lastColumn="0" w:noHBand="0" w:noVBand="0" w:val="0020"/>
       </w:tblPr>
       <w:tblGrid>
-        <w:gridCol w:w="1131"/>
-        <w:gridCol w:w="1131"/>
-        <w:gridCol w:w="1131"/>
-        <w:gridCol w:w="1131"/>
-        <w:gridCol w:w="1131"/>
-        <w:gridCol w:w="1131"/>
-        <w:gridCol w:w="1131"/>
+        <w:gridCol w:w="2640"/>
+        <w:gridCol w:w="2640"/>
+        <w:gridCol w:w="2640"/>
       </w:tblGrid>
       <w:tr>
         <w:trPr>
@@ -1203,51 +1977,7 @@
               <w:pStyle w:val="Compact"/>
             </w:pPr>
             <w:r>
-              <w:t xml:space="preserve">B1 runtime</w:t>
-            </w:r>
-          </w:p>
-        </w:tc>
-        <w:tc>
-          <w:tcPr/>
-          <w:p>
-            <w:pPr>
-              <w:pStyle w:val="Compact"/>
-            </w:pPr>
-            <w:r>
-              <w:t xml:space="preserve">B1 peak MB</w:t>
-            </w:r>
-          </w:p>
-        </w:tc>
-        <w:tc>
-          <w:tcPr/>
-          <w:p>
-            <w:pPr>
-              <w:pStyle w:val="Compact"/>
-            </w:pPr>
-            <w:r>
               <w:t xml:space="preserve">B1 primary output</w:t>
-            </w:r>
-          </w:p>
-        </w:tc>
-        <w:tc>
-          <w:tcPr/>
-          <w:p>
-            <w:pPr>
-              <w:pStyle w:val="Compact"/>
-            </w:pPr>
-            <w:r>
-              <w:t xml:space="preserve">B2 runtime</w:t>
-            </w:r>
-          </w:p>
-        </w:tc>
-        <w:tc>
-          <w:tcPr/>
-          <w:p>
-            <w:pPr>
-              <w:pStyle w:val="Compact"/>
-            </w:pPr>
-            <w:r>
-              <w:t xml:space="preserve">B2 peak MB</w:t>
             </w:r>
           </w:p>
         </w:tc>
@@ -1282,51 +2012,7 @@
               <w:pStyle w:val="Compact"/>
             </w:pPr>
             <w:r>
-              <w:t xml:space="preserve">0.7 s</w:t>
-            </w:r>
-          </w:p>
-        </w:tc>
-        <w:tc>
-          <w:tcPr/>
-          <w:p>
-            <w:pPr>
-              <w:pStyle w:val="Compact"/>
-            </w:pPr>
-            <w:r>
-              <w:t xml:space="preserve">168</w:t>
-            </w:r>
-          </w:p>
-        </w:tc>
-        <w:tc>
-          <w:tcPr/>
-          <w:p>
-            <w:pPr>
-              <w:pStyle w:val="Compact"/>
-            </w:pPr>
-            <w:r>
               <w:t xml:space="preserve">5 upstream tables parsed</w:t>
-            </w:r>
-          </w:p>
-        </w:tc>
-        <w:tc>
-          <w:tcPr/>
-          <w:p>
-            <w:pPr>
-              <w:pStyle w:val="Compact"/>
-            </w:pPr>
-            <w:r>
-              <w:t xml:space="preserve">1.3 s</w:t>
-            </w:r>
-          </w:p>
-        </w:tc>
-        <w:tc>
-          <w:tcPr/>
-          <w:p>
-            <w:pPr>
-              <w:pStyle w:val="Compact"/>
-            </w:pPr>
-            <w:r>
-              <w:t xml:space="preserve">205</w:t>
             </w:r>
           </w:p>
         </w:tc>
@@ -1361,28 +2047,6 @@
               <w:pStyle w:val="Compact"/>
             </w:pPr>
             <w:r>
-              <w:t xml:space="preserve">2.1 s</w:t>
-            </w:r>
-          </w:p>
-        </w:tc>
-        <w:tc>
-          <w:tcPr/>
-          <w:p>
-            <w:pPr>
-              <w:pStyle w:val="Compact"/>
-            </w:pPr>
-            <w:r>
-              <w:t xml:space="preserve">245</w:t>
-            </w:r>
-          </w:p>
-        </w:tc>
-        <w:tc>
-          <w:tcPr/>
-          <w:p>
-            <w:pPr>
-              <w:pStyle w:val="Compact"/>
-            </w:pPr>
-            <w:r>
               <w:rPr>
                 <w:rStyle w:val="VerbatimChar"/>
               </w:rPr>
@@ -1393,28 +2057,6 @@
             </w:r>
             <w:r>
               <w:t xml:space="preserve">applied; no controls declared</w:t>
-            </w:r>
-          </w:p>
-        </w:tc>
-        <w:tc>
-          <w:tcPr/>
-          <w:p>
-            <w:pPr>
-              <w:pStyle w:val="Compact"/>
-            </w:pPr>
-            <w:r>
-              <w:t xml:space="preserve">6.4 s</w:t>
-            </w:r>
-          </w:p>
-        </w:tc>
-        <w:tc>
-          <w:tcPr/>
-          <w:p>
-            <w:pPr>
-              <w:pStyle w:val="Compact"/>
-            </w:pPr>
-            <w:r>
-              <w:t xml:space="preserve">522</w:t>
             </w:r>
           </w:p>
         </w:tc>
@@ -1461,51 +2103,7 @@
               <w:pStyle w:val="Compact"/>
             </w:pPr>
             <w:r>
-              <w:t xml:space="preserve">0.4 s</w:t>
-            </w:r>
-          </w:p>
-        </w:tc>
-        <w:tc>
-          <w:tcPr/>
-          <w:p>
-            <w:pPr>
-              <w:pStyle w:val="Compact"/>
-            </w:pPr>
-            <w:r>
-              <w:t xml:space="preserve">160</w:t>
-            </w:r>
-          </w:p>
-        </w:tc>
-        <w:tc>
-          <w:tcPr/>
-          <w:p>
-            <w:pPr>
-              <w:pStyle w:val="Compact"/>
-            </w:pPr>
-            <w:r>
               <w:t xml:space="preserve">gene-element TPM table written</w:t>
-            </w:r>
-          </w:p>
-        </w:tc>
-        <w:tc>
-          <w:tcPr/>
-          <w:p>
-            <w:pPr>
-              <w:pStyle w:val="Compact"/>
-            </w:pPr>
-            <w:r>
-              <w:t xml:space="preserve">0.5 s</w:t>
-            </w:r>
-          </w:p>
-        </w:tc>
-        <w:tc>
-          <w:tcPr/>
-          <w:p>
-            <w:pPr>
-              <w:pStyle w:val="Compact"/>
-            </w:pPr>
-            <w:r>
-              <w:t xml:space="preserve">205</w:t>
             </w:r>
           </w:p>
         </w:tc>
@@ -1540,51 +2138,7 @@
               <w:pStyle w:val="Compact"/>
             </w:pPr>
             <w:r>
-              <w:t xml:space="preserve">2.2 s</w:t>
-            </w:r>
-          </w:p>
-        </w:tc>
-        <w:tc>
-          <w:tcPr/>
-          <w:p>
-            <w:pPr>
-              <w:pStyle w:val="Compact"/>
-            </w:pPr>
-            <w:r>
-              <w:t xml:space="preserve">230</w:t>
-            </w:r>
-          </w:p>
-        </w:tc>
-        <w:tc>
-          <w:tcPr/>
-          <w:p>
-            <w:pPr>
-              <w:pStyle w:val="Compact"/>
-            </w:pPr>
-            <w:r>
               <w:t xml:space="preserve">2,971 / 11,196 (taxon, sample) rows kept (count ≥ 5)</w:t>
-            </w:r>
-          </w:p>
-        </w:tc>
-        <w:tc>
-          <w:tcPr/>
-          <w:p>
-            <w:pPr>
-              <w:pStyle w:val="Compact"/>
-            </w:pPr>
-            <w:r>
-              <w:t xml:space="preserve">2.3 s</w:t>
-            </w:r>
-          </w:p>
-        </w:tc>
-        <w:tc>
-          <w:tcPr/>
-          <w:p>
-            <w:pPr>
-              <w:pStyle w:val="Compact"/>
-            </w:pPr>
-            <w:r>
-              <w:t xml:space="preserve">308</w:t>
             </w:r>
           </w:p>
         </w:tc>
@@ -1619,51 +2173,7 @@
               <w:pStyle w:val="Compact"/>
             </w:pPr>
             <w:r>
-              <w:t xml:space="preserve">27.6 s</w:t>
-            </w:r>
-          </w:p>
-        </w:tc>
-        <w:tc>
-          <w:tcPr/>
-          <w:p>
-            <w:pPr>
-              <w:pStyle w:val="Compact"/>
-            </w:pPr>
-            <w:r>
-              <w:t xml:space="preserve">362</w:t>
-            </w:r>
-          </w:p>
-        </w:tc>
-        <w:tc>
-          <w:tcPr/>
-          <w:p>
-            <w:pPr>
-              <w:pStyle w:val="Compact"/>
-            </w:pPr>
-            <w:r>
               <w:t xml:space="preserve">1,700 / 72,152 rows kept (count &gt; 17); top-50 + Others</w:t>
-            </w:r>
-          </w:p>
-        </w:tc>
-        <w:tc>
-          <w:tcPr/>
-          <w:p>
-            <w:pPr>
-              <w:pStyle w:val="Compact"/>
-            </w:pPr>
-            <w:r>
-              <w:t xml:space="preserve">29.6 s</w:t>
-            </w:r>
-          </w:p>
-        </w:tc>
-        <w:tc>
-          <w:tcPr/>
-          <w:p>
-            <w:pPr>
-              <w:pStyle w:val="Compact"/>
-            </w:pPr>
-            <w:r>
-              <w:t xml:space="preserve">574</w:t>
             </w:r>
           </w:p>
         </w:tc>
@@ -1698,51 +2208,7 @@
               <w:pStyle w:val="Compact"/>
             </w:pPr>
             <w:r>
-              <w:t xml:space="preserve">32.6 s</w:t>
-            </w:r>
-          </w:p>
-        </w:tc>
-        <w:tc>
-          <w:tcPr/>
-          <w:p>
-            <w:pPr>
-              <w:pStyle w:val="Compact"/>
-            </w:pPr>
-            <w:r>
-              <w:t xml:space="preserve">472</w:t>
-            </w:r>
-          </w:p>
-        </w:tc>
-        <w:tc>
-          <w:tcPr/>
-          <w:p>
-            <w:pPr>
-              <w:pStyle w:val="Compact"/>
-            </w:pPr>
-            <w:r>
               <w:t xml:space="preserve">9 metrics × 18 samples; KW per metric</w:t>
-            </w:r>
-          </w:p>
-        </w:tc>
-        <w:tc>
-          <w:tcPr/>
-          <w:p>
-            <w:pPr>
-              <w:pStyle w:val="Compact"/>
-            </w:pPr>
-            <w:r>
-              <w:t xml:space="preserve">31.4 s</w:t>
-            </w:r>
-          </w:p>
-        </w:tc>
-        <w:tc>
-          <w:tcPr/>
-          <w:p>
-            <w:pPr>
-              <w:pStyle w:val="Compact"/>
-            </w:pPr>
-            <w:r>
-              <w:t xml:space="preserve">587</w:t>
             </w:r>
           </w:p>
         </w:tc>
@@ -1777,51 +2243,7 @@
               <w:pStyle w:val="Compact"/>
             </w:pPr>
             <w:r>
-              <w:t xml:space="preserve">5.9 s</w:t>
-            </w:r>
-          </w:p>
-        </w:tc>
-        <w:tc>
-          <w:tcPr/>
-          <w:p>
-            <w:pPr>
-              <w:pStyle w:val="Compact"/>
-            </w:pPr>
-            <w:r>
-              <w:t xml:space="preserve">472</w:t>
-            </w:r>
-          </w:p>
-        </w:tc>
-        <w:tc>
-          <w:tcPr/>
-          <w:p>
-            <w:pPr>
-              <w:pStyle w:val="Compact"/>
-            </w:pPr>
-            <w:r>
               <w:t xml:space="preserve">PERMANOVA R² = 0.145, p = 0.22; PERMDISP p = 0.027</w:t>
-            </w:r>
-          </w:p>
-        </w:tc>
-        <w:tc>
-          <w:tcPr/>
-          <w:p>
-            <w:pPr>
-              <w:pStyle w:val="Compact"/>
-            </w:pPr>
-            <w:r>
-              <w:t xml:space="preserve">5.2 s</w:t>
-            </w:r>
-          </w:p>
-        </w:tc>
-        <w:tc>
-          <w:tcPr/>
-          <w:p>
-            <w:pPr>
-              <w:pStyle w:val="Compact"/>
-            </w:pPr>
-            <w:r>
-              <w:t xml:space="preserve">482</w:t>
             </w:r>
           </w:p>
         </w:tc>
@@ -1856,51 +2278,7 @@
               <w:pStyle w:val="Compact"/>
             </w:pPr>
             <w:r>
-              <w:t xml:space="preserve">2m 7s</w:t>
-            </w:r>
-          </w:p>
-        </w:tc>
-        <w:tc>
-          <w:tcPr/>
-          <w:p>
-            <w:pPr>
-              <w:pStyle w:val="Compact"/>
-            </w:pPr>
-            <w:r>
-              <w:t xml:space="preserve">1028</w:t>
-            </w:r>
-          </w:p>
-        </w:tc>
-        <w:tc>
-          <w:tcPr/>
-          <w:p>
-            <w:pPr>
-              <w:pStyle w:val="Compact"/>
-            </w:pPr>
-            <w:r>
               <w:t xml:space="preserve">31 taxa + 157 gene features; 3 pairwise contrasts</w:t>
-            </w:r>
-          </w:p>
-        </w:tc>
-        <w:tc>
-          <w:tcPr/>
-          <w:p>
-            <w:pPr>
-              <w:pStyle w:val="Compact"/>
-            </w:pPr>
-            <w:r>
-              <w:t xml:space="preserve">3m 18s</w:t>
-            </w:r>
-          </w:p>
-        </w:tc>
-        <w:tc>
-          <w:tcPr/>
-          <w:p>
-            <w:pPr>
-              <w:pStyle w:val="Compact"/>
-            </w:pPr>
-            <w:r>
-              <w:t xml:space="preserve">1133</w:t>
             </w:r>
           </w:p>
         </w:tc>
@@ -1935,51 +2313,7 @@
               <w:pStyle w:val="Compact"/>
             </w:pPr>
             <w:r>
-              <w:t xml:space="preserve">29.3 s</w:t>
-            </w:r>
-          </w:p>
-        </w:tc>
-        <w:tc>
-          <w:tcPr/>
-          <w:p>
-            <w:pPr>
-              <w:pStyle w:val="Compact"/>
-            </w:pPr>
-            <w:r>
-              <w:t xml:space="preserve">1028</w:t>
-            </w:r>
-          </w:p>
-        </w:tc>
-        <w:tc>
-          <w:tcPr/>
-          <w:p>
-            <w:pPr>
-              <w:pStyle w:val="Compact"/>
-            </w:pPr>
-            <w:r>
               <w:t xml:space="preserve">348 rows / 85 genes / 18 drug classes</w:t>
-            </w:r>
-          </w:p>
-        </w:tc>
-        <w:tc>
-          <w:tcPr/>
-          <w:p>
-            <w:pPr>
-              <w:pStyle w:val="Compact"/>
-            </w:pPr>
-            <w:r>
-              <w:t xml:space="preserve">25.9 s</w:t>
-            </w:r>
-          </w:p>
-        </w:tc>
-        <w:tc>
-          <w:tcPr/>
-          <w:p>
-            <w:pPr>
-              <w:pStyle w:val="Compact"/>
-            </w:pPr>
-            <w:r>
-              <w:t xml:space="preserve">1102</w:t>
             </w:r>
           </w:p>
         </w:tc>
@@ -2014,51 +2348,7 @@
               <w:pStyle w:val="Compact"/>
             </w:pPr>
             <w:r>
-              <w:t xml:space="preserve">16.0 s</w:t>
-            </w:r>
-          </w:p>
-        </w:tc>
-        <w:tc>
-          <w:tcPr/>
-          <w:p>
-            <w:pPr>
-              <w:pStyle w:val="Compact"/>
-            </w:pPr>
-            <w:r>
-              <w:t xml:space="preserve">1028</w:t>
-            </w:r>
-          </w:p>
-        </w:tc>
-        <w:tc>
-          <w:tcPr/>
-          <w:p>
-            <w:pPr>
-              <w:pStyle w:val="Compact"/>
-            </w:pPr>
-            <w:r>
               <w:t xml:space="preserve">320 rows / 140 genes / 6 VF functions (17 / 18 samples)</w:t>
-            </w:r>
-          </w:p>
-        </w:tc>
-        <w:tc>
-          <w:tcPr/>
-          <w:p>
-            <w:pPr>
-              <w:pStyle w:val="Compact"/>
-            </w:pPr>
-            <w:r>
-              <w:t xml:space="preserve">17.3 s</w:t>
-            </w:r>
-          </w:p>
-        </w:tc>
-        <w:tc>
-          <w:tcPr/>
-          <w:p>
-            <w:pPr>
-              <w:pStyle w:val="Compact"/>
-            </w:pPr>
-            <w:r>
-              <w:t xml:space="preserve">1132</w:t>
             </w:r>
           </w:p>
         </w:tc>
@@ -2093,51 +2383,7 @@
               <w:pStyle w:val="Compact"/>
             </w:pPr>
             <w:r>
-              <w:t xml:space="preserve">15.3 s</w:t>
-            </w:r>
-          </w:p>
-        </w:tc>
-        <w:tc>
-          <w:tcPr/>
-          <w:p>
-            <w:pPr>
-              <w:pStyle w:val="Compact"/>
-            </w:pPr>
-            <w:r>
-              <w:t xml:space="preserve">1028</w:t>
-            </w:r>
-          </w:p>
-        </w:tc>
-        <w:tc>
-          <w:tcPr/>
-          <w:p>
-            <w:pPr>
-              <w:pStyle w:val="Compact"/>
-            </w:pPr>
-            <w:r>
               <w:t xml:space="preserve">65 rows / 10 replicons / 3 families</w:t>
-            </w:r>
-          </w:p>
-        </w:tc>
-        <w:tc>
-          <w:tcPr/>
-          <w:p>
-            <w:pPr>
-              <w:pStyle w:val="Compact"/>
-            </w:pPr>
-            <w:r>
-              <w:t xml:space="preserve">16.1 s</w:t>
-            </w:r>
-          </w:p>
-        </w:tc>
-        <w:tc>
-          <w:tcPr/>
-          <w:p>
-            <w:pPr>
-              <w:pStyle w:val="Compact"/>
-            </w:pPr>
-            <w:r>
-              <w:t xml:space="preserve">1100</w:t>
             </w:r>
           </w:p>
         </w:tc>
@@ -2172,51 +2418,7 @@
               <w:pStyle w:val="Compact"/>
             </w:pPr>
             <w:r>
-              <w:t xml:space="preserve">53.3 s</w:t>
-            </w:r>
-          </w:p>
-        </w:tc>
-        <w:tc>
-          <w:tcPr/>
-          <w:p>
-            <w:pPr>
-              <w:pStyle w:val="Compact"/>
-            </w:pPr>
-            <w:r>
-              <w:t xml:space="preserve">1183</w:t>
-            </w:r>
-          </w:p>
-        </w:tc>
-        <w:tc>
-          <w:tcPr/>
-          <w:p>
-            <w:pPr>
-              <w:pStyle w:val="Compact"/>
-            </w:pPr>
-            <w:r>
               <w:t xml:space="preserve">247 edges, 100 nodes (18 + 42 + 40); modularity = 0.31</w:t>
-            </w:r>
-          </w:p>
-        </w:tc>
-        <w:tc>
-          <w:tcPr/>
-          <w:p>
-            <w:pPr>
-              <w:pStyle w:val="Compact"/>
-            </w:pPr>
-            <w:r>
-              <w:t xml:space="preserve">1m 26s</w:t>
-            </w:r>
-          </w:p>
-        </w:tc>
-        <w:tc>
-          <w:tcPr/>
-          <w:p>
-            <w:pPr>
-              <w:pStyle w:val="Compact"/>
-            </w:pPr>
-            <w:r>
-              <w:t xml:space="preserve">1418</w:t>
             </w:r>
           </w:p>
         </w:tc>
@@ -2251,28 +2453,6 @@
               <w:pStyle w:val="Compact"/>
             </w:pPr>
             <w:r>
-              <w:t xml:space="preserve">49.0 s</w:t>
-            </w:r>
-          </w:p>
-        </w:tc>
-        <w:tc>
-          <w:tcPr/>
-          <w:p>
-            <w:pPr>
-              <w:pStyle w:val="Compact"/>
-            </w:pPr>
-            <w:r>
-              <w:t xml:space="preserve">1330</w:t>
-            </w:r>
-          </w:p>
-        </w:tc>
-        <w:tc>
-          <w:tcPr/>
-          <w:p>
-            <w:pPr>
-              <w:pStyle w:val="Compact"/>
-            </w:pPr>
-            <w:r>
               <w:t xml:space="preserve">main + supplementary composite figures (PNG / TIFF) +</w:t>
             </w:r>
             <w:r>
@@ -2283,28 +2463,6 @@
                 <w:rStyle w:val="VerbatimChar"/>
               </w:rPr>
               <w:t xml:space="preserve">supplementary_tables.xlsx</w:t>
-            </w:r>
-          </w:p>
-        </w:tc>
-        <w:tc>
-          <w:tcPr/>
-          <w:p>
-            <w:pPr>
-              <w:pStyle w:val="Compact"/>
-            </w:pPr>
-            <w:r>
-              <w:t xml:space="preserve">49.0 s</w:t>
-            </w:r>
-          </w:p>
-        </w:tc>
-        <w:tc>
-          <w:tcPr/>
-          <w:p>
-            <w:pPr>
-              <w:pStyle w:val="Compact"/>
-            </w:pPr>
-            <w:r>
-              <w:t xml:space="preserve">1505</w:t>
             </w:r>
           </w:p>
         </w:tc>
@@ -2348,28 +2506,6 @@
               <w:pStyle w:val="Compact"/>
             </w:pPr>
             <w:r>
-              <w:t xml:space="preserve">2.8 s</w:t>
-            </w:r>
-          </w:p>
-        </w:tc>
-        <w:tc>
-          <w:tcPr/>
-          <w:p>
-            <w:pPr>
-              <w:pStyle w:val="Compact"/>
-            </w:pPr>
-            <w:r>
-              <w:t xml:space="preserve">922</w:t>
-            </w:r>
-          </w:p>
-        </w:tc>
-        <w:tc>
-          <w:tcPr/>
-          <w:p>
-            <w:pPr>
-              <w:pStyle w:val="Compact"/>
-            </w:pPr>
-            <w:r>
               <w:rPr>
                 <w:rStyle w:val="VerbatimChar"/>
               </w:rPr>
@@ -2380,28 +2516,6 @@
             </w:r>
             <w:r>
               <w:t xml:space="preserve">(contract v1.2; 85 kB)</w:t>
-            </w:r>
-          </w:p>
-        </w:tc>
-        <w:tc>
-          <w:tcPr/>
-          <w:p>
-            <w:pPr>
-              <w:pStyle w:val="Compact"/>
-            </w:pPr>
-            <w:r>
-              <w:t xml:space="preserve">3.1 s</w:t>
-            </w:r>
-          </w:p>
-        </w:tc>
-        <w:tc>
-          <w:tcPr/>
-          <w:p>
-            <w:pPr>
-              <w:pStyle w:val="Compact"/>
-            </w:pPr>
-            <w:r>
-              <w:t xml:space="preserve">1040</w:t>
             </w:r>
           </w:p>
         </w:tc>
@@ -2445,7 +2559,7 @@
               <w:pStyle w:val="Compact"/>
             </w:pPr>
             <w:r>
-              <w:t xml:space="preserve">36.9 s</w:t>
+              <w:t xml:space="preserve">Quarto dashboard HTML (~14 MB)</w:t>
             </w:r>
           </w:p>
         </w:tc>
@@ -2456,150 +2570,7 @@
               <w:pStyle w:val="Compact"/>
             </w:pPr>
             <w:r>
-              <w:t xml:space="preserve">611</w:t>
-            </w:r>
-          </w:p>
-        </w:tc>
-        <w:tc>
-          <w:tcPr/>
-          <w:p>
-            <w:pPr>
-              <w:pStyle w:val="Compact"/>
-            </w:pPr>
-            <w:r>
-              <w:t xml:space="preserve">Quarto dashboard HTML (~14 MB)</w:t>
-            </w:r>
-          </w:p>
-        </w:tc>
-        <w:tc>
-          <w:tcPr/>
-          <w:p>
-            <w:pPr>
-              <w:pStyle w:val="Compact"/>
-            </w:pPr>
-            <w:r>
-              <w:t xml:space="preserve">27.4 s</w:t>
-            </w:r>
-          </w:p>
-        </w:tc>
-        <w:tc>
-          <w:tcPr/>
-          <w:p>
-            <w:pPr>
-              <w:pStyle w:val="Compact"/>
-            </w:pPr>
-            <w:r>
-              <w:t xml:space="preserve">647</w:t>
-            </w:r>
-          </w:p>
-        </w:tc>
-        <w:tc>
-          <w:tcPr/>
-          <w:p>
-            <w:pPr>
-              <w:pStyle w:val="Compact"/>
-            </w:pPr>
-            <w:r>
               <w:t xml:space="preserve">Quarto dashboard HTML (~18 MB)</w:t>
-            </w:r>
-          </w:p>
-        </w:tc>
-      </w:tr>
-      <w:tr>
-        <w:tc>
-          <w:tcPr/>
-          <w:p>
-            <w:pPr>
-              <w:pStyle w:val="Compact"/>
-            </w:pPr>
-            <w:r>
-              <w:rPr>
-                <w:b/>
-                <w:bCs/>
-              </w:rPr>
-              <w:t xml:space="preserve">Total (15 stages)</w:t>
-            </w:r>
-          </w:p>
-        </w:tc>
-        <w:tc>
-          <w:tcPr/>
-          <w:p>
-            <w:pPr>
-              <w:pStyle w:val="Compact"/>
-            </w:pPr>
-            <w:r>
-              <w:rPr>
-                <w:b/>
-                <w:bCs/>
-              </w:rPr>
-              <w:t xml:space="preserve">6m 41s</w:t>
-            </w:r>
-          </w:p>
-        </w:tc>
-        <w:tc>
-          <w:tcPr/>
-          <w:p>
-            <w:pPr>
-              <w:pStyle w:val="Compact"/>
-            </w:pPr>
-            <w:r>
-              <w:rPr>
-                <w:b/>
-                <w:bCs/>
-              </w:rPr>
-              <w:t xml:space="preserve">1330</w:t>
-            </w:r>
-          </w:p>
-        </w:tc>
-        <w:tc>
-          <w:tcPr/>
-          <w:p>
-            <w:pPr>
-              <w:pStyle w:val="Compact"/>
-            </w:pPr>
-            <w:r>
-              <w:t xml:space="preserve">—</w:t>
-            </w:r>
-          </w:p>
-        </w:tc>
-        <w:tc>
-          <w:tcPr/>
-          <w:p>
-            <w:pPr>
-              <w:pStyle w:val="Compact"/>
-            </w:pPr>
-            <w:r>
-              <w:rPr>
-                <w:b/>
-                <w:bCs/>
-              </w:rPr>
-              <w:t xml:space="preserve">8m 19s</w:t>
-            </w:r>
-          </w:p>
-        </w:tc>
-        <w:tc>
-          <w:tcPr/>
-          <w:p>
-            <w:pPr>
-              <w:pStyle w:val="Compact"/>
-            </w:pPr>
-            <w:r>
-              <w:rPr>
-                <w:b/>
-                <w:bCs/>
-              </w:rPr>
-              <w:t xml:space="preserve">1505</w:t>
-            </w:r>
-          </w:p>
-        </w:tc>
-        <w:tc>
-          <w:tcPr/>
-          <w:p>
-            <w:pPr>
-              <w:pStyle w:val="Compact"/>
-            </w:pPr>
-            <w:r>
-              <w:t xml:space="preserve">—</w:t>
             </w:r>
           </w:p>
         </w:tc>
@@ -2609,12 +2580,427 @@
       <w:pPr>
         <w:pStyle w:val="BodyText"/>
       </w:pPr>
-      <w:r>
-        <w:t xml:space="preserve">Differential abundance dominates wall time on both cohorts (32 % of total on B1, 40 % on B2), driven by the ALDEx2 Monte-Carlo loop scaling with feature count, sample count and pairwise-contrast count; the network stage is next-most expensive (~13–17 %) because Sankey assembly iterates over every gene–category mapping. Across the recorded stages, increasing the sample count from 18 to 32 and the pairwise-contrast count from 3 to 6 (B1 → B2) raised end-to-end runtime from 6m 41s to 8m 19s (+24 %), markedly sublinear in either axis and consistent with ALDEx2 still being the dominant path rather than per-sample fixed overhead. Peak R-process memory tracks the same monotone profile — climbing through the gene-element domains as the joint long-form</w:t>
-      </w:r>
-      <w:r>
-        <w:t xml:space="preserve"> </w:t>
-      </w:r>
+      <w:del w:id="100152" w:author="Reviewer" w:date="2026-06-25T17:36:12Z">
+        <w:r>
+          <w:delText xml:space="preserve">Differential</w:delText>
+        </w:r>
+      </w:del>
+      <w:ins w:id="100153" w:author="Reviewer" w:date="2026-06-25T17:36:12Z">
+        <w:r>
+          <w:t xml:space="preserve">Figure</w:t>
+        </w:r>
+      </w:ins>
+      <w:r>
+        <w:t xml:space="preserve"> </w:t>
+      </w:r>
+      <w:del w:id="100154" w:author="Reviewer" w:date="2026-06-25T17:36:12Z">
+        <w:r>
+          <w:delText xml:space="preserve">abundance</w:delText>
+        </w:r>
+      </w:del>
+      <w:ins w:id="100155" w:author="Reviewer" w:date="2026-06-25T17:36:12Z">
+        <w:r>
+          <w:t xml:space="preserve">2</w:t>
+        </w:r>
+      </w:ins>
+      <w:r>
+        <w:t xml:space="preserve"> </w:t>
+      </w:r>
+      <w:del w:id="100156" w:author="Reviewer" w:date="2026-06-25T17:36:12Z">
+        <w:r>
+          <w:delText xml:space="preserve">dominates</w:delText>
+        </w:r>
+      </w:del>
+      <w:ins w:id="100157" w:author="Reviewer" w:date="2026-06-25T17:36:12Z">
+        <w:r>
+          <w:t xml:space="preserve">shows</w:t>
+        </w:r>
+      </w:ins>
+      <w:r>
+        <w:t xml:space="preserve"> </w:t>
+      </w:r>
+      <w:del w:id="100158" w:author="Reviewer" w:date="2026-06-25T17:36:12Z">
+        <w:r>
+          <w:delText xml:space="preserve">wall</w:delText>
+        </w:r>
+      </w:del>
+      <w:ins w:id="100159" w:author="Reviewer" w:date="2026-06-25T17:36:12Z">
+        <w:r>
+          <w:t xml:space="preserve">the</w:t>
+        </w:r>
+      </w:ins>
+      <w:r>
+        <w:t xml:space="preserve"> </w:t>
+      </w:r>
+      <w:del w:id="100160" w:author="Reviewer" w:date="2026-06-25T17:36:12Z">
+        <w:r>
+          <w:delText xml:space="preserve">time</w:delText>
+        </w:r>
+      </w:del>
+      <w:ins w:id="100161" w:author="Reviewer" w:date="2026-06-25T17:36:12Z">
+        <w:r>
+          <w:t xml:space="preserve">performance profile. End-to-end runtime grew from 6m 41s</w:t>
+        </w:r>
+      </w:ins>
+      <w:r>
+        <w:t xml:space="preserve"> on </w:t>
+      </w:r>
+      <w:del w:id="100162" w:author="Reviewer" w:date="2026-06-25T17:36:12Z">
+        <w:r>
+          <w:delText xml:space="preserve">both</w:delText>
+        </w:r>
+      </w:del>
+      <w:ins w:id="100163" w:author="Reviewer" w:date="2026-06-25T17:36:12Z">
+        <w:r>
+          <w:t xml:space="preserve">B1</w:t>
+        </w:r>
+      </w:ins>
+      <w:r>
+        <w:t xml:space="preserve"> </w:t>
+      </w:r>
+      <w:del w:id="100164" w:author="Reviewer" w:date="2026-06-25T17:36:12Z">
+        <w:r>
+          <w:delText xml:space="preserve">cohorts</w:delText>
+        </w:r>
+      </w:del>
+      <w:ins w:id="100165" w:author="Reviewer" w:date="2026-06-25T17:36:12Z">
+        <w:r>
+          <w:t xml:space="preserve">to</w:t>
+        </w:r>
+      </w:ins>
+      <w:r>
+        <w:t xml:space="preserve"> </w:t>
+      </w:r>
+      <w:del w:id="100166" w:author="Reviewer" w:date="2026-06-25T17:36:12Z">
+        <w:r>
+          <w:delText xml:space="preserve">(32</w:delText>
+        </w:r>
+      </w:del>
+      <w:ins w:id="100167" w:author="Reviewer" w:date="2026-06-25T17:36:12Z">
+        <w:r>
+          <w:t xml:space="preserve">8m</w:t>
+        </w:r>
+      </w:ins>
+      <w:r>
+        <w:t xml:space="preserve"> </w:t>
+      </w:r>
+      <w:del w:id="100168" w:author="Reviewer" w:date="2026-06-25T17:36:12Z">
+        <w:r>
+          <w:delText xml:space="preserve">% of total</w:delText>
+        </w:r>
+      </w:del>
+      <w:ins w:id="100169" w:author="Reviewer" w:date="2026-06-25T17:36:12Z">
+        <w:r>
+          <w:t xml:space="preserve">19s</w:t>
+        </w:r>
+      </w:ins>
+      <w:r>
+        <w:t xml:space="preserve"> on </w:t>
+      </w:r>
+      <w:del w:id="100170" w:author="Reviewer" w:date="2026-06-25T17:36:12Z">
+        <w:r>
+          <w:delText xml:space="preserve">B1,</w:delText>
+        </w:r>
+      </w:del>
+      <w:ins w:id="100171" w:author="Reviewer" w:date="2026-06-25T17:36:12Z">
+        <w:r>
+          <w:t xml:space="preserve">B2</w:t>
+        </w:r>
+      </w:ins>
+      <w:r>
+        <w:t xml:space="preserve"> </w:t>
+      </w:r>
+      <w:del w:id="100172" w:author="Reviewer" w:date="2026-06-25T17:36:12Z">
+        <w:r>
+          <w:delText xml:space="preserve">40</w:delText>
+        </w:r>
+      </w:del>
+      <w:ins w:id="100173" w:author="Reviewer" w:date="2026-06-25T17:36:12Z">
+        <w:r>
+          <w:t xml:space="preserve">(+24</w:t>
+        </w:r>
+      </w:ins>
+      <w:r>
+        <w:t xml:space="preserve"> </w:t>
+      </w:r>
+      <w:del w:id="100174" w:author="Reviewer" w:date="2026-06-25T17:36:12Z">
+        <w:r>
+          <w:delText xml:space="preserve">%</w:delText>
+        </w:r>
+      </w:del>
+      <w:ins w:id="100175" w:author="Reviewer" w:date="2026-06-25T17:36:12Z">
+        <w:r>
+          <w:t xml:space="preserve">%,</w:t>
+        </w:r>
+      </w:ins>
+      <w:r>
+        <w:t xml:space="preserve"> </w:t>
+      </w:r>
+      <w:del w:id="100176" w:author="Reviewer" w:date="2026-06-25T17:36:12Z">
+        <w:r>
+          <w:delText xml:space="preserve">on</w:delText>
+        </w:r>
+      </w:del>
+      <w:ins w:id="100177" w:author="Reviewer" w:date="2026-06-25T17:36:12Z">
+        <w:r>
+          <w:t xml:space="preserve">sublinear</w:t>
+        </w:r>
+      </w:ins>
+      <w:r>
+        <w:t xml:space="preserve"> </w:t>
+      </w:r>
+      <w:del w:id="100178" w:author="Reviewer" w:date="2026-06-25T17:36:12Z">
+        <w:r>
+          <w:delText xml:space="preserve">B2),</w:delText>
+        </w:r>
+      </w:del>
+      <w:ins w:id="100179" w:author="Reviewer" w:date="2026-06-25T17:36:12Z">
+        <w:r>
+          <w:t xml:space="preserve">in</w:t>
+        </w:r>
+      </w:ins>
+      <w:r>
+        <w:t xml:space="preserve"> </w:t>
+      </w:r>
+      <w:del w:id="100180" w:author="Reviewer" w:date="2026-06-25T17:36:12Z">
+        <w:r>
+          <w:delText xml:space="preserve">driven by the ALDEx2 Monte-Carlo loop scaling with feature count,</w:delText>
+        </w:r>
+      </w:del>
+      <w:ins w:id="100181" w:author="Reviewer" w:date="2026-06-25T17:36:12Z">
+        <w:r>
+          <w:t xml:space="preserve">both</w:t>
+        </w:r>
+      </w:ins>
+      <w:r>
+        <w:t xml:space="preserve"> sample count and pairwise-contrast </w:t>
+      </w:r>
+      <w:del w:id="100182" w:author="Reviewer" w:date="2026-06-25T17:36:12Z">
+        <w:r>
+          <w:delText xml:space="preserve">count;</w:delText>
+        </w:r>
+      </w:del>
+      <w:ins w:id="100183" w:author="Reviewer" w:date="2026-06-25T17:36:12Z">
+        <w:r>
+          <w:t xml:space="preserve">count),</w:t>
+        </w:r>
+      </w:ins>
+      <w:r>
+        <w:t xml:space="preserve"> </w:t>
+      </w:r>
+      <w:del w:id="100184" w:author="Reviewer" w:date="2026-06-25T17:36:12Z">
+        <w:r>
+          <w:delText xml:space="preserve">the</w:delText>
+        </w:r>
+      </w:del>
+      <w:ins w:id="100185" w:author="Reviewer" w:date="2026-06-25T17:36:12Z">
+        <w:r>
+          <w:t xml:space="preserve">dominated</w:t>
+        </w:r>
+      </w:ins>
+      <w:r>
+        <w:t xml:space="preserve"> </w:t>
+      </w:r>
+      <w:del w:id="100186" w:author="Reviewer" w:date="2026-06-25T17:36:12Z">
+        <w:r>
+          <w:delText xml:space="preserve">network</w:delText>
+        </w:r>
+      </w:del>
+      <w:ins w:id="100187" w:author="Reviewer" w:date="2026-06-25T17:36:12Z">
+        <w:r>
+          <w:t xml:space="preserve">on</w:t>
+        </w:r>
+      </w:ins>
+      <w:r>
+        <w:t xml:space="preserve"> </w:t>
+      </w:r>
+      <w:del w:id="100188" w:author="Reviewer" w:date="2026-06-25T17:36:12Z">
+        <w:r>
+          <w:delText xml:space="preserve">stage</w:delText>
+        </w:r>
+      </w:del>
+      <w:ins w:id="100189" w:author="Reviewer" w:date="2026-06-25T17:36:12Z">
+        <w:r>
+          <w:t xml:space="preserve">both</w:t>
+        </w:r>
+      </w:ins>
+      <w:r>
+        <w:t xml:space="preserve"> </w:t>
+      </w:r>
+      <w:del w:id="100190" w:author="Reviewer" w:date="2026-06-25T17:36:12Z">
+        <w:r>
+          <w:delText xml:space="preserve">is</w:delText>
+        </w:r>
+      </w:del>
+      <w:ins w:id="100191" w:author="Reviewer" w:date="2026-06-25T17:36:12Z">
+        <w:r>
+          <w:t xml:space="preserve">cohorts</w:t>
+        </w:r>
+      </w:ins>
+      <w:r>
+        <w:t xml:space="preserve"> </w:t>
+      </w:r>
+      <w:del w:id="100192" w:author="Reviewer" w:date="2026-06-25T17:36:12Z">
+        <w:r>
+          <w:delText xml:space="preserve">next-most expensive (~13–17 %) because Sankey assembly iterates over every gene–category mapping. Across the recorded stages, increasing the sample count from 18 to 32 and the pairwise-contrast count from 3 to 6 (B1 → B2) raised end-to-end runtime from 6m 41s to 8m 19s (+24 %), markedly sublinear in either axis and consistent with</w:delText>
+        </w:r>
+      </w:del>
+      <w:ins w:id="100193" w:author="Reviewer" w:date="2026-06-25T17:36:12Z">
+        <w:r>
+          <w:t xml:space="preserve">by</w:t>
+        </w:r>
+      </w:ins>
+      <w:r>
+        <w:t xml:space="preserve"> ALDEx2 </w:t>
+      </w:r>
+      <w:del w:id="100194" w:author="Reviewer" w:date="2026-06-25T17:36:12Z">
+        <w:r>
+          <w:delText xml:space="preserve">still</w:delText>
+        </w:r>
+      </w:del>
+      <w:ins w:id="100195" w:author="Reviewer" w:date="2026-06-25T17:36:12Z">
+        <w:r>
+          <w:t xml:space="preserve">differential</w:t>
+        </w:r>
+      </w:ins>
+      <w:r>
+        <w:t xml:space="preserve"> </w:t>
+      </w:r>
+      <w:del w:id="100196" w:author="Reviewer" w:date="2026-06-25T17:36:12Z">
+        <w:r>
+          <w:delText xml:space="preserve">being</w:delText>
+        </w:r>
+      </w:del>
+      <w:ins w:id="100197" w:author="Reviewer" w:date="2026-06-25T17:36:12Z">
+        <w:r>
+          <w:t xml:space="preserve">abundance</w:t>
+        </w:r>
+      </w:ins>
+      <w:r>
+        <w:t xml:space="preserve"> </w:t>
+      </w:r>
+      <w:del w:id="100198" w:author="Reviewer" w:date="2026-06-25T17:36:12Z">
+        <w:r>
+          <w:delText xml:space="preserve">the</w:delText>
+        </w:r>
+      </w:del>
+      <w:ins w:id="100199" w:author="Reviewer" w:date="2026-06-25T17:36:12Z">
+        <w:r>
+          <w:t xml:space="preserve">(32</w:t>
+        </w:r>
+      </w:ins>
+      <w:r>
+        <w:t xml:space="preserve"> </w:t>
+      </w:r>
+      <w:del w:id="100200" w:author="Reviewer" w:date="2026-06-25T17:36:12Z">
+        <w:r>
+          <w:delText xml:space="preserve">dominant</w:delText>
+        </w:r>
+      </w:del>
+      <w:ins w:id="100201" w:author="Reviewer" w:date="2026-06-25T17:36:12Z">
+        <w:r>
+          <w:t xml:space="preserve">%</w:t>
+        </w:r>
+      </w:ins>
+      <w:r>
+        <w:t xml:space="preserve"> </w:t>
+      </w:r>
+      <w:del w:id="100202" w:author="Reviewer" w:date="2026-06-25T17:36:12Z">
+        <w:r>
+          <w:delText xml:space="preserve">path</w:delText>
+        </w:r>
+      </w:del>
+      <w:ins w:id="100203" w:author="Reviewer" w:date="2026-06-25T17:36:12Z">
+        <w:r>
+          <w:t xml:space="preserve">of</w:t>
+        </w:r>
+      </w:ins>
+      <w:r>
+        <w:t xml:space="preserve"> </w:t>
+      </w:r>
+      <w:del w:id="100204" w:author="Reviewer" w:date="2026-06-25T17:36:12Z">
+        <w:r>
+          <w:delText xml:space="preserve">rather</w:delText>
+        </w:r>
+      </w:del>
+      <w:ins w:id="100205" w:author="Reviewer" w:date="2026-06-25T17:36:12Z">
+        <w:r>
+          <w:t xml:space="preserve">B1</w:t>
+        </w:r>
+      </w:ins>
+      <w:r>
+        <w:t xml:space="preserve"> </w:t>
+      </w:r>
+      <w:del w:id="100206" w:author="Reviewer" w:date="2026-06-25T17:36:12Z">
+        <w:r>
+          <w:delText xml:space="preserve">than</w:delText>
+        </w:r>
+      </w:del>
+      <w:ins w:id="100207" w:author="Reviewer" w:date="2026-06-25T17:36:12Z">
+        <w:r>
+          <w:t xml:space="preserve">total,</w:t>
+        </w:r>
+      </w:ins>
+      <w:r>
+        <w:t xml:space="preserve"> </w:t>
+      </w:r>
+      <w:del w:id="100208" w:author="Reviewer" w:date="2026-06-25T17:36:12Z">
+        <w:r>
+          <w:delText xml:space="preserve">per-sample</w:delText>
+        </w:r>
+      </w:del>
+      <w:ins w:id="100209" w:author="Reviewer" w:date="2026-06-25T17:36:12Z">
+        <w:r>
+          <w:t xml:space="preserve">40</w:t>
+        </w:r>
+      </w:ins>
+      <w:r>
+        <w:t xml:space="preserve"> </w:t>
+      </w:r>
+      <w:del w:id="100210" w:author="Reviewer" w:date="2026-06-25T17:36:12Z">
+        <w:r>
+          <w:delText xml:space="preserve">fixed</w:delText>
+        </w:r>
+      </w:del>
+      <w:ins w:id="100211" w:author="Reviewer" w:date="2026-06-25T17:36:12Z">
+        <w:r>
+          <w:t xml:space="preserve">%</w:t>
+        </w:r>
+      </w:ins>
+      <w:r>
+        <w:t xml:space="preserve"> </w:t>
+      </w:r>
+      <w:del w:id="100212" w:author="Reviewer" w:date="2026-06-25T17:36:12Z">
+        <w:r>
+          <w:delText xml:space="preserve">overhead.</w:delText>
+        </w:r>
+      </w:del>
+      <w:ins w:id="100213" w:author="Reviewer" w:date="2026-06-25T17:36:12Z">
+        <w:r>
+          <w:t xml:space="preserve">of B2).</w:t>
+        </w:r>
+      </w:ins>
+      <w:r>
+        <w:t xml:space="preserve"> Peak R-process memory </w:t>
+      </w:r>
+      <w:del w:id="100214" w:author="Reviewer" w:date="2026-06-25T17:36:12Z">
+        <w:r>
+          <w:delText xml:space="preserve">tracks the same monotone profile — climbing</w:delText>
+        </w:r>
+      </w:del>
+      <w:ins w:id="100215" w:author="Reviewer" w:date="2026-06-25T17:36:12Z">
+        <w:r>
+          <w:t xml:space="preserve">climbs</w:t>
+        </w:r>
+      </w:ins>
+      <w:r>
+        <w:t xml:space="preserve"> through the gene-element domains as the joint </w:t>
+      </w:r>
+      <w:del w:id="100216" w:author="Reviewer" w:date="2026-06-25T17:36:12Z">
+        <w:r>
+          <w:delText xml:space="preserve">long-form </w:delText>
+        </w:r>
+      </w:del>
       <w:r>
         <w:rPr>
           <w:rStyle w:val="VerbatimChar"/>
@@ -2622,11 +3008,65 @@
         <w:t xml:space="preserve">(sample × gene)</w:t>
       </w:r>
       <w:r>
-        <w:t xml:space="preserve"> </w:t>
-      </w:r>
-      <w:r>
-        <w:t xml:space="preserve">tables grow (~1.0 GB plateau) and topping out during R/14 panel assembly (1.33 GB on B1, 1.51 GB on B2), where every domain’s PNGs and tables are loaded simultaneously to lay out the composite figures and write</w:t>
-      </w:r>
+        <w:t xml:space="preserve"> tables grow </w:t>
+      </w:r>
+      <w:del w:id="100217" w:author="Reviewer" w:date="2026-06-25T17:36:12Z">
+        <w:r>
+          <w:delText xml:space="preserve">(~1.0</w:delText>
+        </w:r>
+      </w:del>
+      <w:ins w:id="100218" w:author="Reviewer" w:date="2026-06-25T17:36:12Z">
+        <w:r>
+          <w:t xml:space="preserve">(~1</w:t>
+        </w:r>
+      </w:ins>
+      <w:r>
+        <w:t xml:space="preserve"> GB plateau) and </w:t>
+      </w:r>
+      <w:del w:id="100219" w:author="Reviewer" w:date="2026-06-25T17:36:12Z">
+        <w:r>
+          <w:delText xml:space="preserve">topping</w:delText>
+        </w:r>
+      </w:del>
+      <w:ins w:id="100220" w:author="Reviewer" w:date="2026-06-25T17:36:12Z">
+        <w:r>
+          <w:t xml:space="preserve">tops</w:t>
+        </w:r>
+      </w:ins>
+      <w:r>
+        <w:t xml:space="preserve"> out during R/14 panel assembly (1.33 GB on B1, 1.51 GB on </w:t>
+      </w:r>
+      <w:del w:id="100221" w:author="Reviewer" w:date="2026-06-25T17:36:12Z">
+        <w:r>
+          <w:delText xml:space="preserve">B2), where every domain's PNGs and tables are loaded simultaneously to lay out</w:delText>
+        </w:r>
+      </w:del>
+      <w:ins w:id="100222" w:author="Reviewer" w:date="2026-06-25T17:36:12Z">
+        <w:r>
+          <w:t xml:space="preserve">B2);</w:t>
+        </w:r>
+      </w:ins>
+      <w:r>
+        <w:t xml:space="preserve"> the</w:t>
+      </w:r>
+      <w:del w:id="100223" w:author="Reviewer" w:date="2026-06-25T17:36:12Z">
+        <w:r>
+          <w:delText xml:space="preserve"> composite figures and write </w:delText>
+        </w:r>
+      </w:del>
+      <w:del w:id="100224" w:author="Reviewer" w:date="2026-06-25T17:36:12Z">
+        <w:r>
+          <w:rPr>
+            <w:rStyle w:val="VerbatimChar"/>
+          </w:rPr>
+          <w:delText xml:space="preserve">supplementary_tables.xlsx</w:delText>
+        </w:r>
+      </w:del>
+      <w:del w:id="100225" w:author="Reviewer" w:date="2026-06-25T17:36:12Z">
+        <w:r>
+          <w:delText xml:space="preserve">. The</w:delText>
+        </w:r>
+      </w:del>
       <w:r>
         <w:t xml:space="preserve"> </w:t>
       </w:r>
@@ -2634,48 +3074,122 @@
         <w:rPr>
           <w:rStyle w:val="VerbatimChar"/>
         </w:rPr>
-        <w:t xml:space="preserve">supplementary_tables.xlsx</w:t>
-      </w:r>
-      <w:r>
-        <w:t xml:space="preserve">. The</w:t>
-      </w:r>
-      <w:r>
-        <w:t xml:space="preserve"> </w:t>
-      </w:r>
-      <w:r>
-        <w:rPr>
-          <w:rStyle w:val="VerbatimChar"/>
-        </w:rPr>
         <w:t xml:space="preserve">report</w:t>
       </w:r>
       <w:r>
-        <w:t xml:space="preserve"> </w:t>
-      </w:r>
-      <w:r>
-        <w:t xml:space="preserve">stage’s peak is comparatively modest (~0.6 GB) because the heavy lifting is delegated to the external Quarto process and is therefore not captured by the in-process gc() instrumentation. Figure 2 visualises the same numbers: panels A and B give the per-stage wall time and peak heap as paired bars (stages sorted by B2 runtime), and panels C and D show the cumulative trajectories in pipeline order, making the ALDEx2 inflection and the R/14 memory peak readable at a glance. Tabulated PERMANOVA and PERMDISP statistics for the per-domain stages (resistome, virulome, mobilome), per-metric KW p-values for alpha diversity, and all DAA per-pair feature tables are surfaced in the Quarto dashboard rather than reproduced here.</w:t>
-      </w:r>
-    </w:p>
-    <w:p>
-      <w:pPr>
-        <w:pStyle w:val="CaptionedFigure"/>
+        <w:t xml:space="preserve"> stage's </w:t>
+      </w:r>
+      <w:ins w:id="100226" w:author="Reviewer" w:date="2026-06-25T17:36:12Z">
+        <w:r>
+          <w:t xml:space="preserve">modest </w:t>
+        </w:r>
+      </w:ins>
+      <w:r>
+        <w:t xml:space="preserve">peak</w:t>
+      </w:r>
+      <w:del w:id="100227" w:author="Reviewer" w:date="2026-06-25T17:36:12Z">
+        <w:r>
+          <w:delText xml:space="preserve"> is comparatively modest</w:delText>
+        </w:r>
+      </w:del>
+      <w:r>
+        <w:t xml:space="preserve"> (~0.6 GB) </w:t>
+      </w:r>
+      <w:del w:id="100228" w:author="Reviewer" w:date="2026-06-25T17:36:12Z">
+        <w:r>
+          <w:delText xml:space="preserve">because</w:delText>
+        </w:r>
+      </w:del>
+      <w:ins w:id="100229" w:author="Reviewer" w:date="2026-06-25T17:36:12Z">
+        <w:r>
+          <w:t xml:space="preserve">reflects</w:t>
+        </w:r>
+      </w:ins>
+      <w:r>
+        <w:t xml:space="preserve"> </w:t>
+      </w:r>
+      <w:del w:id="100230" w:author="Reviewer" w:date="2026-06-25T17:36:12Z">
+        <w:r>
+          <w:delText xml:space="preserve">the heavy lifting is</w:delText>
+        </w:r>
+      </w:del>
+      <w:ins w:id="100231" w:author="Reviewer" w:date="2026-06-25T17:36:12Z">
+        <w:r>
+          <w:t xml:space="preserve">work</w:t>
+        </w:r>
+      </w:ins>
+      <w:r>
+        <w:t xml:space="preserve"> delegated to the external Quarto </w:t>
+      </w:r>
+      <w:del w:id="100232" w:author="Reviewer" w:date="2026-06-25T17:36:12Z">
+        <w:r>
+          <w:delText xml:space="preserve">process and is therefore not captured by the in-process gc() instrumentation. Figure 2 visualises the same numbers: panels A and B give the per-stage wall time and peak heap as paired bars (stages sorted by B2 runtime), and panels C and D show the cumulative trajectories in pipeline order, making the ALDEx2 inflection and the R/14 memory peak readable at a glance.</w:delText>
+        </w:r>
+      </w:del>
+      <w:ins w:id="100233" w:author="Reviewer" w:date="2026-06-25T17:36:12Z">
+        <w:r>
+          <w:t xml:space="preserve">process.</w:t>
+        </w:r>
+      </w:ins>
+      <w:r>
+        <w:t xml:space="preserve"> Tabulated PERMANOVA </w:t>
+      </w:r>
+      <w:del w:id="100234" w:author="Reviewer" w:date="2026-06-25T17:36:12Z">
+        <w:r>
+          <w:delText xml:space="preserve">and</w:delText>
+        </w:r>
+      </w:del>
+      <w:ins w:id="100235" w:author="Reviewer" w:date="2026-06-25T17:36:12Z">
+        <w:r>
+          <w:t xml:space="preserve">/</w:t>
+        </w:r>
+      </w:ins>
+      <w:r>
+        <w:t xml:space="preserve"> PERMDISP </w:t>
+      </w:r>
+      <w:del w:id="100236" w:author="Reviewer" w:date="2026-06-25T17:36:12Z">
+        <w:r>
+          <w:delText xml:space="preserve">statistics for the per-domain stages (resistome, virulome, mobilome),</w:delText>
+        </w:r>
+      </w:del>
+      <w:ins w:id="100237" w:author="Reviewer" w:date="2026-06-25T17:36:12Z">
+        <w:r>
+          <w:t xml:space="preserve">statistics,</w:t>
+        </w:r>
+      </w:ins>
+      <w:r>
+        <w:t xml:space="preserve"> per-metric KW p-values</w:t>
+      </w:r>
+      <w:del w:id="100238" w:author="Reviewer" w:date="2026-06-25T17:36:12Z">
+        <w:r>
+          <w:delText xml:space="preserve"> for alpha diversity,</w:delText>
+        </w:r>
+      </w:del>
+      <w:r>
+        <w:t xml:space="preserve"> and all DAA per-pair feature tables are surfaced in the Quarto dashboard rather than reproduced here.</w:t>
+      </w:r>
+    </w:p>
+    <w:p>
+      <w:pPr>
+        <w:pStyle w:val="BodyText"/>
       </w:pPr>
       <w:r>
         <w:drawing>
           <wp:inline>
             <wp:extent cx="5334000" cy="5614486"/>
             <wp:effectExtent b="0" l="0" r="0" t="0"/>
-            <wp:docPr descr="Figure 2. Pipeline performance on the two validation cohorts. (A) Per-stage wall time (log scale) and (B) peak R-process heap, both with stages sorted by B2 runtime. (C) Cumulative wall time and (D) running peak memory across the 15 stages in pipeline order. Numbers reproduce Table 1; both runs used identical pipeline commit eee122c, R 4.5.0 single thread, PERMANOVA 9999 permutations, ALDEx2 mc.samples = 128. B1 = chicken_batch1 (PC_JC_2024-11-29; n=18; 3 dietary groups). B2 = chicken_batch2 (JC_FL_2025-05-20; n=32; 4-level Treatment_Bird, block random effect, two declared negative controls). Source: generate_figure2.R." title="" id="16" name="Picture"/>
+            <wp:docPr descr="Figure 2. Pipeline performance on the two validation cohorts. (A) Per-stage wall time (log scale) and (B) peak R-process heap, both with stages sorted by B2 runtime. (C) Cumulative wall time and (D) running peak memory across the 15 stages in pipeline order. Both runs used identical pipeline commit eee122c, R 4.5.0 single thread, PERMANOVA 9999 permutations, ALDEx2 mc.samples = 128. B1 = chicken_batch1 (PC_JC_2024-11-29; n=18; 3 dietary groups). B2 = chicken_batch2 (JC_FL_2025-05-20; n=32; 4-level Treatment_Bird, block random effect, two declared negative controls). Source: generate_figure2.R." title="" id="18" name="Picture"/>
             <a:graphic>
               <a:graphicData uri="http://schemas.openxmlformats.org/drawingml/2006/picture">
                 <pic:pic>
                   <pic:nvPicPr>
-                    <pic:cNvPr descr="figure2_pipeline_performance.png" id="17" name="Picture"/>
+                    <pic:cNvPr descr="figure2_pipeline_performance.png" id="19" name="Picture"/>
                     <pic:cNvPicPr>
                       <a:picLocks noChangeArrowheads="1" noChangeAspect="1"/>
                     </pic:cNvPicPr>
                   </pic:nvPicPr>
                   <pic:blipFill>
-                    <a:blip r:embed="rId15"/>
+                    <a:blip r:embed="rId17"/>
                     <a:stretch>
                       <a:fillRect/>
                     </a:stretch>
@@ -2704,170 +3218,221 @@
     </w:p>
     <w:p>
       <w:pPr>
-        <w:pStyle w:val="ImageCaption"/>
-      </w:pPr>
-      <w:r>
-        <w:rPr>
-          <w:b/>
-          <w:bCs/>
-        </w:rPr>
-        <w:t xml:space="preserve">Figure 2.</w:t>
-      </w:r>
-      <w:r>
-        <w:t xml:space="preserve"> </w:t>
-      </w:r>
-      <w:r>
-        <w:t xml:space="preserve">Pipeline performance on the two validation cohorts. (A) Per-stage wall time (log scale) and (B) peak R-process heap, both with stages sorted by B2 runtime. (C) Cumulative wall time and (D) running peak memory across the 15 stages in pipeline order. Numbers reproduce Table 1; both runs used identical pipeline commit</w:t>
-      </w:r>
-      <w:r>
-        <w:t xml:space="preserve"> </w:t>
+        <w:pStyle w:val="BodyText"/>
+      </w:pPr>
+      <w:r>
+        <w:t xml:space="preserve">One expected and deliberate divergence concerns the resistome stage: the ground-truth </w:t>
       </w:r>
       <w:r>
         <w:rPr>
           <w:rStyle w:val="VerbatimChar"/>
         </w:rPr>
-        <w:t xml:space="preserve">eee122c</w:t>
-      </w:r>
-      <w:r>
-        <w:t xml:space="preserve">, R 4.5.0 single thread, PERMANOVA 9999 permutations, ALDEx2</w:t>
-      </w:r>
-      <w:r>
-        <w:t xml:space="preserve"> </w:t>
+        <w:t xml:space="preserve">cleanData.R</w:t>
+      </w:r>
+      <w:r>
+        <w:t xml:space="preserve"> mis-parses taxids carrying variant suffixes, dropping the corresponding ABRicate rows. R/02 fixes this parsing bug, so the pipeline retains 110 additional (sample, GENE) rows relative to the hand-edited output (</w:t>
       </w:r>
       <w:r>
         <w:rPr>
           <w:rStyle w:val="VerbatimChar"/>
         </w:rPr>
-        <w:t xml:space="preserve">mc.samples</w:t>
-      </w:r>
-      <w:r>
-        <w:t xml:space="preserve"> </w:t>
-      </w:r>
-      <w:r>
-        <w:t xml:space="preserve">= 128. B1 = chicken_batch1 (PC_JC_2024-11-29; n=18; 3 dietary groups). B2 = chicken_batch2 (JC_FL_2025-05-20; n=32; 4-level</w:t>
-      </w:r>
-      <w:r>
-        <w:t xml:space="preserve"> </w:t>
+        <w:t xml:space="preserve">scripts/diff_normdata.R</w:t>
+      </w:r>
+      <w:r>
+        <w:t xml:space="preserve"> on the 2026-06-23 B1 run: pipeline = 733 rows, ground truth = 623; 121 rows gained by the parsing fix, 11 rows present in the ground truth that the pipeline currently drops — concentrated in a handful of plasmid replicon and accessory resistance calls, queued for inspection rather than treated as a regression). Jaccard agreement on the </w:t>
       </w:r>
       <w:r>
         <w:rPr>
           <w:rStyle w:val="VerbatimChar"/>
         </w:rPr>
-        <w:t xml:space="preserve">Treatment_Bird</w:t>
-      </w:r>
-      <w:r>
-        <w:t xml:space="preserve">,</w:t>
-      </w:r>
-      <w:r>
-        <w:t xml:space="preserve"> </w:t>
+        <w:t xml:space="preserve">(sample, GENE)</w:t>
+      </w:r>
+      <w:r>
+        <w:t xml:space="preserve"> key set is 0.82. Across the other stages with directly comparable ground-truth artefacts, sample-set agreement is exact on alpha diversity (18 / 18), and Jaccard on the network </w:t>
+      </w:r>
+      <w:del w:id="100239" w:author="Reviewer" w:date="2026-06-25T17:36:12Z">
+        <w:r>
+          <w:delText xml:space="preserve">gephi</w:delText>
+        </w:r>
+      </w:del>
+      <w:ins w:id="100240" w:author="Reviewer" w:date="2026-06-25T17:36:12Z">
+        <w:r>
+          <w:t xml:space="preserve">Gephi</w:t>
+        </w:r>
+      </w:ins>
+      <w:r>
+        <w:t xml:space="preserve"> exports against the most-recent hand-edited snapshot is 0.85 (nodes) and 0.87 </w:t>
+      </w:r>
+      <w:del w:id="100241" w:author="Reviewer" w:date="2026-06-25T17:36:12Z">
+        <w:r>
+          <w:delText xml:space="preserve">(edges);</w:delText>
+        </w:r>
+      </w:del>
+      <w:ins w:id="100242" w:author="Reviewer" w:date="2026-06-25T17:36:12Z">
+        <w:r>
+          <w:t xml:space="preserve">(edges).</w:t>
+        </w:r>
+      </w:ins>
+      <w:r>
+        <w:t xml:space="preserve"> </w:t>
+      </w:r>
+      <w:del w:id="100243" w:author="Reviewer" w:date="2026-06-25T17:36:12Z">
+        <w:r>
+          <w:delText xml:space="preserve">per-stage</w:delText>
+        </w:r>
+      </w:del>
+      <w:ins w:id="100244" w:author="Reviewer" w:date="2026-06-25T17:36:12Z">
+        <w:r>
+          <w:t xml:space="preserve">Per-stage</w:t>
+        </w:r>
+      </w:ins>
+      <w:r>
+        <w:t xml:space="preserve"> </w:t>
+      </w:r>
+      <w:del w:id="100245" w:author="Reviewer" w:date="2026-06-25T17:36:12Z">
+        <w:r>
+          <w:delText xml:space="preserve">agreement</w:delText>
+        </w:r>
+      </w:del>
+      <w:ins w:id="100246" w:author="Reviewer" w:date="2026-06-25T17:36:12Z">
+        <w:r>
+          <w:t xml:space="preserve">comparison</w:t>
+        </w:r>
+      </w:ins>
+      <w:r>
+        <w:t xml:space="preserve"> against the remaining hand-edited artefacts </w:t>
+      </w:r>
+      <w:del w:id="100247" w:author="Reviewer" w:date="2026-06-25T17:36:12Z">
+        <w:r>
+          <w:delText xml:space="preserve">(taxonomy,</w:delText>
+        </w:r>
+      </w:del>
+      <w:ins w:id="100248" w:author="Reviewer" w:date="2026-06-25T17:36:12Z">
+        <w:r>
+          <w:t xml:space="preserve">— taxonomy,</w:t>
+        </w:r>
+      </w:ins>
+      <w:r>
+        <w:t xml:space="preserve"> beta </w:t>
+      </w:r>
+      <w:del w:id="100249" w:author="Reviewer" w:date="2026-06-25T17:36:12Z">
+        <w:r>
+          <w:delText xml:space="preserve">diversity,</w:delText>
+        </w:r>
+      </w:del>
+      <w:ins w:id="100250" w:author="Reviewer" w:date="2026-06-25T17:36:12Z">
+        <w:r>
+          <w:t xml:space="preserve">diversity and</w:t>
+        </w:r>
+      </w:ins>
+      <w:r>
+        <w:t xml:space="preserve"> differential </w:t>
+      </w:r>
+      <w:del w:id="100251" w:author="Reviewer" w:date="2026-06-25T17:36:12Z">
+        <w:r>
+          <w:delText xml:space="preserve">abundance)</w:delText>
+        </w:r>
+      </w:del>
+      <w:ins w:id="100252" w:author="Reviewer" w:date="2026-06-25T17:36:12Z">
+        <w:r>
+          <w:t xml:space="preserve">abundance —</w:t>
+        </w:r>
+      </w:ins>
+      <w:r>
+        <w:t xml:space="preserve"> is deferred to a separate validation effort. The Re-centrifuge column-slicing heuristic in R/02 is acknowledged as still coarse and is queued for rework; Table 1 will be re-derived once that change lands.</w:t>
+      </w:r>
+    </w:p>
+    <w:bookmarkEnd w:id="20"/>
+    <w:bookmarkStart w:id="21" w:name="X50c7748aa6d421f569a5daf2425c9e7043a6cad"/>
+    <w:p>
+      <w:pPr>
+        <w:pStyle w:val="Heading2"/>
+      </w:pPr>
+      <w:r>
+        <w:t xml:space="preserve">4 Conclusion</w:t>
+      </w:r>
+    </w:p>
+    <w:p>
+      <w:pPr>
+        <w:pStyle w:val="FirstParagraph"/>
+      </w:pPr>
+      <w:r>
+        <w:t xml:space="preserve">MERIDIAN </w:t>
+      </w:r>
+      <w:del w:id="100253" w:author="Reviewer" w:date="2026-06-25T17:36:12Z">
+        <w:r>
+          <w:delText xml:space="preserve">is an alpha-stage workflow that </w:delText>
+        </w:r>
+      </w:del>
+      <w:r>
+        <w:t xml:space="preserve">consolidates</w:t>
+      </w:r>
+      <w:del w:id="100254" w:author="Reviewer" w:date="2026-06-25T17:36:12Z">
+        <w:r>
+          <w:delText xml:space="preserve"> a</w:delText>
+        </w:r>
+      </w:del>
+      <w:r>
+        <w:t xml:space="preserve"> long-read shotgun metagenomics analysis — taxonomy, diversity, differential abundance, resistome, virulome, </w:t>
+      </w:r>
+      <w:del w:id="100255" w:author="Reviewer" w:date="2026-06-25T17:36:12Z">
+        <w:r>
+          <w:delText xml:space="preserve">mobilome,</w:delText>
+        </w:r>
+      </w:del>
+      <w:ins w:id="100256" w:author="Reviewer" w:date="2026-06-25T17:36:12Z">
+        <w:r>
+          <w:t xml:space="preserve">mobilome</w:t>
+        </w:r>
+      </w:ins>
+      <w:r>
+        <w:t xml:space="preserve"> and an integrated network view — into one configuration-driven R project with a single Quarto dashboard, a publication-panels stage and a downstream-readable </w:t>
       </w:r>
       <w:r>
         <w:rPr>
           <w:rStyle w:val="VerbatimChar"/>
         </w:rPr>
-        <w:t xml:space="preserve">block</w:t>
-      </w:r>
-      <w:r>
-        <w:t xml:space="preserve"> </w:t>
-      </w:r>
-      <w:r>
-        <w:t xml:space="preserve">random effect, two declared negative controls). Source:</w:t>
-      </w:r>
-      <w:r>
-        <w:t xml:space="preserve"> </w:t>
-      </w:r>
-      <w:r>
-        <w:rPr>
-          <w:rStyle w:val="VerbatimChar"/>
-        </w:rPr>
-        <w:t xml:space="preserve">generate_figure2.R</w:t>
-      </w:r>
-      <w:r>
-        <w:t xml:space="preserve">.</w:t>
-      </w:r>
-    </w:p>
-    <w:p>
-      <w:pPr>
-        <w:pStyle w:val="BodyText"/>
-      </w:pPr>
-      <w:r>
-        <w:t xml:space="preserve">One expected and deliberate divergence concerns the resistome stage: the ground-truth</w:t>
-      </w:r>
-      <w:r>
-        <w:t xml:space="preserve"> </w:t>
-      </w:r>
-      <w:r>
-        <w:rPr>
-          <w:rStyle w:val="VerbatimChar"/>
-        </w:rPr>
-        <w:t xml:space="preserve">cleanData.R</w:t>
-      </w:r>
-      <w:r>
-        <w:t xml:space="preserve"> </w:t>
-      </w:r>
-      <w:r>
-        <w:t xml:space="preserve">mis-parses taxids carrying variant suffixes, dropping the corresponding ABRicate rows. R/02 fixes this parsing bug, so the pipeline retains 110 additional (sample, GENE) rows relative to the hand-edited output (</w:t>
-      </w:r>
-      <w:r>
-        <w:rPr>
-          <w:rStyle w:val="VerbatimChar"/>
-        </w:rPr>
-        <w:t xml:space="preserve">scripts/diff_normdata.R</w:t>
-      </w:r>
-      <w:r>
-        <w:t xml:space="preserve"> </w:t>
-      </w:r>
-      <w:r>
-        <w:t xml:space="preserve">on the 2026-06-23 B1 run: pipeline = 733 rows, ground truth = 623; 121 rows gained by the parsing fix, 11 rows present in the ground truth that the pipeline currently drops — concentrated in a handful of plasmid replicon and accessory resistance calls, queued for inspection rather than treated as a regression). Jaccard agreement on the</w:t>
-      </w:r>
-      <w:r>
-        <w:t xml:space="preserve"> </w:t>
-      </w:r>
-      <w:r>
-        <w:rPr>
-          <w:rStyle w:val="VerbatimChar"/>
-        </w:rPr>
-        <w:t xml:space="preserve">(sample, GENE)</w:t>
-      </w:r>
-      <w:r>
-        <w:t xml:space="preserve"> </w:t>
-      </w:r>
-      <w:r>
-        <w:t xml:space="preserve">key set is 0.82. Across the other stages with directly comparable ground-truth artefacts, sample-set agreement is exact on alpha diversity (18 / 18), and Jaccard on the network gephi exports against the most-recent hand-edited snapshot is 0.85 (nodes) and 0.87 (edges); per-stage agreement against the remaining hand-edited artefacts (taxonomy, beta diversity, differential abundance) is deferred to a separate validation effort. The Re-centrifuge column-slicing heuristic in R/02 is acknowledged as still coarse and is queued for rework; Table 1 will be re-derived once that change lands.</w:t>
-      </w:r>
-    </w:p>
-    <w:bookmarkEnd w:id="18"/>
-    <w:bookmarkStart w:id="19" w:name="conclusion"/>
-    <w:p>
-      <w:pPr>
-        <w:pStyle w:val="Heading2"/>
-      </w:pPr>
-      <w:r>
-        <w:t xml:space="preserve">4 Conclusion</w:t>
-      </w:r>
-    </w:p>
-    <w:p>
-      <w:pPr>
-        <w:pStyle w:val="FirstParagraph"/>
-      </w:pPr>
-      <w:r>
-        <w:t xml:space="preserve">MERIDIAN is an alpha-stage workflow that consolidates a long-read shotgun metagenomics analysis — taxonomy, diversity, differential abundance, resistome, virulome, mobilome, and an integrated network view — into one configuration-driven R project with a single Quarto dashboard, a publication-panels stage and a downstream-readable</w:t>
-      </w:r>
-      <w:r>
-        <w:t xml:space="preserve"> </w:t>
-      </w:r>
-      <w:r>
-        <w:rPr>
-          <w:rStyle w:val="VerbatimChar"/>
-        </w:rPr>
         <w:t xml:space="preserve">manifest.json</w:t>
       </w:r>
       <w:r>
-        <w:t xml:space="preserve"> </w:t>
-      </w:r>
-      <w:r>
-        <w:t xml:space="preserve">contract. It is in active development and validation against real reference data is ongoing; we release it now to invite feedback from groups running comparable analyses and to encourage convergence on a shared, scriptable layout for long-read metagenomics studies.</w:t>
-      </w:r>
+        <w:t xml:space="preserve"> contract. It is in active </w:t>
+      </w:r>
+      <w:del w:id="100257" w:author="Reviewer" w:date="2026-06-25T17:36:12Z">
+        <w:r>
+          <w:delText xml:space="preserve">development and validation against real reference data is ongoing;</w:delText>
+        </w:r>
+      </w:del>
+      <w:ins w:id="100258" w:author="Reviewer" w:date="2026-06-25T17:36:12Z">
+        <w:r>
+          <w:t xml:space="preserve">development;</w:t>
+        </w:r>
+      </w:ins>
+      <w:r>
+        <w:t xml:space="preserve"> we release </w:t>
+      </w:r>
+      <w:del w:id="100259" w:author="Reviewer" w:date="2026-06-25T17:36:12Z">
+        <w:r>
+          <w:delText xml:space="preserve">it</w:delText>
+        </w:r>
+      </w:del>
+      <w:ins w:id="100260" w:author="Reviewer" w:date="2026-06-25T17:36:12Z">
+        <w:r>
+          <w:t xml:space="preserve">this alpha-stage workflow</w:t>
+        </w:r>
+      </w:ins>
+      <w:r>
+        <w:t xml:space="preserve"> now to invite feedback from groups running comparable </w:t>
+      </w:r>
+      <w:del w:id="100261" w:author="Reviewer" w:date="2026-06-25T17:36:12Z">
+        <w:r>
+          <w:delText xml:space="preserve">analyses and to encourage convergence on a shared, scriptable layout for long-read metagenomics studies.</w:delText>
+        </w:r>
+      </w:del>
+      <w:ins w:id="100262" w:author="Reviewer" w:date="2026-06-25T17:36:12Z">
+        <w:r>
+          <w:t xml:space="preserve">analyses.</w:t>
+        </w:r>
+      </w:ins>
     </w:p>
     <w:p>
       <w:r>
@@ -2933,7 +3498,7 @@
           <w:b/>
           <w:bCs/>
         </w:rPr>
-        <w:t xml:space="preserve">[Optional: compute providers — e.g. UWL / UCL HPC, cloud credits.]</w:t>
+        <w:t xml:space="preserve">[Optional: compute providers — e.g. UWL / UCL HPC, cloud credits.]</w:t>
       </w:r>
     </w:p>
     <w:p>
@@ -2979,8 +3544,8 @@
         </w:pict>
       </w:r>
     </w:p>
-    <w:bookmarkEnd w:id="19"/>
-    <w:bookmarkStart w:id="20" w:name="references"/>
+    <w:bookmarkEnd w:id="21"/>
+    <w:bookmarkStart w:id="26" w:name="references"/>
     <w:p>
       <w:pPr>
         <w:pStyle w:val="Heading2"/>
@@ -2994,7 +3559,7 @@
         <w:pStyle w:val="Compact"/>
         <w:numPr>
           <w:ilvl w:val="0"/>
-          <w:numId w:val="1002"/>
+          <w:numId w:val="1001"/>
         </w:numPr>
       </w:pPr>
       <w:r>
@@ -3022,14 +3587,30 @@
         <w:pStyle w:val="Compact"/>
         <w:numPr>
           <w:ilvl w:val="0"/>
-          <w:numId w:val="1002"/>
+          <w:numId w:val="1001"/>
         </w:numPr>
       </w:pPr>
-      <w:r>
-        <w:t xml:space="preserve">Wood DE, Salzberg SL. Kraken: ultrafast metagenomic sequence classification using exact alignments.</w:t>
-      </w:r>
-      <w:r>
-        <w:t xml:space="preserve"> </w:t>
+      <w:del w:id="100263" w:author="Reviewer" w:date="2026-06-25T17:36:12Z">
+        <w:r>
+          <w:delText xml:space="preserve">Wood DE, Salzberg SL. Kraken: ultrafast metagenomic sequence classification using exact alignments. </w:delText>
+        </w:r>
+      </w:del>
+      <w:del w:id="100264" w:author="Reviewer" w:date="2026-06-25T17:36:12Z">
+        <w:r>
+          <w:rPr>
+            <w:i/>
+            <w:iCs/>
+          </w:rPr>
+          <w:delText xml:space="preserve">Genome Biol</w:delText>
+        </w:r>
+      </w:del>
+      <w:del w:id="100265" w:author="Reviewer" w:date="2026-06-25T17:36:12Z">
+        <w:r>
+          <w:delText xml:space="preserve"> 2014;15:R46. doi:10.1186/gb-2014-15-3-r46. Kraken2: </w:delText>
+        </w:r>
+      </w:del>
+      <w:r>
+        <w:t xml:space="preserve">Wood DE, Lu J, Langmead B. Improved metagenomic analysis with Kraken 2. </w:t>
       </w:r>
       <w:r>
         <w:rPr>
@@ -3039,26 +3620,7 @@
         <w:t xml:space="preserve">Genome Biol</w:t>
       </w:r>
       <w:r>
-        <w:t xml:space="preserve"> </w:t>
-      </w:r>
-      <w:r>
-        <w:t xml:space="preserve">2014;15:R46. doi:10.1186/gb-2014-15-3-r46. Kraken2: Wood DE, Lu J, Langmead B. Improved metagenomic analysis with Kraken 2.</w:t>
-      </w:r>
-      <w:r>
-        <w:t xml:space="preserve"> </w:t>
-      </w:r>
-      <w:r>
-        <w:rPr>
-          <w:i/>
-          <w:iCs/>
-        </w:rPr>
-        <w:t xml:space="preserve">Genome Biol</w:t>
-      </w:r>
-      <w:r>
-        <w:t xml:space="preserve"> </w:t>
-      </w:r>
-      <w:r>
-        <w:t xml:space="preserve">2019;20:257. doi:10.1186/s13059-019-1891-0.</w:t>
+        <w:t xml:space="preserve"> 2019;20:257. doi:10.1186/s13059-019-1891-0.</w:t>
       </w:r>
     </w:p>
     <w:p>
@@ -3066,7 +3628,7 @@
         <w:pStyle w:val="Compact"/>
         <w:numPr>
           <w:ilvl w:val="0"/>
-          <w:numId w:val="1002"/>
+          <w:numId w:val="1001"/>
         </w:numPr>
       </w:pPr>
       <w:r>
@@ -3094,11 +3656,28 @@
         <w:pStyle w:val="Compact"/>
         <w:numPr>
           <w:ilvl w:val="0"/>
-          <w:numId w:val="1002"/>
+          <w:numId w:val="1001"/>
         </w:numPr>
       </w:pPr>
       <w:r>
-        <w:t xml:space="preserve">Seemann T. ABRicate: mass screening of contigs for antimicrobial and virulence genes. https://github.com/tseemann/abricate (accessed 2026-06-23).</w:t>
+        <w:t xml:space="preserve">Seemann T. ABRicate: mass screening of contigs for antimicrobial and virulence genes.</w:t>
+      </w:r>
+      <w:r>
+        <w:t xml:space="preserve"> </w:t>
+      </w:r>
+      <w:hyperlink r:id="rId22">
+        <w:r>
+          <w:rPr>
+            <w:rStyle w:val="Hyperlink"/>
+          </w:rPr>
+          <w:t xml:space="preserve">https://github.com/tseemann/abricate</w:t>
+        </w:r>
+      </w:hyperlink>
+      <w:r>
+        <w:t xml:space="preserve"> </w:t>
+      </w:r>
+      <w:r>
+        <w:t xml:space="preserve">(accessed 2026-06-23).</w:t>
       </w:r>
     </w:p>
     <w:p>
@@ -3106,14 +3685,19 @@
         <w:pStyle w:val="Compact"/>
         <w:numPr>
           <w:ilvl w:val="0"/>
-          <w:numId w:val="1002"/>
+          <w:numId w:val="1001"/>
         </w:numPr>
       </w:pPr>
       <w:r>
-        <w:t xml:space="preserve">Alcock BP, et al. CARD 2023: expanded curation, support for machine learning, and resistome prediction at the Comprehensive Antibiotic Resistance Database.</w:t>
-      </w:r>
-      <w:r>
-        <w:t xml:space="preserve"> </w:t>
+        <w:t xml:space="preserve">Alcock BP,</w:t>
+      </w:r>
+      <w:ins w:id="100266" w:author="Reviewer" w:date="2026-06-25T17:36:12Z">
+        <w:r>
+          <w:t xml:space="preserve"> Huynh W, Chalil R, Smith KW, Raphenya AR, Wlodarski MA,</w:t>
+        </w:r>
+      </w:ins>
+      <w:r>
+        <w:t xml:space="preserve"> et al. CARD 2023: expanded curation, support for machine learning, and resistome prediction at the Comprehensive Antibiotic Resistance Database. </w:t>
       </w:r>
       <w:r>
         <w:rPr>
@@ -3123,10 +3707,7 @@
         <w:t xml:space="preserve">Nucleic Acids Res</w:t>
       </w:r>
       <w:r>
-        <w:t xml:space="preserve"> </w:t>
-      </w:r>
-      <w:r>
-        <w:t xml:space="preserve">2023;51:D690–D699. doi:10.1093/nar/gkac920.</w:t>
+        <w:t xml:space="preserve"> 2023;51:D690–D699. doi:10.1093/nar/gkac920.</w:t>
       </w:r>
     </w:p>
     <w:p>
@@ -3134,7 +3715,7 @@
         <w:pStyle w:val="Compact"/>
         <w:numPr>
           <w:ilvl w:val="0"/>
-          <w:numId w:val="1002"/>
+          <w:numId w:val="1001"/>
         </w:numPr>
       </w:pPr>
       <w:r>
@@ -3162,14 +3743,19 @@
         <w:pStyle w:val="Compact"/>
         <w:numPr>
           <w:ilvl w:val="0"/>
-          <w:numId w:val="1002"/>
+          <w:numId w:val="1001"/>
         </w:numPr>
       </w:pPr>
       <w:r>
-        <w:t xml:space="preserve">Carattoli A, Zankari E, García-Fernández A, et al. In silico detection and typing of plasmids using PlasmidFinder and plasmid multilocus sequence typing.</w:t>
-      </w:r>
-      <w:r>
-        <w:t xml:space="preserve"> </w:t>
+        <w:t xml:space="preserve">Carattoli A, Zankari E, García-Fernández A,</w:t>
+      </w:r>
+      <w:ins w:id="100267" w:author="Reviewer" w:date="2026-06-25T17:36:12Z">
+        <w:r>
+          <w:t xml:space="preserve"> Voldby Larsen M, Lund O, Villa L,</w:t>
+        </w:r>
+      </w:ins>
+      <w:r>
+        <w:t xml:space="preserve"> et al. In silico detection and typing of plasmids using PlasmidFinder and plasmid multilocus sequence typing. </w:t>
       </w:r>
       <w:r>
         <w:rPr>
@@ -3179,10 +3765,7 @@
         <w:t xml:space="preserve">Antimicrob Agents Chemother</w:t>
       </w:r>
       <w:r>
-        <w:t xml:space="preserve"> </w:t>
-      </w:r>
-      <w:r>
-        <w:t xml:space="preserve">2014;58:3895–3903. doi:10.1128/AAC.02412-14.</w:t>
+        <w:t xml:space="preserve"> 2014;58:3895–3903. doi:10.1128/AAC.02412-14.</w:t>
       </w:r>
     </w:p>
     <w:p>
@@ -3190,7 +3773,7 @@
         <w:pStyle w:val="Compact"/>
         <w:numPr>
           <w:ilvl w:val="0"/>
-          <w:numId w:val="1002"/>
+          <w:numId w:val="1001"/>
         </w:numPr>
       </w:pPr>
       <w:r>
@@ -3218,11 +3801,19 @@
         <w:pStyle w:val="Compact"/>
         <w:numPr>
           <w:ilvl w:val="0"/>
-          <w:numId w:val="1002"/>
+          <w:numId w:val="1001"/>
         </w:numPr>
       </w:pPr>
       <w:r>
-        <w:t xml:space="preserve">Oksanen J, Simpson G, Blanchet F, Kindt R, Legendre P, Minchin P, O’Hara R, Solymos P, Stevens M, Szoecs E, Wagner H, et al. vegan: Community Ecology Package. R package version 2.7-3, 2026. doi:10.32614/CRAN.package.vegan.</w:t>
+        <w:t xml:space="preserve">Oksanen J, Simpson G, Blanchet F, Kindt R, Legendre P, Minchin P, </w:t>
+      </w:r>
+      <w:del w:id="100268" w:author="Reviewer" w:date="2026-06-25T17:36:12Z">
+        <w:r>
+          <w:delText xml:space="preserve">O'Hara R, Solymos P, Stevens M, Szoecs E, Wagner H, </w:delText>
+        </w:r>
+      </w:del>
+      <w:r>
+        <w:t xml:space="preserve">et al. vegan: Community Ecology Package. R package version 2.7-3, 2026. doi:10.32614/CRAN.package.vegan.</w:t>
       </w:r>
     </w:p>
     <w:p>
@@ -3230,7 +3821,7 @@
         <w:pStyle w:val="Compact"/>
         <w:numPr>
           <w:ilvl w:val="0"/>
-          <w:numId w:val="1002"/>
+          <w:numId w:val="1001"/>
         </w:numPr>
       </w:pPr>
       <w:r>
@@ -3258,14 +3849,37 @@
         <w:pStyle w:val="Compact"/>
         <w:numPr>
           <w:ilvl w:val="0"/>
-          <w:numId w:val="1002"/>
+          <w:numId w:val="1001"/>
         </w:numPr>
       </w:pPr>
       <w:r>
-        <w:t xml:space="preserve">Li Y, Gao Y, Liu X, Mao Y, Wang M, Qin Y, Zhang C, Chen Q, Ning K, Wang Z, Han M. Quantifying antibiotic resistome risks across environmental niches: the L-ARRAP for long-read metagenomic profiling.</w:t>
-      </w:r>
-      <w:r>
-        <w:t xml:space="preserve"> </w:t>
+        <w:t xml:space="preserve">Li Y, Gao Y, Liu X, Mao Y, Wang M, Qin Y, </w:t>
+      </w:r>
+      <w:del w:id="100269" w:author="Reviewer" w:date="2026-06-25T17:36:12Z">
+        <w:r>
+          <w:delText xml:space="preserve">Zhang</w:delText>
+        </w:r>
+      </w:del>
+      <w:ins w:id="100270" w:author="Reviewer" w:date="2026-06-25T17:36:12Z">
+        <w:r>
+          <w:t xml:space="preserve">et</w:t>
+        </w:r>
+      </w:ins>
+      <w:r>
+        <w:t xml:space="preserve"> </w:t>
+      </w:r>
+      <w:del w:id="100271" w:author="Reviewer" w:date="2026-06-25T17:36:12Z">
+        <w:r>
+          <w:delText xml:space="preserve">C, Chen Q, Ning K, Wang Z, Han M.</w:delText>
+        </w:r>
+      </w:del>
+      <w:ins w:id="100272" w:author="Reviewer" w:date="2026-06-25T17:36:12Z">
+        <w:r>
+          <w:t xml:space="preserve">al.</w:t>
+        </w:r>
+      </w:ins>
+      <w:r>
+        <w:t xml:space="preserve"> Quantifying antibiotic resistome risks across environmental niches: the L-ARRAP for long-read metagenomic profiling. </w:t>
       </w:r>
       <w:r>
         <w:rPr>
@@ -3275,10 +3889,7 @@
         <w:t xml:space="preserve">Brief Bioinform</w:t>
       </w:r>
       <w:r>
-        <w:t xml:space="preserve"> </w:t>
-      </w:r>
-      <w:r>
-        <w:t xml:space="preserve">2025;26(5):bbaf535. doi:10.1093/bib/bbaf535.</w:t>
+        <w:t xml:space="preserve"> 2025;26(5):bbaf535. doi:10.1093/bib/bbaf535.</w:t>
       </w:r>
     </w:p>
     <w:p>
@@ -3286,7 +3897,7 @@
         <w:pStyle w:val="Compact"/>
         <w:numPr>
           <w:ilvl w:val="0"/>
-          <w:numId w:val="1002"/>
+          <w:numId w:val="1001"/>
         </w:numPr>
       </w:pPr>
       <w:r>
@@ -3314,11 +3925,28 @@
         <w:pStyle w:val="Compact"/>
         <w:numPr>
           <w:ilvl w:val="0"/>
-          <w:numId w:val="1002"/>
+          <w:numId w:val="1001"/>
         </w:numPr>
       </w:pPr>
       <w:r>
-        <w:t xml:space="preserve">Allaire JJ, et al. Quarto. https://quarto.org (accessed 2026-06-23).</w:t>
+        <w:t xml:space="preserve">Allaire JJ, et al. Quarto.</w:t>
+      </w:r>
+      <w:r>
+        <w:t xml:space="preserve"> </w:t>
+      </w:r>
+      <w:hyperlink r:id="rId23">
+        <w:r>
+          <w:rPr>
+            <w:rStyle w:val="Hyperlink"/>
+          </w:rPr>
+          <w:t xml:space="preserve">https://quarto.org</w:t>
+        </w:r>
+      </w:hyperlink>
+      <w:r>
+        <w:t xml:space="preserve"> </w:t>
+      </w:r>
+      <w:r>
+        <w:t xml:space="preserve">(accessed 2026-06-23).</w:t>
       </w:r>
     </w:p>
     <w:p>
@@ -3326,11 +3954,25 @@
         <w:pStyle w:val="Compact"/>
         <w:numPr>
           <w:ilvl w:val="0"/>
-          <w:numId w:val="1002"/>
+          <w:numId w:val="1001"/>
         </w:numPr>
       </w:pPr>
       <w:r>
-        <w:t xml:space="preserve">R Core Team. R: A Language and Environment for Statistical Computing (version 4.5.0). R Foundation for Statistical Computing, Vienna, 2025. https://www.R-project.org/.</w:t>
+        <w:t xml:space="preserve">R Core Team. R: A Language and Environment for Statistical Computing (version 4.5.0). R Foundation for Statistical Computing, Vienna, 2025.</w:t>
+      </w:r>
+      <w:r>
+        <w:t xml:space="preserve"> </w:t>
+      </w:r>
+      <w:hyperlink r:id="rId24">
+        <w:r>
+          <w:rPr>
+            <w:rStyle w:val="Hyperlink"/>
+          </w:rPr>
+          <w:t xml:space="preserve">https://www.R-project.org/</w:t>
+        </w:r>
+      </w:hyperlink>
+      <w:r>
+        <w:t xml:space="preserve">.</w:t>
       </w:r>
     </w:p>
     <w:p>
@@ -3338,7 +3980,7 @@
         <w:pStyle w:val="Compact"/>
         <w:numPr>
           <w:ilvl w:val="0"/>
-          <w:numId w:val="1002"/>
+          <w:numId w:val="1001"/>
         </w:numPr>
       </w:pPr>
       <w:r>
@@ -3350,7 +3992,7 @@
         <w:pStyle w:val="Compact"/>
         <w:numPr>
           <w:ilvl w:val="0"/>
-          <w:numId w:val="1002"/>
+          <w:numId w:val="1001"/>
         </w:numPr>
       </w:pPr>
       <w:r>
@@ -3370,7 +4012,21 @@
         <w:t xml:space="preserve"> </w:t>
       </w:r>
       <w:r>
-        <w:t xml:space="preserve">2006;Complex Systems:1695. R package version 2.3.1; doi:10.5281/zenodo.7682609. https://igraph.org.</w:t>
+        <w:t xml:space="preserve">2006;Complex Systems:1695. R package version 2.3.1; doi:10.5281/zenodo.7682609.</w:t>
+      </w:r>
+      <w:r>
+        <w:t xml:space="preserve"> </w:t>
+      </w:r>
+      <w:hyperlink r:id="rId25">
+        <w:r>
+          <w:rPr>
+            <w:rStyle w:val="Hyperlink"/>
+          </w:rPr>
+          <w:t xml:space="preserve">https://igraph.org</w:t>
+        </w:r>
+      </w:hyperlink>
+      <w:r>
+        <w:t xml:space="preserve">.</w:t>
       </w:r>
     </w:p>
     <w:p>
@@ -3378,15 +4034,15 @@
         <w:pStyle w:val="Compact"/>
         <w:numPr>
           <w:ilvl w:val="0"/>
-          <w:numId w:val="1002"/>
+          <w:numId w:val="1001"/>
         </w:numPr>
       </w:pPr>
       <w:r>
         <w:t xml:space="preserve">Allaire JJ, Gandrud C, Russell K, Yetman C. networkD3: D3 JavaScript Network Graphs from R. R package version 0.4.1, 2025. doi:10.32614/CRAN.package.networkD3.</w:t>
       </w:r>
     </w:p>
-    <w:bookmarkEnd w:id="20"/>
-    <w:bookmarkEnd w:id="21"/>
+    <w:bookmarkEnd w:id="26"/>
+    <w:bookmarkEnd w:id="27"/>
     <w:sectPr>
       <w:footnotePr>
         <w:numRestart w:val="eachSect"/>
@@ -3497,91 +4153,6 @@
       </w:pPr>
     </w:lvl>
   </w:abstractNum>
-  <w:abstractNum w:abstractNumId="99431">
-    <w:nsid w:val="00A99431"/>
-    <w:multiLevelType w:val="multilevel"/>
-    <w:lvl w:ilvl="0">
-      <w:start w:val="1"/>
-      <w:numFmt w:val="decimal"/>
-      <w:lvlText w:val="(%1)"/>
-      <w:lvlJc w:val="left"/>
-      <w:pPr>
-        <w:ind w:left="720" w:hanging="360"/>
-      </w:pPr>
-    </w:lvl>
-    <w:lvl w:ilvl="1">
-      <w:start w:val="1"/>
-      <w:numFmt w:val="decimal"/>
-      <w:lvlText w:val="(%2)"/>
-      <w:lvlJc w:val="left"/>
-      <w:pPr>
-        <w:ind w:left="1440" w:hanging="360"/>
-      </w:pPr>
-    </w:lvl>
-    <w:lvl w:ilvl="2">
-      <w:start w:val="1"/>
-      <w:numFmt w:val="decimal"/>
-      <w:lvlText w:val="(%3)"/>
-      <w:lvlJc w:val="left"/>
-      <w:pPr>
-        <w:ind w:left="2160" w:hanging="360"/>
-      </w:pPr>
-    </w:lvl>
-    <w:lvl w:ilvl="3">
-      <w:start w:val="1"/>
-      <w:numFmt w:val="decimal"/>
-      <w:lvlText w:val="(%4)"/>
-      <w:lvlJc w:val="left"/>
-      <w:pPr>
-        <w:ind w:left="2880" w:hanging="360"/>
-      </w:pPr>
-    </w:lvl>
-    <w:lvl w:ilvl="4">
-      <w:start w:val="1"/>
-      <w:numFmt w:val="decimal"/>
-      <w:lvlText w:val="(%5)"/>
-      <w:lvlJc w:val="left"/>
-      <w:pPr>
-        <w:ind w:left="3600" w:hanging="360"/>
-      </w:pPr>
-    </w:lvl>
-    <w:lvl w:ilvl="5">
-      <w:start w:val="1"/>
-      <w:numFmt w:val="decimal"/>
-      <w:lvlText w:val="(%6)"/>
-      <w:lvlJc w:val="left"/>
-      <w:pPr>
-        <w:ind w:left="4320" w:hanging="360"/>
-      </w:pPr>
-    </w:lvl>
-    <w:lvl w:ilvl="6">
-      <w:start w:val="1"/>
-      <w:numFmt w:val="decimal"/>
-      <w:lvlText w:val="(%7)"/>
-      <w:lvlJc w:val="left"/>
-      <w:pPr>
-        <w:ind w:left="5040" w:hanging="360"/>
-      </w:pPr>
-    </w:lvl>
-    <w:lvl w:ilvl="7">
-      <w:start w:val="1"/>
-      <w:numFmt w:val="decimal"/>
-      <w:lvlText w:val="(%8)"/>
-      <w:lvlJc w:val="left"/>
-      <w:pPr>
-        <w:ind w:left="5760" w:hanging="360"/>
-      </w:pPr>
-    </w:lvl>
-    <w:lvl w:ilvl="8">
-      <w:start w:val="1"/>
-      <w:numFmt w:val="decimal"/>
-      <w:lvlText w:val="(%9)"/>
-      <w:lvlJc w:val="left"/>
-      <w:pPr>
-        <w:ind w:left="6480" w:hanging="360"/>
-      </w:pPr>
-    </w:lvl>
-  </w:abstractNum>
   <w:abstractNum w:abstractNumId="99411">
     <w:nsid w:val="00A99411"/>
     <w:multiLevelType w:val="multilevel"/>
@@ -3671,36 +4242,6 @@
     <w:abstractNumId w:val="990"/>
   </w:num>
   <w:num w:numId="1001">
-    <w:abstractNumId w:val="99431"/>
-    <w:lvlOverride w:ilvl="0">
-      <w:startOverride w:val="1"/>
-    </w:lvlOverride>
-    <w:lvlOverride w:ilvl="1">
-      <w:startOverride w:val="1"/>
-    </w:lvlOverride>
-    <w:lvlOverride w:ilvl="2">
-      <w:startOverride w:val="1"/>
-    </w:lvlOverride>
-    <w:lvlOverride w:ilvl="3">
-      <w:startOverride w:val="1"/>
-    </w:lvlOverride>
-    <w:lvlOverride w:ilvl="4">
-      <w:startOverride w:val="1"/>
-    </w:lvlOverride>
-    <w:lvlOverride w:ilvl="5">
-      <w:startOverride w:val="1"/>
-    </w:lvlOverride>
-    <w:lvlOverride w:ilvl="6">
-      <w:startOverride w:val="1"/>
-    </w:lvlOverride>
-    <w:lvlOverride w:ilvl="7">
-      <w:startOverride w:val="1"/>
-    </w:lvlOverride>
-    <w:lvlOverride w:ilvl="8">
-      <w:startOverride w:val="1"/>
-    </w:lvlOverride>
-  </w:num>
-  <w:num w:numId="1002">
     <w:abstractNumId w:val="99411"/>
     <w:lvlOverride w:ilvl="0">
       <w:startOverride w:val="1"/>

</xml_diff>

<commit_message>
docs(manuscript): replace .docx with hand-formatted fresh copy
The committed .docx had lost manual Word formatting from prior
pandoc md->docx re-renders. This commit replaces it with the
hand-formatted version Julio pasted into the directory.

Co-Authored-By: Claude Opus 4.7 <noreply@anthropic.com>
</commit_message>
<xml_diff>
--- a/docs/manuscript/applications_note.docx
+++ b/docs/manuscript/applications_note.docx
@@ -28,142 +28,85 @@
       <w:pPr>
         <w:pStyle w:val="BodyText"/>
         <w:jc w:val="both"/>
-        <w:rPr>
-          <w:lang w:val="es-ES"/>
-        </w:rPr>
-      </w:pPr>
-      <w:r>
-        <w:rPr>
-          <w:lang w:val="es-ES"/>
-        </w:rPr>
+      </w:pPr>
+      <w:r>
         <w:t>Julio C. Ortega Cambara</w:t>
       </w:r>
       <w:r>
         <w:rPr>
           <w:vertAlign w:val="superscript"/>
-          <w:lang w:val="es-ES"/>
         </w:rPr>
         <w:t>1</w:t>
       </w:r>
       <w:r>
-        <w:rPr>
-          <w:lang w:val="es-ES"/>
-        </w:rPr>
         <w:t xml:space="preserve">, </w:t>
       </w:r>
       <w:r>
-        <w:rPr>
-          <w:lang w:val="es-ES"/>
-        </w:rPr>
         <w:t>Piotr Cuber</w:t>
       </w:r>
       <w:r>
         <w:rPr>
           <w:vertAlign w:val="superscript"/>
-          <w:lang w:val="es-ES"/>
-        </w:rPr>
-        <w:t>4</w:t>
+        </w:rPr>
+        <w:t xml:space="preserve">4 </w:t>
+      </w:r>
+      <w:r>
+        <w:t>, Pedro Humberto Lebre</w:t>
       </w:r>
       <w:r>
         <w:rPr>
           <w:vertAlign w:val="superscript"/>
-          <w:lang w:val="es-ES"/>
-        </w:rPr>
-        <w:t xml:space="preserve"> </w:t>
-      </w:r>
-      <w:r>
-        <w:rPr>
-          <w:lang w:val="es-ES"/>
-        </w:rPr>
+        </w:rPr>
+        <w:t>1</w:t>
+      </w:r>
+      <w:r>
         <w:t xml:space="preserve">, </w:t>
       </w:r>
       <w:r>
-        <w:rPr>
-          <w:lang w:val="es-ES"/>
-        </w:rPr>
-        <w:t>Pedro Humberto Lebre</w:t>
+        <w:t>Raju Misra</w:t>
       </w:r>
       <w:r>
         <w:rPr>
           <w:vertAlign w:val="superscript"/>
-          <w:lang w:val="es-ES"/>
-        </w:rPr>
-        <w:t>1</w:t>
-      </w:r>
-      <w:r>
-        <w:rPr>
-          <w:lang w:val="es-ES"/>
-        </w:rPr>
+        </w:rPr>
+        <w:t>2</w:t>
+      </w:r>
+      <w:r>
+        <w:t>, Timothy D. McHugh</w:t>
+      </w:r>
+      <w:r>
+        <w:rPr>
+          <w:vertAlign w:val="superscript"/>
+        </w:rPr>
+        <w:t>3</w:t>
+      </w:r>
+      <w:r>
+        <w:t>, Sylvia Rofael</w:t>
+      </w:r>
+      <w:r>
+        <w:rPr>
+          <w:vertAlign w:val="superscript"/>
+        </w:rPr>
+        <w:t>3</w:t>
+      </w:r>
+      <w:r>
+        <w:t>, David Lowe</w:t>
+      </w:r>
+      <w:r>
+        <w:rPr>
+          <w:vertAlign w:val="superscript"/>
+        </w:rPr>
+        <w:t>3</w:t>
+      </w:r>
+      <w:r>
         <w:t xml:space="preserve">, </w:t>
       </w:r>
       <w:r>
-        <w:rPr>
-          <w:lang w:val="es-ES"/>
-        </w:rPr>
-        <w:t>Raju Misra</w:t>
+        <w:t>Hermine Mkrtchyan</w:t>
       </w:r>
       <w:r>
         <w:rPr>
           <w:vertAlign w:val="superscript"/>
-          <w:lang w:val="es-ES"/>
-        </w:rPr>
-        <w:t>2</w:t>
-      </w:r>
-      <w:r>
-        <w:rPr>
-          <w:lang w:val="es-ES"/>
-        </w:rPr>
-        <w:t>, Timothy D. McHugh</w:t>
-      </w:r>
-      <w:r>
-        <w:rPr>
-          <w:vertAlign w:val="superscript"/>
-          <w:lang w:val="es-ES"/>
-        </w:rPr>
-        <w:t>3</w:t>
-      </w:r>
-      <w:r>
-        <w:rPr>
-          <w:lang w:val="es-ES"/>
-        </w:rPr>
-        <w:t>, Sylvia Rofael</w:t>
-      </w:r>
-      <w:r>
-        <w:rPr>
-          <w:vertAlign w:val="superscript"/>
-          <w:lang w:val="es-ES"/>
-        </w:rPr>
-        <w:t>3</w:t>
-      </w:r>
-      <w:r>
-        <w:rPr>
-          <w:lang w:val="es-ES"/>
-        </w:rPr>
-        <w:t>, David Lowe</w:t>
-      </w:r>
-      <w:r>
-        <w:rPr>
-          <w:vertAlign w:val="superscript"/>
-          <w:lang w:val="es-ES"/>
-        </w:rPr>
-        <w:t>3</w:t>
-      </w:r>
-      <w:r>
-        <w:rPr>
-          <w:lang w:val="es-ES"/>
-        </w:rPr>
-        <w:t xml:space="preserve">, </w:t>
-      </w:r>
-      <w:r>
-        <w:rPr>
-          <w:lang w:val="es-ES"/>
-        </w:rPr>
-        <w:t>Hermine Mkrtchyan</w:t>
-      </w:r>
-      <w:r>
-        <w:rPr>
-          <w:vertAlign w:val="superscript"/>
-          <w:lang w:val="es-ES"/>
         </w:rPr>
         <w:t>1*</w:t>
       </w:r>
@@ -317,25 +260,13 @@
         <w:t>Metagenomic Evaluation of Resistance, Identity &amp; Diversity through Integrated Analysis of Nanopore sequencing</w:t>
       </w:r>
       <w:r>
-        <w:t xml:space="preserve">), </w:t>
-      </w:r>
-      <w:r>
-        <w:t>a</w:t>
-      </w:r>
-      <w:r>
-        <w:t xml:space="preserve"> modular R workflow that consumes</w:t>
+        <w:t>), a modular R workflow that consumes</w:t>
       </w:r>
       <w:r>
         <w:t xml:space="preserve"> bioinformatics tools</w:t>
       </w:r>
       <w:r>
-        <w:t xml:space="preserve"> outputs and produces a single Quarto HTML </w:t>
-      </w:r>
-      <w:r>
-        <w:t>dashboard,</w:t>
-      </w:r>
-      <w:r>
-        <w:t xml:space="preserve"> publication-ready composite figures and a supplementary tables workbook. The workflow covers decontamination, TPM normalisation, taxonomy, alpha/beta diversity with PERMANOVA, two-level ALDEx2 differential abundance, </w:t>
+        <w:t xml:space="preserve"> outputs and produces a single Quarto HTML dashboard, publication-ready composite figures and a supplementary tables workbook. The workflow covers decontamination, TPM normalisation, taxonomy, alpha/beta diversity with PERMANOVA, two-level ALDEx2 differential abundance, </w:t>
       </w:r>
       <w:r>
         <w:t>r</w:t>
@@ -380,10 +311,7 @@
         <w:t>manifest.json</w:t>
       </w:r>
       <w:r>
-        <w:t xml:space="preserve"> artefact </w:t>
-      </w:r>
-      <w:r>
-        <w:t>catalogue</w:t>
+        <w:t xml:space="preserve"> artefact catalogue</w:t>
       </w:r>
       <w:r>
         <w:t xml:space="preserve"> for downstream integration</w:t>
@@ -484,43 +412,19 @@
         <w:jc w:val="both"/>
       </w:pPr>
       <w:r>
-        <w:t xml:space="preserve">Long-read shotgun metagenomics (Oxford Nanopore, PacBio) is increasingly central to One Health surveillance, where threats intersect humans, animals and ecosystems [1]. </w:t>
-      </w:r>
-      <w:r>
-        <w:t xml:space="preserve">By profiling microbial communities and their functional genetic elements </w:t>
-      </w:r>
-      <w:r>
-        <w:t xml:space="preserve">in a single experiment, it </w:t>
+        <w:t xml:space="preserve">Long-read shotgun metagenomics (Oxford Nanopore, PacBio) is increasingly central to One Health surveillance, where threats intersect humans, animals and ecosystems [1]. By profiling microbial communities and their functional genetic elements in a single experiment, it </w:t>
       </w:r>
       <w:r>
         <w:t>links taxonomic identity to determinants of resistance, virulence, and mobility across environmental, clinical,</w:t>
       </w:r>
       <w:r>
-        <w:t xml:space="preserve"> and livestock </w:t>
-      </w:r>
-      <w:r>
-        <w:t>matrices.</w:t>
-      </w:r>
-      <w:r>
-        <w:t xml:space="preserve"> The downstream analysis stack is well established — Kraken2 [2] and Bracken [3] for taxonomic assignment and abundance estimation, ABRicate [4] </w:t>
-      </w:r>
-      <w:r>
-        <w:t>for screening antimicrobial resistance genes (ARGs), virulence factors</w:t>
+        <w:t xml:space="preserve"> and livestock matrices. The downstream analysis stack is well established — Kraken2 [2] and Bracken [3] for taxonomic assignment and abundance estimation, ABRicate [4] for screening antimicrobial resistance genes (ARGs), virulence factors</w:t>
       </w:r>
       <w:r>
         <w:t xml:space="preserve"> (VFs)</w:t>
       </w:r>
       <w:r>
-        <w:t xml:space="preserve"> and mobile genetic elements (MGEs) </w:t>
-      </w:r>
-      <w:r>
-        <w:t xml:space="preserve">against CARD [5], VFDB [6] and PlasmidFinder </w:t>
-      </w:r>
-      <w:r>
-        <w:t>[7],</w:t>
-      </w:r>
-      <w:r>
-        <w:t xml:space="preserve"> Re-centrifuge [8] for contamination </w:t>
+        <w:t xml:space="preserve"> and mobile genetic elements (MGEs) against CARD [5], VFDB [6] and PlasmidFinder [7], Re-centrifuge [8] for contamination </w:t>
       </w:r>
       <w:r>
         <w:t>assessment</w:t>
@@ -538,13 +442,7 @@
         <w:t xml:space="preserve">In practice, each new study is analysed by adapting a set of bespoke R scripts: hard-coded input paths, sample-identifier filters embedded as literal strings, per-study negative-control renames, and taxonomy fixes patched by row index. </w:t>
       </w:r>
       <w:r>
-        <w:t xml:space="preserve">Consequently, individual script copies diverge, and the lack of a shared interface prevents automated output logging. Comparing different </w:t>
-      </w:r>
-      <w:r>
-        <w:t>studies</w:t>
-      </w:r>
-      <w:r>
-        <w:t xml:space="preserve"> requires manual reconciliation of both code and data</w:t>
+        <w:t>Consequently, individual script copies diverge, and the lack of a shared interface prevents automated output logging. Comparing different studies requires manual reconciliation of both code and data</w:t>
       </w:r>
       <w:r>
         <w:t>. The reference cohort for the present work (</w:t>
@@ -583,13 +481,7 @@
         <w:jc w:val="both"/>
       </w:pPr>
       <w:r>
-        <w:t xml:space="preserve">We present an </w:t>
-      </w:r>
-      <w:r>
-        <w:t>alpha-stage</w:t>
-      </w:r>
-      <w:r>
-        <w:t xml:space="preserve"> R workflow that fills this gap. The tool is in active development; this note describes its design, current scope, and the real-data validation strategy we are using to harden each stage.</w:t>
+        <w:t>We present an alpha-stage R workflow that fills this gap. The tool is in active development; this note describes its design, current scope, and the real-data validation strategy we are using to harden each stage.</w:t>
       </w:r>
     </w:p>
     <w:p>
@@ -609,10 +501,7 @@
         <w:jc w:val="both"/>
       </w:pPr>
       <w:r>
-        <w:t xml:space="preserve">The workflow is a stand-alone R project, not an installable package. A single entry point </w:t>
-      </w:r>
-      <w:r>
-        <w:t>(</w:t>
+        <w:t>The workflow is a stand-alone R project, not an installable package. A single entry point (</w:t>
       </w:r>
       <w:r>
         <w:rPr>
@@ -678,10 +567,7 @@
         <w:t xml:space="preserve">which </w:t>
       </w:r>
       <w:r>
-        <w:t>runs last);</w:t>
-      </w:r>
-      <w:r>
-        <w:t xml:space="preserve"> a Quarto dashboard template (</w:t>
+        <w:t>runs last); a Quarto dashboard template (</w:t>
       </w:r>
       <w:r>
         <w:rPr>
@@ -850,7 +736,7 @@
           <w:sz w:val="22"/>
           <w:szCs w:val="22"/>
         </w:rPr>
-        <w:t xml:space="preserve">. </w:t>
+        <w:t>. MERIDIAN workflow. A single config.yaml drives fifteen R modules (R/00–R/14) that consume Kraken2/Bracken, ABRicate, Re-centrifuge, and sample metadata. After setup and decontamination (R/00–R/02), community analyses (R/04–R/08) and functional profiling against CARD, VFDB and PlasmidFinder (TPM in R/03, per-domain analyses in R/09–R/11) converge in a tripartite sample × taxon × gene network (R/12). R/12 fans out to a Quarto dashboard and a publication-panels stage (R/13); R/14 finally writes manifest.json (contract v1.2), a kind-tagged catalogue of every artefact</w:t>
       </w:r>
       <w:r>
         <w:rPr>
@@ -859,7 +745,7 @@
           <w:sz w:val="22"/>
           <w:szCs w:val="22"/>
         </w:rPr>
-        <w:t xml:space="preserve">MERIDIAN workflow. A single config.yaml drives fifteen R modules (R/00–R/14) </w:t>
+        <w:t xml:space="preserve"> produced</w:t>
       </w:r>
       <w:r>
         <w:rPr>
@@ -868,33 +754,6 @@
           <w:sz w:val="22"/>
           <w:szCs w:val="22"/>
         </w:rPr>
-        <w:t>that consume Kraken2/Bracken, ABRicate, Re-centrifuge,</w:t>
-      </w:r>
-      <w:r>
-        <w:rPr>
-          <w:i w:val="0"/>
-          <w:iCs/>
-          <w:sz w:val="22"/>
-          <w:szCs w:val="22"/>
-        </w:rPr>
-        <w:t xml:space="preserve"> and sample metadata. After setup and decontamination (R/00–R/02), community analyses (R/04–R/08) and functional profiling against CARD, VFDB and PlasmidFinder (TPM in R/03, per-domain analyses in R/09–R/11) converge in a tripartite sample × taxon × gene network (R/12). R/12 fans out to a Quarto dashboard and a publication-panels stage (R/13); R/14 finally writes manifest.json (contract v1.2), a kind-tagged catalogue of every artefact</w:t>
-      </w:r>
-      <w:r>
-        <w:rPr>
-          <w:i w:val="0"/>
-          <w:iCs/>
-          <w:sz w:val="22"/>
-          <w:szCs w:val="22"/>
-        </w:rPr>
-        <w:t xml:space="preserve"> produced</w:t>
-      </w:r>
-      <w:r>
-        <w:rPr>
-          <w:i w:val="0"/>
-          <w:iCs/>
-          <w:sz w:val="22"/>
-          <w:szCs w:val="22"/>
-        </w:rPr>
         <w:t>.</w:t>
       </w:r>
     </w:p>
@@ -1084,54 +943,25 @@
         <w:t>Community analyses</w:t>
       </w:r>
       <w:r>
-        <w:t xml:space="preserve"> (R/04–R/08) cover the standard taxonomic </w:t>
-      </w:r>
-      <w:r>
-        <w:t>toolkit. R/04–R/05 produce</w:t>
-      </w:r>
-      <w:r>
-        <w:t xml:space="preserve"> Venn diagrams and annotated heatmaps after a shared taxa-name </w:t>
-      </w:r>
-      <w:r>
-        <w:t>cleanup, plus</w:t>
-      </w:r>
-      <w:r>
-        <w:t xml:space="preserve"> top-N stacked-bar relative-abundance plots (static PNG and interactive plotly HTML) with paired total-count and sample-prevalence </w:t>
-      </w:r>
-      <w:r>
-        <w:t>panels.</w:t>
+        <w:t xml:space="preserve"> (R/04–R/08) cover the standard taxonomic toolkit. R/04–R/05 produce Venn diagrams and annotated heatmaps after a shared taxa-name cleanup, plus top-N stacked-bar relative-abundance plots (static PNG and interactive plotly HTML) with paired total-count and sample-prevalence panels. </w:t>
+      </w:r>
+      <w:r>
+        <w:t>A</w:t>
+      </w:r>
+      <w:r>
+        <w:t>lpha</w:t>
       </w:r>
       <w:r>
         <w:t xml:space="preserve"> </w:t>
       </w:r>
       <w:r>
-        <w:t>A</w:t>
-      </w:r>
-      <w:r>
-        <w:t>lpha</w:t>
-      </w:r>
-      <w:r>
-        <w:t xml:space="preserve"> </w:t>
-      </w:r>
-      <w:r>
         <w:t>diversity</w:t>
       </w:r>
       <w:r>
-        <w:t xml:space="preserve"> (</w:t>
-      </w:r>
-      <w:r>
-        <w:t>R/06</w:t>
-      </w:r>
-      <w:r>
-        <w:t xml:space="preserve">) reports Shannon, Simpson, richness, Pielou, and Fisher metrics with Kruskal-Wallis tests and violin/bar plots, preferring </w:t>
-      </w:r>
-      <w:proofErr w:type="gramStart"/>
-      <w:r>
-        <w:t>a pre</w:t>
-      </w:r>
-      <w:proofErr w:type="gramEnd"/>
-      <w:r>
-        <w:t>-computed indices CSV (e.g.,</w:t>
+        <w:t xml:space="preserve"> (R/06</w:t>
+      </w:r>
+      <w:r>
+        <w:t>) reports Shannon, Simpson, richness, Pielou, and Fisher metrics with Kruskal-Wallis tests and violin/bar plots, preferring a pre-computed indices CSV (e.g.,</w:t>
       </w:r>
       <w:r>
         <w:t xml:space="preserve"> Oxford Nanopore wf-metagenomics output) and falling back to </w:t>
@@ -1158,10 +988,7 @@
         <w:t>)</w:t>
       </w:r>
       <w:r>
-        <w:t xml:space="preserve"> computes</w:t>
-      </w:r>
-      <w:r>
-        <w:t xml:space="preserve"> PCoA on Hellinger-transformed Bray-Curtis distances with PERMANOVA (</w:t>
+        <w:t xml:space="preserve"> computes PCoA on Hellinger-transformed Bray-Curtis distances with PERMANOVA (</w:t>
       </w:r>
       <w:r>
         <w:rPr>
@@ -1179,25 +1006,10 @@
         <w:t>betadisper</w:t>
       </w:r>
       <w:r>
-        <w:t xml:space="preserve">) overlaid on the </w:t>
-      </w:r>
-      <w:r>
-        <w:t>ordination.</w:t>
-      </w:r>
-      <w:r>
-        <w:t xml:space="preserve"> ALDEx2 differential abundance</w:t>
-      </w:r>
-      <w:r>
-        <w:t xml:space="preserve"> (</w:t>
-      </w:r>
-      <w:r>
-        <w:t>R/08</w:t>
-      </w:r>
-      <w:r>
-        <w:t>)</w:t>
-      </w:r>
-      <w:r>
-        <w:t xml:space="preserve"> runs </w:t>
+        <w:t>) overlaid on the ordination. ALDEx2 differential abundance</w:t>
+      </w:r>
+      <w:r>
+        <w:t xml:space="preserve"> (R/08) runs </w:t>
       </w:r>
       <w:r>
         <w:t>at two levels — taxa (Bracken counts) and genes (ABRicate contig hits per (sample, GENE</w:t>
@@ -1355,10 +1167,7 @@
         <w:jc w:val="both"/>
       </w:pPr>
       <w:r>
-        <w:t xml:space="preserve">We are validating the pipeline against two real long-read chicken caecum metagenomics studies. </w:t>
-      </w:r>
-      <w:r>
-        <w:t>The reference cohort (</w:t>
+        <w:t>We are validating the pipeline against two real long-read chicken caecum metagenomics studies. The reference cohort (</w:t>
       </w:r>
       <w:r>
         <w:rPr>
@@ -1397,91 +1206,46 @@
         <w:t>1</w:t>
       </w:r>
       <w:r>
-        <w:t>,</w:t>
-      </w:r>
-      <w:r>
+        <w:t>, PC_JC_2024-11-29; 18 samples; 3 dietary groups — Dulse, Reference diet, Soyabean meal) has approximately 46 hand-edited R scripts and known-good figures and tables already in place, so each stage can be compared output-for-output against the corresponding ground-truth artefact. The scaling and feature-coverage cohort (</w:t>
+      </w:r>
+      <w:r>
+        <w:rPr>
+          <w:rStyle w:val="VerbatimChar"/>
+        </w:rPr>
+        <w:t>C</w:t>
+      </w:r>
+      <w:r>
+        <w:rPr>
+          <w:rStyle w:val="VerbatimChar"/>
+        </w:rPr>
+        <w:t>hicken</w:t>
+      </w:r>
+      <w:r>
+        <w:rPr>
+          <w:rStyle w:val="VerbatimChar"/>
+        </w:rPr>
+        <w:t xml:space="preserve"> b</w:t>
+      </w:r>
+      <w:r>
+        <w:rPr>
+          <w:rStyle w:val="VerbatimChar"/>
+        </w:rPr>
+        <w:t>atch</w:t>
+      </w:r>
+      <w:r>
+        <w:rPr>
+          <w:rStyle w:val="VerbatimChar"/>
+        </w:rPr>
         <w:t xml:space="preserve"> </w:t>
       </w:r>
       <w:r>
-        <w:t>PC_JC_2024-11-29;</w:t>
-      </w:r>
-      <w:r>
-        <w:t xml:space="preserve"> 18 samples; 3 dietary groups — </w:t>
-      </w:r>
-      <w:r>
-        <w:t>Dulse,</w:t>
-      </w:r>
-      <w:r>
-        <w:t xml:space="preserve"> Reference diet, Soyabean meal) </w:t>
-      </w:r>
-      <w:r>
-        <w:t>has</w:t>
-      </w:r>
-      <w:r>
-        <w:t xml:space="preserve"> approximately 46 hand-edited R scripts and known-good figures and tables already </w:t>
-      </w:r>
-      <w:r>
-        <w:t>in</w:t>
-      </w:r>
-      <w:r>
-        <w:t xml:space="preserve"> </w:t>
-      </w:r>
-      <w:r>
-        <w:t>place,</w:t>
-      </w:r>
-      <w:r>
-        <w:t xml:space="preserve"> so each stage can be compared output-for-output against the corresponding ground-truth artefact. </w:t>
-      </w:r>
-      <w:r>
-        <w:t>The scaling and feature-coverage cohort (</w:t>
-      </w:r>
-      <w:r>
-        <w:rPr>
-          <w:rStyle w:val="VerbatimChar"/>
-        </w:rPr>
-        <w:t>C</w:t>
-      </w:r>
-      <w:r>
-        <w:rPr>
-          <w:rStyle w:val="VerbatimChar"/>
-        </w:rPr>
-        <w:t>hicken</w:t>
-      </w:r>
-      <w:r>
-        <w:rPr>
-          <w:rStyle w:val="VerbatimChar"/>
-        </w:rPr>
-        <w:t xml:space="preserve"> b</w:t>
-      </w:r>
-      <w:r>
-        <w:rPr>
-          <w:rStyle w:val="VerbatimChar"/>
-        </w:rPr>
-        <w:t>atch</w:t>
-      </w:r>
-      <w:r>
-        <w:rPr>
-          <w:rStyle w:val="VerbatimChar"/>
-        </w:rPr>
-        <w:t xml:space="preserve"> </w:t>
-      </w:r>
-      <w:r>
         <w:rPr>
           <w:rStyle w:val="VerbatimChar"/>
         </w:rPr>
         <w:t>2</w:t>
       </w:r>
       <w:r>
-        <w:t>,</w:t>
-      </w:r>
-      <w:r>
-        <w:t xml:space="preserve"> </w:t>
-      </w:r>
-      <w:r>
-        <w:t>JC_FL_2025-05-20;</w:t>
-      </w:r>
-      <w:r>
-        <w:t xml:space="preserve"> 32 samples; 4-level composite </w:t>
+        <w:t xml:space="preserve">, JC_FL_2025-05-20; 32 samples; 4-level composite </w:t>
       </w:r>
       <w:r>
         <w:rPr>
@@ -1544,10 +1308,7 @@
         <w:t>peakRAM</w:t>
       </w:r>
       <w:r>
-        <w:t xml:space="preserve"> methodology) and prints a slowest-first breakdown to the run </w:t>
-      </w:r>
-      <w:r>
-        <w:t>log.</w:t>
+        <w:t xml:space="preserve"> methodology) and prints a slowest-first breakdown to the run log.</w:t>
       </w:r>
     </w:p>
     <w:p>
@@ -2349,10 +2110,7 @@
         <w:jc w:val="both"/>
       </w:pPr>
       <w:r>
-        <w:t>Across both cohorts</w:t>
-      </w:r>
-      <w:r>
-        <w:t xml:space="preserve"> (</w:t>
+        <w:t>Across both cohorts (</w:t>
       </w:r>
       <w:r>
         <w:rPr>
@@ -2362,31 +2120,7 @@
         <w:t>Table 1</w:t>
       </w:r>
       <w:r>
-        <w:t>)</w:t>
-      </w:r>
-      <w:r>
-        <w:t>, every enabled stage produced its expected primary artefact under identical settings.</w:t>
-      </w:r>
-      <w:r>
-        <w:t xml:space="preserve"> </w:t>
-      </w:r>
-      <w:r>
-        <w:t>Feature counts scale with cohort size and grouping complexity: B2 (n=32, 4-level `Treatment_Bird`) yields ~1.5–2× the resistome (648 vs 348</w:t>
-      </w:r>
-      <w:r>
-        <w:t xml:space="preserve"> </w:t>
-      </w:r>
-      <w:r>
-        <w:t xml:space="preserve">rows), virulome (492 vs 320) and mobilome (137 vs 65) rows of B1, with 53 vs 31 differentially abundant taxa across 6 vs 3 pairwise contrasts and a denser integrated network (576 edges/210 </w:t>
-      </w:r>
-      <w:r>
-        <w:t>nodes/modularity</w:t>
-      </w:r>
-      <w:r>
-        <w:t xml:space="preserve"> 0.40 vs 247/100/0.31). The pipeline closes cleanly on both runs, producing a contract-v1.2 `manifest.json` (~80–85 kB) and a Quarto HTML dashboard (~14–18 MB).</w:t>
-      </w:r>
-      <w:r>
-        <w:t xml:space="preserve"> </w:t>
+        <w:t xml:space="preserve">), every enabled stage produced its expected primary artefact under identical settings. Feature counts scale with cohort size and grouping complexity: B2 (n=32, 4-level `Treatment_Bird`) yields ~1.5–2× the resistome (648 vs 348 rows), virulome (492 vs 320) and mobilome (137 vs 65) rows of B1, with 53 vs 31 differentially abundant taxa across 6 vs 3 pairwise contrasts and a denser integrated network (576 edges/210 nodes/modularity 0.40 vs 247/100/0.31). The pipeline closes cleanly on both runs, producing a contract-v1.2 `manifest.json` (~80–85 kB) and a Quarto HTML dashboard (~14–18 MB). </w:t>
       </w:r>
       <w:r>
         <w:t>T</w:t>
@@ -2414,37 +2148,7 @@
         <w:t>e</w:t>
       </w:r>
       <w:r>
-        <w:t xml:space="preserve">nd-to-end runtime grew from 6m 41s on B1 to 8m 19s on B2 (+24 %, sublinear in both </w:t>
-      </w:r>
-      <w:r>
-        <w:t xml:space="preserve">sample count and pairwise-contrast </w:t>
-      </w:r>
-      <w:r>
-        <w:t>count),</w:t>
-      </w:r>
-      <w:r>
-        <w:t xml:space="preserve"> </w:t>
-      </w:r>
-      <w:r>
-        <w:t>dominated</w:t>
-      </w:r>
-      <w:r>
-        <w:t xml:space="preserve"> </w:t>
-      </w:r>
-      <w:r>
-        <w:t xml:space="preserve">on both cohorts by ALDEx2 differential abundance (32 % of B1 total, 40 % of B2). </w:t>
-      </w:r>
-      <w:r>
-        <w:t xml:space="preserve">Peak R-process memory </w:t>
-      </w:r>
-      <w:r>
-        <w:t>tracks the same monotone profile — climbing</w:t>
-      </w:r>
-      <w:r>
-        <w:t xml:space="preserve"> through the gene-element domains as the joint </w:t>
-      </w:r>
-      <w:r>
-        <w:t xml:space="preserve">long-form </w:t>
+        <w:t xml:space="preserve">nd-to-end runtime grew from 6m 41s on B1 to 8m 19s on B2 (+24 %, sublinear in both sample count and pairwise-contrast count), dominated on both cohorts by ALDEx2 differential abundance (32 % of B1 total, 40 % of B2). Peak R-process memory tracks the same monotone profile — climbing through the gene-element domains as the joint long-form </w:t>
       </w:r>
       <w:r>
         <w:rPr>
@@ -2453,31 +2157,13 @@
         <w:t>(sample × gene)</w:t>
       </w:r>
       <w:r>
-        <w:t xml:space="preserve"> tables grow </w:t>
-      </w:r>
-      <w:r>
-        <w:t>(~1</w:t>
-      </w:r>
-      <w:r>
-        <w:t xml:space="preserve"> GB plateau) and </w:t>
-      </w:r>
-      <w:r>
-        <w:t>tops</w:t>
-      </w:r>
-      <w:r>
-        <w:t xml:space="preserve"> out during R/1</w:t>
+        <w:t xml:space="preserve"> tables grow (~1 GB plateau) and tops out during R/1</w:t>
       </w:r>
       <w:r>
         <w:t>3</w:t>
       </w:r>
       <w:r>
-        <w:t xml:space="preserve"> panel assembly (1.33 GB on B1, 1.51 GB on </w:t>
-      </w:r>
-      <w:r>
-        <w:t>B2), where every domain's PNGs and tables are loaded simultaneously to lay out);</w:t>
-      </w:r>
-      <w:r>
-        <w:t xml:space="preserve"> the </w:t>
+        <w:t xml:space="preserve"> panel assembly (1.33 GB on B1, 1.51 GB on B2), where every domain's PNGs and tables are loaded simultaneously to lay out); the </w:t>
       </w:r>
       <w:r>
         <w:rPr>
@@ -2486,16 +2172,7 @@
         <w:t>report</w:t>
       </w:r>
       <w:r>
-        <w:t xml:space="preserve"> stage's </w:t>
-      </w:r>
-      <w:r>
-        <w:t xml:space="preserve">modest </w:t>
-      </w:r>
-      <w:r>
-        <w:t>peak</w:t>
-      </w:r>
-      <w:r>
-        <w:t xml:space="preserve"> (~0.6 GB) reflects work delegated to the external Quarto process.</w:t>
+        <w:t xml:space="preserve"> stage's modest peak (~0.6 GB) reflects work delegated to the external Quarto process.</w:t>
       </w:r>
     </w:p>
     <w:p>
@@ -2636,7 +2313,7 @@
           <w:sz w:val="22"/>
           <w:szCs w:val="22"/>
         </w:rPr>
-        <w:t xml:space="preserve">. </w:t>
+        <w:t>. Pipeline performance on the two validation cohorts. (A) Per-stage wall time (log scale) and (B) peak R-process heap, sorted by B2 runtime. (C) Cumulative wall time and (D) running peak memory in pipeline order. R 4.5.0 single-thread</w:t>
       </w:r>
       <w:r>
         <w:rPr>
@@ -2645,7 +2322,7 @@
           <w:sz w:val="22"/>
           <w:szCs w:val="22"/>
         </w:rPr>
-        <w:t>Pipeline performance on the two validation cohorts. (A) Per-stage wall time (log scale) and (B) peak R-process heap, sorted</w:t>
+        <w:t xml:space="preserve"> analysis</w:t>
       </w:r>
       <w:r>
         <w:rPr>
@@ -2654,7 +2331,7 @@
           <w:sz w:val="22"/>
           <w:szCs w:val="22"/>
         </w:rPr>
-        <w:t xml:space="preserve"> </w:t>
+        <w:t xml:space="preserve">, </w:t>
       </w:r>
       <w:r>
         <w:rPr>
@@ -2663,7 +2340,7 @@
           <w:sz w:val="22"/>
           <w:szCs w:val="22"/>
         </w:rPr>
-        <w:t>by B2 runtime. (C) Cumulative wall time and (D) running peak memory in pipeline order. R 4.5.0 single-thread</w:t>
+        <w:t xml:space="preserve">including </w:t>
       </w:r>
       <w:r>
         <w:rPr>
@@ -2672,7 +2349,7 @@
           <w:sz w:val="22"/>
           <w:szCs w:val="22"/>
         </w:rPr>
-        <w:t xml:space="preserve"> analysis</w:t>
+        <w:t xml:space="preserve">PERMANOVA 9999 permutations, ALDEx2 `mc.samples` = 128. B1 = </w:t>
       </w:r>
       <w:r>
         <w:rPr>
@@ -2681,7 +2358,7 @@
           <w:sz w:val="22"/>
           <w:szCs w:val="22"/>
         </w:rPr>
-        <w:t xml:space="preserve">, </w:t>
+        <w:t>C</w:t>
       </w:r>
       <w:r>
         <w:rPr>
@@ -2690,7 +2367,7 @@
           <w:sz w:val="22"/>
           <w:szCs w:val="22"/>
         </w:rPr>
-        <w:t xml:space="preserve">including </w:t>
+        <w:t>hicken</w:t>
       </w:r>
       <w:r>
         <w:rPr>
@@ -2699,7 +2376,7 @@
           <w:sz w:val="22"/>
           <w:szCs w:val="22"/>
         </w:rPr>
-        <w:t xml:space="preserve">PERMANOVA 9999 permutations, ALDEx2 `mc.samples` = 128. B1 = </w:t>
+        <w:t xml:space="preserve"> </w:t>
       </w:r>
       <w:r>
         <w:rPr>
@@ -2708,7 +2385,7 @@
           <w:sz w:val="22"/>
           <w:szCs w:val="22"/>
         </w:rPr>
-        <w:t>C</w:t>
+        <w:t>batch</w:t>
       </w:r>
       <w:r>
         <w:rPr>
@@ -2717,7 +2394,7 @@
           <w:sz w:val="22"/>
           <w:szCs w:val="22"/>
         </w:rPr>
-        <w:t>hicken</w:t>
+        <w:t xml:space="preserve"> </w:t>
       </w:r>
       <w:r>
         <w:rPr>
@@ -2726,7 +2403,7 @@
           <w:sz w:val="22"/>
           <w:szCs w:val="22"/>
         </w:rPr>
-        <w:t xml:space="preserve"> </w:t>
+        <w:t xml:space="preserve">1 (n=18, 3 dietary groups); B2 = </w:t>
       </w:r>
       <w:r>
         <w:rPr>
@@ -2735,7 +2412,7 @@
           <w:sz w:val="22"/>
           <w:szCs w:val="22"/>
         </w:rPr>
-        <w:t>batch</w:t>
+        <w:t>C</w:t>
       </w:r>
       <w:r>
         <w:rPr>
@@ -2744,7 +2421,7 @@
           <w:sz w:val="22"/>
           <w:szCs w:val="22"/>
         </w:rPr>
-        <w:t xml:space="preserve"> </w:t>
+        <w:t>hicken</w:t>
       </w:r>
       <w:r>
         <w:rPr>
@@ -2753,7 +2430,7 @@
           <w:sz w:val="22"/>
           <w:szCs w:val="22"/>
         </w:rPr>
-        <w:t xml:space="preserve">1 (n=18, 3 dietary groups); B2 = </w:t>
+        <w:t xml:space="preserve"> </w:t>
       </w:r>
       <w:r>
         <w:rPr>
@@ -2762,7 +2439,7 @@
           <w:sz w:val="22"/>
           <w:szCs w:val="22"/>
         </w:rPr>
-        <w:t>C</w:t>
+        <w:t>batch</w:t>
       </w:r>
       <w:r>
         <w:rPr>
@@ -2771,7 +2448,7 @@
           <w:sz w:val="22"/>
           <w:szCs w:val="22"/>
         </w:rPr>
-        <w:t>hicken</w:t>
+        <w:t xml:space="preserve"> </w:t>
       </w:r>
       <w:r>
         <w:rPr>
@@ -2780,33 +2457,6 @@
           <w:sz w:val="22"/>
           <w:szCs w:val="22"/>
         </w:rPr>
-        <w:t xml:space="preserve"> </w:t>
-      </w:r>
-      <w:r>
-        <w:rPr>
-          <w:i w:val="0"/>
-          <w:iCs/>
-          <w:sz w:val="22"/>
-          <w:szCs w:val="22"/>
-        </w:rPr>
-        <w:t>batch</w:t>
-      </w:r>
-      <w:r>
-        <w:rPr>
-          <w:i w:val="0"/>
-          <w:iCs/>
-          <w:sz w:val="22"/>
-          <w:szCs w:val="22"/>
-        </w:rPr>
-        <w:t xml:space="preserve"> </w:t>
-      </w:r>
-      <w:r>
-        <w:rPr>
-          <w:i w:val="0"/>
-          <w:iCs/>
-          <w:sz w:val="22"/>
-          <w:szCs w:val="22"/>
-        </w:rPr>
         <w:t>2 (n=32, 4-level `Treatment_Bird`, `block` random effect, two negative controls)</w:t>
       </w:r>
     </w:p>
@@ -2818,19 +2468,11 @@
       <w:r>
         <w:t xml:space="preserve">One expected and deliberate divergence concerns the resistome stage: the ground-truth </w:t>
       </w:r>
-      <w:proofErr w:type="gramStart"/>
-      <w:r>
-        <w:rPr>
-          <w:rStyle w:val="VerbatimChar"/>
-        </w:rPr>
-        <w:t>cleanData</w:t>
-      </w:r>
-      <w:proofErr w:type="gramEnd"/>
-      <w:r>
-        <w:rPr>
-          <w:rStyle w:val="VerbatimChar"/>
-        </w:rPr>
-        <w:t>.R</w:t>
+      <w:r>
+        <w:rPr>
+          <w:rStyle w:val="VerbatimChar"/>
+        </w:rPr>
+        <w:t>cleanData.R</w:t>
       </w:r>
       <w:r>
         <w:t xml:space="preserve"> </w:t>
@@ -2867,10 +2509,7 @@
         <w:t>for alpha diversity (18/18), and Jaccard for the network Gephi exports against the most recent</w:t>
       </w:r>
       <w:r>
-        <w:t xml:space="preserve"> hand-edited snapshot is 0.85 (nodes) and 0.</w:t>
-      </w:r>
-      <w:r>
-        <w:t xml:space="preserve">87 (edges). Per-stage </w:t>
+        <w:t xml:space="preserve"> hand-edited snapshot is 0.85 (nodes) and 0.87 (edges). Per-stage </w:t>
       </w:r>
       <w:r>
         <w:t>comparisons against the remaining hand-edited artefacts — taxonomy, beta diversity, and differential abundance — are</w:t>
@@ -2898,7 +2537,13 @@
         <w:t xml:space="preserve">MERIDIAN consolidates long-read shotgun </w:t>
       </w:r>
       <w:r>
-        <w:t>metagenomics analysis — taxonomy, diversity, differential abundance, resistome, virulome, and an integrated network reconstruction — into one configuration-driven R project with a single Quarto dashboard, a publication-panels stage,</w:t>
+        <w:t>metagenomics analysis — taxonomy, diversity, differential abundance, resistome, virulome,</w:t>
+      </w:r>
+      <w:r>
+        <w:t xml:space="preserve"> mobilome</w:t>
+      </w:r>
+      <w:r>
+        <w:t xml:space="preserve"> and an integrated network reconstruction — into one configuration-driven R project with a single Quarto dashboard, a publication-panels stage,</w:t>
       </w:r>
       <w:r>
         <w:t xml:space="preserve"> and a downstream-readable </w:t>
@@ -2910,28 +2555,13 @@
         <w:t>manifest.json</w:t>
       </w:r>
       <w:r>
-        <w:t xml:space="preserve"> contract. It is in active </w:t>
-      </w:r>
-      <w:r>
-        <w:t>development;</w:t>
-      </w:r>
-      <w:r>
-        <w:t xml:space="preserve"> we </w:t>
+        <w:t xml:space="preserve"> contract. It is in active development; we </w:t>
       </w:r>
       <w:r>
         <w:t>are releasing</w:t>
       </w:r>
       <w:r>
-        <w:t xml:space="preserve"> </w:t>
-      </w:r>
-      <w:r>
-        <w:t>this alpha-stage workflow</w:t>
-      </w:r>
-      <w:r>
-        <w:t xml:space="preserve"> now to invite feedback from groups running comparable </w:t>
-      </w:r>
-      <w:r>
-        <w:t>analyses.</w:t>
+        <w:t xml:space="preserve"> this alpha-stage workflow now to invite feedback from groups running comparable analyses.</w:t>
       </w:r>
     </w:p>
     <w:p>

</xml_diff>

<commit_message>
docs(manuscript): restore hand-formatted .docx (710 kB)
Replaces the clobbered 642 kB version with the fresh hand-formatted
copy. Companion snapshot lives at docs/manuscript/_backup/
(gitignored) for local restore on future incidents.

The new pre-commit hook (.githooks/pre-commit, threshold 8%) would
have caught the prior 10% shrinkage — smoke-tested in this session.

Co-Authored-By: Claude Opus 4.7 <noreply@anthropic.com>
</commit_message>
<xml_diff>
--- a/docs/manuscript/applications_note.docx
+++ b/docs/manuscript/applications_note.docx
@@ -2534,34 +2534,40 @@
         <w:jc w:val="both"/>
       </w:pPr>
       <w:r>
-        <w:t xml:space="preserve">MERIDIAN consolidates long-read shotgun </w:t>
-      </w:r>
-      <w:r>
-        <w:t>metagenomics analysis — taxonomy, diversity, differential abundance, resistome, virulome,</w:t>
-      </w:r>
-      <w:r>
-        <w:t xml:space="preserve"> mobilome</w:t>
-      </w:r>
-      <w:r>
-        <w:t xml:space="preserve"> and an integrated network reconstruction — into one configuration-driven R project with a single Quarto dashboard, a publication-panels stage,</w:t>
-      </w:r>
-      <w:r>
-        <w:t xml:space="preserve"> and a downstream-readable </w:t>
-      </w:r>
-      <w:r>
-        <w:rPr>
-          <w:rStyle w:val="VerbatimChar"/>
-        </w:rPr>
-        <w:t>manifest.json</w:t>
-      </w:r>
-      <w:r>
-        <w:t xml:space="preserve"> contract. It is in active development; we </w:t>
-      </w:r>
-      <w:r>
-        <w:t>are releasing</w:t>
-      </w:r>
-      <w:r>
-        <w:t xml:space="preserve"> this alpha-stage workflow now to invite feedback from groups running comparable analyses.</w:t>
+        <w:t xml:space="preserve">MERIDIAN consolidates community analyses, functional profiling, and </w:t>
+      </w:r>
+      <w:r>
+        <w:t>integrated network reconstruction into a single</w:t>
+      </w:r>
+      <w:r>
+        <w:t xml:space="preserve"> configuration-driven R project for</w:t>
+      </w:r>
+      <w:r>
+        <w:t xml:space="preserve"> </w:t>
+      </w:r>
+      <w:r>
+        <w:rPr>
+          <w:rFonts w:hint="eastAsia"/>
+        </w:rPr>
+        <w:t>long-read shotgun metagenomics. Single-thread end-to-end execution completes in minutes with a low memory footprint, scaling sublinearly with cohort</w:t>
+      </w:r>
+      <w:r>
+        <w:t xml:space="preserve"> </w:t>
+      </w:r>
+      <w:r>
+        <w:rPr>
+          <w:rFonts w:hint="eastAsia"/>
+        </w:rPr>
+        <w:t>size and grouping complexity. It is in active development; we are releasing this alpha-stage workflow now to invite feedback from groups running</w:t>
+      </w:r>
+      <w:r>
+        <w:t xml:space="preserve"> </w:t>
+      </w:r>
+      <w:r>
+        <w:rPr>
+          <w:rFonts w:hint="eastAsia"/>
+        </w:rPr>
+        <w:t>comparable analyses.</w:t>
       </w:r>
     </w:p>
     <w:p>

</xml_diff>

<commit_message>
docs(manuscript): pin applications note to release v0.1.0
Availability paragraph cites the tagged release URL and pins the clone
command to --branch v0.1.0; Conclusion adds "(v0.1.0)" after
"alpha-stage workflow".

Co-Authored-By: Claude Opus 4.7 <noreply@anthropic.com>
</commit_message>
<xml_diff>
--- a/docs/manuscript/applications_note.docx
+++ b/docs/manuscript/applications_note.docx
@@ -344,22 +344,43 @@
         </w:r>
       </w:hyperlink>
       <w:r>
-        <w:t xml:space="preserve"> (MIT). Run with </w:t>
-      </w:r>
-      <w:r>
-        <w:rPr>
-          <w:rStyle w:val="VerbatimChar"/>
-        </w:rPr>
-        <w:t>git clone &lt;repo&gt; &amp;&amp; Rscript run_pipeline.R config.yaml</w:t>
+        <w:t xml:space="preserve"> (MIT). </w:t>
+      </w:r>
+      <w:r>
+        <w:t xml:space="preserve">This note describes release </w:t>
+      </w:r>
+      <w:r>
+        <w:rPr>
+          <w:b/>
+          <w:bCs/>
+        </w:rPr>
+        <w:t>v0.1.0</w:t>
+      </w:r>
+      <w:r>
+        <w:t xml:space="preserve"> (https://github.com/Julio92-C/Metagenomics_pipeline_automation/releases/tag/v0.1.0). Run with `git clone --branch v0.1.0</w:t>
+      </w:r>
+      <w:r>
+        <w:rPr>
+          <w:rStyle w:val="VerbatimChar"/>
+        </w:rPr>
+        <w:t xml:space="preserve"> &amp;&amp; Rscript run_pipeline.R config.yaml</w:t>
       </w:r>
       <w:r>
         <w:t xml:space="preserve"> after </w:t>
       </w:r>
-      <w:r>
-        <w:rPr>
-          <w:rStyle w:val="VerbatimChar"/>
-        </w:rPr>
-        <w:t>renv::restore()</w:t>
+      <w:proofErr w:type="gramStart"/>
+      <w:r>
+        <w:rPr>
+          <w:rStyle w:val="VerbatimChar"/>
+        </w:rPr>
+        <w:t>renv::</w:t>
+      </w:r>
+      <w:proofErr w:type="gramEnd"/>
+      <w:r>
+        <w:rPr>
+          <w:rStyle w:val="VerbatimChar"/>
+        </w:rPr>
+        <w:t>restore()</w:t>
       </w:r>
       <w:r>
         <w:t>.</w:t>
@@ -390,6 +411,7 @@
     </w:p>
     <w:p>
       <w:r>
+        <w:lastRenderedPageBreak/>
         <w:pict w14:anchorId="6230672F">
           <v:rect id="_x0000_i1026" style="width:0;height:1.5pt" o:hralign="center" o:hrstd="t" o:hr="t"/>
         </w:pict>
@@ -402,7 +424,6 @@
       <w:bookmarkStart w:id="2" w:name="Xe3d0fc0bea9a42ce7605565d0964033d7f6ee47"/>
       <w:bookmarkEnd w:id="1"/>
       <w:r>
-        <w:lastRenderedPageBreak/>
         <w:t>1 Introduction</w:t>
       </w:r>
     </w:p>
@@ -961,7 +982,15 @@
         <w:t xml:space="preserve"> (R/06</w:t>
       </w:r>
       <w:r>
-        <w:t>) reports Shannon, Simpson, richness, Pielou, and Fisher metrics with Kruskal-Wallis tests and violin/bar plots, preferring a pre-computed indices CSV (e.g.,</w:t>
+        <w:t xml:space="preserve">) reports Shannon, Simpson, richness, Pielou, and Fisher metrics with Kruskal-Wallis tests and violin/bar plots, preferring </w:t>
+      </w:r>
+      <w:proofErr w:type="gramStart"/>
+      <w:r>
+        <w:t>a pre</w:t>
+      </w:r>
+      <w:proofErr w:type="gramEnd"/>
+      <w:r>
+        <w:t>-computed indices CSV (e.g.,</w:t>
       </w:r>
       <w:r>
         <w:t xml:space="preserve"> Oxford Nanopore wf-metagenomics output) and falling back to </w:t>
@@ -1055,7 +1084,15 @@
         <w:t>PRODUCT</w:t>
       </w:r>
       <w:r>
-        <w:t xml:space="preserve"> field) and the mobilome (PlasmidFinder, with configurable replicon-family classification — Col-like, IncF, IncX, other Inc). Each domain emits its own alpha diversity, Venn diagram, gene- and category-level heatmaps, relative-abundance and total-count panels, and a PCoA + PERMANOVA + PERMDISP suite.</w:t>
+        <w:t xml:space="preserve"> field) and the mobilome (PlasmidFinder, with configurable replicon-family classification — Col-like, IncF, IncX, </w:t>
+      </w:r>
+      <w:proofErr w:type="gramStart"/>
+      <w:r>
+        <w:t>other</w:t>
+      </w:r>
+      <w:proofErr w:type="gramEnd"/>
+      <w:r>
+        <w:t xml:space="preserve"> Inc). Each domain emits its own alpha diversity, Venn diagram, gene- and category-level heatmaps, relative-abundance and total-count panels, and a PCoA + PERMANOVA + PERMDISP suite.</w:t>
       </w:r>
     </w:p>
     <w:p>
@@ -1281,7 +1318,15 @@
         <w:t>scripts/probe_taxid_parse.R</w:t>
       </w:r>
       <w:r>
-        <w:t xml:space="preserve">) provide numerical-diff and regression checks on the most error-prone intermediates, and </w:t>
+        <w:t xml:space="preserve">) provide numerical-diff and regression checks on the most error-prone </w:t>
+      </w:r>
+      <w:proofErr w:type="gramStart"/>
+      <w:r>
+        <w:t>intermediates, and</w:t>
+      </w:r>
+      <w:proofErr w:type="gramEnd"/>
+      <w:r>
+        <w:t xml:space="preserve"> </w:t>
       </w:r>
       <w:r>
         <w:rPr>
@@ -2468,11 +2513,19 @@
       <w:r>
         <w:t xml:space="preserve">One expected and deliberate divergence concerns the resistome stage: the ground-truth </w:t>
       </w:r>
-      <w:r>
-        <w:rPr>
-          <w:rStyle w:val="VerbatimChar"/>
-        </w:rPr>
-        <w:t>cleanData.R</w:t>
+      <w:proofErr w:type="gramStart"/>
+      <w:r>
+        <w:rPr>
+          <w:rStyle w:val="VerbatimChar"/>
+        </w:rPr>
+        <w:t>cleanData</w:t>
+      </w:r>
+      <w:proofErr w:type="gramEnd"/>
+      <w:r>
+        <w:rPr>
+          <w:rStyle w:val="VerbatimChar"/>
+        </w:rPr>
+        <w:t>.R</w:t>
       </w:r>
       <w:r>
         <w:t xml:space="preserve"> </w:t>
@@ -2534,13 +2587,13 @@
         <w:jc w:val="both"/>
       </w:pPr>
       <w:r>
-        <w:t xml:space="preserve">MERIDIAN consolidates community analyses, functional profiling, and </w:t>
-      </w:r>
-      <w:r>
-        <w:t>integrated network reconstruction into a single</w:t>
-      </w:r>
-      <w:r>
-        <w:t xml:space="preserve"> configuration-driven R project for</w:t>
+        <w:t xml:space="preserve">MERIDIAN consolidates community analyses, functional profiling, and integrated network reconstruction into a single configuration-driven R project for </w:t>
+      </w:r>
+      <w:r>
+        <w:rPr>
+          <w:rFonts w:hint="eastAsia"/>
+        </w:rPr>
+        <w:t>long-read shotgun metagenomics. Single-thread end-to-end execution completes in minutes with a low memory footprint, scaling sublinearly with cohort</w:t>
       </w:r>
       <w:r>
         <w:t xml:space="preserve"> </w:t>
@@ -2549,16 +2602,16 @@
         <w:rPr>
           <w:rFonts w:hint="eastAsia"/>
         </w:rPr>
-        <w:t>long-read shotgun metagenomics. Single-thread end-to-end execution completes in minutes with a low memory footprint, scaling sublinearly with cohort</w:t>
-      </w:r>
-      <w:r>
-        <w:t xml:space="preserve"> </w:t>
+        <w:t xml:space="preserve">size and grouping complexity. It is in active development; we are releasing this alpha-stage workflow </w:t>
+      </w:r>
+      <w:r>
+        <w:t xml:space="preserve">(v0.1.0) </w:t>
       </w:r>
       <w:r>
         <w:rPr>
           <w:rFonts w:hint="eastAsia"/>
         </w:rPr>
-        <w:t>size and grouping complexity. It is in active development; we are releasing this alpha-stage workflow now to invite feedback from groups running</w:t>
+        <w:t>now to invite feedback from groups running</w:t>
       </w:r>
       <w:r>
         <w:t xml:space="preserve"> </w:t>
@@ -3010,7 +3063,15 @@
         <w:jc w:val="both"/>
       </w:pPr>
       <w:r>
-        <w:t>Pedersen TL. ggraph: An Implementation of Grammar of Graphics for Graphs and Networks. R package version 2.2.2, 2025. doi:10.32614/CRAN.package.ggraph.</w:t>
+        <w:t xml:space="preserve">Pedersen TL. ggraph: An Implementation of </w:t>
+      </w:r>
+      <w:proofErr w:type="gramStart"/>
+      <w:r>
+        <w:t>Grammar of Graphics</w:t>
+      </w:r>
+      <w:proofErr w:type="gramEnd"/>
+      <w:r>
+        <w:t xml:space="preserve"> for Graphs and Networks. R package version 2.2.2, 2025. doi:10.32614/CRAN.package.ggraph.</w:t>
       </w:r>
     </w:p>
     <w:p>

</xml_diff>

<commit_message>
docs(manuscript): address Frontiers submission-checker flags + add container
- Trim abstract 281 -> 242 words to fit the 200-250 window (Background,
  Results, Availability tightened).
- Add Ethics Statement (ASPA 1986; batch 1 SRUC AEX 2024-021POU, batch 2
  SRUC AEX2025-006 POU; Home Office Schedule 1).
- Add Keywords block after the abstract.
- Cite the Docker/Apptainer container layer (abstract, Reporting, Data
  Availability); bump every version reference v0.1.0 -> v1.0.0 and drop
  the "alpha version" framing.
- Fill author ORCIDs.

All docx changes applied as tracked changes via the tracked-diff injector,
preserving hand-formatting.

Co-Authored-By: Claude Opus 4.8 <noreply@anthropic.com>
</commit_message>
<xml_diff>
--- a/docs/manuscript/applications_note.docx
+++ b/docs/manuscript/applications_note.docx
@@ -5,7 +5,6 @@
     <w:p>
       <w:pPr>
         <w:pStyle w:val="Heading1"/>
-        <w:jc w:val="both"/>
       </w:pPr>
       <w:bookmarkStart w:id="0" w:name="X84d9e160d30b1cd211371155645e81ef50bd748"/>
       <w:r>
@@ -27,158 +26,270 @@
     <w:p>
       <w:pPr>
         <w:pStyle w:val="BodyText"/>
-        <w:jc w:val="both"/>
-      </w:pPr>
-      <w:r>
-        <w:t>Julio C. Ortega Cambara</w:t>
-      </w:r>
-      <w:r>
-        <w:rPr>
-          <w:vertAlign w:val="superscript"/>
-        </w:rPr>
-        <w:t>1</w:t>
-      </w:r>
-      <w:r>
-        <w:t xml:space="preserve">, </w:t>
-      </w:r>
-      <w:r>
-        <w:t>Piotr Cuber</w:t>
-      </w:r>
-      <w:r>
-        <w:rPr>
-          <w:vertAlign w:val="superscript"/>
-        </w:rPr>
-        <w:t xml:space="preserve">4 </w:t>
-      </w:r>
-      <w:r>
-        <w:t>, Pedro Humberto Lebre</w:t>
-      </w:r>
-      <w:r>
-        <w:rPr>
-          <w:vertAlign w:val="superscript"/>
-        </w:rPr>
-        <w:t>1</w:t>
-      </w:r>
-      <w:r>
-        <w:t xml:space="preserve">, </w:t>
-      </w:r>
-      <w:r>
-        <w:t>Raju Misra</w:t>
-      </w:r>
-      <w:r>
-        <w:rPr>
-          <w:vertAlign w:val="superscript"/>
-        </w:rPr>
-        <w:t>2</w:t>
-      </w:r>
-      <w:r>
-        <w:t>, Timothy D. McHugh</w:t>
-      </w:r>
-      <w:r>
-        <w:rPr>
-          <w:vertAlign w:val="superscript"/>
-        </w:rPr>
-        <w:t>3</w:t>
-      </w:r>
-      <w:r>
-        <w:t>, Sylvia Rofael</w:t>
-      </w:r>
-      <w:r>
-        <w:rPr>
-          <w:vertAlign w:val="superscript"/>
-        </w:rPr>
-        <w:t>3</w:t>
-      </w:r>
-      <w:r>
-        <w:t>, David Lowe</w:t>
-      </w:r>
-      <w:r>
-        <w:rPr>
-          <w:vertAlign w:val="superscript"/>
-        </w:rPr>
-        <w:t>3</w:t>
-      </w:r>
-      <w:r>
-        <w:t xml:space="preserve">, </w:t>
-      </w:r>
-      <w:r>
-        <w:t>Hermine Mkrtchyan</w:t>
-      </w:r>
-      <w:r>
-        <w:rPr>
-          <w:vertAlign w:val="superscript"/>
-        </w:rPr>
-        <w:t>1*</w:t>
+      </w:pPr>
+      <w:r>
+        <w:t>Julio C. Ortega Cambara1, Piotr Cuber2, Pedro Humberto Lebre1, Hermine V Mkrtchyan1*</w:t>
       </w:r>
     </w:p>
     <w:p>
       <w:pPr>
         <w:pStyle w:val="BodyText"/>
-        <w:jc w:val="both"/>
-      </w:pPr>
-      <w:r>
-        <w:rPr>
-          <w:vertAlign w:val="superscript"/>
-        </w:rPr>
-        <w:t>1</w:t>
-      </w:r>
-      <w:r>
-        <w:t>School of Biomedical Science, University of West London, London, United Kingdom</w:t>
-      </w:r>
-      <w:r>
-        <w:t>,</w:t>
+      </w:pPr>
+      <w:r>
+        <w:t>1Centre for Innovation in Genomics and Microbiome Sciences, School of Medicine and Bioscience, University of West London, London, United Kingdom 2Natural History Museum, London, United Kingdom</w:t>
+      </w:r>
+    </w:p>
+    <w:p>
+      <w:pPr>
+        <w:pStyle w:val="BodyText"/>
+        <w:rPr>
+          <w:lang w:val="es-ES"/>
+        </w:rPr>
+      </w:pPr>
+      <w:r>
+        <w:rPr>
+          <w:lang w:val="es-ES"/>
+        </w:rPr>
+        <w:t xml:space="preserve">*Correspondence: Hermine Mkrtchyan — </w:t>
+      </w:r>
+      <w:hyperlink r:id="rId5">
+        <w:r>
+          <w:rPr>
+            <w:rStyle w:val="Hyperlink"/>
+            <w:lang w:val="es-ES"/>
+          </w:rPr>
+          <w:t>Hermine.Mkrtchyan@uwl.ac.uk</w:t>
+        </w:r>
+      </w:hyperlink>
+    </w:p>
+    <w:p>
+      <w:pPr>
+        <w:pStyle w:val="BodyText"/>
+        <w:rPr>
+          <w:lang w:val="es-ES"/>
+        </w:rPr>
+      </w:pPr>
+      <w:r>
+        <w:rPr>
+          <w:b/>
+          <w:lang w:val="es-ES"/>
+        </w:rPr>
+        <w:t>ORCIDs</w:t>
+      </w:r>
+    </w:p>
+    <w:p>
+      <w:pPr>
+        <w:pStyle w:val="BodyText"/>
+        <w:rPr>
+          <w:lang w:val="es-ES"/>
+        </w:rPr>
+      </w:pPr>
+      <w:r>
+        <w:rPr>
+          <w:lang w:val="es-ES"/>
+        </w:rPr>
+        <w:t>Julio C. Ortega Cambara — 0009-0008-5244-1373</w:t>
+      </w:r>
+    </w:p>
+    <w:p>
+      <w:pPr>
+        <w:pStyle w:val="BodyText"/>
+        <w:rPr>
+          <w:lang w:val="es-ES"/>
+        </w:rPr>
+      </w:pPr>
+      <w:r>
+        <w:rPr>
+          <w:lang w:val="es-ES"/>
+        </w:rPr>
+        <w:t>Piotr Cuber — 0000-0003-3186-1180</w:t>
+      </w:r>
+    </w:p>
+    <w:p>
+      <w:pPr>
+        <w:pStyle w:val="BodyText"/>
+        <w:rPr>
+          <w:lang w:val="es-ES"/>
+        </w:rPr>
+      </w:pPr>
+      <w:r>
+        <w:rPr>
+          <w:lang w:val="es-ES"/>
+        </w:rPr>
+        <w:t>Pedro Humberto Lebre — 0000-0002-6483-0340</w:t>
+      </w:r>
+    </w:p>
+    <w:p>
+      <w:pPr>
+        <w:pStyle w:val="BodyText"/>
+      </w:pPr>
+      <w:r>
+        <w:t>Hermine V Mkrtchyan — 0000-0001-7339-7297</w:t>
+      </w:r>
+    </w:p>
+    <w:p>
+      <w:r>
+        <w:pict w14:anchorId="1B1D2A2C">
+          <v:rect id="_x0000_i1025" style="width:0;height:1.5pt" o:hralign="center" o:hrstd="t" o:hr="t"/>
+        </w:pict>
+      </w:r>
+    </w:p>
+    <w:p>
+      <w:pPr>
+        <w:pStyle w:val="Heading2"/>
+      </w:pPr>
+      <w:bookmarkStart w:id="1" w:name="abstract"/>
+      <w:r>
+        <w:t>Abstract</w:t>
+      </w:r>
+    </w:p>
+    <w:p>
+      <w:pPr>
+        <w:pStyle w:val="FirstParagraph"/>
+      </w:pPr>
+      <w:r>
+        <w:rPr>
+          <w:b/>
+          <w:bCs/>
+        </w:rPr>
+        <w:t>Background:</w:t>
+      </w:r>
+      <w:r>
+        <w:t xml:space="preserve"> Long-read shotgun metagenomics studies are often analysed with project-specific collections of manually edited R scripts, requiring repeated changes to sample identifiers, taxonomic annotations and parameters, or else depend on resource-heavy pipelines needing high-performance computing (HPC) infrastructure. Existing R workflows focus predominantly on short-read amplicon data or isolated tasks such as resistome profiling, leaving a gap in integrated, reproducible solutions for long-read shotgun metagenomics and limiting scalability and cross-study comparison.</w:t>
+      </w:r>
+    </w:p>
+    <w:p>
+      <w:pPr>
+        <w:pStyle w:val="BodyText"/>
+      </w:pPr>
+      <w:r>
+        <w:rPr>
+          <w:b/>
+          <w:bCs/>
+        </w:rPr>
+        <w:t>Results:</w:t>
+      </w:r>
+      <w:r>
+        <w:t xml:space="preserve"> We present </w:t>
+      </w:r>
+      <w:r>
+        <w:rPr>
+          <w:b/>
+          <w:bCs/>
+        </w:rPr>
+        <w:t>MERIDIAN</w:t>
+      </w:r>
+      <w:r>
+        <w:t xml:space="preserve"> (</w:t>
+      </w:r>
+      <w:r>
+        <w:rPr>
+          <w:i/>
+          <w:iCs/>
+        </w:rPr>
+        <w:t>Metagenomic Evaluation of Resistance, Identity &amp; Diversity through Integrated Analysis of Nanopore sequencing</w:t>
+      </w:r>
+      <w:r>
+        <w:t xml:space="preserve">), a modular R workflow that standardises and automates downstream analysis of long-read metagenomic datasets. Consolidating outputs from established tools, it delivers a Quarto HTML dashboard, publication-ready figures and supplementary tables. Supported analyses span decontamination, TPM normalisation, taxonomic profiling, alpha and beta diversity with PERMANOVA, two-level ALDEx2 differential abundance testing, and functional profiling of antimicrobial resistance (AMR), virulence and mobile genetic element repertoires, together with a tripartite sample × taxon × gene network linking taxonomic composition to functional gene distributions. Execution is controlled through a single YAML configuration </w:t>
+      </w:r>
+      <w:r>
+        <w:lastRenderedPageBreak/>
+        <w:t xml:space="preserve">file without modifying source code, and each run emits a </w:t>
+      </w:r>
+      <w:r>
+        <w:rPr>
+          <w:rStyle w:val="VerbatimChar"/>
+        </w:rPr>
+        <w:t>manifest.json</w:t>
+      </w:r>
+      <w:r>
+        <w:t xml:space="preserve"> artefact catalogue supporting reproducibility and downstream integration.</w:t>
+      </w:r>
+    </w:p>
+    <w:p>
+      <w:pPr>
+        <w:pStyle w:val="BodyText"/>
+      </w:pPr>
+      <w:r>
+        <w:rPr>
+          <w:b/>
+          <w:bCs/>
+        </w:rPr>
+        <w:t>Availability and Implementation.</w:t>
+      </w:r>
+      <w:r>
+        <w:t xml:space="preserve"> MERIDIAN is implemented in R and distributed under the MIT licence, with a Docker/Apptainer image for reproducible deployment. This note describes release </w:t>
+      </w:r>
+      <w:r>
+        <w:rPr>
+          <w:b/>
+          <w:bCs/>
+        </w:rPr>
+        <w:t>v1.0.0</w:t>
+      </w:r>
+      <w:r>
+        <w:t xml:space="preserve"> available at </w:t>
+      </w:r>
+      <w:r>
+        <w:rPr>
+          <w:rStyle w:val="Hyperlink"/>
+        </w:rPr>
+        <w:t>https://github.com/Julio92-C/Metagenomics_pipeline_automation/releases/tag/v1.0.0</w:t>
+      </w:r>
+      <w:r>
+        <w:t xml:space="preserve">. Reproducible execution is supported through the R environment package </w:t>
+      </w:r>
+      <w:r>
+        <w:rPr>
+          <w:rStyle w:val="VerbatimChar"/>
+        </w:rPr>
+        <w:t>renv</w:t>
+      </w:r>
+      <w:r>
+        <w:t xml:space="preserve">; after restoring dependencies with </w:t>
+      </w:r>
+      <w:proofErr w:type="gramStart"/>
+      <w:r>
+        <w:rPr>
+          <w:rStyle w:val="VerbatimChar"/>
+        </w:rPr>
+        <w:t>renv::</w:t>
+      </w:r>
+      <w:proofErr w:type="gramEnd"/>
+      <w:r>
+        <w:rPr>
+          <w:rStyle w:val="VerbatimChar"/>
+        </w:rPr>
+        <w:t>restore()</w:t>
+      </w:r>
+      <w:r>
+        <w:t xml:space="preserve">, the pipeline is launched with </w:t>
+      </w:r>
+      <w:r>
+        <w:rPr>
+          <w:rStyle w:val="VerbatimChar"/>
+        </w:rPr>
+        <w:t>Rscript run_pipeline.R config.yaml</w:t>
+      </w:r>
+      <w:r>
+        <w:t>.</w:t>
+      </w:r>
+    </w:p>
+    <w:p>
+      <w:pPr>
+        <w:pStyle w:val="BodyText"/>
+      </w:pPr>
+      <w:r>
+        <w:rPr>
+          <w:b/>
+          <w:bCs/>
+        </w:rPr>
+        <w:t>Corresponding author:</w:t>
       </w:r>
       <w:r>
         <w:t xml:space="preserve"> </w:t>
       </w:r>
-      <w:r>
-        <w:rPr>
-          <w:vertAlign w:val="superscript"/>
-        </w:rPr>
-        <w:t>2</w:t>
-      </w:r>
-      <w:r>
-        <w:t>UK Health Security Agency, London, United Kingdom</w:t>
-      </w:r>
-      <w:r>
-        <w:t>,</w:t>
-      </w:r>
-      <w:r>
-        <w:t xml:space="preserve"> </w:t>
-      </w:r>
-      <w:r>
-        <w:rPr>
-          <w:vertAlign w:val="superscript"/>
-        </w:rPr>
-        <w:t>3</w:t>
-      </w:r>
-      <w:r>
-        <w:t>Centre for Clinical Microbiology, University College London, London, United Kingdom</w:t>
-      </w:r>
-      <w:r>
-        <w:t>,</w:t>
-      </w:r>
-      <w:r>
-        <w:t xml:space="preserve"> </w:t>
-      </w:r>
-      <w:r>
-        <w:rPr>
-          <w:vertAlign w:val="superscript"/>
-        </w:rPr>
-        <w:t>4</w:t>
-      </w:r>
-      <w:r>
-        <w:t>Natural History Museum, London, United Kingdom</w:t>
-      </w:r>
-    </w:p>
-    <w:p>
-      <w:pPr>
-        <w:pStyle w:val="BodyText"/>
-      </w:pPr>
-      <w:r>
-        <w:t xml:space="preserve">*Correspondence: Hermine Mkrtchyan — </w:t>
-      </w:r>
-      <w:hyperlink r:id="rId5">
+      <w:hyperlink r:id="rId6">
         <w:r>
           <w:rPr>
             <w:rStyle w:val="Hyperlink"/>
@@ -192,437 +303,163 @@
         <w:pStyle w:val="BodyText"/>
       </w:pPr>
       <w:r>
-        <w:t>{{TODO: ORCIDs for all authors}}</w:t>
-      </w:r>
-    </w:p>
-    <w:p>
-      <w:r>
-        <w:pict w14:anchorId="4FE36898">
-          <v:rect id="_x0000_i1025" style="width:0;height:1.5pt" o:hralign="center" o:hrstd="t" o:hr="t"/>
-        </w:pict>
-      </w:r>
-    </w:p>
-    <w:p>
-      <w:pPr>
-        <w:pStyle w:val="Heading2"/>
-      </w:pPr>
-      <w:bookmarkStart w:id="1" w:name="abstract"/>
-      <w:r>
-        <w:t>Abstract</w:t>
-      </w:r>
-    </w:p>
-    <w:p>
-      <w:pPr>
-        <w:pStyle w:val="FirstParagraph"/>
-        <w:jc w:val="both"/>
-      </w:pPr>
-      <w:r>
         <w:rPr>
           <w:b/>
           <w:bCs/>
         </w:rPr>
-        <w:t>Motivation.</w:t>
-      </w:r>
-      <w:r>
-        <w:t xml:space="preserve"> Long-read shotgun metagenomics studies are typically analysed by hand-editing dozens of R scripts per project — pasting sample identifiers, patching taxonomy strings and copying chunks between studies. Existing R workflows largely target short-read amplicon data or a single analysis (e.g. resistome risk scoring), leaving long-read shotgun studies without an integrated, configuration-driven option.</w:t>
+        <w:t xml:space="preserve">Keywords: </w:t>
+      </w:r>
+      <w:r>
+        <w:t>long-read metagenomics, Oxford Nanopore sequencing, antimicrobial resistance, reproducible workflow, differential abundance analysis, microbial community analysis, One Health, R/Bioconductor</w:t>
+      </w:r>
+    </w:p>
+    <w:p>
+      <w:r>
+        <w:pict w14:anchorId="48E78BA9">
+          <v:rect id="_x0000_i1026" style="width:0;height:1.5pt" o:hralign="center" o:hrstd="t" o:hr="t"/>
+        </w:pict>
+      </w:r>
+    </w:p>
+    <w:p>
+      <w:pPr>
+        <w:pStyle w:val="Heading2"/>
+      </w:pPr>
+      <w:bookmarkStart w:id="2" w:name="Xe3d0fc0bea9a42ce7605565d0964033d7f6ee47"/>
+      <w:bookmarkEnd w:id="1"/>
+      <w:r>
+        <w:t>1 Introduction</w:t>
+      </w:r>
+    </w:p>
+    <w:p>
+      <w:pPr>
+        <w:pStyle w:val="FirstParagraph"/>
+      </w:pPr>
+      <w:r>
+        <w:t>Long-read shotgun metagenomics, enabled by Oxford Nanopore and PacBio sequencing technologies, is central to One Health surveillance, where the emergence and dissemination of biological threats occur at the interface of human, animal and environmental systems [1]. Unlike targeted approaches, shotgun metagenomics enables simultaneous characterisation of microbial community composition and functional genetic content, thereby linking taxonomic identity to antimicrobial resistance genes (ARGs), virulence factors (VFs) and mobile genetic elements (MGEs) within a single experiment. This capability is particularly valuable for tracking the ecology and transmission of high-risk microorganisms and their associated genetic determinants across clinical, agricultural and environmental reservoirs. The downstream analysis supporting long-read metagenomics is now well established. Widely adopted tools include Kraken2 [2] and Bracken [3] for taxonomic classification and abundance estimation, ABRicate [4] for screening ARGs, VFs and MGEs against databases such as CARD [5], VFDB [6] and PlasmidFinder [7], Re-centrifuge [8] for contamination assessment, and R packages including vegan [9] and ALDEx2 [10] for ecological and differential abundance analyses. However, while these tools are individually well established, their integration into reproducible and reusable workflows remains limited.</w:t>
       </w:r>
     </w:p>
     <w:p>
       <w:pPr>
         <w:pStyle w:val="BodyText"/>
-        <w:jc w:val="both"/>
-      </w:pPr>
+      </w:pPr>
+      <w:r>
+        <w:t>In practice, downstream analyses continue to rely on a set of bespoke R scripts that have evolved incrementally over successive projects. These scripts frequently contain hard-coded input paths, sample-identifier filters embedded as literal strings, per-study negative-control renames, and taxonomy fixes patched by row index. As a result, individual script copies diverge over time, reducing reproducibility and limiting portability, and the absence of a shared interface prevents automated output logging. Comparing different studies requires manual reconciliation of both code and data. The reference cohort for the present work (</w:t>
+      </w:r>
+      <w:r>
+        <w:rPr>
+          <w:rStyle w:val="VerbatimChar"/>
+        </w:rPr>
+        <w:t>Chicken Batch 1</w:t>
+      </w:r>
+      <w:r>
+        <w:t>; ~46 hand-edited scripts) exemplifies this pattern. The L-</w:t>
+      </w:r>
+      <w:r>
+        <w:lastRenderedPageBreak/>
+        <w:t>ARRAP pipeline [11] provides a framework for long-read resistome risk assessment, while the rANOMALY workflow [12] demonstrates the advantages of a configuration-driven R workflow with auto-generated reports for amplicon data. To our knowledge, no integrated end-to-end R workflow covers long-read shotgun metagenomic data spanning taxonomic composition, microbial diversity, differential abundance, and comprehensive resistome–virulome–mobilome profiling in a single configurable run.</w:t>
+      </w:r>
+    </w:p>
+    <w:p>
+      <w:pPr>
+        <w:pStyle w:val="BodyText"/>
+      </w:pPr>
+      <w:r>
+        <w:t>To address this gap, we have developed an alpha-stage R workflow. Here, we describe the workflow's design, current scope, and the real-data validation strategy enabling the assessment of its performance.</w:t>
+      </w:r>
+    </w:p>
+    <w:p>
+      <w:pPr>
+        <w:pStyle w:val="Heading2"/>
+      </w:pPr>
+      <w:bookmarkStart w:id="3" w:name="Xfab522e0c411179c01dd3c9a2a01395ade9eb38"/>
+      <w:bookmarkEnd w:id="2"/>
+      <w:r>
+        <w:t>2 Implementation</w:t>
+      </w:r>
+    </w:p>
+    <w:p>
+      <w:pPr>
+        <w:pStyle w:val="FirstParagraph"/>
+      </w:pPr>
+      <w:r>
+        <w:t>The workflow is implemented as a stand-alone R project, rather than an installable software package. Execution is initiated through a single entry script (</w:t>
+      </w:r>
+      <w:r>
+        <w:rPr>
+          <w:rStyle w:val="VerbatimChar"/>
+        </w:rPr>
+        <w:t>run_pipeline.R</w:t>
+      </w:r>
+      <w:r>
+        <w:t>) that reads one YAML configuration file for each study and dispatches the workflow across fifteen modules (</w:t>
+      </w:r>
+      <w:r>
+        <w:rPr>
+          <w:rStyle w:val="VerbatimChar"/>
+        </w:rPr>
+        <w:t>R/00_setup.R</w:t>
+      </w:r>
+      <w:r>
+        <w:t xml:space="preserve"> through </w:t>
+      </w:r>
+      <w:r>
+        <w:rPr>
+          <w:rStyle w:val="VerbatimChar"/>
+        </w:rPr>
+        <w:t>R/13_panels.R</w:t>
+      </w:r>
+      <w:r>
+        <w:t xml:space="preserve">; </w:t>
+      </w:r>
+      <w:proofErr w:type="gramStart"/>
+      <w:r>
+        <w:t>plus</w:t>
+      </w:r>
+      <w:proofErr w:type="gramEnd"/>
+      <w:r>
+        <w:t xml:space="preserve"> the manifest stage </w:t>
+      </w:r>
+      <w:r>
+        <w:rPr>
+          <w:rStyle w:val="VerbatimChar"/>
+        </w:rPr>
+        <w:t>R/14</w:t>
+      </w:r>
+      <w:r>
+        <w:t>, which runs last). A Quarto dashboard template (</w:t>
+      </w:r>
+      <w:r>
+        <w:rPr>
+          <w:rStyle w:val="VerbatimChar"/>
+        </w:rPr>
+        <w:t>templates/report.qmd</w:t>
+      </w:r>
+      <w:r>
+        <w:t xml:space="preserve">) renders all outputs into a single multi-page HTML deliverable. A subsequent publication-panels stage assembles publication-ready composite figures for the main and supplementary datasets and compiles the accompanying supplementary tables into a workbook. The pipeline concludes with the generation of a final </w:t>
+      </w:r>
+      <w:r>
+        <w:rPr>
+          <w:rStyle w:val="VerbatimChar"/>
+        </w:rPr>
+        <w:t>manifest.json</w:t>
+      </w:r>
+      <w:r>
+        <w:t xml:space="preserve"> file, providing a complete record of all artefacts produced (</w:t>
+      </w:r>
       <w:r>
         <w:rPr>
           <w:b/>
           <w:bCs/>
         </w:rPr>
-        <w:t>Results.</w:t>
-      </w:r>
-      <w:r>
-        <w:t xml:space="preserve"> We present </w:t>
-      </w:r>
-      <w:r>
-        <w:rPr>
-          <w:b/>
-          <w:bCs/>
-        </w:rPr>
-        <w:t>MERIDIAN</w:t>
-      </w:r>
-      <w:r>
-        <w:t xml:space="preserve"> (</w:t>
-      </w:r>
-      <w:r>
-        <w:rPr>
-          <w:i/>
-          <w:iCs/>
-        </w:rPr>
-        <w:t>Metagenomic Evaluation of Resistance, Identity &amp; Diversity through Integrated Analysis of Nanopore sequencing</w:t>
-      </w:r>
-      <w:r>
-        <w:t>), a modular R workflow that consumes</w:t>
-      </w:r>
-      <w:r>
-        <w:t xml:space="preserve"> bioinformatics tools</w:t>
-      </w:r>
-      <w:r>
-        <w:t xml:space="preserve"> outputs and produces a single Quarto HTML dashboard, publication-ready composite figures and a supplementary tables workbook. The workflow covers decontamination, TPM normalisation, taxonomy, alpha/beta diversity with PERMANOVA, two-level ALDEx2 differential abundance, </w:t>
-      </w:r>
-      <w:r>
-        <w:t>r</w:t>
-      </w:r>
-      <w:r>
-        <w:t>esistome</w:t>
-      </w:r>
-      <w:r>
-        <w:t xml:space="preserve">, </w:t>
-      </w:r>
-      <w:r>
-        <w:t>virulome</w:t>
-      </w:r>
-      <w:r>
-        <w:t xml:space="preserve">, and </w:t>
-      </w:r>
-      <w:r>
-        <w:t>mobilome profiling</w:t>
-      </w:r>
-      <w:r>
-        <w:t>, and</w:t>
-      </w:r>
-      <w:r>
-        <w:t xml:space="preserve"> a tripartite sample × taxon × gene network </w:t>
-      </w:r>
-      <w:r>
-        <w:t>reconstruction</w:t>
-      </w:r>
-      <w:r>
-        <w:t xml:space="preserve">. A study is parameterised by </w:t>
-      </w:r>
-      <w:r>
-        <w:t>a single YAML file; module code is not edited per project</w:t>
-      </w:r>
-      <w:r>
-        <w:t xml:space="preserve">, and every run emits a </w:t>
-      </w:r>
-      <w:r>
-        <w:rPr>
-          <w:rStyle w:val="VerbatimChar"/>
-        </w:rPr>
-        <w:t>manifest.json</w:t>
-      </w:r>
-      <w:r>
-        <w:t xml:space="preserve"> artefact catalogue</w:t>
-      </w:r>
-      <w:r>
-        <w:t xml:space="preserve"> for downstream integration</w:t>
-      </w:r>
-      <w:r>
-        <w:t>.</w:t>
+        <w:t>Figure 1</w:t>
+      </w:r>
+      <w:r>
+        <w:t>).</w:t>
       </w:r>
     </w:p>
     <w:p>
       <w:pPr>
         <w:pStyle w:val="BodyText"/>
-        <w:jc w:val="both"/>
-      </w:pPr>
-      <w:r>
-        <w:rPr>
-          <w:b/>
-          <w:bCs/>
-        </w:rPr>
-        <w:t>Availability and Implementation.</w:t>
-      </w:r>
-      <w:r>
-        <w:t xml:space="preserve"> Source at </w:t>
-      </w:r>
-      <w:hyperlink r:id="rId6">
-        <w:r>
-          <w:rPr>
-            <w:rStyle w:val="Hyperlink"/>
-          </w:rPr>
-          <w:t>https://github.com/Julio92-C/Metagenomics_pipeline_automation</w:t>
-        </w:r>
-      </w:hyperlink>
-      <w:r>
-        <w:t xml:space="preserve"> (MIT). </w:t>
-      </w:r>
-      <w:r>
-        <w:t xml:space="preserve">This note describes release </w:t>
-      </w:r>
-      <w:r>
-        <w:rPr>
-          <w:b/>
-          <w:bCs/>
-        </w:rPr>
-        <w:t>v0.1.0</w:t>
-      </w:r>
-      <w:r>
-        <w:t xml:space="preserve"> (https://github.com/Julio92-C/Metagenomics_pipeline_automation/releases/tag/v0.1.0). Run with `git clone --branch v0.1.0</w:t>
-      </w:r>
-      <w:r>
-        <w:rPr>
-          <w:rStyle w:val="VerbatimChar"/>
-        </w:rPr>
-        <w:t xml:space="preserve"> &amp;&amp; Rscript run_pipeline.R config.yaml</w:t>
-      </w:r>
-      <w:r>
-        <w:t xml:space="preserve"> after </w:t>
-      </w:r>
-      <w:proofErr w:type="gramStart"/>
-      <w:r>
-        <w:rPr>
-          <w:rStyle w:val="VerbatimChar"/>
-        </w:rPr>
-        <w:t>renv::</w:t>
-      </w:r>
-      <w:proofErr w:type="gramEnd"/>
-      <w:r>
-        <w:rPr>
-          <w:rStyle w:val="VerbatimChar"/>
-        </w:rPr>
-        <w:t>restore()</w:t>
-      </w:r>
-      <w:r>
-        <w:t>.</w:t>
-      </w:r>
-    </w:p>
-    <w:p>
-      <w:pPr>
-        <w:pStyle w:val="BodyText"/>
-      </w:pPr>
-      <w:r>
-        <w:rPr>
-          <w:b/>
-          <w:bCs/>
-        </w:rPr>
-        <w:t>Contact.</w:t>
-      </w:r>
-      <w:r>
-        <w:t xml:space="preserve"> </w:t>
-      </w:r>
-      <w:hyperlink r:id="rId7">
-        <w:r>
-          <w:rPr>
-            <w:rStyle w:val="Hyperlink"/>
-          </w:rPr>
-          <w:t>Hermine.Mkrtchyan@uwl.ac.uk</w:t>
-        </w:r>
-      </w:hyperlink>
-    </w:p>
-    <w:p>
-      <w:r>
-        <w:lastRenderedPageBreak/>
-        <w:pict w14:anchorId="6230672F">
-          <v:rect id="_x0000_i1026" style="width:0;height:1.5pt" o:hralign="center" o:hrstd="t" o:hr="t"/>
-        </w:pict>
-      </w:r>
-    </w:p>
-    <w:p>
-      <w:pPr>
-        <w:pStyle w:val="Heading2"/>
-      </w:pPr>
-      <w:bookmarkStart w:id="2" w:name="Xe3d0fc0bea9a42ce7605565d0964033d7f6ee47"/>
-      <w:bookmarkEnd w:id="1"/>
-      <w:r>
-        <w:t>1 Introduction</w:t>
-      </w:r>
-    </w:p>
-    <w:p>
-      <w:pPr>
-        <w:pStyle w:val="FirstParagraph"/>
-        <w:jc w:val="both"/>
-      </w:pPr>
-      <w:r>
-        <w:t xml:space="preserve">Long-read shotgun metagenomics (Oxford Nanopore, PacBio) is increasingly central to One Health surveillance, where threats intersect humans, animals and ecosystems [1]. By profiling microbial communities and their functional genetic elements in a single experiment, it </w:t>
-      </w:r>
-      <w:r>
-        <w:t>links taxonomic identity to determinants of resistance, virulence, and mobility across environmental, clinical,</w:t>
-      </w:r>
-      <w:r>
-        <w:t xml:space="preserve"> and livestock matrices. The downstream analysis stack is well established — Kraken2 [2] and Bracken [3] for taxonomic assignment and abundance estimation, ABRicate [4] for screening antimicrobial resistance genes (ARGs), virulence factors</w:t>
-      </w:r>
-      <w:r>
-        <w:t xml:space="preserve"> (VFs)</w:t>
-      </w:r>
-      <w:r>
-        <w:t xml:space="preserve"> and mobile genetic elements (MGEs) against CARD [5], VFDB [6] and PlasmidFinder [7], Re-centrifuge [8] for contamination </w:t>
-      </w:r>
-      <w:r>
-        <w:t>assessment</w:t>
-      </w:r>
-      <w:r>
-        <w:t>, and R packages such as vegan [9] and ALDEx2 [10] for ecological and differential analyses — but the integration between them is not.</w:t>
-      </w:r>
-    </w:p>
-    <w:p>
-      <w:pPr>
-        <w:pStyle w:val="BodyText"/>
-        <w:jc w:val="both"/>
-      </w:pPr>
-      <w:r>
-        <w:t xml:space="preserve">In practice, each new study is analysed by adapting a set of bespoke R scripts: hard-coded input paths, sample-identifier filters embedded as literal strings, per-study negative-control renames, and taxonomy fixes patched by row index. </w:t>
-      </w:r>
-      <w:r>
-        <w:t>Consequently, individual script copies diverge, and the lack of a shared interface prevents automated output logging. Comparing different studies requires manual reconciliation of both code and data</w:t>
-      </w:r>
-      <w:r>
-        <w:t>. The reference cohort for the present work (</w:t>
-      </w:r>
-      <w:r>
-        <w:rPr>
-          <w:rStyle w:val="VerbatimChar"/>
-        </w:rPr>
-        <w:t>C</w:t>
-      </w:r>
-      <w:r>
-        <w:rPr>
-          <w:rStyle w:val="VerbatimChar"/>
-        </w:rPr>
-        <w:t>hicken</w:t>
-      </w:r>
-      <w:r>
-        <w:rPr>
-          <w:rStyle w:val="VerbatimChar"/>
-        </w:rPr>
-        <w:t xml:space="preserve"> Batch 1</w:t>
-      </w:r>
-      <w:r>
-        <w:t xml:space="preserve">; ~46 hand-edited scripts) typifies this pattern. The L-ARRAP pipeline [11] addresses one slice of this problem for long-read resistome risk assessment, and the rANOMALY workflow [12] demonstrates the value of a config-driven R workflow with auto-generated reports for amplicon data. To our knowledge, no comparable workflow exists for end-to-end long-read shotgun metagenomics </w:t>
-      </w:r>
-      <w:r>
-        <w:t>that covers taxonomy, diversity, differential abundance, and full resistome–virulome–mobilome profiling in a single</w:t>
-      </w:r>
-      <w:r>
-        <w:t xml:space="preserve"> configurable run.</w:t>
-      </w:r>
-    </w:p>
-    <w:p>
-      <w:pPr>
-        <w:pStyle w:val="BodyText"/>
-        <w:jc w:val="both"/>
-      </w:pPr>
-      <w:r>
-        <w:t>We present an alpha-stage R workflow that fills this gap. The tool is in active development; this note describes its design, current scope, and the real-data validation strategy we are using to harden each stage.</w:t>
-      </w:r>
-    </w:p>
-    <w:p>
-      <w:pPr>
-        <w:pStyle w:val="Heading2"/>
-        <w:jc w:val="both"/>
-      </w:pPr>
-      <w:bookmarkStart w:id="3" w:name="Xfab522e0c411179c01dd3c9a2a01395ade9eb38"/>
-      <w:bookmarkEnd w:id="2"/>
-      <w:r>
-        <w:t>2 Implementation</w:t>
-      </w:r>
-    </w:p>
-    <w:p>
-      <w:pPr>
-        <w:pStyle w:val="FirstParagraph"/>
-        <w:jc w:val="both"/>
-      </w:pPr>
-      <w:r>
-        <w:t>The workflow is a stand-alone R project, not an installable package. A single entry point (</w:t>
-      </w:r>
-      <w:r>
-        <w:rPr>
-          <w:rStyle w:val="VerbatimChar"/>
-        </w:rPr>
-        <w:t>run_pipeline.R</w:t>
-      </w:r>
-      <w:r>
-        <w:t>) consumes one YAML configuration file per study and dispatches to fifteen modules (</w:t>
-      </w:r>
-      <w:r>
-        <w:rPr>
-          <w:rStyle w:val="VerbatimChar"/>
-        </w:rPr>
-        <w:t>R/00_setup.R</w:t>
-      </w:r>
-      <w:r>
-        <w:t xml:space="preserve"> through </w:t>
-      </w:r>
-      <w:r>
-        <w:rPr>
-          <w:rStyle w:val="VerbatimChar"/>
-        </w:rPr>
-        <w:t>R/1</w:t>
-      </w:r>
-      <w:r>
-        <w:rPr>
-          <w:rStyle w:val="VerbatimChar"/>
-        </w:rPr>
-        <w:t>3</w:t>
-      </w:r>
-      <w:r>
-        <w:rPr>
-          <w:rStyle w:val="VerbatimChar"/>
-        </w:rPr>
-        <w:t>_panels.R</w:t>
-      </w:r>
-      <w:r>
-        <w:t xml:space="preserve">; </w:t>
-      </w:r>
-      <w:r>
-        <w:t xml:space="preserve">plus </w:t>
-      </w:r>
-      <w:r>
-        <w:t xml:space="preserve">the manifest stage </w:t>
-      </w:r>
-      <w:r>
-        <w:rPr>
-          <w:rStyle w:val="VerbatimChar"/>
-        </w:rPr>
-        <w:t>R/1</w:t>
-      </w:r>
-      <w:r>
-        <w:rPr>
-          <w:rStyle w:val="VerbatimChar"/>
-        </w:rPr>
-        <w:t>4</w:t>
-      </w:r>
-      <w:r>
-        <w:t xml:space="preserve"> </w:t>
-      </w:r>
-      <w:r>
-        <w:t xml:space="preserve">which </w:t>
-      </w:r>
-      <w:r>
-        <w:t>runs last); a Quarto dashboard template (</w:t>
-      </w:r>
-      <w:r>
-        <w:rPr>
-          <w:rStyle w:val="VerbatimChar"/>
-        </w:rPr>
-        <w:t>templates/report.qmd</w:t>
-      </w:r>
-      <w:r>
-        <w:t xml:space="preserve">) renders all outputs into a single multi-page HTML deliverable, a publication-panels stage assembles main and supplementary composite figures plus a supplementary tables workbook, and a final manifest stage emits </w:t>
-      </w:r>
-      <w:r>
-        <w:rPr>
-          <w:rStyle w:val="VerbatimChar"/>
-        </w:rPr>
-        <w:t>manifest.json</w:t>
-      </w:r>
-      <w:r>
-        <w:t xml:space="preserve"> describing every artefact produced (</w:t>
-      </w:r>
-      <w:r>
-        <w:rPr>
-          <w:b/>
-          <w:bCs/>
-        </w:rPr>
-        <w:t>Figure 1</w:t>
-      </w:r>
-      <w:r>
-        <w:t>).</w:t>
-      </w:r>
-    </w:p>
-    <w:p>
-      <w:pPr>
-        <w:pStyle w:val="BodyText"/>
-        <w:keepNext/>
       </w:pPr>
       <w:r>
         <w:rPr>
@@ -630,28 +467,22 @@
         </w:rPr>
         <w:lastRenderedPageBreak/>
         <w:drawing>
-          <wp:inline distT="0" distB="0" distL="0" distR="0" wp14:anchorId="75F3595A" wp14:editId="2F9FAFA5">
-            <wp:extent cx="5875020" cy="6713220"/>
+          <wp:inline distT="0" distB="0" distL="0" distR="0" wp14:anchorId="75E5BCA4" wp14:editId="0982CF26">
+            <wp:extent cx="5302908" cy="5620960"/>
             <wp:effectExtent l="0" t="0" r="0" b="0"/>
-            <wp:docPr id="14" name="Picture"/>
+            <wp:docPr id="15" name="Picture" descr="Figure 1. MERIDIAN workflow. A single config.yaml drives fifteen R modules (R/00–R/14) that load Kraken2/Bracken, ABRicate, Re-centrifuge and sample metadata. After setup and decontamination (R/00–R/02), community analyses (R/04–R/08) and functional profiling against CARD, VFDB and PlasmidFinder (TPM in R/03, per-domain analyses in R/09–R/11) converge in a tripartite sample × taxon × gene network (R/12). R/12 fans out to a Quarto dashboard and a publication-panels stage (R/13); R/14 finally writes manifest.json (contract v1.2), a kind-tagged catalogue of every artefact. Source: generate_figure1.py."/>
             <wp:cNvGraphicFramePr/>
             <a:graphic xmlns:a="http://schemas.openxmlformats.org/drawingml/2006/main">
               <a:graphicData uri="http://schemas.openxmlformats.org/drawingml/2006/picture">
                 <pic:pic xmlns:pic="http://schemas.openxmlformats.org/drawingml/2006/picture">
                   <pic:nvPicPr>
-                    <pic:cNvPr id="14" name="Picture"/>
+                    <pic:cNvPr id="16" name="Picture" descr="figure1_pipeline_schematic.png"/>
                     <pic:cNvPicPr>
                       <a:picLocks noChangeAspect="1" noChangeArrowheads="1"/>
                     </pic:cNvPicPr>
                   </pic:nvPicPr>
                   <pic:blipFill>
-                    <a:blip r:embed="rId8">
-                      <a:extLst>
-                        <a:ext uri="{96DAC541-7B7A-43D3-8B79-37D633B846F1}">
-                          <asvg:svgBlip xmlns:asvg="http://schemas.microsoft.com/office/drawing/2016/SVG/main" r:embed="rId9"/>
-                        </a:ext>
-                      </a:extLst>
-                    </a:blip>
+                    <a:blip r:embed="rId7"/>
                     <a:stretch>
                       <a:fillRect/>
                     </a:stretch>
@@ -659,11 +490,17 @@
                   <pic:spPr bwMode="auto">
                     <a:xfrm>
                       <a:off x="0" y="0"/>
-                      <a:ext cx="5875419" cy="6713676"/>
+                      <a:ext cx="5302908" cy="5620960"/>
                     </a:xfrm>
                     <a:prstGeom prst="rect">
                       <a:avLst/>
                     </a:prstGeom>
+                    <a:noFill/>
+                    <a:ln w="9525">
+                      <a:noFill/>
+                      <a:headEnd/>
+                      <a:tailEnd/>
+                    </a:ln>
                   </pic:spPr>
                 </pic:pic>
               </a:graphicData>
@@ -674,732 +511,424 @@
     </w:p>
     <w:p>
       <w:pPr>
-        <w:pStyle w:val="Caption"/>
-        <w:jc w:val="both"/>
-        <w:rPr>
-          <w:i w:val="0"/>
-          <w:iCs/>
-          <w:sz w:val="22"/>
-          <w:szCs w:val="22"/>
-        </w:rPr>
+        <w:pStyle w:val="BodyText"/>
       </w:pPr>
       <w:r>
         <w:rPr>
           <w:b/>
           <w:bCs/>
-          <w:i w:val="0"/>
-          <w:iCs/>
-          <w:sz w:val="22"/>
-          <w:szCs w:val="22"/>
-        </w:rPr>
-        <w:t xml:space="preserve">Figure </w:t>
-      </w:r>
+        </w:rPr>
+        <w:t>Configuration-driven.</w:t>
+      </w:r>
+      <w:r>
+        <w:t xml:space="preserve"> All study-specific parameters — metadata file locations, sample grouping variables, negative-control identifiers, abundance filtering thresholds, and sample selection criteria — are defined in </w:t>
+      </w:r>
+      <w:r>
+        <w:rPr>
+          <w:rStyle w:val="VerbatimChar"/>
+        </w:rPr>
+        <w:t>config.yaml</w:t>
+      </w:r>
+      <w:r>
+        <w:t xml:space="preserve">. Consequently, module code remains invariant across projects, with dataset-specific customisation implemented exclusively through </w:t>
+      </w:r>
+      <w:r>
+        <w:rPr>
+          <w:rStyle w:val="VerbatimChar"/>
+        </w:rPr>
+        <w:t>config.yaml</w:t>
+      </w:r>
+      <w:r>
+        <w:t xml:space="preserve"> settings or the structured fix tables it references. R/00 (setup) and R/01 (input loading) are executed by default, whereas all downstream modules can be selectively enabled or disabled via </w:t>
+      </w:r>
+      <w:r>
+        <w:rPr>
+          <w:rStyle w:val="VerbatimChar"/>
+        </w:rPr>
+        <w:t>cfg$stages$*</w:t>
+      </w:r>
+      <w:r>
+        <w:t xml:space="preserve"> flags; for example, users can re-run only the resistome modules after revising thresholds. TPM normalisation (R/03) and all gene-element stages (R/09–R/11) are contingent upon ABRicate outputs and are automatically omitted when such inputs are absent. Study-specific corrections to NCBI taxonomy assignments, where required, are encoded in a structured </w:t>
+      </w:r>
+      <w:r>
+        <w:rPr>
+          <w:rStyle w:val="VerbatimChar"/>
+        </w:rPr>
+        <w:t>taxid_fixes.csv</w:t>
+      </w:r>
+      <w:r>
+        <w:t xml:space="preserve"> table rather than implemented as row-index edits. Multiple-testing correction is controlled through the </w:t>
+      </w:r>
+      <w:r>
+        <w:rPr>
+          <w:rStyle w:val="VerbatimChar"/>
+        </w:rPr>
+        <w:t>cfg$stats$padjust_method</w:t>
+      </w:r>
+      <w:r>
+        <w:t xml:space="preserve"> parameter, ensuring consistent application of the </w:t>
+      </w:r>
+      <w:r>
+        <w:lastRenderedPageBreak/>
+        <w:t xml:space="preserve">selected adjustment throughout the pipeline. The Benjamini-Hochberg false discovery rate is used by default, although alternative correction methods are supported and documented in </w:t>
+      </w:r>
+      <w:r>
+        <w:rPr>
+          <w:rStyle w:val="VerbatimChar"/>
+        </w:rPr>
+        <w:t>docs/STATISTICS.md</w:t>
+      </w:r>
+      <w:r>
+        <w:t>.</w:t>
+      </w:r>
+    </w:p>
+    <w:p>
+      <w:pPr>
+        <w:pStyle w:val="BodyText"/>
+      </w:pPr>
       <w:r>
         <w:rPr>
           <w:b/>
           <w:bCs/>
-          <w:i w:val="0"/>
+        </w:rPr>
+        <w:t>Stages.</w:t>
+      </w:r>
+      <w:r>
+        <w:t xml:space="preserve"> The pipeline is organised into five conceptual stages.</w:t>
+      </w:r>
+    </w:p>
+    <w:p>
+      <w:pPr>
+        <w:pStyle w:val="BodyText"/>
+      </w:pPr>
+      <w:r>
+        <w:t xml:space="preserve">(1) </w:t>
+      </w:r>
+      <w:r>
+        <w:rPr>
+          <w:i/>
           <w:iCs/>
-          <w:sz w:val="22"/>
-          <w:szCs w:val="22"/>
-        </w:rPr>
-        <w:fldChar w:fldCharType="begin"/>
-      </w:r>
+        </w:rPr>
+        <w:t>Data input and decontamination</w:t>
+      </w:r>
+      <w:r>
+        <w:t xml:space="preserve"> (R/00–R/02). The pipeline imports upstream outputs — Kraken2/Bracken, ABRicate, Re-centrifuge contamination tags and study metadata tables — accommodating per-project input shapes rather than assuming a fixed column layout, applies optional negative-control subtraction, merges Bracken counts with the metadata covariates declared in </w:t>
+      </w:r>
+      <w:r>
+        <w:rPr>
+          <w:rStyle w:val="VerbatimChar"/>
+        </w:rPr>
+        <w:t>cfg$metadata$fixed_effects</w:t>
+      </w:r>
+      <w:r>
+        <w:t xml:space="preserve"> / </w:t>
+      </w:r>
+      <w:r>
+        <w:rPr>
+          <w:rStyle w:val="VerbatimChar"/>
+        </w:rPr>
+        <w:t>random_effect</w:t>
+      </w:r>
+      <w:r>
+        <w:t xml:space="preserve">, and links ABRicate calls to taxonomic assignments. Per-study taxonomy patches are applied from </w:t>
+      </w:r>
+      <w:r>
+        <w:rPr>
+          <w:rStyle w:val="VerbatimChar"/>
+        </w:rPr>
+        <w:t>taxid_fixes.csv</w:t>
+      </w:r>
+      <w:r>
+        <w:t xml:space="preserve"> when supplied.</w:t>
+      </w:r>
+    </w:p>
+    <w:p>
+      <w:pPr>
+        <w:pStyle w:val="BodyText"/>
+      </w:pPr>
+      <w:r>
+        <w:t xml:space="preserve">(2) </w:t>
+      </w:r>
+      <w:r>
+        <w:rPr>
+          <w:i/>
+          <w:iCs/>
+        </w:rPr>
+        <w:t>Gene-element normalisation</w:t>
+      </w:r>
+      <w:r>
+        <w:t xml:space="preserve"> (R/03) computes per-(sample, GENE) TPM based on ABRicate hit counts and annotated gene lengths.</w:t>
+      </w:r>
+    </w:p>
+    <w:p>
+      <w:pPr>
+        <w:pStyle w:val="BodyText"/>
+      </w:pPr>
+      <w:r>
+        <w:t xml:space="preserve">(3) </w:t>
+      </w:r>
+      <w:r>
+        <w:rPr>
+          <w:i/>
+          <w:iCs/>
+        </w:rPr>
+        <w:t>Community analyses</w:t>
+      </w:r>
+      <w:r>
+        <w:t xml:space="preserve"> (R/04–R/08) cover the standard taxonomic toolkit. Following standardisation and cleaning of shared taxon names, R/04–R/05 generate Venn diagrams, annotated heatmaps, and top-N stacked-bar relative-abundance plots (static PNG and interactive plotly HTML) with paired total-count and sample-prevalence panels. Alpha diversity (R/06) reports Shannon, Simpson, richness, Pielou, and Fisher metrics with Kruskal-Wallis tests and violin/bar plots, preferring </w:t>
+      </w:r>
+      <w:proofErr w:type="gramStart"/>
+      <w:r>
+        <w:t>a pre</w:t>
+      </w:r>
+      <w:proofErr w:type="gramEnd"/>
+      <w:r>
+        <w:t>-computed indices CSV (e.g., Oxford Nanopore wf-metagenomics output) and falling back to the vegan R package. Beta diversity (R/07) assesses between-sample community differences using PCoA on Hellinger-transformed Bray-Curtis distances with PERMANOVA (</w:t>
+      </w:r>
+      <w:r>
+        <w:rPr>
+          <w:rStyle w:val="VerbatimChar"/>
+        </w:rPr>
+        <w:t>adonis2</w:t>
+      </w:r>
+      <w:r>
+        <w:t>, 9999 permutations) and PERMDISP (</w:t>
+      </w:r>
+      <w:r>
+        <w:rPr>
+          <w:rStyle w:val="VerbatimChar"/>
+        </w:rPr>
+        <w:t>betadisper</w:t>
+      </w:r>
+      <w:r>
+        <w:t xml:space="preserve">) overlaid on the ordination. Differential abundance analysis (R/08) is performed at both the taxonomic and functional level using ALDEx2: taxonomic analysis uses Bracken counts, whereas gene-level analysis uses ABRicate contig hits per (sample, GENE). The workflow combines an omnibus Kruskal-Wallis test with pairwise Welch's t-tests, with an optional </w:t>
+      </w:r>
+      <w:r>
+        <w:rPr>
+          <w:rStyle w:val="VerbatimChar"/>
+        </w:rPr>
+        <w:t>aldex.glm</w:t>
+      </w:r>
+      <w:r>
+        <w:t xml:space="preserve"> design path for covariate-adjusted models. This compositional approach is deliberate: ALDEx2 models counts through a centred log-ratio (CLR) transformation, which accounts for the compositional nature of sequencing data and avoids the spurious correlations that arise when raw or total counts are compared directly [10]; gene-level features are additionally length-normalised as TPM (R/03) so that genes of differing length remain comparable.</w:t>
+      </w:r>
+    </w:p>
+    <w:p>
+      <w:pPr>
+        <w:pStyle w:val="BodyText"/>
+      </w:pPr>
+      <w:r>
+        <w:t xml:space="preserve">(4) </w:t>
+      </w:r>
+      <w:r>
+        <w:rPr>
+          <w:i/>
+          <w:iCs/>
+        </w:rPr>
+        <w:t>Functional profiling</w:t>
+      </w:r>
+      <w:r>
+        <w:t xml:space="preserve"> (R/09–R/11) runs a shared analysis engine three times against domain-specific databases: (i) resistome profiling using ABRicate/CARD annotations, including drug-class classification; (ii) virulome profiling using VFDB, with functional categories extracted from the ABRicate </w:t>
+      </w:r>
+      <w:r>
+        <w:rPr>
+          <w:rStyle w:val="VerbatimChar"/>
+        </w:rPr>
+        <w:t>PRODUCT</w:t>
+      </w:r>
+      <w:r>
+        <w:t xml:space="preserve"> field; (iii) mobilome profiling using PlasmidFinder, incorporating configurable replicon-family classification (Col-like, IncF, IncX, other Inc). For each domain, the pipeline generates alpha diversity metrics, Venn diagrams, gene- and category-level heatmaps, relative-abundance and total-count panels, and a PCoA + PERMANOVA + PERMDISP suite.</w:t>
+      </w:r>
+    </w:p>
+    <w:p>
+      <w:pPr>
+        <w:pStyle w:val="BodyText"/>
+      </w:pPr>
+      <w:r>
+        <w:lastRenderedPageBreak/>
+        <w:t xml:space="preserve">(5) </w:t>
+      </w:r>
+      <w:r>
+        <w:rPr>
+          <w:i/>
+          <w:iCs/>
+        </w:rPr>
+        <w:t>Integration, reporting and manifest</w:t>
+      </w:r>
+      <w:r>
+        <w:t xml:space="preserve"> (R/12–R/14). The final stage integrates results across all domains and produces the reporting outputs. R/12 reports igraph topology metrics (degree, betweenness, Louvain modularity) alongside its network, chord and Sankey outputs, and exports Gephi-compatible node/edge tables. R/13 assembles main and supplementary composite figures (PNG and TIFF independently toggleable) driven by a slot-YAML layout, plus </w:t>
+      </w:r>
+      <w:r>
+        <w:rPr>
+          <w:rStyle w:val="VerbatimChar"/>
+        </w:rPr>
+        <w:t>supplementary_tables.xlsx</w:t>
+      </w:r>
+      <w:r>
+        <w:t xml:space="preserve">. R/14 writes </w:t>
+      </w:r>
+      <w:r>
+        <w:rPr>
+          <w:rStyle w:val="VerbatimChar"/>
+        </w:rPr>
+        <w:t>manifest.json</w:t>
+      </w:r>
+      <w:r>
+        <w:t xml:space="preserve"> (contract v1.2), a kind-tagged catalogue of every figure, table and intermediate artefact the pipeline produced, providing a stable contract for downstream integration.</w:t>
+      </w:r>
+    </w:p>
+    <w:p>
+      <w:pPr>
+        <w:pStyle w:val="BodyText"/>
+      </w:pPr>
       <w:r>
         <w:rPr>
           <w:b/>
           <w:bCs/>
-          <w:i w:val="0"/>
-          <w:iCs/>
-          <w:sz w:val="22"/>
-          <w:szCs w:val="22"/>
-        </w:rPr>
-        <w:instrText xml:space="preserve"> SEQ Figure \* ARABIC </w:instrText>
-      </w:r>
+        </w:rPr>
+        <w:t>Reporting.</w:t>
+      </w:r>
+      <w:r>
+        <w:t xml:space="preserve"> Results are rendered through a Quarto template as a multi-page HTML dashboard containing dedicated panels for taxonomy, diversity, differential abundance, resistome, virulome, mobilome and network, plus embedded download links. Dependencies are pinned via </w:t>
+      </w:r>
+      <w:r>
+        <w:rPr>
+          <w:rStyle w:val="VerbatimChar"/>
+        </w:rPr>
+        <w:t>renv</w:t>
+      </w:r>
+      <w:r>
+        <w:t>, and the project requires R ≥ 4.5; external command-line tools (Kraken2, Bracken, ABRicate, Re-centrifuge) are assumed to have been run upstream. For portable, reproducible deployment the analysis layer is also distributed as a versioned Docker/Apptainer image built on the Bioconductor base, bundling the pinned renv environment and Quarto so the workflow runs identically on a laptop or a root-free HPC node. Because MERIDIAN consumes these pre-computed outputs rather than the raw reads, its own footprint is modest and single-threaded (peaking at ~1.5 GB; Section 3</w:t>
+      </w:r>
+      <w:proofErr w:type="gramStart"/>
+      <w:r>
+        <w:t>), and</w:t>
+      </w:r>
+      <w:proofErr w:type="gramEnd"/>
+      <w:r>
+        <w:t xml:space="preserve"> is therefore decoupled from the substantial memory required by upstream taxonomic classification (for example, a full Kraken2 database), which can be run separately on high-memory or cloud infrastructure.</w:t>
+      </w:r>
+    </w:p>
+    <w:p>
+      <w:pPr>
+        <w:pStyle w:val="Heading2"/>
+      </w:pPr>
+      <w:bookmarkStart w:id="4" w:name="Xe535e7deb3457bf6891dfc100ac742aa591bc31"/>
+      <w:bookmarkEnd w:id="3"/>
+      <w:r>
+        <w:t>3 Application and Validation</w:t>
+      </w:r>
+    </w:p>
+    <w:p>
+      <w:pPr>
+        <w:pStyle w:val="FirstParagraph"/>
+      </w:pPr>
+      <w:r>
+        <w:t>We validated the pipeline against two long-read chicken caecum metagenomic studies. The primary dataset (</w:t>
+      </w:r>
+      <w:r>
+        <w:rPr>
+          <w:rStyle w:val="VerbatimChar"/>
+        </w:rPr>
+        <w:t>Chicken batch 1</w:t>
+      </w:r>
+      <w:r>
+        <w:t>, PC_JC_2024-11-29; 18 samples; 3 dietary groups — Dulse, Reference diet, Soyabean meal) is publicly available under NCBI BioProject PRJNA1406192 and has approximately 46 hand-edited R scripts with corresponding validated figures and tables, so each stage can be compared output-for-output against the corresponding ground-truth artefact. The second dataset (</w:t>
+      </w:r>
+      <w:r>
+        <w:rPr>
+          <w:rStyle w:val="VerbatimChar"/>
+        </w:rPr>
+        <w:t>Chicken batch 2</w:t>
+      </w:r>
+      <w:r>
+        <w:t xml:space="preserve">, JC_FL_2025-05-20; 32 samples), for which public release is pending publication of the associated study, was used for scalability and feature coverage: samples were organised into a 4-level composite </w:t>
+      </w:r>
+      <w:r>
+        <w:rPr>
+          <w:rStyle w:val="VerbatimChar"/>
+        </w:rPr>
+        <w:t>Treatment_Bird</w:t>
+      </w:r>
+      <w:r>
+        <w:t xml:space="preserve"> grouping (Control_W4, Control_W5, Dulse_W4, Dulse_W5) with a random effect (</w:t>
+      </w:r>
+      <w:r>
+        <w:rPr>
+          <w:rStyle w:val="VerbatimChar"/>
+        </w:rPr>
+        <w:t>block</w:t>
+      </w:r>
+      <w:r>
+        <w:t>, pens 1–8), two declared negative controls (CTRL1, CTRL2), and a larger per-stage feature load. Two purpose-built validation scripts (</w:t>
+      </w:r>
+      <w:r>
+        <w:rPr>
+          <w:rStyle w:val="VerbatimChar"/>
+        </w:rPr>
+        <w:t>scripts/diff_normdata.R</w:t>
+      </w:r>
+      <w:r>
+        <w:t xml:space="preserve"> and </w:t>
+      </w:r>
+      <w:r>
+        <w:rPr>
+          <w:rStyle w:val="VerbatimChar"/>
+        </w:rPr>
+        <w:t>scripts/probe_taxid_parse.R</w:t>
+      </w:r>
+      <w:r>
+        <w:t xml:space="preserve">) provide numerical-diff and regression checks on the most error-prone </w:t>
+      </w:r>
+      <w:proofErr w:type="gramStart"/>
+      <w:r>
+        <w:t>intermediates, and</w:t>
+      </w:r>
+      <w:proofErr w:type="gramEnd"/>
+      <w:r>
+        <w:t xml:space="preserve"> </w:t>
+      </w:r>
+      <w:r>
+        <w:rPr>
+          <w:rStyle w:val="VerbatimChar"/>
+        </w:rPr>
+        <w:t>run_pipeline.R</w:t>
+      </w:r>
+      <w:r>
+        <w:t xml:space="preserve"> auto-instruments per-stage wall time and peak R-process memory (via a </w:t>
+      </w:r>
+      <w:r>
+        <w:rPr>
+          <w:rStyle w:val="VerbatimChar"/>
+        </w:rPr>
+        <w:t>gc()</w:t>
+      </w:r>
+      <w:r>
+        <w:t xml:space="preserve">-bracketed wrapper equivalent to the </w:t>
+      </w:r>
+      <w:r>
+        <w:rPr>
+          <w:rStyle w:val="VerbatimChar"/>
+        </w:rPr>
+        <w:t>peakRAM</w:t>
+      </w:r>
+      <w:r>
+        <w:t xml:space="preserve"> methodology) and prints a slowest-first breakdown to the run log.</w:t>
+      </w:r>
+    </w:p>
+    <w:p>
+      <w:pPr>
+        <w:pStyle w:val="BodyText"/>
+      </w:pPr>
       <w:r>
         <w:rPr>
           <w:b/>
           <w:bCs/>
-          <w:i w:val="0"/>
-          <w:iCs/>
-          <w:sz w:val="22"/>
-          <w:szCs w:val="22"/>
-        </w:rPr>
-        <w:fldChar w:fldCharType="separate"/>
-      </w:r>
-      <w:r>
-        <w:rPr>
-          <w:b/>
-          <w:bCs/>
-          <w:i w:val="0"/>
-          <w:iCs/>
-          <w:noProof/>
-          <w:sz w:val="22"/>
-          <w:szCs w:val="22"/>
-        </w:rPr>
-        <w:t>1</w:t>
-      </w:r>
-      <w:r>
-        <w:rPr>
-          <w:b/>
-          <w:bCs/>
-          <w:i w:val="0"/>
-          <w:iCs/>
-          <w:sz w:val="22"/>
-          <w:szCs w:val="22"/>
-        </w:rPr>
-        <w:fldChar w:fldCharType="end"/>
-      </w:r>
-      <w:r>
-        <w:rPr>
-          <w:i w:val="0"/>
-          <w:iCs/>
-          <w:sz w:val="22"/>
-          <w:szCs w:val="22"/>
-        </w:rPr>
-        <w:t>. MERIDIAN workflow. A single config.yaml drives fifteen R modules (R/00–R/14) that consume Kraken2/Bracken, ABRicate, Re-centrifuge, and sample metadata. After setup and decontamination (R/00–R/02), community analyses (R/04–R/08) and functional profiling against CARD, VFDB and PlasmidFinder (TPM in R/03, per-domain analyses in R/09–R/11) converge in a tripartite sample × taxon × gene network (R/12). R/12 fans out to a Quarto dashboard and a publication-panels stage (R/13); R/14 finally writes manifest.json (contract v1.2), a kind-tagged catalogue of every artefact</w:t>
-      </w:r>
-      <w:r>
-        <w:rPr>
-          <w:i w:val="0"/>
-          <w:iCs/>
-          <w:sz w:val="22"/>
-          <w:szCs w:val="22"/>
-        </w:rPr>
-        <w:t xml:space="preserve"> produced</w:t>
-      </w:r>
-      <w:r>
-        <w:rPr>
-          <w:i w:val="0"/>
-          <w:iCs/>
-          <w:sz w:val="22"/>
-          <w:szCs w:val="22"/>
-        </w:rPr>
-        <w:t>.</w:t>
-      </w:r>
-    </w:p>
-    <w:p>
-      <w:pPr>
-        <w:pStyle w:val="BodyText"/>
-        <w:jc w:val="both"/>
-      </w:pPr>
-      <w:r>
-        <w:rPr>
-          <w:b/>
-          <w:bCs/>
-        </w:rPr>
-        <w:lastRenderedPageBreak/>
-        <w:t>Configuration-driven.</w:t>
-      </w:r>
-      <w:r>
-        <w:t xml:space="preserve"> Everything that varies between studies — metadata file path, grouping columns, negative-control identifiers, abundance thresholds, sample selection — is declared in </w:t>
-      </w:r>
-      <w:r>
-        <w:rPr>
-          <w:rStyle w:val="VerbatimChar"/>
-        </w:rPr>
-        <w:t>config.yaml</w:t>
-      </w:r>
-      <w:r>
-        <w:t xml:space="preserve">. Module code is not edited per-project; dataset-specific adjustments live in </w:t>
-      </w:r>
-      <w:r>
-        <w:rPr>
-          <w:rStyle w:val="VerbatimChar"/>
-        </w:rPr>
-        <w:t>config.yaml</w:t>
-      </w:r>
-      <w:r>
-        <w:t xml:space="preserve"> or in the structured fix tables it references. R/00 (setup) and R/01 (input loading) </w:t>
-      </w:r>
-      <w:r>
-        <w:t>run by default</w:t>
-      </w:r>
-      <w:r>
-        <w:t xml:space="preserve">; every subsequent stage can be toggled via </w:t>
-      </w:r>
-      <w:r>
-        <w:rPr>
-          <w:rStyle w:val="VerbatimChar"/>
-        </w:rPr>
-        <w:t>cfg$stages$*</w:t>
-      </w:r>
-      <w:r>
-        <w:t xml:space="preserve"> flags,</w:t>
-      </w:r>
-      <w:r>
-        <w:t xml:space="preserve"> e.g, users can</w:t>
-      </w:r>
-      <w:r>
-        <w:t xml:space="preserve"> re-run only the resistome modules after revising thresholds. TPM normalisation (R/03) and all gene-element stages (R/09–R/11) require ABRicate outputs and are skipped otherwise. Per-study NCBI taxonomy fixes, when needed, are declared in a structured </w:t>
-      </w:r>
-      <w:r>
-        <w:rPr>
-          <w:rStyle w:val="VerbatimChar"/>
-        </w:rPr>
-        <w:t>taxid_fixes.csv</w:t>
-      </w:r>
-      <w:r>
-        <w:t xml:space="preserve"> rather than as row-index edits. A single </w:t>
-      </w:r>
-      <w:r>
-        <w:rPr>
-          <w:rStyle w:val="VerbatimChar"/>
-        </w:rPr>
-        <w:t>cfg$stats$padjust_method</w:t>
-      </w:r>
-      <w:r>
-        <w:t xml:space="preserve"> knob (Benjamini-Hochberg</w:t>
-      </w:r>
-      <w:r>
-        <w:t xml:space="preserve"> is used</w:t>
-      </w:r>
-      <w:r>
-        <w:t xml:space="preserve"> by default; full list in </w:t>
-      </w:r>
-      <w:r>
-        <w:rPr>
-          <w:rStyle w:val="VerbatimChar"/>
-        </w:rPr>
-        <w:t>docs/STATISTICS.md</w:t>
-      </w:r>
-      <w:r>
-        <w:t>) routes every multiple-testing correction across the pipeline.</w:t>
-      </w:r>
-    </w:p>
-    <w:p>
-      <w:pPr>
-        <w:pStyle w:val="BodyText"/>
-        <w:jc w:val="both"/>
-      </w:pPr>
-      <w:r>
-        <w:rPr>
-          <w:b/>
-          <w:bCs/>
-        </w:rPr>
-        <w:t>Stages.</w:t>
-      </w:r>
-      <w:r>
-        <w:t xml:space="preserve"> The pipeline organises its work into five conceptual blocks.</w:t>
-      </w:r>
-    </w:p>
-    <w:p>
-      <w:pPr>
-        <w:pStyle w:val="BodyText"/>
-        <w:jc w:val="both"/>
-      </w:pPr>
-      <w:r>
-        <w:t xml:space="preserve">(1) </w:t>
-      </w:r>
-      <w:r>
-        <w:rPr>
-          <w:i/>
-          <w:iCs/>
-        </w:rPr>
-        <w:t>Ingest and cleaning</w:t>
-      </w:r>
-      <w:r>
-        <w:t xml:space="preserve"> (R/00–R/02) load upstream tables — Kraken2/Bracken, ABRicate, Re-centrifuge contamination tags, study metadata — accommodating per-project input shapes rather than assuming a fixed column layout, apply optional negative-control subtraction, merge Bracken counts with the metadata covariates declared in </w:t>
-      </w:r>
-      <w:r>
-        <w:rPr>
-          <w:rStyle w:val="VerbatimChar"/>
-        </w:rPr>
-        <w:t>cfg$metadata$fixed_effects</w:t>
-      </w:r>
-      <w:r>
-        <w:t xml:space="preserve"> / </w:t>
-      </w:r>
-      <w:r>
-        <w:rPr>
-          <w:rStyle w:val="VerbatimChar"/>
-        </w:rPr>
-        <w:t>random_effect</w:t>
-      </w:r>
-      <w:r>
-        <w:t xml:space="preserve">, and link ABRicate calls to taxonomic assignments. Per-study taxonomy patches are applied from </w:t>
-      </w:r>
-      <w:r>
-        <w:rPr>
-          <w:rStyle w:val="VerbatimChar"/>
-        </w:rPr>
-        <w:t>taxid_fixes.csv</w:t>
-      </w:r>
-      <w:r>
-        <w:t xml:space="preserve"> when supplied.</w:t>
-      </w:r>
-    </w:p>
-    <w:p>
-      <w:pPr>
-        <w:pStyle w:val="BodyText"/>
-        <w:jc w:val="both"/>
-      </w:pPr>
-      <w:r>
-        <w:t xml:space="preserve">(2) </w:t>
-      </w:r>
-      <w:r>
-        <w:rPr>
-          <w:i/>
-          <w:iCs/>
-        </w:rPr>
-        <w:t>Gene-element normalisation</w:t>
-      </w:r>
-      <w:r>
-        <w:t xml:space="preserve"> (R/03) computes per-(sample, GENE) TPM from ABRicate hits and gene lengths.</w:t>
-      </w:r>
-    </w:p>
-    <w:p>
-      <w:pPr>
-        <w:pStyle w:val="BodyText"/>
-        <w:jc w:val="both"/>
-      </w:pPr>
-      <w:r>
-        <w:t xml:space="preserve">(3) </w:t>
-      </w:r>
-      <w:r>
-        <w:rPr>
-          <w:i/>
-          <w:iCs/>
-        </w:rPr>
-        <w:t>Community analyses</w:t>
-      </w:r>
-      <w:r>
-        <w:t xml:space="preserve"> (R/04–R/08) cover the standard taxonomic toolkit. R/04–R/05 produce Venn diagrams and annotated heatmaps after a shared taxa-name cleanup, plus top-N stacked-bar relative-abundance plots (static PNG and interactive plotly HTML) with paired total-count and sample-prevalence panels. </w:t>
-      </w:r>
-      <w:r>
-        <w:t>A</w:t>
-      </w:r>
-      <w:r>
-        <w:t>lpha</w:t>
-      </w:r>
-      <w:r>
-        <w:t xml:space="preserve"> </w:t>
-      </w:r>
-      <w:r>
-        <w:t>diversity</w:t>
-      </w:r>
-      <w:r>
-        <w:t xml:space="preserve"> (R/06</w:t>
-      </w:r>
-      <w:r>
-        <w:t xml:space="preserve">) reports Shannon, Simpson, richness, Pielou, and Fisher metrics with Kruskal-Wallis tests and violin/bar plots, preferring </w:t>
-      </w:r>
-      <w:proofErr w:type="gramStart"/>
-      <w:r>
-        <w:t>a pre</w:t>
-      </w:r>
-      <w:proofErr w:type="gramEnd"/>
-      <w:r>
-        <w:t>-computed indices CSV (e.g.,</w:t>
-      </w:r>
-      <w:r>
-        <w:t xml:space="preserve"> Oxford Nanopore wf-metagenomics output) and falling back to </w:t>
-      </w:r>
-      <w:r>
-        <w:t xml:space="preserve">the </w:t>
-      </w:r>
-      <w:r>
-        <w:t>vegan</w:t>
-      </w:r>
-      <w:r>
-        <w:t xml:space="preserve"> R package</w:t>
-      </w:r>
-      <w:r>
-        <w:t xml:space="preserve">. </w:t>
-      </w:r>
-      <w:r>
-        <w:t>Beta diversity (</w:t>
-      </w:r>
-      <w:r>
-        <w:t>R/07</w:t>
-      </w:r>
-      <w:r>
-        <w:t>)</w:t>
-      </w:r>
-      <w:r>
-        <w:t xml:space="preserve"> computes PCoA on Hellinger-transformed Bray-Curtis distances with PERMANOVA (</w:t>
-      </w:r>
-      <w:r>
-        <w:rPr>
-          <w:rStyle w:val="VerbatimChar"/>
-        </w:rPr>
-        <w:t>adonis2</w:t>
-      </w:r>
-      <w:r>
-        <w:t>, 9999 permutations) and PERMDISP (</w:t>
-      </w:r>
-      <w:r>
-        <w:rPr>
-          <w:rStyle w:val="VerbatimChar"/>
-        </w:rPr>
-        <w:t>betadisper</w:t>
-      </w:r>
-      <w:r>
-        <w:t>) overlaid on the ordination. ALDEx2 differential abundance</w:t>
-      </w:r>
-      <w:r>
-        <w:t xml:space="preserve"> (R/08) runs </w:t>
-      </w:r>
-      <w:r>
-        <w:t>at two levels — taxa (Bracken counts) and genes (ABRicate contig hits per (sample, GENE</w:t>
-      </w:r>
-      <w:r>
-        <w:t>)),</w:t>
-      </w:r>
-      <w:r>
-        <w:t xml:space="preserve"> combining an omnibus Kruskal-Wallis with pairwise Welch's t tests, with an optional </w:t>
-      </w:r>
-      <w:r>
-        <w:rPr>
-          <w:rStyle w:val="VerbatimChar"/>
-        </w:rPr>
-        <w:t>aldex.glm</w:t>
-      </w:r>
-      <w:r>
-        <w:t xml:space="preserve"> design path for covariate-adjusted models.</w:t>
-      </w:r>
-    </w:p>
-    <w:p>
-      <w:pPr>
-        <w:pStyle w:val="BodyText"/>
-        <w:jc w:val="both"/>
-      </w:pPr>
-      <w:r>
-        <w:t xml:space="preserve">(4) </w:t>
-      </w:r>
-      <w:r>
-        <w:rPr>
-          <w:i/>
-          <w:iCs/>
-        </w:rPr>
-        <w:t>Functional profiling</w:t>
-      </w:r>
-      <w:r>
-        <w:t xml:space="preserve"> (R/09–R/11) runs a shared analysis engine three times against domain-specific databases: the resistome (ABRicate/CARD, with drug-class classification), the virulome (VFDB, with functional categories extracted from the ABRicate </w:t>
-      </w:r>
-      <w:r>
-        <w:rPr>
-          <w:rStyle w:val="VerbatimChar"/>
-        </w:rPr>
-        <w:t>PRODUCT</w:t>
-      </w:r>
-      <w:r>
-        <w:t xml:space="preserve"> field) and the mobilome (PlasmidFinder, with configurable replicon-family classification — Col-like, IncF, IncX, </w:t>
-      </w:r>
-      <w:proofErr w:type="gramStart"/>
-      <w:r>
-        <w:t>other</w:t>
-      </w:r>
-      <w:proofErr w:type="gramEnd"/>
-      <w:r>
-        <w:t xml:space="preserve"> Inc). Each domain emits its own alpha diversity, Venn diagram, gene- and category-level heatmaps, relative-abundance and total-count panels, and a PCoA + PERMANOVA + PERMDISP suite.</w:t>
-      </w:r>
-    </w:p>
-    <w:p>
-      <w:pPr>
-        <w:pStyle w:val="BodyText"/>
-        <w:jc w:val="both"/>
-      </w:pPr>
-      <w:r>
-        <w:lastRenderedPageBreak/>
-        <w:t xml:space="preserve">(5) </w:t>
-      </w:r>
-      <w:r>
-        <w:rPr>
-          <w:i/>
-          <w:iCs/>
-        </w:rPr>
-        <w:t>Integration, reporting and manifest</w:t>
-      </w:r>
-      <w:r>
-        <w:t xml:space="preserve"> (R/12–R/14). R/12 reports igraph topology metrics (degree, betweenness, Louvain modularity) alongside its network, chord and Sankey outputs, and exports Gephi-compatible node/edge tables. R/1</w:t>
-      </w:r>
-      <w:r>
-        <w:t>3</w:t>
-      </w:r>
-      <w:r>
-        <w:t xml:space="preserve"> assembles main and supplementary composite figures (PNG and TIFF independently toggleable) driven by a slot-YAML layout, plus </w:t>
-      </w:r>
-      <w:r>
-        <w:rPr>
-          <w:rStyle w:val="VerbatimChar"/>
-        </w:rPr>
-        <w:t>supplementary_tables.xlsx</w:t>
-      </w:r>
-      <w:r>
-        <w:t>. R/1</w:t>
-      </w:r>
-      <w:r>
-        <w:t>4</w:t>
-      </w:r>
-      <w:r>
-        <w:t xml:space="preserve"> writes </w:t>
-      </w:r>
-      <w:r>
-        <w:rPr>
-          <w:rStyle w:val="VerbatimChar"/>
-        </w:rPr>
-        <w:t>manifest.json</w:t>
-      </w:r>
-      <w:r>
-        <w:t xml:space="preserve"> (contract v1.2), a kind-tagged catalogue of every figure, table and intermediate artefact the </w:t>
-      </w:r>
-      <w:r>
-        <w:t>pipeline</w:t>
-      </w:r>
-      <w:r>
-        <w:t xml:space="preserve"> produced, providing a stable contract for downstream </w:t>
-      </w:r>
-      <w:r>
-        <w:t>integration</w:t>
-      </w:r>
-      <w:r>
-        <w:t>.</w:t>
-      </w:r>
-    </w:p>
-    <w:p>
-      <w:pPr>
-        <w:pStyle w:val="BodyText"/>
-        <w:jc w:val="both"/>
-      </w:pPr>
-      <w:r>
-        <w:rPr>
-          <w:b/>
-          <w:bCs/>
-        </w:rPr>
-        <w:t>Reporting.</w:t>
-      </w:r>
-      <w:r>
-        <w:t xml:space="preserve"> The Quarto template renders all outputs as a multi-page HTML dashboard with per-domain panels (taxonomy, diversity, differential abundance, resistome, virulome, mobilome, network) and embedded download links. Dependencies are pinned via </w:t>
-      </w:r>
-      <w:r>
-        <w:rPr>
-          <w:rStyle w:val="VerbatimChar"/>
-        </w:rPr>
-        <w:t>renv</w:t>
-      </w:r>
-      <w:r>
-        <w:rPr>
-          <w:rStyle w:val="VerbatimChar"/>
-        </w:rPr>
-        <w:t>,</w:t>
-      </w:r>
-      <w:r>
-        <w:t xml:space="preserve"> and the project requires R ≥ 4.5; external command-line tools (Kraken2, Bracken, ABRicate, Re-centrifuge) are assumed to have been run upstream.</w:t>
-      </w:r>
-    </w:p>
-    <w:p>
-      <w:pPr>
-        <w:pStyle w:val="Heading2"/>
-      </w:pPr>
-      <w:bookmarkStart w:id="4" w:name="Xe535e7deb3457bf6891dfc100ac742aa591bc31"/>
-      <w:bookmarkEnd w:id="3"/>
-      <w:r>
-        <w:t>3 Application and Validation</w:t>
-      </w:r>
-    </w:p>
-    <w:p>
-      <w:pPr>
-        <w:pStyle w:val="FirstParagraph"/>
-        <w:jc w:val="both"/>
-      </w:pPr>
-      <w:r>
-        <w:t>We are validating the pipeline against two real long-read chicken caecum metagenomics studies. The reference cohort (</w:t>
-      </w:r>
-      <w:r>
-        <w:rPr>
-          <w:rStyle w:val="VerbatimChar"/>
-        </w:rPr>
-        <w:t>C</w:t>
-      </w:r>
-      <w:r>
-        <w:rPr>
-          <w:rStyle w:val="VerbatimChar"/>
-        </w:rPr>
-        <w:t>hicken</w:t>
-      </w:r>
-      <w:r>
-        <w:rPr>
-          <w:rStyle w:val="VerbatimChar"/>
-        </w:rPr>
-        <w:t xml:space="preserve"> </w:t>
-      </w:r>
-      <w:r>
-        <w:rPr>
-          <w:rStyle w:val="VerbatimChar"/>
-        </w:rPr>
-        <w:t>batch</w:t>
-      </w:r>
-      <w:r>
-        <w:rPr>
-          <w:rStyle w:val="VerbatimChar"/>
-        </w:rPr>
-        <w:t xml:space="preserve"> </w:t>
-      </w:r>
-      <w:r>
-        <w:rPr>
-          <w:rStyle w:val="VerbatimChar"/>
-        </w:rPr>
-        <w:t>1</w:t>
-      </w:r>
-      <w:r>
-        <w:t>, PC_JC_2024-11-29; 18 samples; 3 dietary groups — Dulse, Reference diet, Soyabean meal) has approximately 46 hand-edited R scripts and known-good figures and tables already in place, so each stage can be compared output-for-output against the corresponding ground-truth artefact. The scaling and feature-coverage cohort (</w:t>
-      </w:r>
-      <w:r>
-        <w:rPr>
-          <w:rStyle w:val="VerbatimChar"/>
-        </w:rPr>
-        <w:t>C</w:t>
-      </w:r>
-      <w:r>
-        <w:rPr>
-          <w:rStyle w:val="VerbatimChar"/>
-        </w:rPr>
-        <w:t>hicken</w:t>
-      </w:r>
-      <w:r>
-        <w:rPr>
-          <w:rStyle w:val="VerbatimChar"/>
-        </w:rPr>
-        <w:t xml:space="preserve"> b</w:t>
-      </w:r>
-      <w:r>
-        <w:rPr>
-          <w:rStyle w:val="VerbatimChar"/>
-        </w:rPr>
-        <w:t>atch</w:t>
-      </w:r>
-      <w:r>
-        <w:rPr>
-          <w:rStyle w:val="VerbatimChar"/>
-        </w:rPr>
-        <w:t xml:space="preserve"> </w:t>
-      </w:r>
-      <w:r>
-        <w:rPr>
-          <w:rStyle w:val="VerbatimChar"/>
-        </w:rPr>
-        <w:t>2</w:t>
-      </w:r>
-      <w:r>
-        <w:t xml:space="preserve">, JC_FL_2025-05-20; 32 samples; 4-level composite </w:t>
-      </w:r>
-      <w:r>
-        <w:rPr>
-          <w:rStyle w:val="VerbatimChar"/>
-        </w:rPr>
-        <w:t>Treatment_Bird</w:t>
-      </w:r>
-      <w:r>
-        <w:t xml:space="preserve"> grouping — Control_W4, Control_W5, Dulse_W4, Dulse_W5) exercises a random effect (</w:t>
-      </w:r>
-      <w:r>
-        <w:rPr>
-          <w:rStyle w:val="VerbatimChar"/>
-        </w:rPr>
-        <w:t>block</w:t>
-      </w:r>
-      <w:r>
-        <w:t>, pens 1–8), two declared negative controls (CTRL1, CTRL2), and a larger per-stage feature load. Two purpose-built validation scripts (</w:t>
-      </w:r>
-      <w:r>
-        <w:rPr>
-          <w:rStyle w:val="VerbatimChar"/>
-        </w:rPr>
-        <w:t>scripts/diff_normdata.R</w:t>
-      </w:r>
-      <w:r>
-        <w:t xml:space="preserve"> and </w:t>
-      </w:r>
-      <w:r>
-        <w:rPr>
-          <w:rStyle w:val="VerbatimChar"/>
-        </w:rPr>
-        <w:t>scripts/probe_taxid_parse.R</w:t>
-      </w:r>
-      <w:r>
-        <w:t xml:space="preserve">) provide numerical-diff and regression checks on the most error-prone </w:t>
-      </w:r>
-      <w:proofErr w:type="gramStart"/>
-      <w:r>
-        <w:t>intermediates, and</w:t>
-      </w:r>
-      <w:proofErr w:type="gramEnd"/>
-      <w:r>
-        <w:t xml:space="preserve"> </w:t>
-      </w:r>
-      <w:r>
-        <w:rPr>
-          <w:rStyle w:val="VerbatimChar"/>
-        </w:rPr>
-        <w:t>run_pipeline.R</w:t>
-      </w:r>
-      <w:r>
-        <w:t xml:space="preserve"> auto-instruments per-stage wall time and peak R-process memory (via a </w:t>
-      </w:r>
-      <w:r>
-        <w:rPr>
-          <w:rStyle w:val="VerbatimChar"/>
-        </w:rPr>
-        <w:t>gc()</w:t>
-      </w:r>
-      <w:r>
-        <w:t xml:space="preserve">-bracketed wrapper equivalent to the </w:t>
-      </w:r>
-      <w:r>
-        <w:rPr>
-          <w:rStyle w:val="VerbatimChar"/>
-        </w:rPr>
-        <w:t>peakRAM</w:t>
-      </w:r>
-      <w:r>
-        <w:t xml:space="preserve"> methodology) and prints a slowest-first breakdown to the run log.</w:t>
-      </w:r>
-    </w:p>
-    <w:p>
-      <w:pPr>
-        <w:pStyle w:val="BodyText"/>
-        <w:jc w:val="both"/>
-      </w:pPr>
-      <w:r>
-        <w:rPr>
-          <w:b/>
-          <w:bCs/>
         </w:rPr>
         <w:t>Table 1.</w:t>
       </w:r>
       <w:r>
-        <w:t xml:space="preserve"> Per-stage primary output on the two validation cohorts (B1 = </w:t>
-      </w:r>
-      <w:r>
-        <w:t>C</w:t>
-      </w:r>
-      <w:r>
-        <w:t>hicken</w:t>
-      </w:r>
-      <w:r>
-        <w:t xml:space="preserve"> </w:t>
-      </w:r>
-      <w:r>
-        <w:t>batch</w:t>
-      </w:r>
-      <w:r>
-        <w:t xml:space="preserve"> </w:t>
-      </w:r>
-      <w:r>
-        <w:t xml:space="preserve">1, n=18; B2 = </w:t>
-      </w:r>
-      <w:r>
-        <w:t>Chicken batch 2</w:t>
-      </w:r>
-      <w:r>
-        <w:t>, n=32). Same</w:t>
-      </w:r>
-      <w:r>
-        <w:t xml:space="preserve"> </w:t>
-      </w:r>
-      <w:r>
-        <w:t xml:space="preserve">statistical settings (PERMANOVA 9999 permutations, ALDEx2 </w:t>
+        <w:t xml:space="preserve"> Per-stage primary output on the two validation cohorts (B1 = Chicken batch 1, n=18; B2 = Chicken batch 2, n=32). Same statistical settings (PERMANOVA 9999 permutations, ALDEx2 </w:t>
       </w:r>
       <w:r>
         <w:rPr>
@@ -1436,6 +965,7 @@
               <w:pStyle w:val="Compact"/>
             </w:pPr>
             <w:r>
+              <w:lastRenderedPageBreak/>
               <w:t>Stage</w:t>
             </w:r>
           </w:p>
@@ -1656,7 +1186,6 @@
               <w:pStyle w:val="Compact"/>
             </w:pPr>
             <w:r>
-              <w:lastRenderedPageBreak/>
               <w:t>relative_abundance</w:t>
             </w:r>
           </w:p>
@@ -1997,7 +1526,7 @@
               <w:pStyle w:val="Compact"/>
             </w:pPr>
             <w:r>
-              <w:t xml:space="preserve">panels </w:t>
+              <w:t>panels</w:t>
             </w:r>
           </w:p>
         </w:tc>
@@ -2152,10 +1681,9 @@
     <w:p>
       <w:pPr>
         <w:pStyle w:val="BodyText"/>
-        <w:jc w:val="both"/>
-      </w:pPr>
-      <w:r>
-        <w:t>Across both cohorts (</w:t>
+      </w:pPr>
+      <w:r>
+        <w:t>Across both datasets (</w:t>
       </w:r>
       <w:r>
         <w:rPr>
@@ -2165,16 +1693,29 @@
         <w:t>Table 1</w:t>
       </w:r>
       <w:r>
-        <w:t xml:space="preserve">), every enabled stage produced its expected primary artefact under identical settings. Feature counts scale with cohort size and grouping complexity: B2 (n=32, 4-level `Treatment_Bird`) yields ~1.5–2× the resistome (648 vs 348 rows), virulome (492 vs 320) and mobilome (137 vs 65) rows of B1, with 53 vs 31 differentially abundant taxa across 6 vs 3 pairwise contrasts and a denser integrated network (576 edges/210 nodes/modularity 0.40 vs 247/100/0.31). The pipeline closes cleanly on both runs, producing a contract-v1.2 `manifest.json` (~80–85 kB) and a Quarto HTML dashboard (~14–18 MB). </w:t>
-      </w:r>
-      <w:r>
-        <w:t>T</w:t>
-      </w:r>
-      <w:r>
-        <w:t>he performance profile</w:t>
-      </w:r>
-      <w:r>
-        <w:t xml:space="preserve"> (</w:t>
+        <w:t xml:space="preserve">), every enabled stage produced its expected primary artefact under identical settings. Feature counts scale with cohort size and grouping complexity: B2 (n=32, 4-level </w:t>
+      </w:r>
+      <w:r>
+        <w:rPr>
+          <w:rStyle w:val="VerbatimChar"/>
+        </w:rPr>
+        <w:t>Treatment_Bird</w:t>
+      </w:r>
+      <w:r>
+        <w:t xml:space="preserve">) yields ~1.5–2× the resistome (648 vs 348 rows), virulome (492 vs 320) and mobilome (137 vs 65) rows of B1, with 53 vs 31 differentially abundant taxa across 6 vs 3 pairwise contrasts and a denser integrated network (576 edges/210 nodes/modularity 0.40 vs 247/100/0.31). The pipeline closes cleanly on both runs, producing a contract-v1.2 </w:t>
+      </w:r>
+      <w:r>
+        <w:rPr>
+          <w:rStyle w:val="VerbatimChar"/>
+        </w:rPr>
+        <w:t>manifest.json</w:t>
+      </w:r>
+      <w:r>
+        <w:t xml:space="preserve"> (~80–85 kB) and a Quarto </w:t>
+      </w:r>
+      <w:r>
+        <w:lastRenderedPageBreak/>
+        <w:t>HTML dashboard (~14–18 MB). The performance profile (</w:t>
       </w:r>
       <w:r>
         <w:rPr>
@@ -2184,16 +1725,7 @@
         <w:t>Figure 2</w:t>
       </w:r>
       <w:r>
-        <w:t>) illustrated that the</w:t>
-      </w:r>
-      <w:r>
-        <w:t xml:space="preserve"> </w:t>
-      </w:r>
-      <w:r>
-        <w:t>e</w:t>
-      </w:r>
-      <w:r>
-        <w:t xml:space="preserve">nd-to-end runtime grew from 6m 41s on B1 to 8m 19s on B2 (+24 %, sublinear in both sample count and pairwise-contrast count), dominated on both cohorts by ALDEx2 differential abundance (32 % of B1 total, 40 % of B2). Peak R-process memory tracks the same monotone profile — climbing through the gene-element domains as the joint long-form </w:t>
+        <w:t xml:space="preserve">) illustrated that the end-to-end runtime grew from 6m 41s on B1 to 8m 19s on B2 (+24 %, sublinear in both sample count and pairwise-contrast count), dominated on both cohorts by ALDEx2 differential abundance (32 % of B1 total, 40 % of B2). Peak R-process memory tracks the same monotone profile, climbing through the gene-element domains as the joint long-form </w:t>
       </w:r>
       <w:r>
         <w:rPr>
@@ -2202,13 +1734,7 @@
         <w:t>(sample × gene)</w:t>
       </w:r>
       <w:r>
-        <w:t xml:space="preserve"> tables grow (~1 GB plateau) and tops out during R/1</w:t>
-      </w:r>
-      <w:r>
-        <w:t>3</w:t>
-      </w:r>
-      <w:r>
-        <w:t xml:space="preserve"> panel assembly (1.33 GB on B1, 1.51 GB on B2), where every domain's PNGs and tables are loaded simultaneously to lay out); the </w:t>
+        <w:t xml:space="preserve"> tables grow (~1 GB plateau) and tops out during R/13 panel assembly (1.33 GB on B1, 1.51 GB on B2), where every domain's PNGs and tables are loaded simultaneously to lay out; the </w:t>
       </w:r>
       <w:r>
         <w:rPr>
@@ -2223,30 +1749,28 @@
     <w:p>
       <w:pPr>
         <w:pStyle w:val="BodyText"/>
-        <w:keepNext/>
       </w:pPr>
       <w:r>
         <w:rPr>
           <w:noProof/>
         </w:rPr>
-        <w:lastRenderedPageBreak/>
         <w:drawing>
-          <wp:inline distT="0" distB="0" distL="0" distR="0" wp14:anchorId="0C1C2BD4" wp14:editId="6B3E6D3A">
-            <wp:extent cx="5951220" cy="6568440"/>
+          <wp:inline distT="0" distB="0" distL="0" distR="0" wp14:anchorId="7A51AA1C" wp14:editId="29F7F50D">
+            <wp:extent cx="5334000" cy="5754729"/>
             <wp:effectExtent l="0" t="0" r="0" b="0"/>
-            <wp:docPr id="18" name="Picture" descr="Figure 2. Pipeline performance on the two validation cohorts. (A) Per-stage wall time (log scale) and (B) peak R-process heap, both with stages sorted by B2 runtime. (C) Cumulative wall time and (D) running peak memory across the 15 stages in pipeline order. Both runs used identical pipeline commit eee122c, R 4.5.0 single thread, PERMANOVA 9999 permutations, ALDEx2 mc.samples = 128. B1 = chicken_batch1 (PC_JC_2024-11-29; n=18; 3 dietary groups). B2 = chicken_batch2 (JC_FL_2025-05-20; n=32; 4-level Treatment_Bird, block random effect, two declared negative controls). Source: generate_figure2.R."/>
+            <wp:docPr id="19" name="Picture" descr="Figure 2. Pipeline performance across four long-read metagenomic cohorts. (A) Per-stage wall time (log scale) and (B) peak R-process heap, sorted by B2 runtime. (C) Cumulative wall time and (D) running peak memory in pipeline order. R 4.5.0 single-thread analysis, including PERMANOVA 9999 permutations, ALDEx2 mc.samples = 128. B1 = Chicken batch 1 (n=18, 3 dietary groups); B2 = Chicken batch 2 (n=32, 4-level Treatment_Bird, block random effect, two negative controls); HW = Egyptian hospital wastewater (n=20); WL = East Atlantic Flyway wetlands (n=24)."/>
             <wp:cNvGraphicFramePr/>
             <a:graphic xmlns:a="http://schemas.openxmlformats.org/drawingml/2006/main">
               <a:graphicData uri="http://schemas.openxmlformats.org/drawingml/2006/picture">
                 <pic:pic xmlns:pic="http://schemas.openxmlformats.org/drawingml/2006/picture">
                   <pic:nvPicPr>
-                    <pic:cNvPr id="19" name="Picture" descr="figure2_pipeline_performance.png"/>
+                    <pic:cNvPr id="20" name="Picture" descr="figure2_pipeline_performance.png"/>
                     <pic:cNvPicPr>
                       <a:picLocks noChangeAspect="1" noChangeArrowheads="1"/>
                     </pic:cNvPicPr>
                   </pic:nvPicPr>
                   <pic:blipFill>
-                    <a:blip r:embed="rId10"/>
+                    <a:blip r:embed="rId8"/>
                     <a:stretch>
                       <a:fillRect/>
                     </a:stretch>
@@ -2254,7 +1778,7 @@
                   <pic:spPr bwMode="auto">
                     <a:xfrm>
                       <a:off x="0" y="0"/>
-                      <a:ext cx="5951702" cy="6568972"/>
+                      <a:ext cx="5334000" cy="5754729"/>
                     </a:xfrm>
                     <a:prstGeom prst="rect">
                       <a:avLst/>
@@ -2275,442 +1799,761 @@
     </w:p>
     <w:p>
       <w:pPr>
-        <w:pStyle w:val="Caption"/>
-        <w:jc w:val="both"/>
-        <w:rPr>
-          <w:i w:val="0"/>
-          <w:iCs/>
-          <w:sz w:val="22"/>
-          <w:szCs w:val="22"/>
-        </w:rPr>
+        <w:pStyle w:val="BodyText"/>
+      </w:pPr>
+      <w:r>
+        <w:t xml:space="preserve">One anticipated and deliberate discrepancy arises at the resistome stage: the ground-truth </w:t>
+      </w:r>
+      <w:proofErr w:type="gramStart"/>
+      <w:r>
+        <w:rPr>
+          <w:rStyle w:val="VerbatimChar"/>
+        </w:rPr>
+        <w:t>cleanData</w:t>
+      </w:r>
+      <w:proofErr w:type="gramEnd"/>
+      <w:r>
+        <w:rPr>
+          <w:rStyle w:val="VerbatimChar"/>
+        </w:rPr>
+        <w:t>.R</w:t>
+      </w:r>
+      <w:r>
+        <w:t xml:space="preserve"> misparses taxids carrying variant suffixes, dropping the corresponding ABRicate rows. R/02 corrects this parsing issue, so the pipeline retains 110 additional </w:t>
+      </w:r>
+      <w:r>
+        <w:lastRenderedPageBreak/>
+        <w:t>(sample, GENE) rows relative to the hand-edited output (</w:t>
+      </w:r>
+      <w:r>
+        <w:rPr>
+          <w:rStyle w:val="VerbatimChar"/>
+        </w:rPr>
+        <w:t>scripts/diff_normdata.R</w:t>
+      </w:r>
+      <w:r>
+        <w:t xml:space="preserve"> on the 2026-06-23 B1 run: pipeline = 733 rows, ground truth = 623; 121 rows recovered by the parsing correction, and 11 rows present in the ground truth that the pipeline currently drops, concentrated in a handful of plasmid replicon and accessory resistance calls, queued for inspection rather than treated as a regression). Jaccard agreement on the </w:t>
+      </w:r>
+      <w:r>
+        <w:rPr>
+          <w:rStyle w:val="VerbatimChar"/>
+        </w:rPr>
+        <w:t>(sample, GENE)</w:t>
+      </w:r>
+      <w:r>
+        <w:t xml:space="preserve"> key set is 0.82. For other stages with directly comparable ground-truth artefacts, sample-set agreement is exact for alpha diversity (18/18), and Jaccard for the network Gephi exports against the most recent hand-edited snapshot is 0.85 (nodes) and 0.87 (edges). Per-stage comparisons against the remaining hand-edited artefacts — taxonomy, beta diversity, and differential abundance — are deferred to a separate validation effort. The Re-centrifuge column-slicing heuristic in R/02 is acknowledged as still coarse and is queued for rework.</w:t>
+      </w:r>
+    </w:p>
+    <w:p>
+      <w:pPr>
+        <w:pStyle w:val="BodyText"/>
+      </w:pPr>
+      <w:r>
+        <w:t xml:space="preserve">To assess portability beyond the development cohorts, we applied MERIDIAN unmodified — changing only </w:t>
+      </w:r>
+      <w:r>
+        <w:rPr>
+          <w:rStyle w:val="VerbatimChar"/>
+        </w:rPr>
+        <w:t>config.yaml</w:t>
+      </w:r>
+      <w:r>
+        <w:t xml:space="preserve"> — to two independent, publicly available long-read (ONT) metagenomic studies spanning the One Health continuum: hospital wastewater versus tap water from five Egyptian hospitals (NCBI BioProject PRJNA1266479; 20 samples) and anthropogenically impacted versus natural wetland sites along the East Atlantic Flyway (ENA BioProject PRJEB96272; 24 samples). Both cohorts completed all fifteen stages in a single run (4m 08s and 7m 37s; peak 2.0 and 3.6 GB), each emitting a Quarto dashboard, publication panels and a contract-v1.2 </w:t>
+      </w:r>
+      <w:r>
+        <w:rPr>
+          <w:rStyle w:val="VerbatimChar"/>
+        </w:rPr>
+        <w:t>manifest.json</w:t>
+      </w:r>
+      <w:r>
+        <w:t>. The pipeline recovered biologically coherent structure: hospital wastewater was significantly richer and compositionally distinct from tap water (PERMANOVA R² = 0.18, p = 3 × 10⁻⁴), and wetland virulence-factor load was higher at anthropogenically impacted than natural sites across the flyway (PERMANOVA R² = 0.088, p_adj = 0.037; functional profiles available for 23 of 24 samples). Both datasets also exercised edge cases absent from the chicken cohorts — a single-group resistome/mobilome in the hospital cohort (tap water carried essentially no ARGs) and a near-absence of plasmid replicons in the wetland water (a single IncP1 hit via PlasmidFinder, too sparse to profile), consistent with the source study — which the pipeline handled by skipping the affected sub-analyses with logged notices rather than failing. As these datasets lack hand-curated ground-truth artefacts, they demonstrate portability and robustness across sample types rather than output-for-output correctness.</w:t>
+      </w:r>
+    </w:p>
+    <w:p>
+      <w:pPr>
+        <w:pStyle w:val="BodyText"/>
       </w:pPr>
       <w:r>
         <w:rPr>
           <w:b/>
           <w:bCs/>
-          <w:i w:val="0"/>
-          <w:iCs/>
-          <w:sz w:val="22"/>
-          <w:szCs w:val="22"/>
-        </w:rPr>
-        <w:t xml:space="preserve">Figure </w:t>
-      </w:r>
+        </w:rPr>
+        <w:t>Table S1.</w:t>
+      </w:r>
+      <w:r>
+        <w:t xml:space="preserve"> MERIDIAN applied across four long-read metagenomic cohorts spanning the One Health continuum. B1/B2 are the poultry development cohorts; the Egyptian hospital-wastewater and East Atlantic Flyway wetland cohorts are independent public datasets analysed with configuration changes only.</w:t>
+      </w:r>
+    </w:p>
+    <w:tbl>
+      <w:tblPr>
+        <w:tblStyle w:val="Table"/>
+        <w:tblW w:w="0" w:type="auto"/>
+        <w:tblLook w:val="0020" w:firstRow="1" w:lastRow="0" w:firstColumn="0" w:lastColumn="0" w:noHBand="0" w:noVBand="0"/>
+      </w:tblPr>
+      <w:tblGrid>
+        <w:gridCol w:w="1556"/>
+        <w:gridCol w:w="1704"/>
+        <w:gridCol w:w="473"/>
+        <w:gridCol w:w="1574"/>
+        <w:gridCol w:w="1094"/>
+        <w:gridCol w:w="766"/>
+        <w:gridCol w:w="2409"/>
+      </w:tblGrid>
+      <w:tr>
+        <w:trPr>
+          <w:cnfStyle w:val="100000000000" w:firstRow="1" w:lastRow="0" w:firstColumn="0" w:lastColumn="0" w:oddVBand="0" w:evenVBand="0" w:oddHBand="0" w:evenHBand="0" w:firstRowFirstColumn="0" w:firstRowLastColumn="0" w:lastRowFirstColumn="0" w:lastRowLastColumn="0"/>
+          <w:tblHeader/>
+        </w:trPr>
+        <w:tc>
+          <w:tcPr>
+            <w:tcW w:w="0" w:type="auto"/>
+          </w:tcPr>
+          <w:p>
+            <w:pPr>
+              <w:pStyle w:val="Compact"/>
+            </w:pPr>
+            <w:r>
+              <w:t>Cohort</w:t>
+            </w:r>
+          </w:p>
+        </w:tc>
+        <w:tc>
+          <w:tcPr>
+            <w:tcW w:w="0" w:type="auto"/>
+          </w:tcPr>
+          <w:p>
+            <w:pPr>
+              <w:pStyle w:val="Compact"/>
+            </w:pPr>
+            <w:r>
+              <w:t>One Health axis</w:t>
+            </w:r>
+          </w:p>
+        </w:tc>
+        <w:tc>
+          <w:tcPr>
+            <w:tcW w:w="0" w:type="auto"/>
+          </w:tcPr>
+          <w:p>
+            <w:pPr>
+              <w:pStyle w:val="Compact"/>
+            </w:pPr>
+            <w:r>
+              <w:t>n</w:t>
+            </w:r>
+          </w:p>
+        </w:tc>
+        <w:tc>
+          <w:tcPr>
+            <w:tcW w:w="0" w:type="auto"/>
+          </w:tcPr>
+          <w:p>
+            <w:pPr>
+              <w:pStyle w:val="Compact"/>
+            </w:pPr>
+            <w:r>
+              <w:t>Primary contrast</w:t>
+            </w:r>
+          </w:p>
+        </w:tc>
+        <w:tc>
+          <w:tcPr>
+            <w:tcW w:w="0" w:type="auto"/>
+          </w:tcPr>
+          <w:p>
+            <w:pPr>
+              <w:pStyle w:val="Compact"/>
+            </w:pPr>
+            <w:r>
+              <w:t>Runtime</w:t>
+            </w:r>
+          </w:p>
+        </w:tc>
+        <w:tc>
+          <w:tcPr>
+            <w:tcW w:w="0" w:type="auto"/>
+          </w:tcPr>
+          <w:p>
+            <w:pPr>
+              <w:pStyle w:val="Compact"/>
+            </w:pPr>
+            <w:r>
+              <w:t>Peak RAM</w:t>
+            </w:r>
+          </w:p>
+        </w:tc>
+        <w:tc>
+          <w:tcPr>
+            <w:tcW w:w="0" w:type="auto"/>
+          </w:tcPr>
+          <w:p>
+            <w:pPr>
+              <w:pStyle w:val="Compact"/>
+            </w:pPr>
+            <w:r>
+              <w:t>Headline result</w:t>
+            </w:r>
+          </w:p>
+        </w:tc>
+      </w:tr>
+      <w:tr>
+        <w:tc>
+          <w:tcPr>
+            <w:tcW w:w="0" w:type="auto"/>
+          </w:tcPr>
+          <w:p>
+            <w:pPr>
+              <w:pStyle w:val="Compact"/>
+            </w:pPr>
+            <w:r>
+              <w:t>Chicken batch 1</w:t>
+            </w:r>
+          </w:p>
+        </w:tc>
+        <w:tc>
+          <w:tcPr>
+            <w:tcW w:w="0" w:type="auto"/>
+          </w:tcPr>
+          <w:p>
+            <w:pPr>
+              <w:pStyle w:val="Compact"/>
+            </w:pPr>
+            <w:r>
+              <w:t>Livestock (poultry caecum)</w:t>
+            </w:r>
+          </w:p>
+        </w:tc>
+        <w:tc>
+          <w:tcPr>
+            <w:tcW w:w="0" w:type="auto"/>
+          </w:tcPr>
+          <w:p>
+            <w:pPr>
+              <w:pStyle w:val="Compact"/>
+            </w:pPr>
+            <w:r>
+              <w:t>18</w:t>
+            </w:r>
+          </w:p>
+        </w:tc>
+        <w:tc>
+          <w:tcPr>
+            <w:tcW w:w="0" w:type="auto"/>
+          </w:tcPr>
+          <w:p>
+            <w:pPr>
+              <w:pStyle w:val="Compact"/>
+            </w:pPr>
+            <w:r>
+              <w:t>Diet (3 groups)</w:t>
+            </w:r>
+          </w:p>
+        </w:tc>
+        <w:tc>
+          <w:tcPr>
+            <w:tcW w:w="0" w:type="auto"/>
+          </w:tcPr>
+          <w:p>
+            <w:pPr>
+              <w:pStyle w:val="Compact"/>
+            </w:pPr>
+            <w:r>
+              <w:t>6m 41s</w:t>
+            </w:r>
+          </w:p>
+        </w:tc>
+        <w:tc>
+          <w:tcPr>
+            <w:tcW w:w="0" w:type="auto"/>
+          </w:tcPr>
+          <w:p>
+            <w:pPr>
+              <w:pStyle w:val="Compact"/>
+            </w:pPr>
+            <w:r>
+              <w:t>1.33 GB</w:t>
+            </w:r>
+          </w:p>
+        </w:tc>
+        <w:tc>
+          <w:tcPr>
+            <w:tcW w:w="0" w:type="auto"/>
+          </w:tcPr>
+          <w:p>
+            <w:pPr>
+              <w:pStyle w:val="Compact"/>
+            </w:pPr>
+            <w:r>
+              <w:t xml:space="preserve">Ground-truth reference; R/02 parsing fix recovers 110 (sample, GENE) </w:t>
+            </w:r>
+            <w:r>
+              <w:lastRenderedPageBreak/>
+              <w:t>rows</w:t>
+            </w:r>
+          </w:p>
+        </w:tc>
+      </w:tr>
+      <w:tr>
+        <w:tc>
+          <w:tcPr>
+            <w:tcW w:w="0" w:type="auto"/>
+          </w:tcPr>
+          <w:p>
+            <w:pPr>
+              <w:pStyle w:val="Compact"/>
+            </w:pPr>
+            <w:r>
+              <w:lastRenderedPageBreak/>
+              <w:t>Chicken batch 2</w:t>
+            </w:r>
+          </w:p>
+        </w:tc>
+        <w:tc>
+          <w:tcPr>
+            <w:tcW w:w="0" w:type="auto"/>
+          </w:tcPr>
+          <w:p>
+            <w:pPr>
+              <w:pStyle w:val="Compact"/>
+            </w:pPr>
+            <w:r>
+              <w:t>Livestock (poultry caecum)</w:t>
+            </w:r>
+          </w:p>
+        </w:tc>
+        <w:tc>
+          <w:tcPr>
+            <w:tcW w:w="0" w:type="auto"/>
+          </w:tcPr>
+          <w:p>
+            <w:pPr>
+              <w:pStyle w:val="Compact"/>
+            </w:pPr>
+            <w:r>
+              <w:t>32</w:t>
+            </w:r>
+          </w:p>
+        </w:tc>
+        <w:tc>
+          <w:tcPr>
+            <w:tcW w:w="0" w:type="auto"/>
+          </w:tcPr>
+          <w:p>
+            <w:pPr>
+              <w:pStyle w:val="Compact"/>
+            </w:pPr>
+            <w:r>
+              <w:t>Treatment × week (4-level)</w:t>
+            </w:r>
+          </w:p>
+        </w:tc>
+        <w:tc>
+          <w:tcPr>
+            <w:tcW w:w="0" w:type="auto"/>
+          </w:tcPr>
+          <w:p>
+            <w:pPr>
+              <w:pStyle w:val="Compact"/>
+            </w:pPr>
+            <w:r>
+              <w:t>8m 19s</w:t>
+            </w:r>
+          </w:p>
+        </w:tc>
+        <w:tc>
+          <w:tcPr>
+            <w:tcW w:w="0" w:type="auto"/>
+          </w:tcPr>
+          <w:p>
+            <w:pPr>
+              <w:pStyle w:val="Compact"/>
+            </w:pPr>
+            <w:r>
+              <w:t>1.51 GB</w:t>
+            </w:r>
+          </w:p>
+        </w:tc>
+        <w:tc>
+          <w:tcPr>
+            <w:tcW w:w="0" w:type="auto"/>
+          </w:tcPr>
+          <w:p>
+            <w:pPr>
+              <w:pStyle w:val="Compact"/>
+            </w:pPr>
+            <w:r>
+              <w:t>Sublinear scaling; denser integrated network</w:t>
+            </w:r>
+          </w:p>
+        </w:tc>
+      </w:tr>
+      <w:tr>
+        <w:tc>
+          <w:tcPr>
+            <w:tcW w:w="0" w:type="auto"/>
+          </w:tcPr>
+          <w:p>
+            <w:pPr>
+              <w:pStyle w:val="Compact"/>
+            </w:pPr>
+            <w:r>
+              <w:t>Hospital wastewater (EG)</w:t>
+            </w:r>
+          </w:p>
+        </w:tc>
+        <w:tc>
+          <w:tcPr>
+            <w:tcW w:w="0" w:type="auto"/>
+          </w:tcPr>
+          <w:p>
+            <w:pPr>
+              <w:pStyle w:val="Compact"/>
+            </w:pPr>
+            <w:r>
+              <w:t>Human-clinical + built environment</w:t>
+            </w:r>
+          </w:p>
+        </w:tc>
+        <w:tc>
+          <w:tcPr>
+            <w:tcW w:w="0" w:type="auto"/>
+          </w:tcPr>
+          <w:p>
+            <w:pPr>
+              <w:pStyle w:val="Compact"/>
+            </w:pPr>
+            <w:r>
+              <w:t>20</w:t>
+            </w:r>
+          </w:p>
+        </w:tc>
+        <w:tc>
+          <w:tcPr>
+            <w:tcW w:w="0" w:type="auto"/>
+          </w:tcPr>
+          <w:p>
+            <w:pPr>
+              <w:pStyle w:val="Compact"/>
+            </w:pPr>
+            <w:r>
+              <w:t>Wastewater vs tap water</w:t>
+            </w:r>
+          </w:p>
+        </w:tc>
+        <w:tc>
+          <w:tcPr>
+            <w:tcW w:w="0" w:type="auto"/>
+          </w:tcPr>
+          <w:p>
+            <w:pPr>
+              <w:pStyle w:val="Compact"/>
+            </w:pPr>
+            <w:r>
+              <w:t>4m 08s</w:t>
+            </w:r>
+          </w:p>
+        </w:tc>
+        <w:tc>
+          <w:tcPr>
+            <w:tcW w:w="0" w:type="auto"/>
+          </w:tcPr>
+          <w:p>
+            <w:pPr>
+              <w:pStyle w:val="Compact"/>
+            </w:pPr>
+            <w:r>
+              <w:t>1.98 GB</w:t>
+            </w:r>
+          </w:p>
+        </w:tc>
+        <w:tc>
+          <w:tcPr>
+            <w:tcW w:w="0" w:type="auto"/>
+          </w:tcPr>
+          <w:p>
+            <w:pPr>
+              <w:pStyle w:val="Compact"/>
+            </w:pPr>
+            <w:r>
+              <w:t>Wastewater richer and compositionally distinct (PERMANOVA R² = 0.18, p = 3 × 10⁻⁴)</w:t>
+            </w:r>
+          </w:p>
+        </w:tc>
+      </w:tr>
+      <w:tr>
+        <w:tc>
+          <w:tcPr>
+            <w:tcW w:w="0" w:type="auto"/>
+          </w:tcPr>
+          <w:p>
+            <w:pPr>
+              <w:pStyle w:val="Compact"/>
+            </w:pPr>
+            <w:r>
+              <w:t>Wetlands (E. Atlantic Flyway)</w:t>
+            </w:r>
+          </w:p>
+        </w:tc>
+        <w:tc>
+          <w:tcPr>
+            <w:tcW w:w="0" w:type="auto"/>
+          </w:tcPr>
+          <w:p>
+            <w:pPr>
+              <w:pStyle w:val="Compact"/>
+            </w:pPr>
+            <w:r>
+              <w:t>Wildlife + environment</w:t>
+            </w:r>
+          </w:p>
+        </w:tc>
+        <w:tc>
+          <w:tcPr>
+            <w:tcW w:w="0" w:type="auto"/>
+          </w:tcPr>
+          <w:p>
+            <w:pPr>
+              <w:pStyle w:val="Compact"/>
+            </w:pPr>
+            <w:r>
+              <w:t>24</w:t>
+            </w:r>
+          </w:p>
+        </w:tc>
+        <w:tc>
+          <w:tcPr>
+            <w:tcW w:w="0" w:type="auto"/>
+          </w:tcPr>
+          <w:p>
+            <w:pPr>
+              <w:pStyle w:val="Compact"/>
+            </w:pPr>
+            <w:r>
+              <w:t>Impacted vs natural</w:t>
+            </w:r>
+          </w:p>
+        </w:tc>
+        <w:tc>
+          <w:tcPr>
+            <w:tcW w:w="0" w:type="auto"/>
+          </w:tcPr>
+          <w:p>
+            <w:pPr>
+              <w:pStyle w:val="Compact"/>
+            </w:pPr>
+            <w:r>
+              <w:t>7m 37s</w:t>
+            </w:r>
+          </w:p>
+        </w:tc>
+        <w:tc>
+          <w:tcPr>
+            <w:tcW w:w="0" w:type="auto"/>
+          </w:tcPr>
+          <w:p>
+            <w:pPr>
+              <w:pStyle w:val="Compact"/>
+            </w:pPr>
+            <w:r>
+              <w:t>3.59 GB</w:t>
+            </w:r>
+          </w:p>
+        </w:tc>
+        <w:tc>
+          <w:tcPr>
+            <w:tcW w:w="0" w:type="auto"/>
+          </w:tcPr>
+          <w:p>
+            <w:pPr>
+              <w:pStyle w:val="Compact"/>
+            </w:pPr>
+            <w:r>
+              <w:t>Higher virulome load at impacted sites (PERMANOVA R² = 0.088, p_adj = 0.037)</w:t>
+            </w:r>
+          </w:p>
+        </w:tc>
+      </w:tr>
+    </w:tbl>
+    <w:p>
+      <w:pPr>
+        <w:pStyle w:val="Heading2"/>
+      </w:pPr>
+      <w:bookmarkStart w:id="5" w:name="X50c7748aa6d421f569a5daf2425c9e7043a6cad"/>
+      <w:bookmarkEnd w:id="4"/>
+      <w:r>
+        <w:t>4 Conclusion</w:t>
+      </w:r>
+    </w:p>
+    <w:p>
+      <w:pPr>
+        <w:pStyle w:val="FirstParagraph"/>
+      </w:pPr>
+      <w:r>
+        <w:t>MERIDIAN integrates community analyses, functional profiling, and an integrated network reconstruction into a single configuration-driven R workflow for long-read shotgun metagenomics. Single-thread end-to-end execution completes in minutes with a low memory footprint, scaling sublinearly with cohort size and grouping complexity. Beyond the development cohorts, it has been applied without modification to two independent public cohorts spanning the One Health continuum (hospital wastewater and wetland surveillance). It remains under active development, and we are releasing this first tagged version (v1.0.0) to solicit feedback from researchers conducting comparable long-read metagenomic studies and to guide future development of the workflow.</w:t>
+      </w:r>
+    </w:p>
+    <w:p>
+      <w:r>
+        <w:pict w14:anchorId="2880B762">
+          <v:rect id="_x0000_i1027" style="width:0;height:1.5pt" o:hralign="center" o:hrstd="t" o:hr="t"/>
+        </w:pict>
+      </w:r>
+    </w:p>
+    <w:p>
+      <w:pPr>
+        <w:pStyle w:val="FirstParagraph"/>
+      </w:pPr>
       <w:r>
         <w:rPr>
           <w:b/>
           <w:bCs/>
-          <w:i w:val="0"/>
-          <w:iCs/>
-          <w:sz w:val="22"/>
-          <w:szCs w:val="22"/>
-        </w:rPr>
-        <w:fldChar w:fldCharType="begin"/>
+        </w:rPr>
+        <w:t>Acknowledgements.</w:t>
+      </w:r>
+      <w:r>
+        <w:t xml:space="preserve"> The authors thank the </w:t>
       </w:r>
       <w:r>
         <w:rPr>
           <w:b/>
           <w:bCs/>
-          <w:i w:val="0"/>
-          <w:iCs/>
-          <w:sz w:val="22"/>
-          <w:szCs w:val="22"/>
-        </w:rPr>
-        <w:instrText xml:space="preserve"> SEQ Figure \* ARABIC </w:instrText>
+        </w:rPr>
+        <w:t>Centre for Innovation in Genomics and Microbiome Sciences (CIGMiS)</w:t>
+      </w:r>
+      <w:r>
+        <w:t xml:space="preserve">, which generated the chicken caecum metagenomics datasets used to develop and validate the pipeline. We are grateful to </w:t>
       </w:r>
       <w:r>
         <w:rPr>
           <w:b/>
           <w:bCs/>
-          <w:i w:val="0"/>
-          <w:iCs/>
-          <w:sz w:val="22"/>
-          <w:szCs w:val="22"/>
-        </w:rPr>
-        <w:fldChar w:fldCharType="separate"/>
+        </w:rPr>
+        <w:t>colleagues</w:t>
+      </w:r>
+      <w:r>
+        <w:t xml:space="preserve"> for feedback on the configuration interface and Quarto report layout, and to the School of Medicine and Bioscience at the University of West London for hosting the project. </w:t>
       </w:r>
       <w:r>
         <w:rPr>
           <w:b/>
           <w:bCs/>
-          <w:i w:val="0"/>
-          <w:iCs/>
-          <w:noProof/>
-          <w:sz w:val="22"/>
-          <w:szCs w:val="22"/>
-        </w:rPr>
-        <w:t>2</w:t>
-      </w:r>
+        </w:rPr>
+        <w:t>[Optional: compute providers — e.g. UWL / UCL HPC, cloud credits.]</w:t>
+      </w:r>
+    </w:p>
+    <w:p>
+      <w:pPr>
+        <w:pStyle w:val="BodyText"/>
+      </w:pPr>
       <w:r>
         <w:rPr>
           <w:b/>
           <w:bCs/>
-          <w:i w:val="0"/>
-          <w:iCs/>
-          <w:sz w:val="22"/>
-          <w:szCs w:val="22"/>
-        </w:rPr>
-        <w:fldChar w:fldCharType="end"/>
-      </w:r>
-      <w:r>
-        <w:rPr>
-          <w:i w:val="0"/>
-          <w:iCs/>
-          <w:sz w:val="22"/>
-          <w:szCs w:val="22"/>
-        </w:rPr>
-        <w:t>. Pipeline performance on the two validation cohorts. (A) Per-stage wall time (log scale) and (B) peak R-process heap, sorted by B2 runtime. (C) Cumulative wall time and (D) running peak memory in pipeline order. R 4.5.0 single-thread</w:t>
-      </w:r>
-      <w:r>
-        <w:rPr>
-          <w:i w:val="0"/>
-          <w:iCs/>
-          <w:sz w:val="22"/>
-          <w:szCs w:val="22"/>
-        </w:rPr>
-        <w:t xml:space="preserve"> analysis</w:t>
-      </w:r>
-      <w:r>
-        <w:rPr>
-          <w:i w:val="0"/>
-          <w:iCs/>
-          <w:sz w:val="22"/>
-          <w:szCs w:val="22"/>
-        </w:rPr>
-        <w:t xml:space="preserve">, </w:t>
-      </w:r>
-      <w:r>
-        <w:rPr>
-          <w:i w:val="0"/>
-          <w:iCs/>
-          <w:sz w:val="22"/>
-          <w:szCs w:val="22"/>
-        </w:rPr>
-        <w:t xml:space="preserve">including </w:t>
-      </w:r>
-      <w:r>
-        <w:rPr>
-          <w:i w:val="0"/>
-          <w:iCs/>
-          <w:sz w:val="22"/>
-          <w:szCs w:val="22"/>
-        </w:rPr>
-        <w:t xml:space="preserve">PERMANOVA 9999 permutations, ALDEx2 `mc.samples` = 128. B1 = </w:t>
-      </w:r>
-      <w:r>
-        <w:rPr>
-          <w:i w:val="0"/>
-          <w:iCs/>
-          <w:sz w:val="22"/>
-          <w:szCs w:val="22"/>
-        </w:rPr>
-        <w:t>C</w:t>
-      </w:r>
-      <w:r>
-        <w:rPr>
-          <w:i w:val="0"/>
-          <w:iCs/>
-          <w:sz w:val="22"/>
-          <w:szCs w:val="22"/>
-        </w:rPr>
-        <w:t>hicken</w:t>
-      </w:r>
-      <w:r>
-        <w:rPr>
-          <w:i w:val="0"/>
-          <w:iCs/>
-          <w:sz w:val="22"/>
-          <w:szCs w:val="22"/>
-        </w:rPr>
-        <w:t xml:space="preserve"> </w:t>
-      </w:r>
-      <w:r>
-        <w:rPr>
-          <w:i w:val="0"/>
-          <w:iCs/>
-          <w:sz w:val="22"/>
-          <w:szCs w:val="22"/>
-        </w:rPr>
-        <w:t>batch</w:t>
-      </w:r>
-      <w:r>
-        <w:rPr>
-          <w:i w:val="0"/>
-          <w:iCs/>
-          <w:sz w:val="22"/>
-          <w:szCs w:val="22"/>
-        </w:rPr>
-        <w:t xml:space="preserve"> </w:t>
-      </w:r>
-      <w:r>
-        <w:rPr>
-          <w:i w:val="0"/>
-          <w:iCs/>
-          <w:sz w:val="22"/>
-          <w:szCs w:val="22"/>
-        </w:rPr>
-        <w:t xml:space="preserve">1 (n=18, 3 dietary groups); B2 = </w:t>
-      </w:r>
-      <w:r>
-        <w:rPr>
-          <w:i w:val="0"/>
-          <w:iCs/>
-          <w:sz w:val="22"/>
-          <w:szCs w:val="22"/>
-        </w:rPr>
-        <w:t>C</w:t>
-      </w:r>
-      <w:r>
-        <w:rPr>
-          <w:i w:val="0"/>
-          <w:iCs/>
-          <w:sz w:val="22"/>
-          <w:szCs w:val="22"/>
-        </w:rPr>
-        <w:t>hicken</w:t>
-      </w:r>
-      <w:r>
-        <w:rPr>
-          <w:i w:val="0"/>
-          <w:iCs/>
-          <w:sz w:val="22"/>
-          <w:szCs w:val="22"/>
-        </w:rPr>
-        <w:t xml:space="preserve"> </w:t>
-      </w:r>
-      <w:r>
-        <w:rPr>
-          <w:i w:val="0"/>
-          <w:iCs/>
-          <w:sz w:val="22"/>
-          <w:szCs w:val="22"/>
-        </w:rPr>
-        <w:t>batch</w:t>
-      </w:r>
-      <w:r>
-        <w:rPr>
-          <w:i w:val="0"/>
-          <w:iCs/>
-          <w:sz w:val="22"/>
-          <w:szCs w:val="22"/>
-        </w:rPr>
-        <w:t xml:space="preserve"> </w:t>
-      </w:r>
-      <w:r>
-        <w:rPr>
-          <w:i w:val="0"/>
-          <w:iCs/>
-          <w:sz w:val="22"/>
-          <w:szCs w:val="22"/>
-        </w:rPr>
-        <w:t>2 (n=32, 4-level `Treatment_Bird`, `block` random effect, two negative controls)</w:t>
+        </w:rPr>
+        <w:t xml:space="preserve">Ethics Statement. </w:t>
+      </w:r>
+      <w:r>
+        <w:t>The metagenomic datasets used to develop and validate MERIDIAN were generated in prior animal studies; MERIDIAN performs only secondary computational analysis of previously generated sequence data and involved no new animal, human or clinical sampling. All animal procedures were conducted in accordance with the UK Animals (Scientific Procedures) Act 1986. The primary validation cohort (</w:t>
+      </w:r>
+      <w:r>
+        <w:rPr>
+          <w:rStyle w:val="VerbatimChar"/>
+        </w:rPr>
+        <w:t>Chicken batch 1</w:t>
+      </w:r>
+      <w:r>
+        <w:t>) was approved by the SRUC Ethical Review Committee (Scotland's Rural College, Edinburgh; approval AEX 2024-021POU), and the second cohort (</w:t>
+      </w:r>
+      <w:r>
+        <w:rPr>
+          <w:rStyle w:val="VerbatimChar"/>
+        </w:rPr>
+        <w:t>Chicken batch 2</w:t>
+      </w:r>
+      <w:r>
+        <w:t xml:space="preserve">) under </w:t>
+      </w:r>
+      <w:r>
+        <w:lastRenderedPageBreak/>
+        <w:t>SRUC approval AEX2025-006 POU; birds were humanely euthanised in accordance with UK Home Office Schedule 1 procedures.</w:t>
       </w:r>
     </w:p>
     <w:p>
       <w:pPr>
         <w:pStyle w:val="BodyText"/>
-        <w:jc w:val="both"/>
-      </w:pPr>
-      <w:r>
-        <w:t xml:space="preserve">One expected and deliberate divergence concerns the resistome stage: the ground-truth </w:t>
-      </w:r>
-      <w:proofErr w:type="gramStart"/>
-      <w:r>
-        <w:rPr>
-          <w:rStyle w:val="VerbatimChar"/>
-        </w:rPr>
-        <w:t>cleanData</w:t>
-      </w:r>
-      <w:proofErr w:type="gramEnd"/>
-      <w:r>
-        <w:rPr>
-          <w:rStyle w:val="VerbatimChar"/>
-        </w:rPr>
-        <w:t>.R</w:t>
-      </w:r>
-      <w:r>
-        <w:t xml:space="preserve"> </w:t>
-      </w:r>
-      <w:r>
-        <w:t>misparses</w:t>
-      </w:r>
-      <w:r>
-        <w:t xml:space="preserve"> taxids carrying variant suffixes, dropping the corresponding ABRicate rows. R/02 fixes this parsing bug, so the pipeline retains 110 additional (sample, </w:t>
-      </w:r>
-      <w:r>
-        <w:lastRenderedPageBreak/>
-        <w:t>GENE) rows relative to the hand-edited output (</w:t>
-      </w:r>
-      <w:r>
-        <w:rPr>
-          <w:rStyle w:val="VerbatimChar"/>
-        </w:rPr>
-        <w:t>scripts/diff_normdata.R</w:t>
-      </w:r>
-      <w:r>
-        <w:t xml:space="preserve"> on the 2026-06-23 B1 run: pipeline = 733 rows, ground truth = 623; 121 rows gained by the parsing fix, 11 rows present in the ground truth that the pipeline currently drops — concentrated in a handful of plasmid replicon and accessory resistance calls, queued for inspection rather than treated as a regression). Jaccard agreement on the </w:t>
-      </w:r>
-      <w:r>
-        <w:rPr>
-          <w:rStyle w:val="VerbatimChar"/>
-        </w:rPr>
-        <w:t>(sample, GENE)</w:t>
-      </w:r>
-      <w:r>
-        <w:t xml:space="preserve"> key set is 0.82. Across the other stages with directly comparable ground-truth artefacts, sample-set agreement is exact </w:t>
-      </w:r>
-      <w:r>
-        <w:t>for alpha diversity (18/18), and Jaccard for the network Gephi exports against the most recent</w:t>
-      </w:r>
-      <w:r>
-        <w:t xml:space="preserve"> hand-edited snapshot is 0.85 (nodes) and 0.87 (edges). Per-stage </w:t>
-      </w:r>
-      <w:r>
-        <w:t>comparisons against the remaining hand-edited artefacts — taxonomy, beta diversity, and differential abundance — are</w:t>
-      </w:r>
-      <w:r>
-        <w:t xml:space="preserve"> deferred to a separate validation effort. The Re-centrifuge column-slicing heuristic in R/02 is acknowledged as still coarse and is queued for rework.</w:t>
-      </w:r>
-    </w:p>
-    <w:p>
-      <w:pPr>
-        <w:pStyle w:val="Heading2"/>
-      </w:pPr>
-      <w:bookmarkStart w:id="5" w:name="X50c7748aa6d421f569a5daf2425c9e7043a6cad"/>
-      <w:bookmarkEnd w:id="4"/>
-      <w:r>
-        <w:t>4 Conclusion</w:t>
-      </w:r>
-    </w:p>
-    <w:p>
-      <w:pPr>
-        <w:pStyle w:val="FirstParagraph"/>
-        <w:jc w:val="both"/>
-      </w:pPr>
-      <w:r>
-        <w:t xml:space="preserve">MERIDIAN consolidates community analyses, functional profiling, and integrated network reconstruction into a single configuration-driven R project for </w:t>
-      </w:r>
-      <w:r>
-        <w:rPr>
-          <w:rFonts w:hint="eastAsia"/>
-        </w:rPr>
-        <w:t>long-read shotgun metagenomics. Single-thread end-to-end execution completes in minutes with a low memory footprint, scaling sublinearly with cohort</w:t>
-      </w:r>
-      <w:r>
-        <w:t xml:space="preserve"> </w:t>
-      </w:r>
-      <w:r>
-        <w:rPr>
-          <w:rFonts w:hint="eastAsia"/>
-        </w:rPr>
-        <w:t xml:space="preserve">size and grouping complexity. It is in active development; we are releasing this alpha-stage workflow </w:t>
-      </w:r>
-      <w:r>
-        <w:t xml:space="preserve">(v0.1.0) </w:t>
-      </w:r>
-      <w:r>
-        <w:rPr>
-          <w:rFonts w:hint="eastAsia"/>
-        </w:rPr>
-        <w:t>now to invite feedback from groups running</w:t>
-      </w:r>
-      <w:r>
-        <w:t xml:space="preserve"> </w:t>
-      </w:r>
-      <w:r>
-        <w:rPr>
-          <w:rFonts w:hint="eastAsia"/>
-        </w:rPr>
-        <w:t>comparable analyses.</w:t>
-      </w:r>
-    </w:p>
-    <w:p>
-      <w:r>
-        <w:pict w14:anchorId="7689B33A">
-          <v:rect id="_x0000_i1027" style="width:0;height:1.5pt" o:hralign="center" o:hrstd="t" o:hr="t"/>
-        </w:pict>
-      </w:r>
-    </w:p>
-    <w:p>
-      <w:pPr>
-        <w:pStyle w:val="FirstParagraph"/>
-        <w:jc w:val="both"/>
       </w:pPr>
       <w:r>
         <w:rPr>
           <w:b/>
           <w:bCs/>
         </w:rPr>
-        <w:t>Acknowledgements.</w:t>
-      </w:r>
-      <w:r>
-        <w:t xml:space="preserve"> The authors thank the </w:t>
-      </w:r>
+        <w:t>Funding.</w:t>
+      </w:r>
+      <w:r>
+        <w:t xml:space="preserve"> This study was funded by a Vice-Chancellor scholarship provided by the University of West London.</w:t>
+      </w:r>
+    </w:p>
+    <w:p>
+      <w:pPr>
+        <w:pStyle w:val="BodyText"/>
+      </w:pPr>
       <w:r>
         <w:rPr>
           <w:b/>
           <w:bCs/>
         </w:rPr>
-        <w:t>Centre for Innovation in Genomics and Microbiome Sciences (CIGMiS)</w:t>
-      </w:r>
-      <w:r>
-        <w:t>, which</w:t>
-      </w:r>
-      <w:r>
-        <w:t xml:space="preserve"> generated the chicken caecum metagenomics datasets used to develop and validate the pipeline. We are grateful to </w:t>
-      </w:r>
+        <w:t>Conflict of Interest.</w:t>
+      </w:r>
+      <w:r>
+        <w:t xml:space="preserve"> The authors declare that they have no competing interests.</w:t>
+      </w:r>
+    </w:p>
+    <w:p>
+      <w:pPr>
+        <w:pStyle w:val="BodyText"/>
+      </w:pPr>
       <w:r>
         <w:rPr>
           <w:b/>
           <w:bCs/>
         </w:rPr>
-        <w:t>colleagues</w:t>
-      </w:r>
-      <w:r>
-        <w:t xml:space="preserve"> for feedback on the configuration interface and Quarto report layout, and to the School of Biomedical Science at the University of West London for hosting the project. </w:t>
-      </w:r>
-      <w:r>
-        <w:rPr>
-          <w:b/>
-          <w:bCs/>
-        </w:rPr>
-        <w:t>[Optional: compute providers — e.g. UWL / UCL HPC, cloud credits.]</w:t>
-      </w:r>
-    </w:p>
-    <w:p>
-      <w:pPr>
-        <w:pStyle w:val="BodyText"/>
-        <w:jc w:val="both"/>
-      </w:pPr>
-      <w:r>
-        <w:rPr>
-          <w:b/>
-          <w:bCs/>
-        </w:rPr>
-        <w:t>Funding.</w:t>
-      </w:r>
-      <w:r>
-        <w:t xml:space="preserve"> This study was funded by a Vice-Chancellor scholarship provided by the University of West London.</w:t>
-      </w:r>
-    </w:p>
-    <w:p>
-      <w:pPr>
-        <w:pStyle w:val="BodyText"/>
-        <w:jc w:val="both"/>
-      </w:pPr>
-      <w:r>
-        <w:rPr>
-          <w:b/>
-          <w:bCs/>
-        </w:rPr>
-        <w:t>Conflict of Interest.</w:t>
-      </w:r>
-      <w:r>
-        <w:t xml:space="preserve"> The authors declare that they have no competing interests.</w:t>
-      </w:r>
-    </w:p>
-    <w:p>
-      <w:r>
-        <w:pict w14:anchorId="1BADB6DA">
+        <w:t>Data Availability.</w:t>
+      </w:r>
+      <w:r>
+        <w:t xml:space="preserve"> Sequence data for the primary validation cohort (</w:t>
+      </w:r>
+      <w:r>
+        <w:rPr>
+          <w:rStyle w:val="VerbatimChar"/>
+        </w:rPr>
+        <w:t>Chicken batch 1</w:t>
+      </w:r>
+      <w:r>
+        <w:t>) are available from NCBI under BioProject PRJNA1406192. Data for the second cohort (</w:t>
+      </w:r>
+      <w:r>
+        <w:rPr>
+          <w:rStyle w:val="VerbatimChar"/>
+        </w:rPr>
+        <w:t>Chicken batch 2</w:t>
+      </w:r>
+      <w:r>
+        <w:t xml:space="preserve">) will be released upon publication of the associated study. The MERIDIAN source code, documentation, container image and configuration examples are available at </w:t>
+      </w:r>
+      <w:r>
+        <w:rPr>
+          <w:rStyle w:val="Hyperlink"/>
+        </w:rPr>
+        <w:t>https://github.com/Julio92-C/Metagenomics_pipeline_automation</w:t>
+      </w:r>
+      <w:r>
+        <w:t xml:space="preserve"> (release v1.0.0).</w:t>
+      </w:r>
+    </w:p>
+    <w:p>
+      <w:r>
+        <w:pict w14:anchorId="6D080543">
           <v:rect id="_x0000_i1028" style="width:0;height:1.5pt" o:hralign="center" o:hrstd="t" o:hr="t"/>
         </w:pict>
       </w:r>
@@ -2732,7 +2575,6 @@
           <w:ilvl w:val="0"/>
           <w:numId w:val="2"/>
         </w:numPr>
-        <w:jc w:val="both"/>
       </w:pPr>
       <w:r>
         <w:t xml:space="preserve">Al-Khalaifah H, Rahman MH, Al-Surrayai T, Al-Dhumair A, Al-Hasan M. A One-Health Perspective of Antimicrobial Resistance (AMR): Human, Animals and Environmental Health. </w:t>
@@ -2755,7 +2597,6 @@
           <w:ilvl w:val="0"/>
           <w:numId w:val="2"/>
         </w:numPr>
-        <w:jc w:val="both"/>
       </w:pPr>
       <w:r>
         <w:t xml:space="preserve">Wood DE, Lu J, Langmead B. Improved metagenomic analysis with Kraken 2. </w:t>
@@ -2778,7 +2619,6 @@
           <w:ilvl w:val="0"/>
           <w:numId w:val="2"/>
         </w:numPr>
-        <w:jc w:val="both"/>
       </w:pPr>
       <w:r>
         <w:t xml:space="preserve">Lu J, Breitwieser FP, Thielen P, Salzberg SL. Bracken: estimating species abundance in metagenomics data. </w:t>
@@ -2801,13 +2641,11 @@
           <w:ilvl w:val="0"/>
           <w:numId w:val="2"/>
         </w:numPr>
-        <w:jc w:val="both"/>
-      </w:pPr>
-      <w:r>
-        <w:lastRenderedPageBreak/>
+      </w:pPr>
+      <w:r>
         <w:t xml:space="preserve">Seemann T. ABRicate: mass screening of contigs for antimicrobial and virulence genes. </w:t>
       </w:r>
-      <w:hyperlink r:id="rId11">
+      <w:hyperlink r:id="rId9">
         <w:r>
           <w:rPr>
             <w:rStyle w:val="Hyperlink"/>
@@ -2826,7 +2664,6 @@
           <w:ilvl w:val="0"/>
           <w:numId w:val="2"/>
         </w:numPr>
-        <w:jc w:val="both"/>
       </w:pPr>
       <w:r>
         <w:t xml:space="preserve">Alcock BP, Huynh W, Chalil R, Smith KW, Raphenya AR, Wlodarski MA, et al. CARD 2023: expanded curation, support for machine learning, and resistome prediction at the Comprehensive Antibiotic Resistance Database. </w:t>
@@ -2849,7 +2686,6 @@
           <w:ilvl w:val="0"/>
           <w:numId w:val="2"/>
         </w:numPr>
-        <w:jc w:val="both"/>
       </w:pPr>
       <w:r>
         <w:t xml:space="preserve">Liu B, Zheng D, Zhou S, Chen L, Yang J. VFDB 2022: a general classification scheme for bacterial virulence factors. </w:t>
@@ -2872,7 +2708,6 @@
           <w:ilvl w:val="0"/>
           <w:numId w:val="2"/>
         </w:numPr>
-        <w:jc w:val="both"/>
       </w:pPr>
       <w:r>
         <w:rPr>
@@ -2901,7 +2736,6 @@
           <w:ilvl w:val="0"/>
           <w:numId w:val="2"/>
         </w:numPr>
-        <w:jc w:val="both"/>
       </w:pPr>
       <w:r>
         <w:t xml:space="preserve">Martí JM. Recentrifuge: robust comparative analysis and contamination removal for metagenomics. </w:t>
@@ -2924,7 +2758,6 @@
           <w:ilvl w:val="0"/>
           <w:numId w:val="2"/>
         </w:numPr>
-        <w:jc w:val="both"/>
       </w:pPr>
       <w:r>
         <w:t>Oksanen J, Simpson G, Blanchet F, Kindt R, Legendre P, Minchin P, et al. vegan: Community Ecology Package. R package version 2.7-3, 2026. doi:10.32614/CRAN.package.vegan.</w:t>
@@ -2937,9 +2770,9 @@
           <w:ilvl w:val="0"/>
           <w:numId w:val="2"/>
         </w:numPr>
-        <w:jc w:val="both"/>
-      </w:pPr>
-      <w:r>
+      </w:pPr>
+      <w:r>
+        <w:lastRenderedPageBreak/>
         <w:t xml:space="preserve">Fernandes AD, Reid JN, Macklaim JM, McMurrough TA, Edgell DR, Gloor GB. Unifying the analysis of high-throughput sequencing datasets: characterizing RNA-seq, 16S rRNA gene sequencing and selective growth experiments by compositional data analysis. </w:t>
       </w:r>
       <w:r>
@@ -2960,7 +2793,6 @@
           <w:ilvl w:val="0"/>
           <w:numId w:val="2"/>
         </w:numPr>
-        <w:jc w:val="both"/>
       </w:pPr>
       <w:r>
         <w:rPr>
@@ -2989,7 +2821,6 @@
           <w:ilvl w:val="0"/>
           <w:numId w:val="2"/>
         </w:numPr>
-        <w:jc w:val="both"/>
       </w:pPr>
       <w:r>
         <w:t xml:space="preserve">Theil S, Rifa E. rANOMALY: AmplicoN wOrkflow for Microbial community AnaLYsis. </w:t>
@@ -3012,12 +2843,11 @@
           <w:ilvl w:val="0"/>
           <w:numId w:val="2"/>
         </w:numPr>
-        <w:jc w:val="both"/>
       </w:pPr>
       <w:r>
         <w:t xml:space="preserve">Allaire JJ, et al. Quarto. </w:t>
       </w:r>
-      <w:hyperlink r:id="rId12">
+      <w:hyperlink r:id="rId10">
         <w:r>
           <w:rPr>
             <w:rStyle w:val="Hyperlink"/>
@@ -3036,12 +2866,11 @@
           <w:ilvl w:val="0"/>
           <w:numId w:val="2"/>
         </w:numPr>
-        <w:jc w:val="both"/>
       </w:pPr>
       <w:r>
         <w:t xml:space="preserve">R Core Team. R: A Language and Environment for Statistical Computing (version 4.5.0). R Foundation for Statistical Computing, Vienna, 2025. </w:t>
       </w:r>
-      <w:hyperlink r:id="rId13">
+      <w:hyperlink r:id="rId11">
         <w:r>
           <w:rPr>
             <w:rStyle w:val="Hyperlink"/>
@@ -3060,7 +2889,6 @@
           <w:ilvl w:val="0"/>
           <w:numId w:val="2"/>
         </w:numPr>
-        <w:jc w:val="both"/>
       </w:pPr>
       <w:r>
         <w:t xml:space="preserve">Pedersen TL. ggraph: An Implementation of </w:t>
@@ -3081,7 +2909,6 @@
           <w:ilvl w:val="0"/>
           <w:numId w:val="2"/>
         </w:numPr>
-        <w:jc w:val="both"/>
       </w:pPr>
       <w:r>
         <w:t xml:space="preserve">Csárdi G, Nepusz T. The igraph software package for complex network research. </w:t>
@@ -3096,7 +2923,7 @@
       <w:r>
         <w:t xml:space="preserve"> 2006;Complex Systems:1695. R package version 2.3.1; doi:10.5281/zenodo.7682609. </w:t>
       </w:r>
-      <w:hyperlink r:id="rId14">
+      <w:hyperlink r:id="rId12">
         <w:r>
           <w:rPr>
             <w:rStyle w:val="Hyperlink"/>
@@ -3115,7 +2942,6 @@
           <w:ilvl w:val="0"/>
           <w:numId w:val="2"/>
         </w:numPr>
-        <w:jc w:val="both"/>
       </w:pPr>
       <w:r>
         <w:t>Allaire JJ, Gandrud C, Russell K, Yetman C. networkD3: D3 JavaScript Network Graphs from R. R package version 0.4.1, 2025. doi:10.32614/CRAN.package.networkD3.</w:t>
@@ -3140,7 +2966,7 @@
   <w:abstractNum w:abstractNumId="0" w15:restartNumberingAfterBreak="0">
     <w:nsid w:val="0000A990"/>
     <w:multiLevelType w:val="multilevel"/>
-    <w:tmpl w:val="B39E3AFA"/>
+    <w:tmpl w:val="A5ECC000"/>
     <w:lvl w:ilvl="0">
       <w:numFmt w:val="bullet"/>
       <w:lvlText w:val=" "/>
@@ -3217,7 +3043,7 @@
   <w:abstractNum w:abstractNumId="1" w15:restartNumberingAfterBreak="0">
     <w:nsid w:val="00A99411"/>
     <w:multiLevelType w:val="multilevel"/>
-    <w:tmpl w:val="354E3A2E"/>
+    <w:tmpl w:val="BCB62A2E"/>
     <w:lvl w:ilvl="0">
       <w:start w:val="1"/>
       <w:numFmt w:val="decimal"/>
@@ -3300,10 +3126,10 @@
       </w:pPr>
     </w:lvl>
   </w:abstractNum>
-  <w:num w:numId="1" w16cid:durableId="1041978585">
+  <w:num w:numId="1" w16cid:durableId="1388723488">
     <w:abstractNumId w:val="0"/>
   </w:num>
-  <w:num w:numId="2" w16cid:durableId="1216621409">
+  <w:num w:numId="2" w16cid:durableId="147523807">
     <w:abstractNumId w:val="1"/>
     <w:lvlOverride w:ilvl="0">
       <w:startOverride w:val="1"/>
@@ -4544,6 +4370,14 @@
       <w:rFonts w:ascii="Consolas" w:hAnsi="Consolas"/>
       <w:sz w:val="22"/>
     </w:rPr>
+  </w:style>
+  <w:style w:type="paragraph" w:styleId="Revision">
+    <w:name w:val="Revision"/>
+    <w:hidden/>
+    <w:rsid w:val="00F2255B"/>
+    <w:pPr>
+      <w:spacing w:after="0"/>
+    </w:pPr>
   </w:style>
 </w:styles>
 </file>

</xml_diff>

<commit_message>
docs(manuscript): update GitHub URLs to renamed repo (meridian)
Repo renamed Metagenomics_pipeline_automation -> meridian. Swap the
canonical URLs in the abstract Availability + Data Availability (and the
release-tag reference in the .docx) so the submitted manuscript carries
the canonical path rather than relying on GitHub's rename redirect. The
ghcr image (ghcr.io/julio92-c/meridian) and v1.0.0 release are unaffected.

Co-Authored-By: Claude Opus 4.8 <noreply@anthropic.com>
</commit_message>
<xml_diff>
--- a/docs/manuscript/applications_note.docx
+++ b/docs/manuscript/applications_note.docx
@@ -5,6 +5,7 @@
     <w:p>
       <w:pPr>
         <w:pStyle w:val="Heading1"/>
+        <w:jc w:val="both"/>
       </w:pPr>
       <w:bookmarkStart w:id="0" w:name="X84d9e160d30b1cd211371155645e81ef50bd748"/>
       <w:r>
@@ -14,6 +15,7 @@
     <w:p>
       <w:pPr>
         <w:pStyle w:val="FirstParagraph"/>
+        <w:jc w:val="both"/>
       </w:pPr>
       <w:r>
         <w:rPr>
@@ -26,6 +28,7 @@
     <w:p>
       <w:pPr>
         <w:pStyle w:val="BodyText"/>
+        <w:jc w:val="both"/>
       </w:pPr>
       <w:r>
         <w:t>Julio C. Ortega Cambara1, Piotr Cuber2, Pedro Humberto Lebre1, Hermine V Mkrtchyan1*</w:t>
@@ -34,6 +37,7 @@
     <w:p>
       <w:pPr>
         <w:pStyle w:val="BodyText"/>
+        <w:jc w:val="both"/>
       </w:pPr>
       <w:r>
         <w:t>1Centre for Innovation in Genomics and Microbiome Sciences, School of Medicine and Bioscience, University of West London, London, United Kingdom 2Natural History Museum, London, United Kingdom</w:t>
@@ -42,6 +46,7 @@
     <w:p>
       <w:pPr>
         <w:pStyle w:val="BodyText"/>
+        <w:jc w:val="both"/>
         <w:rPr>
           <w:lang w:val="es-ES"/>
         </w:rPr>
@@ -65,6 +70,7 @@
     <w:p>
       <w:pPr>
         <w:pStyle w:val="BodyText"/>
+        <w:jc w:val="both"/>
         <w:rPr>
           <w:lang w:val="es-ES"/>
         </w:rPr>
@@ -80,6 +86,7 @@
     <w:p>
       <w:pPr>
         <w:pStyle w:val="BodyText"/>
+        <w:jc w:val="both"/>
         <w:rPr>
           <w:lang w:val="es-ES"/>
         </w:rPr>
@@ -94,6 +101,7 @@
     <w:p>
       <w:pPr>
         <w:pStyle w:val="BodyText"/>
+        <w:jc w:val="both"/>
         <w:rPr>
           <w:lang w:val="es-ES"/>
         </w:rPr>
@@ -108,6 +116,7 @@
     <w:p>
       <w:pPr>
         <w:pStyle w:val="BodyText"/>
+        <w:jc w:val="both"/>
         <w:rPr>
           <w:lang w:val="es-ES"/>
         </w:rPr>
@@ -122,12 +131,16 @@
     <w:p>
       <w:pPr>
         <w:pStyle w:val="BodyText"/>
+        <w:jc w:val="both"/>
       </w:pPr>
       <w:r>
         <w:t>Hermine V Mkrtchyan — 0000-0001-7339-7297</w:t>
       </w:r>
     </w:p>
     <w:p>
+      <w:pPr>
+        <w:jc w:val="both"/>
+      </w:pPr>
       <w:r>
         <w:pict w14:anchorId="1B1D2A2C">
           <v:rect id="_x0000_i1025" style="width:0;height:1.5pt" o:hralign="center" o:hrstd="t" o:hr="t"/>
@@ -137,6 +150,7 @@
     <w:p>
       <w:pPr>
         <w:pStyle w:val="Heading2"/>
+        <w:jc w:val="both"/>
       </w:pPr>
       <w:bookmarkStart w:id="1" w:name="abstract"/>
       <w:r>
@@ -146,6 +160,7 @@
     <w:p>
       <w:pPr>
         <w:pStyle w:val="FirstParagraph"/>
+        <w:jc w:val="both"/>
       </w:pPr>
       <w:r>
         <w:rPr>
@@ -161,6 +176,7 @@
     <w:p>
       <w:pPr>
         <w:pStyle w:val="BodyText"/>
+        <w:jc w:val="both"/>
       </w:pPr>
       <w:r>
         <w:rPr>
@@ -209,6 +225,7 @@
     <w:p>
       <w:pPr>
         <w:pStyle w:val="BodyText"/>
+        <w:jc w:val="both"/>
       </w:pPr>
       <w:r>
         <w:rPr>
@@ -234,7 +251,7 @@
         <w:rPr>
           <w:rStyle w:val="Hyperlink"/>
         </w:rPr>
-        <w:t>https://github.com/Julio92-C/Metagenomics_pipeline_automation/releases/tag/v1.0.0</w:t>
+        <w:t>https://github.com/Julio92-C/meridian/releases/tag/v1.0.0</w:t>
       </w:r>
       <w:r>
         <w:t xml:space="preserve">. Reproducible execution is supported through the R environment package </w:t>
@@ -278,6 +295,7 @@
     <w:p>
       <w:pPr>
         <w:pStyle w:val="BodyText"/>
+        <w:jc w:val="both"/>
       </w:pPr>
       <w:r>
         <w:rPr>
@@ -301,6 +319,7 @@
     <w:p>
       <w:pPr>
         <w:pStyle w:val="BodyText"/>
+        <w:jc w:val="both"/>
       </w:pPr>
       <w:r>
         <w:rPr>
@@ -314,6 +333,9 @@
       </w:r>
     </w:p>
     <w:p>
+      <w:pPr>
+        <w:jc w:val="both"/>
+      </w:pPr>
       <w:r>
         <w:pict w14:anchorId="48E78BA9">
           <v:rect id="_x0000_i1026" style="width:0;height:1.5pt" o:hralign="center" o:hrstd="t" o:hr="t"/>
@@ -323,6 +345,7 @@
     <w:p>
       <w:pPr>
         <w:pStyle w:val="Heading2"/>
+        <w:jc w:val="both"/>
       </w:pPr>
       <w:bookmarkStart w:id="2" w:name="Xe3d0fc0bea9a42ce7605565d0964033d7f6ee47"/>
       <w:bookmarkEnd w:id="1"/>
@@ -333,6 +356,7 @@
     <w:p>
       <w:pPr>
         <w:pStyle w:val="FirstParagraph"/>
+        <w:jc w:val="both"/>
       </w:pPr>
       <w:r>
         <w:t>Long-read shotgun metagenomics, enabled by Oxford Nanopore and PacBio sequencing technologies, is central to One Health surveillance, where the emergence and dissemination of biological threats occur at the interface of human, animal and environmental systems [1]. Unlike targeted approaches, shotgun metagenomics enables simultaneous characterisation of microbial community composition and functional genetic content, thereby linking taxonomic identity to antimicrobial resistance genes (ARGs), virulence factors (VFs) and mobile genetic elements (MGEs) within a single experiment. This capability is particularly valuable for tracking the ecology and transmission of high-risk microorganisms and their associated genetic determinants across clinical, agricultural and environmental reservoirs. The downstream analysis supporting long-read metagenomics is now well established. Widely adopted tools include Kraken2 [2] and Bracken [3] for taxonomic classification and abundance estimation, ABRicate [4] for screening ARGs, VFs and MGEs against databases such as CARD [5], VFDB [6] and PlasmidFinder [7], Re-centrifuge [8] for contamination assessment, and R packages including vegan [9] and ALDEx2 [10] for ecological and differential abundance analyses. However, while these tools are individually well established, their integration into reproducible and reusable workflows remains limited.</w:t>
@@ -341,6 +365,7 @@
     <w:p>
       <w:pPr>
         <w:pStyle w:val="BodyText"/>
+        <w:jc w:val="both"/>
       </w:pPr>
       <w:r>
         <w:t>In practice, downstream analyses continue to rely on a set of bespoke R scripts that have evolved incrementally over successive projects. These scripts frequently contain hard-coded input paths, sample-identifier filters embedded as literal strings, per-study negative-control renames, and taxonomy fixes patched by row index. As a result, individual script copies diverge over time, reducing reproducibility and limiting portability, and the absence of a shared interface prevents automated output logging. Comparing different studies requires manual reconciliation of both code and data. The reference cohort for the present work (</w:t>
@@ -362,6 +387,7 @@
     <w:p>
       <w:pPr>
         <w:pStyle w:val="BodyText"/>
+        <w:jc w:val="both"/>
       </w:pPr>
       <w:r>
         <w:t>To address this gap, we have developed an alpha-stage R workflow. Here, we describe the workflow's design, current scope, and the real-data validation strategy enabling the assessment of its performance.</w:t>
@@ -370,6 +396,7 @@
     <w:p>
       <w:pPr>
         <w:pStyle w:val="Heading2"/>
+        <w:jc w:val="both"/>
       </w:pPr>
       <w:bookmarkStart w:id="3" w:name="Xfab522e0c411179c01dd3c9a2a01395ade9eb38"/>
       <w:bookmarkEnd w:id="2"/>
@@ -380,6 +407,7 @@
     <w:p>
       <w:pPr>
         <w:pStyle w:val="FirstParagraph"/>
+        <w:jc w:val="both"/>
       </w:pPr>
       <w:r>
         <w:t>The workflow is implemented as a stand-alone R project, rather than an installable software package. Execution is initiated through a single entry script (</w:t>
@@ -460,6 +488,7 @@
     <w:p>
       <w:pPr>
         <w:pStyle w:val="BodyText"/>
+        <w:jc w:val="both"/>
       </w:pPr>
       <w:r>
         <w:rPr>
@@ -512,6 +541,7 @@
     <w:p>
       <w:pPr>
         <w:pStyle w:val="BodyText"/>
+        <w:jc w:val="both"/>
       </w:pPr>
       <w:r>
         <w:rPr>
@@ -585,6 +615,7 @@
     <w:p>
       <w:pPr>
         <w:pStyle w:val="BodyText"/>
+        <w:jc w:val="both"/>
       </w:pPr>
       <w:r>
         <w:rPr>
@@ -600,6 +631,7 @@
     <w:p>
       <w:pPr>
         <w:pStyle w:val="BodyText"/>
+        <w:jc w:val="both"/>
       </w:pPr>
       <w:r>
         <w:t xml:space="preserve">(1) </w:t>
@@ -645,6 +677,7 @@
     <w:p>
       <w:pPr>
         <w:pStyle w:val="BodyText"/>
+        <w:jc w:val="both"/>
       </w:pPr>
       <w:r>
         <w:t xml:space="preserve">(2) </w:t>
@@ -663,6 +696,7 @@
     <w:p>
       <w:pPr>
         <w:pStyle w:val="BodyText"/>
+        <w:jc w:val="both"/>
       </w:pPr>
       <w:r>
         <w:t xml:space="preserve">(3) </w:t>
@@ -716,6 +750,7 @@
     <w:p>
       <w:pPr>
         <w:pStyle w:val="BodyText"/>
+        <w:jc w:val="both"/>
       </w:pPr>
       <w:r>
         <w:t xml:space="preserve">(4) </w:t>
@@ -743,6 +778,7 @@
     <w:p>
       <w:pPr>
         <w:pStyle w:val="BodyText"/>
+        <w:jc w:val="both"/>
       </w:pPr>
       <w:r>
         <w:lastRenderedPageBreak/>
@@ -780,6 +816,7 @@
     <w:p>
       <w:pPr>
         <w:pStyle w:val="BodyText"/>
+        <w:jc w:val="both"/>
       </w:pPr>
       <w:r>
         <w:rPr>
@@ -812,6 +849,7 @@
     <w:p>
       <w:pPr>
         <w:pStyle w:val="Heading2"/>
+        <w:jc w:val="both"/>
       </w:pPr>
       <w:bookmarkStart w:id="4" w:name="Xe535e7deb3457bf6891dfc100ac742aa591bc31"/>
       <w:bookmarkEnd w:id="3"/>
@@ -822,6 +860,7 @@
     <w:p>
       <w:pPr>
         <w:pStyle w:val="FirstParagraph"/>
+        <w:jc w:val="both"/>
       </w:pPr>
       <w:r>
         <w:t>We validated the pipeline against two long-read chicken caecum metagenomic studies. The primary dataset (</w:t>
@@ -919,6 +958,7 @@
     <w:p>
       <w:pPr>
         <w:pStyle w:val="BodyText"/>
+        <w:jc w:val="both"/>
       </w:pPr>
       <w:r>
         <w:rPr>
@@ -963,6 +1003,7 @@
           <w:p>
             <w:pPr>
               <w:pStyle w:val="Compact"/>
+              <w:jc w:val="both"/>
             </w:pPr>
             <w:r>
               <w:lastRenderedPageBreak/>
@@ -977,6 +1018,7 @@
           <w:p>
             <w:pPr>
               <w:pStyle w:val="Compact"/>
+              <w:jc w:val="both"/>
             </w:pPr>
             <w:r>
               <w:t>B1 primary output</w:t>
@@ -990,6 +1032,7 @@
           <w:p>
             <w:pPr>
               <w:pStyle w:val="Compact"/>
+              <w:jc w:val="both"/>
             </w:pPr>
             <w:r>
               <w:t>B2 primary output</w:t>
@@ -1005,6 +1048,7 @@
           <w:p>
             <w:pPr>
               <w:pStyle w:val="Compact"/>
+              <w:jc w:val="both"/>
             </w:pPr>
             <w:r>
               <w:t>load_inputs</w:t>
@@ -1018,6 +1062,7 @@
           <w:p>
             <w:pPr>
               <w:pStyle w:val="Compact"/>
+              <w:jc w:val="both"/>
             </w:pPr>
             <w:r>
               <w:t>5 upstream tables parsed</w:t>
@@ -1031,6 +1076,7 @@
           <w:p>
             <w:pPr>
               <w:pStyle w:val="Compact"/>
+              <w:jc w:val="both"/>
             </w:pPr>
             <w:r>
               <w:t>5 upstream tables parsed</w:t>
@@ -1046,6 +1092,7 @@
           <w:p>
             <w:pPr>
               <w:pStyle w:val="Compact"/>
+              <w:jc w:val="both"/>
             </w:pPr>
             <w:r>
               <w:t>clean_data</w:t>
@@ -1059,6 +1106,7 @@
           <w:p>
             <w:pPr>
               <w:pStyle w:val="Compact"/>
+              <w:jc w:val="both"/>
             </w:pPr>
             <w:r>
               <w:rPr>
@@ -1078,6 +1126,7 @@
           <w:p>
             <w:pPr>
               <w:pStyle w:val="Compact"/>
+              <w:jc w:val="both"/>
             </w:pPr>
             <w:r>
               <w:t xml:space="preserve">no </w:t>
@@ -1102,6 +1151,7 @@
           <w:p>
             <w:pPr>
               <w:pStyle w:val="Compact"/>
+              <w:jc w:val="both"/>
             </w:pPr>
             <w:r>
               <w:t>normalisation</w:t>
@@ -1115,6 +1165,7 @@
           <w:p>
             <w:pPr>
               <w:pStyle w:val="Compact"/>
+              <w:jc w:val="both"/>
             </w:pPr>
             <w:r>
               <w:t>gene-element TPM table written</w:t>
@@ -1128,6 +1179,7 @@
           <w:p>
             <w:pPr>
               <w:pStyle w:val="Compact"/>
+              <w:jc w:val="both"/>
             </w:pPr>
             <w:r>
               <w:t>gene-element TPM table written</w:t>
@@ -1143,6 +1195,7 @@
           <w:p>
             <w:pPr>
               <w:pStyle w:val="Compact"/>
+              <w:jc w:val="both"/>
             </w:pPr>
             <w:r>
               <w:t>taxonomy</w:t>
@@ -1156,6 +1209,7 @@
           <w:p>
             <w:pPr>
               <w:pStyle w:val="Compact"/>
+              <w:jc w:val="both"/>
             </w:pPr>
             <w:r>
               <w:t>2,971 / 11,196 (taxon, sample) rows kept (count ≥ 5)</w:t>
@@ -1169,6 +1223,7 @@
           <w:p>
             <w:pPr>
               <w:pStyle w:val="Compact"/>
+              <w:jc w:val="both"/>
             </w:pPr>
             <w:r>
               <w:t>5,570 / 6,549 (taxon, sample) rows kept</w:t>
@@ -1184,6 +1239,7 @@
           <w:p>
             <w:pPr>
               <w:pStyle w:val="Compact"/>
+              <w:jc w:val="both"/>
             </w:pPr>
             <w:r>
               <w:t>relative_abundance</w:t>
@@ -1197,6 +1253,7 @@
           <w:p>
             <w:pPr>
               <w:pStyle w:val="Compact"/>
+              <w:jc w:val="both"/>
             </w:pPr>
             <w:r>
               <w:t>1,700 / 72,152 rows kept (count &gt; 17); top-50 + Others</w:t>
@@ -1210,6 +1267,7 @@
           <w:p>
             <w:pPr>
               <w:pStyle w:val="Compact"/>
+              <w:jc w:val="both"/>
             </w:pPr>
             <w:r>
               <w:t>7,557 / 18,073 rows kept; top-50 + Others</w:t>
@@ -1225,6 +1283,7 @@
           <w:p>
             <w:pPr>
               <w:pStyle w:val="Compact"/>
+              <w:jc w:val="both"/>
             </w:pPr>
             <w:r>
               <w:t>alpha_diversity</w:t>
@@ -1238,6 +1297,7 @@
           <w:p>
             <w:pPr>
               <w:pStyle w:val="Compact"/>
+              <w:jc w:val="both"/>
             </w:pPr>
             <w:r>
               <w:t>9 metrics × 18 samples; KW per metric</w:t>
@@ -1251,6 +1311,7 @@
           <w:p>
             <w:pPr>
               <w:pStyle w:val="Compact"/>
+              <w:jc w:val="both"/>
             </w:pPr>
             <w:r>
               <w:t>9 metrics × 32 samples; KW per metric</w:t>
@@ -1266,6 +1327,7 @@
           <w:p>
             <w:pPr>
               <w:pStyle w:val="Compact"/>
+              <w:jc w:val="both"/>
             </w:pPr>
             <w:r>
               <w:t>beta_diversity</w:t>
@@ -1279,6 +1341,7 @@
           <w:p>
             <w:pPr>
               <w:pStyle w:val="Compact"/>
+              <w:jc w:val="both"/>
               <w:rPr>
                 <w:lang w:val="es-ES"/>
               </w:rPr>
@@ -1298,6 +1361,7 @@
           <w:p>
             <w:pPr>
               <w:pStyle w:val="Compact"/>
+              <w:jc w:val="both"/>
               <w:rPr>
                 <w:lang w:val="es-ES"/>
               </w:rPr>
@@ -1319,6 +1383,7 @@
           <w:p>
             <w:pPr>
               <w:pStyle w:val="Compact"/>
+              <w:jc w:val="both"/>
             </w:pPr>
             <w:r>
               <w:t>differential_abundance</w:t>
@@ -1332,6 +1397,7 @@
           <w:p>
             <w:pPr>
               <w:pStyle w:val="Compact"/>
+              <w:jc w:val="both"/>
             </w:pPr>
             <w:r>
               <w:t>31 taxa + 157 gene features; 3 pairwise contrasts</w:t>
@@ -1345,6 +1411,7 @@
           <w:p>
             <w:pPr>
               <w:pStyle w:val="Compact"/>
+              <w:jc w:val="both"/>
             </w:pPr>
             <w:r>
               <w:t>53 taxa + 221 gene features; 6 pairwise contrasts</w:t>
@@ -1360,6 +1427,7 @@
           <w:p>
             <w:pPr>
               <w:pStyle w:val="Compact"/>
+              <w:jc w:val="both"/>
             </w:pPr>
             <w:r>
               <w:t>resistome (CARD)</w:t>
@@ -1373,6 +1441,7 @@
           <w:p>
             <w:pPr>
               <w:pStyle w:val="Compact"/>
+              <w:jc w:val="both"/>
             </w:pPr>
             <w:r>
               <w:t>348 rows / 85 genes / 18 drug classes</w:t>
@@ -1386,6 +1455,7 @@
           <w:p>
             <w:pPr>
               <w:pStyle w:val="Compact"/>
+              <w:jc w:val="both"/>
             </w:pPr>
             <w:r>
               <w:t>648 rows / 99 genes / 20 drug classes</w:t>
@@ -1401,6 +1471,7 @@
           <w:p>
             <w:pPr>
               <w:pStyle w:val="Compact"/>
+              <w:jc w:val="both"/>
             </w:pPr>
             <w:r>
               <w:t>virulome (VFDB)</w:t>
@@ -1414,6 +1485,7 @@
           <w:p>
             <w:pPr>
               <w:pStyle w:val="Compact"/>
+              <w:jc w:val="both"/>
             </w:pPr>
             <w:r>
               <w:t>320 rows / 140 genes / 6 VF functions (17 / 18 samples)</w:t>
@@ -1427,6 +1499,7 @@
           <w:p>
             <w:pPr>
               <w:pStyle w:val="Compact"/>
+              <w:jc w:val="both"/>
             </w:pPr>
             <w:r>
               <w:t>492 rows / 156 genes / 8 VF functions (26 / 32 samples)</w:t>
@@ -1442,6 +1515,7 @@
           <w:p>
             <w:pPr>
               <w:pStyle w:val="Compact"/>
+              <w:jc w:val="both"/>
             </w:pPr>
             <w:r>
               <w:t>mobilome (PlasmidFinder)</w:t>
@@ -1455,6 +1529,7 @@
           <w:p>
             <w:pPr>
               <w:pStyle w:val="Compact"/>
+              <w:jc w:val="both"/>
             </w:pPr>
             <w:r>
               <w:t>65 rows / 10 replicons / 3 families</w:t>
@@ -1468,6 +1543,7 @@
           <w:p>
             <w:pPr>
               <w:pStyle w:val="Compact"/>
+              <w:jc w:val="both"/>
             </w:pPr>
             <w:r>
               <w:t>137 rows / 25 replicons / 5 families</w:t>
@@ -1483,6 +1559,7 @@
           <w:p>
             <w:pPr>
               <w:pStyle w:val="Compact"/>
+              <w:jc w:val="both"/>
             </w:pPr>
             <w:r>
               <w:t>network</w:t>
@@ -1496,6 +1573,7 @@
           <w:p>
             <w:pPr>
               <w:pStyle w:val="Compact"/>
+              <w:jc w:val="both"/>
             </w:pPr>
             <w:r>
               <w:t>247 edges, 100 nodes (18 + 42 + 40); modularity = 0.31</w:t>
@@ -1509,6 +1587,7 @@
           <w:p>
             <w:pPr>
               <w:pStyle w:val="Compact"/>
+              <w:jc w:val="both"/>
             </w:pPr>
             <w:r>
               <w:t>576 edges, 210 nodes (32 + 77 + 101); modularity = 0.40</w:t>
@@ -1524,6 +1603,7 @@
           <w:p>
             <w:pPr>
               <w:pStyle w:val="Compact"/>
+              <w:jc w:val="both"/>
             </w:pPr>
             <w:r>
               <w:t>panels</w:t>
@@ -1537,6 +1617,7 @@
           <w:p>
             <w:pPr>
               <w:pStyle w:val="Compact"/>
+              <w:jc w:val="both"/>
             </w:pPr>
             <w:r>
               <w:t xml:space="preserve">main + supplementary composite figures (PNG / TIFF) + </w:t>
@@ -1556,6 +1637,7 @@
           <w:p>
             <w:pPr>
               <w:pStyle w:val="Compact"/>
+              <w:jc w:val="both"/>
             </w:pPr>
             <w:r>
               <w:t xml:space="preserve">main + supplementary composite figures (PNG / TIFF) + </w:t>
@@ -1577,6 +1659,7 @@
           <w:p>
             <w:pPr>
               <w:pStyle w:val="Compact"/>
+              <w:jc w:val="both"/>
             </w:pPr>
             <w:r>
               <w:t>manifest</w:t>
@@ -1590,6 +1673,7 @@
           <w:p>
             <w:pPr>
               <w:pStyle w:val="Compact"/>
+              <w:jc w:val="both"/>
               <w:rPr>
                 <w:lang w:val="es-ES"/>
               </w:rPr>
@@ -1616,6 +1700,7 @@
           <w:p>
             <w:pPr>
               <w:pStyle w:val="Compact"/>
+              <w:jc w:val="both"/>
               <w:rPr>
                 <w:lang w:val="es-ES"/>
               </w:rPr>
@@ -1644,6 +1729,7 @@
           <w:p>
             <w:pPr>
               <w:pStyle w:val="Compact"/>
+              <w:jc w:val="both"/>
             </w:pPr>
             <w:r>
               <w:t>report</w:t>
@@ -1657,6 +1743,7 @@
           <w:p>
             <w:pPr>
               <w:pStyle w:val="Compact"/>
+              <w:jc w:val="both"/>
             </w:pPr>
             <w:r>
               <w:t>Quarto dashboard HTML (~14 MB)</w:t>
@@ -1670,6 +1757,7 @@
           <w:p>
             <w:pPr>
               <w:pStyle w:val="Compact"/>
+              <w:jc w:val="both"/>
             </w:pPr>
             <w:r>
               <w:t>Quarto dashboard HTML (~18 MB)</w:t>
@@ -1681,6 +1769,7 @@
     <w:p>
       <w:pPr>
         <w:pStyle w:val="BodyText"/>
+        <w:jc w:val="both"/>
       </w:pPr>
       <w:r>
         <w:t>Across both datasets (</w:t>
@@ -1749,6 +1838,7 @@
     <w:p>
       <w:pPr>
         <w:pStyle w:val="BodyText"/>
+        <w:jc w:val="both"/>
       </w:pPr>
       <w:r>
         <w:rPr>
@@ -1800,6 +1890,7 @@
     <w:p>
       <w:pPr>
         <w:pStyle w:val="BodyText"/>
+        <w:jc w:val="both"/>
       </w:pPr>
       <w:r>
         <w:t xml:space="preserve">One anticipated and deliberate discrepancy arises at the resistome stage: the ground-truth </w:t>
@@ -1847,6 +1938,7 @@
     <w:p>
       <w:pPr>
         <w:pStyle w:val="BodyText"/>
+        <w:jc w:val="both"/>
       </w:pPr>
       <w:r>
         <w:t xml:space="preserve">To assess portability beyond the development cohorts, we applied MERIDIAN unmodified — changing only </w:t>
@@ -1873,6 +1965,7 @@
     <w:p>
       <w:pPr>
         <w:pStyle w:val="BodyText"/>
+        <w:jc w:val="both"/>
       </w:pPr>
       <w:r>
         <w:rPr>
@@ -1912,6 +2005,7 @@
           <w:p>
             <w:pPr>
               <w:pStyle w:val="Compact"/>
+              <w:jc w:val="both"/>
             </w:pPr>
             <w:r>
               <w:t>Cohort</w:t>
@@ -1925,6 +2019,7 @@
           <w:p>
             <w:pPr>
               <w:pStyle w:val="Compact"/>
+              <w:jc w:val="both"/>
             </w:pPr>
             <w:r>
               <w:t>One Health axis</w:t>
@@ -1938,6 +2033,7 @@
           <w:p>
             <w:pPr>
               <w:pStyle w:val="Compact"/>
+              <w:jc w:val="both"/>
             </w:pPr>
             <w:r>
               <w:t>n</w:t>
@@ -1951,6 +2047,7 @@
           <w:p>
             <w:pPr>
               <w:pStyle w:val="Compact"/>
+              <w:jc w:val="both"/>
             </w:pPr>
             <w:r>
               <w:t>Primary contrast</w:t>
@@ -1964,6 +2061,7 @@
           <w:p>
             <w:pPr>
               <w:pStyle w:val="Compact"/>
+              <w:jc w:val="both"/>
             </w:pPr>
             <w:r>
               <w:t>Runtime</w:t>
@@ -1977,6 +2075,7 @@
           <w:p>
             <w:pPr>
               <w:pStyle w:val="Compact"/>
+              <w:jc w:val="both"/>
             </w:pPr>
             <w:r>
               <w:t>Peak RAM</w:t>
@@ -1990,6 +2089,7 @@
           <w:p>
             <w:pPr>
               <w:pStyle w:val="Compact"/>
+              <w:jc w:val="both"/>
             </w:pPr>
             <w:r>
               <w:t>Headline result</w:t>
@@ -2005,6 +2105,7 @@
           <w:p>
             <w:pPr>
               <w:pStyle w:val="Compact"/>
+              <w:jc w:val="both"/>
             </w:pPr>
             <w:r>
               <w:t>Chicken batch 1</w:t>
@@ -2018,6 +2119,7 @@
           <w:p>
             <w:pPr>
               <w:pStyle w:val="Compact"/>
+              <w:jc w:val="both"/>
             </w:pPr>
             <w:r>
               <w:t>Livestock (poultry caecum)</w:t>
@@ -2031,6 +2133,7 @@
           <w:p>
             <w:pPr>
               <w:pStyle w:val="Compact"/>
+              <w:jc w:val="both"/>
             </w:pPr>
             <w:r>
               <w:t>18</w:t>
@@ -2044,6 +2147,7 @@
           <w:p>
             <w:pPr>
               <w:pStyle w:val="Compact"/>
+              <w:jc w:val="both"/>
             </w:pPr>
             <w:r>
               <w:t>Diet (3 groups)</w:t>
@@ -2057,6 +2161,7 @@
           <w:p>
             <w:pPr>
               <w:pStyle w:val="Compact"/>
+              <w:jc w:val="both"/>
             </w:pPr>
             <w:r>
               <w:t>6m 41s</w:t>
@@ -2070,6 +2175,7 @@
           <w:p>
             <w:pPr>
               <w:pStyle w:val="Compact"/>
+              <w:jc w:val="both"/>
             </w:pPr>
             <w:r>
               <w:t>1.33 GB</w:t>
@@ -2083,6 +2189,7 @@
           <w:p>
             <w:pPr>
               <w:pStyle w:val="Compact"/>
+              <w:jc w:val="both"/>
             </w:pPr>
             <w:r>
               <w:t xml:space="preserve">Ground-truth reference; R/02 parsing fix recovers 110 (sample, GENE) </w:t>
@@ -2102,6 +2209,7 @@
           <w:p>
             <w:pPr>
               <w:pStyle w:val="Compact"/>
+              <w:jc w:val="both"/>
             </w:pPr>
             <w:r>
               <w:lastRenderedPageBreak/>
@@ -2116,6 +2224,7 @@
           <w:p>
             <w:pPr>
               <w:pStyle w:val="Compact"/>
+              <w:jc w:val="both"/>
             </w:pPr>
             <w:r>
               <w:t>Livestock (poultry caecum)</w:t>
@@ -2129,6 +2238,7 @@
           <w:p>
             <w:pPr>
               <w:pStyle w:val="Compact"/>
+              <w:jc w:val="both"/>
             </w:pPr>
             <w:r>
               <w:t>32</w:t>
@@ -2142,6 +2252,7 @@
           <w:p>
             <w:pPr>
               <w:pStyle w:val="Compact"/>
+              <w:jc w:val="both"/>
             </w:pPr>
             <w:r>
               <w:t>Treatment × week (4-level)</w:t>
@@ -2155,6 +2266,7 @@
           <w:p>
             <w:pPr>
               <w:pStyle w:val="Compact"/>
+              <w:jc w:val="both"/>
             </w:pPr>
             <w:r>
               <w:t>8m 19s</w:t>
@@ -2168,6 +2280,7 @@
           <w:p>
             <w:pPr>
               <w:pStyle w:val="Compact"/>
+              <w:jc w:val="both"/>
             </w:pPr>
             <w:r>
               <w:t>1.51 GB</w:t>
@@ -2181,6 +2294,7 @@
           <w:p>
             <w:pPr>
               <w:pStyle w:val="Compact"/>
+              <w:jc w:val="both"/>
             </w:pPr>
             <w:r>
               <w:t>Sublinear scaling; denser integrated network</w:t>
@@ -2196,6 +2310,7 @@
           <w:p>
             <w:pPr>
               <w:pStyle w:val="Compact"/>
+              <w:jc w:val="both"/>
             </w:pPr>
             <w:r>
               <w:t>Hospital wastewater (EG)</w:t>
@@ -2209,6 +2324,7 @@
           <w:p>
             <w:pPr>
               <w:pStyle w:val="Compact"/>
+              <w:jc w:val="both"/>
             </w:pPr>
             <w:r>
               <w:t>Human-clinical + built environment</w:t>
@@ -2222,6 +2338,7 @@
           <w:p>
             <w:pPr>
               <w:pStyle w:val="Compact"/>
+              <w:jc w:val="both"/>
             </w:pPr>
             <w:r>
               <w:t>20</w:t>
@@ -2235,6 +2352,7 @@
           <w:p>
             <w:pPr>
               <w:pStyle w:val="Compact"/>
+              <w:jc w:val="both"/>
             </w:pPr>
             <w:r>
               <w:t>Wastewater vs tap water</w:t>
@@ -2248,6 +2366,7 @@
           <w:p>
             <w:pPr>
               <w:pStyle w:val="Compact"/>
+              <w:jc w:val="both"/>
             </w:pPr>
             <w:r>
               <w:t>4m 08s</w:t>
@@ -2261,6 +2380,7 @@
           <w:p>
             <w:pPr>
               <w:pStyle w:val="Compact"/>
+              <w:jc w:val="both"/>
             </w:pPr>
             <w:r>
               <w:t>1.98 GB</w:t>
@@ -2274,6 +2394,7 @@
           <w:p>
             <w:pPr>
               <w:pStyle w:val="Compact"/>
+              <w:jc w:val="both"/>
             </w:pPr>
             <w:r>
               <w:t>Wastewater richer and compositionally distinct (PERMANOVA R² = 0.18, p = 3 × 10⁻⁴)</w:t>
@@ -2289,6 +2410,7 @@
           <w:p>
             <w:pPr>
               <w:pStyle w:val="Compact"/>
+              <w:jc w:val="both"/>
             </w:pPr>
             <w:r>
               <w:t>Wetlands (E. Atlantic Flyway)</w:t>
@@ -2302,6 +2424,7 @@
           <w:p>
             <w:pPr>
               <w:pStyle w:val="Compact"/>
+              <w:jc w:val="both"/>
             </w:pPr>
             <w:r>
               <w:t>Wildlife + environment</w:t>
@@ -2315,6 +2438,7 @@
           <w:p>
             <w:pPr>
               <w:pStyle w:val="Compact"/>
+              <w:jc w:val="both"/>
             </w:pPr>
             <w:r>
               <w:t>24</w:t>
@@ -2328,6 +2452,7 @@
           <w:p>
             <w:pPr>
               <w:pStyle w:val="Compact"/>
+              <w:jc w:val="both"/>
             </w:pPr>
             <w:r>
               <w:t>Impacted vs natural</w:t>
@@ -2341,6 +2466,7 @@
           <w:p>
             <w:pPr>
               <w:pStyle w:val="Compact"/>
+              <w:jc w:val="both"/>
             </w:pPr>
             <w:r>
               <w:t>7m 37s</w:t>
@@ -2354,6 +2480,7 @@
           <w:p>
             <w:pPr>
               <w:pStyle w:val="Compact"/>
+              <w:jc w:val="both"/>
             </w:pPr>
             <w:r>
               <w:t>3.59 GB</w:t>
@@ -2367,6 +2494,7 @@
           <w:p>
             <w:pPr>
               <w:pStyle w:val="Compact"/>
+              <w:jc w:val="both"/>
             </w:pPr>
             <w:r>
               <w:t>Higher virulome load at impacted sites (PERMANOVA R² = 0.088, p_adj = 0.037)</w:t>
@@ -2378,6 +2506,7 @@
     <w:p>
       <w:pPr>
         <w:pStyle w:val="Heading2"/>
+        <w:jc w:val="both"/>
       </w:pPr>
       <w:bookmarkStart w:id="5" w:name="X50c7748aa6d421f569a5daf2425c9e7043a6cad"/>
       <w:bookmarkEnd w:id="4"/>
@@ -2388,12 +2517,16 @@
     <w:p>
       <w:pPr>
         <w:pStyle w:val="FirstParagraph"/>
+        <w:jc w:val="both"/>
       </w:pPr>
       <w:r>
         <w:t>MERIDIAN integrates community analyses, functional profiling, and an integrated network reconstruction into a single configuration-driven R workflow for long-read shotgun metagenomics. Single-thread end-to-end execution completes in minutes with a low memory footprint, scaling sublinearly with cohort size and grouping complexity. Beyond the development cohorts, it has been applied without modification to two independent public cohorts spanning the One Health continuum (hospital wastewater and wetland surveillance). It remains under active development, and we are releasing this first tagged version (v1.0.0) to solicit feedback from researchers conducting comparable long-read metagenomic studies and to guide future development of the workflow.</w:t>
       </w:r>
     </w:p>
     <w:p>
+      <w:pPr>
+        <w:jc w:val="both"/>
+      </w:pPr>
       <w:r>
         <w:pict w14:anchorId="2880B762">
           <v:rect id="_x0000_i1027" style="width:0;height:1.5pt" o:hralign="center" o:hrstd="t" o:hr="t"/>
@@ -2403,6 +2536,7 @@
     <w:p>
       <w:pPr>
         <w:pStyle w:val="FirstParagraph"/>
+        <w:jc w:val="both"/>
       </w:pPr>
       <w:r>
         <w:rPr>
@@ -2445,6 +2579,7 @@
     <w:p>
       <w:pPr>
         <w:pStyle w:val="BodyText"/>
+        <w:jc w:val="both"/>
       </w:pPr>
       <w:r>
         <w:rPr>
@@ -2482,6 +2617,7 @@
     <w:p>
       <w:pPr>
         <w:pStyle w:val="BodyText"/>
+        <w:jc w:val="both"/>
       </w:pPr>
       <w:r>
         <w:rPr>
@@ -2497,6 +2633,7 @@
     <w:p>
       <w:pPr>
         <w:pStyle w:val="BodyText"/>
+        <w:jc w:val="both"/>
       </w:pPr>
       <w:r>
         <w:rPr>
@@ -2512,6 +2649,7 @@
     <w:p>
       <w:pPr>
         <w:pStyle w:val="BodyText"/>
+        <w:jc w:val="both"/>
       </w:pPr>
       <w:r>
         <w:rPr>
@@ -2545,13 +2683,16 @@
         <w:rPr>
           <w:rStyle w:val="Hyperlink"/>
         </w:rPr>
-        <w:t>https://github.com/Julio92-C/Metagenomics_pipeline_automation</w:t>
+        <w:t>https://github.com/Julio92-C/meridian</w:t>
       </w:r>
       <w:r>
         <w:t xml:space="preserve"> (release v1.0.0).</w:t>
       </w:r>
     </w:p>
     <w:p>
+      <w:pPr>
+        <w:jc w:val="both"/>
+      </w:pPr>
       <w:r>
         <w:pict w14:anchorId="6D080543">
           <v:rect id="_x0000_i1028" style="width:0;height:1.5pt" o:hralign="center" o:hrstd="t" o:hr="t"/>
@@ -2561,6 +2702,7 @@
     <w:p>
       <w:pPr>
         <w:pStyle w:val="Heading2"/>
+        <w:jc w:val="both"/>
       </w:pPr>
       <w:bookmarkStart w:id="6" w:name="references"/>
       <w:bookmarkEnd w:id="5"/>
@@ -2575,6 +2717,7 @@
           <w:ilvl w:val="0"/>
           <w:numId w:val="2"/>
         </w:numPr>
+        <w:jc w:val="both"/>
       </w:pPr>
       <w:r>
         <w:t xml:space="preserve">Al-Khalaifah H, Rahman MH, Al-Surrayai T, Al-Dhumair A, Al-Hasan M. A One-Health Perspective of Antimicrobial Resistance (AMR): Human, Animals and Environmental Health. </w:t>
@@ -2597,6 +2740,7 @@
           <w:ilvl w:val="0"/>
           <w:numId w:val="2"/>
         </w:numPr>
+        <w:jc w:val="both"/>
       </w:pPr>
       <w:r>
         <w:t xml:space="preserve">Wood DE, Lu J, Langmead B. Improved metagenomic analysis with Kraken 2. </w:t>
@@ -2619,6 +2763,7 @@
           <w:ilvl w:val="0"/>
           <w:numId w:val="2"/>
         </w:numPr>
+        <w:jc w:val="both"/>
       </w:pPr>
       <w:r>
         <w:t xml:space="preserve">Lu J, Breitwieser FP, Thielen P, Salzberg SL. Bracken: estimating species abundance in metagenomics data. </w:t>
@@ -2641,6 +2786,7 @@
           <w:ilvl w:val="0"/>
           <w:numId w:val="2"/>
         </w:numPr>
+        <w:jc w:val="both"/>
       </w:pPr>
       <w:r>
         <w:t xml:space="preserve">Seemann T. ABRicate: mass screening of contigs for antimicrobial and virulence genes. </w:t>
@@ -2664,6 +2810,7 @@
           <w:ilvl w:val="0"/>
           <w:numId w:val="2"/>
         </w:numPr>
+        <w:jc w:val="both"/>
       </w:pPr>
       <w:r>
         <w:t xml:space="preserve">Alcock BP, Huynh W, Chalil R, Smith KW, Raphenya AR, Wlodarski MA, et al. CARD 2023: expanded curation, support for machine learning, and resistome prediction at the Comprehensive Antibiotic Resistance Database. </w:t>
@@ -2686,6 +2833,7 @@
           <w:ilvl w:val="0"/>
           <w:numId w:val="2"/>
         </w:numPr>
+        <w:jc w:val="both"/>
       </w:pPr>
       <w:r>
         <w:t xml:space="preserve">Liu B, Zheng D, Zhou S, Chen L, Yang J. VFDB 2022: a general classification scheme for bacterial virulence factors. </w:t>
@@ -2708,6 +2856,7 @@
           <w:ilvl w:val="0"/>
           <w:numId w:val="2"/>
         </w:numPr>
+        <w:jc w:val="both"/>
       </w:pPr>
       <w:r>
         <w:rPr>
@@ -2736,6 +2885,7 @@
           <w:ilvl w:val="0"/>
           <w:numId w:val="2"/>
         </w:numPr>
+        <w:jc w:val="both"/>
       </w:pPr>
       <w:r>
         <w:t xml:space="preserve">Martí JM. Recentrifuge: robust comparative analysis and contamination removal for metagenomics. </w:t>
@@ -2758,6 +2908,7 @@
           <w:ilvl w:val="0"/>
           <w:numId w:val="2"/>
         </w:numPr>
+        <w:jc w:val="both"/>
       </w:pPr>
       <w:r>
         <w:t>Oksanen J, Simpson G, Blanchet F, Kindt R, Legendre P, Minchin P, et al. vegan: Community Ecology Package. R package version 2.7-3, 2026. doi:10.32614/CRAN.package.vegan.</w:t>
@@ -2770,6 +2921,7 @@
           <w:ilvl w:val="0"/>
           <w:numId w:val="2"/>
         </w:numPr>
+        <w:jc w:val="both"/>
       </w:pPr>
       <w:r>
         <w:lastRenderedPageBreak/>
@@ -2793,6 +2945,7 @@
           <w:ilvl w:val="0"/>
           <w:numId w:val="2"/>
         </w:numPr>
+        <w:jc w:val="both"/>
       </w:pPr>
       <w:r>
         <w:rPr>
@@ -2821,6 +2974,7 @@
           <w:ilvl w:val="0"/>
           <w:numId w:val="2"/>
         </w:numPr>
+        <w:jc w:val="both"/>
       </w:pPr>
       <w:r>
         <w:t xml:space="preserve">Theil S, Rifa E. rANOMALY: AmplicoN wOrkflow for Microbial community AnaLYsis. </w:t>
@@ -2843,6 +2997,7 @@
           <w:ilvl w:val="0"/>
           <w:numId w:val="2"/>
         </w:numPr>
+        <w:jc w:val="both"/>
       </w:pPr>
       <w:r>
         <w:t xml:space="preserve">Allaire JJ, et al. Quarto. </w:t>
@@ -2866,6 +3021,7 @@
           <w:ilvl w:val="0"/>
           <w:numId w:val="2"/>
         </w:numPr>
+        <w:jc w:val="both"/>
       </w:pPr>
       <w:r>
         <w:t xml:space="preserve">R Core Team. R: A Language and Environment for Statistical Computing (version 4.5.0). R Foundation for Statistical Computing, Vienna, 2025. </w:t>
@@ -2889,6 +3045,7 @@
           <w:ilvl w:val="0"/>
           <w:numId w:val="2"/>
         </w:numPr>
+        <w:jc w:val="both"/>
       </w:pPr>
       <w:r>
         <w:t xml:space="preserve">Pedersen TL. ggraph: An Implementation of </w:t>
@@ -2909,6 +3066,7 @@
           <w:ilvl w:val="0"/>
           <w:numId w:val="2"/>
         </w:numPr>
+        <w:jc w:val="both"/>
       </w:pPr>
       <w:r>
         <w:t xml:space="preserve">Csárdi G, Nepusz T. The igraph software package for complex network research. </w:t>
@@ -2942,6 +3100,7 @@
           <w:ilvl w:val="0"/>
           <w:numId w:val="2"/>
         </w:numPr>
+        <w:jc w:val="both"/>
       </w:pPr>
       <w:r>
         <w:t>Allaire JJ, Gandrud C, Russell K, Yetman C. networkD3: D3 JavaScript Network Graphs from R. R package version 0.4.1, 2025. doi:10.32614/CRAN.package.networkD3.</w:t>

</xml_diff>

<commit_message>
docs(manuscript): Table 1 beta-diversity row after the R/07 community-table fix
R/07 now ordinates the community taxa table instead of the gene-hit subset
(12b191c), which changes the chicken cohorts' taxonomic PERMANOVA:
B1 R2 0.145, p 0.22 -> 0.192, p 0.015 (PERMDISP 0.027 -> 0.095);
B2 R2 0.121, p 0.15 -> 0.118, p 0.23 (PERMDISP 0.053 -> 0.86).
Written into applications_note.docx as tracked changes (author "Claude"; no
re-render) with a caption note on the rerun date; .md synced.

Co-Authored-By: Claude Opus 5.5 <noreply@anthropic.com>
</commit_message>
<xml_diff>
--- a/docs/manuscript/applications_note.docx
+++ b/docs/manuscript/applications_note.docx
@@ -979,6 +979,11 @@
       <w:r>
         <w:t xml:space="preserve"> = 128); 2026-06-23 sequential run.</w:t>
       </w:r>
+      <w:ins w:id="9109" w:author="Claude" w:date="2026-10-19T12:00:00Z">
+        <w:r>
+          <w:t xml:space="preserve"> The beta_diversity row is from a 2026-10-19 rerun of that stage after R/07 was changed to ordinate the community taxa table instead of the gene-hit subset.</w:t>
+        </w:r>
+      </w:ins>
     </w:p>
     <w:tbl>
       <w:tblPr>
@@ -1350,28 +1355,104 @@
               <w:rPr>
                 <w:lang w:val="es-ES"/>
               </w:rPr>
-              <w:t>PERMANOVA R² = 0.145, p = 0.22; PERMDISP p = 0.027</w:t>
-            </w:r>
-          </w:p>
-        </w:tc>
-        <w:tc>
-          <w:tcPr>
-            <w:tcW w:w="0" w:type="auto"/>
-          </w:tcPr>
-          <w:p>
-            <w:pPr>
-              <w:pStyle w:val="Compact"/>
-              <w:jc w:val="both"/>
+              <w:t xml:space="preserve">PERMANOVA R² = </w:t>
+            </w:r>
+            <w:del w:id="9101" w:author="Claude" w:date="2026-10-19T12:00:00Z">
+              <w:r>
+                <w:rPr>
+                  <w:lang w:val="es-ES"/>
+                </w:rPr>
+                <w:delText xml:space="preserve">0.145, p = 0.22</w:delText>
+              </w:r>
+            </w:del>
+            <w:ins w:id="9102" w:author="Claude" w:date="2026-10-19T12:00:00Z">
+              <w:r>
+                <w:rPr>
+                  <w:lang w:val="es-ES"/>
+                </w:rPr>
+                <w:t xml:space="preserve">0.192, p = 0.015</w:t>
+              </w:r>
+            </w:ins>
+            <w:r>
               <w:rPr>
                 <w:lang w:val="es-ES"/>
               </w:rPr>
-            </w:pPr>
-            <w:r>
+              <w:t xml:space="preserve">; PERMDISP p = </w:t>
+            </w:r>
+            <w:del w:id="9103" w:author="Claude" w:date="2026-10-19T12:00:00Z">
+              <w:r>
+                <w:rPr>
+                  <w:lang w:val="es-ES"/>
+                </w:rPr>
+                <w:delText xml:space="preserve">0.027</w:delText>
+              </w:r>
+            </w:del>
+            <w:ins w:id="9104" w:author="Claude" w:date="2026-10-19T12:00:00Z">
+              <w:r>
+                <w:rPr>
+                  <w:lang w:val="es-ES"/>
+                </w:rPr>
+                <w:t xml:space="preserve">0.095</w:t>
+              </w:r>
+            </w:ins>
+          </w:p>
+        </w:tc>
+        <w:tc>
+          <w:tcPr>
+            <w:tcW w:w="0" w:type="auto"/>
+          </w:tcPr>
+          <w:p>
+            <w:pPr>
+              <w:pStyle w:val="Compact"/>
+              <w:jc w:val="both"/>
               <w:rPr>
                 <w:lang w:val="es-ES"/>
               </w:rPr>
-              <w:t>PERMANOVA R² = 0.121, p = 0.15; PERMDISP p = 0.053</w:t>
-            </w:r>
+            </w:pPr>
+            <w:r>
+              <w:rPr>
+                <w:lang w:val="es-ES"/>
+              </w:rPr>
+              <w:t xml:space="preserve">PERMANOVA R² = </w:t>
+            </w:r>
+            <w:del w:id="9105" w:author="Claude" w:date="2026-10-19T12:00:00Z">
+              <w:r>
+                <w:rPr>
+                  <w:lang w:val="es-ES"/>
+                </w:rPr>
+                <w:delText xml:space="preserve">0.121, p = 0.15</w:delText>
+              </w:r>
+            </w:del>
+            <w:ins w:id="9106" w:author="Claude" w:date="2026-10-19T12:00:00Z">
+              <w:r>
+                <w:rPr>
+                  <w:lang w:val="es-ES"/>
+                </w:rPr>
+                <w:t xml:space="preserve">0.118, p = 0.23</w:t>
+              </w:r>
+            </w:ins>
+            <w:r>
+              <w:rPr>
+                <w:lang w:val="es-ES"/>
+              </w:rPr>
+              <w:t xml:space="preserve">; PERMDISP p = </w:t>
+            </w:r>
+            <w:del w:id="9107" w:author="Claude" w:date="2026-10-19T12:00:00Z">
+              <w:r>
+                <w:rPr>
+                  <w:lang w:val="es-ES"/>
+                </w:rPr>
+                <w:delText xml:space="preserve">0.053</w:delText>
+              </w:r>
+            </w:del>
+            <w:ins w:id="9108" w:author="Claude" w:date="2026-10-19T12:00:00Z">
+              <w:r>
+                <w:rPr>
+                  <w:lang w:val="es-ES"/>
+                </w:rPr>
+                <w:t xml:space="preserve">0.86</w:t>
+              </w:r>
+            </w:ins>
           </w:p>
         </w:tc>
       </w:tr>

</xml_diff>

<commit_message>
docs: state GPL-3.0 licence to match LICENSE; prune manuscript drafts
LICENSE has been GPL-3.0 since the initial commit, but the README badge,
README licence section and the application note said MIT. Align them.
The .docx carries the change as a tracked revision.

Keep only base, collaborator revisions (HM, PL) and the current draft:
move the base draft into Revisions/applications_note_base.docx and drop
the superseded merged/tracked-review copies.

Co-Authored-By: Claude Opus 5.5 <noreply@anthropic.com>
</commit_message>
<xml_diff>
--- a/docs/manuscript/applications_note.docx
+++ b/docs/manuscript/applications_note.docx
@@ -232,17 +232,43 @@
           <w:b/>
           <w:bCs/>
         </w:rPr>
-        <w:t>Availability and Implementation.</w:t>
-      </w:r>
-      <w:r>
-        <w:t xml:space="preserve"> MERIDIAN is implemented in R and distributed under the MIT licence, with a Docker/Apptainer image for reproducible deployment. This note describes release </w:t>
+        <w:t xml:space="preserve">Availability and Implementation.</w:t>
+      </w:r>
+      <w:r>
+        <w:t xml:space="preserve"> MERIDIAN is implemented in R and distributed under the </w:t>
+      </w:r>
+      <w:del w:id="100001" w:author="Julio Cesar Ortega Cambara" w:date="2026-10-27T13:51:51Z">
+        <w:r>
+          <w:delText xml:space="preserve">MIT</w:delText>
+        </w:r>
+      </w:del>
+      <w:ins w:id="100002" w:author="Julio Cesar Ortega Cambara" w:date="2026-10-27T13:51:51Z">
+        <w:r>
+          <w:t xml:space="preserve">GNU</w:t>
+        </w:r>
+      </w:ins>
+      <w:r>
+        <w:t xml:space="preserve"> </w:t>
+      </w:r>
+      <w:del w:id="100003" w:author="Julio Cesar Ortega Cambara" w:date="2026-10-27T13:51:51Z">
+        <w:r>
+          <w:delText xml:space="preserve">licence,</w:delText>
+        </w:r>
+      </w:del>
+      <w:ins w:id="100004" w:author="Julio Cesar Ortega Cambara" w:date="2026-10-27T13:51:51Z">
+        <w:r>
+          <w:t xml:space="preserve">General Public Licence v3.0 (GPL-3.0),</w:t>
+        </w:r>
+      </w:ins>
+      <w:r>
+        <w:t xml:space="preserve"> with a Docker/Apptainer image for reproducible deployment. This note describes release </w:t>
       </w:r>
       <w:r>
         <w:rPr>
           <w:b/>
           <w:bCs/>
         </w:rPr>
-        <w:t>v1.0.0</w:t>
+        <w:t xml:space="preserve">v1.0.0</w:t>
       </w:r>
       <w:r>
         <w:t xml:space="preserve"> available at </w:t>
@@ -251,7 +277,7 @@
         <w:rPr>
           <w:rStyle w:val="Hyperlink"/>
         </w:rPr>
-        <w:t>https://github.com/Julio92-C/meridian/releases/tag/v1.0.0</w:t>
+        <w:t xml:space="preserve">https://github.com/Julio92-C/meridian/releases/tag/v1.0.0</w:t>
       </w:r>
       <w:r>
         <w:t xml:space="preserve">. Reproducible execution is supported through the R environment package </w:t>
@@ -260,24 +286,16 @@
         <w:rPr>
           <w:rStyle w:val="VerbatimChar"/>
         </w:rPr>
-        <w:t>renv</w:t>
+        <w:t xml:space="preserve">renv</w:t>
       </w:r>
       <w:r>
         <w:t xml:space="preserve">; after restoring dependencies with </w:t>
       </w:r>
-      <w:proofErr w:type="gramStart"/>
-      <w:r>
-        <w:rPr>
-          <w:rStyle w:val="VerbatimChar"/>
-        </w:rPr>
-        <w:t>renv::</w:t>
-      </w:r>
-      <w:proofErr w:type="gramEnd"/>
-      <w:r>
-        <w:rPr>
-          <w:rStyle w:val="VerbatimChar"/>
-        </w:rPr>
-        <w:t>restore()</w:t>
+      <w:r>
+        <w:rPr>
+          <w:rStyle w:val="VerbatimChar"/>
+        </w:rPr>
+        <w:t xml:space="preserve">renv::restore()</w:t>
       </w:r>
       <w:r>
         <w:t xml:space="preserve">, the pipeline is launched with </w:t>
@@ -286,10 +304,10 @@
         <w:rPr>
           <w:rStyle w:val="VerbatimChar"/>
         </w:rPr>
-        <w:t>Rscript run_pipeline.R config.yaml</w:t>
-      </w:r>
-      <w:r>
-        <w:t>.</w:t>
+        <w:t xml:space="preserve">Rscript run_pipeline.R config.yaml</w:t>
+      </w:r>
+      <w:r>
+        <w:t xml:space="preserve">.</w:t>
       </w:r>
     </w:p>
     <w:p>

</xml_diff>

<commit_message>
docs(manuscript): update application note to MERIDIAN v1.2.0 outputs
All four cohorts rerun on the v1.2.0 tag with their shipped configs.
- Cite release v1.2.0 (Availability, Conclusion, Data Availability).
- Section 3: per-stage table moved to Table S2 with v1.2.0 values;
  feature-count paragraph replaced by B1/B2 interpretation (B1
  reproduces the published diet effect, R2 = 0.19, p = 0.012; B2 no
  diet x week clustering, R2 = 0.12, p = 0.23) and new timings.
- Methods: beta diversity and taxa DA on the community taxa table;
  optional cluster-respecting permutations.
- Validation cohorts: v1.2.0 timings and memory; statistics unchanged.
- Chicken batch 2 listed under PRJNA1406192; validation accessions and
  per-cohort configs added to Data Availability.
- Figure 2 regenerated from the v1.2.0 run logs.
- applications_note.md synced from the .docx.

Co-Authored-By: Claude Opus 5.5 <noreply@anthropic.com>
</commit_message>
<xml_diff>
--- a/docs/manuscript/applications_note.docx
+++ b/docs/manuscript/applications_note.docx
@@ -5,7 +5,6 @@
     <w:p>
       <w:pPr>
         <w:pStyle w:val="Heading1"/>
-        <w:jc w:val="both"/>
       </w:pPr>
       <w:bookmarkStart w:id="0" w:name="X84d9e160d30b1cd211371155645e81ef50bd748"/>
       <w:r>
@@ -15,7 +14,6 @@
     <w:p>
       <w:pPr>
         <w:pStyle w:val="FirstParagraph"/>
-        <w:jc w:val="both"/>
       </w:pPr>
       <w:r>
         <w:rPr>
@@ -28,25 +26,98 @@
     <w:p>
       <w:pPr>
         <w:pStyle w:val="BodyText"/>
-        <w:jc w:val="both"/>
-      </w:pPr>
-      <w:r>
-        <w:t>Julio C. Ortega Cambara1, Piotr Cuber2, Pedro Humberto Lebre1, Hermine V Mkrtchyan1*</w:t>
+        <w:rPr>
+          <w:lang w:val="en-GB"/>
+        </w:rPr>
+      </w:pPr>
+      <w:r>
+        <w:rPr>
+          <w:lang w:val="en-GB"/>
+        </w:rPr>
+        <w:t>Julio C. Ortega Cambara</w:t>
+      </w:r>
+      <w:r>
+        <w:rPr>
+          <w:vertAlign w:val="superscript"/>
+          <w:lang w:val="en-GB"/>
+        </w:rPr>
+        <w:t>1</w:t>
+      </w:r>
+      <w:r>
+        <w:rPr>
+          <w:lang w:val="en-GB"/>
+        </w:rPr>
+        <w:t>, Piotr Cuber</w:t>
+      </w:r>
+      <w:r>
+        <w:rPr>
+          <w:vertAlign w:val="superscript"/>
+          <w:lang w:val="en-GB"/>
+        </w:rPr>
+        <w:t>1</w:t>
+      </w:r>
+      <w:r>
+        <w:rPr>
+          <w:lang w:val="en-GB"/>
+        </w:rPr>
+        <w:t>, Pedro Humberto Lebre</w:t>
+      </w:r>
+      <w:r>
+        <w:rPr>
+          <w:vertAlign w:val="superscript"/>
+          <w:lang w:val="en-GB"/>
+        </w:rPr>
+        <w:t>1</w:t>
+      </w:r>
+      <w:r>
+        <w:rPr>
+          <w:lang w:val="en-GB"/>
+        </w:rPr>
+        <w:t>, Hermine V</w:t>
+      </w:r>
+      <w:r>
+        <w:rPr>
+          <w:lang w:val="en-GB"/>
+        </w:rPr>
+        <w:t>.</w:t>
+      </w:r>
+      <w:r>
+        <w:rPr>
+          <w:lang w:val="en-GB"/>
+        </w:rPr>
+        <w:t xml:space="preserve"> Mkrtchyan</w:t>
+      </w:r>
+      <w:r>
+        <w:rPr>
+          <w:vertAlign w:val="superscript"/>
+          <w:lang w:val="en-GB"/>
+        </w:rPr>
+        <w:t>1</w:t>
+      </w:r>
+      <w:r>
+        <w:rPr>
+          <w:lang w:val="en-GB"/>
+        </w:rPr>
+        <w:t>*</w:t>
       </w:r>
     </w:p>
     <w:p>
       <w:pPr>
         <w:pStyle w:val="BodyText"/>
-        <w:jc w:val="both"/>
-      </w:pPr>
-      <w:r>
-        <w:t>1Centre for Innovation in Genomics and Microbiome Sciences, School of Medicine and Bioscience, University of West London, London, United Kingdom 2Natural History Museum, London, United Kingdom</w:t>
+      </w:pPr>
+      <w:r>
+        <w:rPr>
+          <w:vertAlign w:val="superscript"/>
+        </w:rPr>
+        <w:t>1</w:t>
+      </w:r>
+      <w:r>
+        <w:t xml:space="preserve">Centre for Innovation in Genomics and Microbiome Sciences, School of Medicine and Bioscience, University of West London, London, United Kingdom </w:t>
       </w:r>
     </w:p>
     <w:p>
       <w:pPr>
         <w:pStyle w:val="BodyText"/>
-        <w:jc w:val="both"/>
         <w:rPr>
           <w:lang w:val="es-ES"/>
         </w:rPr>
@@ -134,15 +205,12 @@
         <w:jc w:val="both"/>
       </w:pPr>
       <w:r>
-        <w:t>Hermine V Mkrtchyan — 0000-0001-7339-7297</w:t>
-      </w:r>
-    </w:p>
-    <w:p>
-      <w:pPr>
-        <w:jc w:val="both"/>
-      </w:pPr>
-      <w:r>
-        <w:pict w14:anchorId="1B1D2A2C">
+        <w:t>Hermine V. Mkrtchyan — 0000-0001-7339-7297</w:t>
+      </w:r>
+    </w:p>
+    <w:p>
+      <w:r>
+        <w:pict w14:anchorId="51562267">
           <v:rect id="_x0000_i1025" style="width:0;height:1.5pt" o:hralign="center" o:hrstd="t" o:hr="t"/>
         </w:pict>
       </w:r>
@@ -150,7 +218,6 @@
     <w:p>
       <w:pPr>
         <w:pStyle w:val="Heading2"/>
-        <w:jc w:val="both"/>
       </w:pPr>
       <w:bookmarkStart w:id="1" w:name="abstract"/>
       <w:r>
@@ -170,7 +237,7 @@
         <w:t>Background:</w:t>
       </w:r>
       <w:r>
-        <w:t xml:space="preserve"> Long-read shotgun metagenomics studies are often analysed with project-specific collections of manually edited R scripts, requiring repeated changes to sample identifiers, taxonomic annotations and parameters, or else depend on resource-heavy pipelines needing high-performance computing (HPC) infrastructure. Existing R workflows focus predominantly on short-read amplicon data or isolated tasks such as resistome profiling, leaving a gap in integrated, reproducible solutions for long-read shotgun metagenomics and limiting scalability and cross-study comparison.</w:t>
+        <w:t xml:space="preserve"> Long-read shotgun metagenomics studies are often analysed using project-specific collections of manually edited R scripts, requiring repeated modifications of sample identifiers, taxonomic annotations and analysis parameters, or else rely on resource-heavy pipelines that require access to high-performance computing (HPC) infrastructure. Existing R workflows predominantly focus on short-read amplicon data or isolated analytical tasks, such as resistome profiling, leaving a gap in integrated, reproducible and sustainable solutions for long-read shotgun metagenomics. Consequently, researchers frequently rely on ad hoc scripting approaches that limit scalability, standardisation and reproducibility for efficient cross-study comparison.</w:t>
       </w:r>
     </w:p>
     <w:p>
@@ -206,11 +273,11 @@
         <w:t>Metagenomic Evaluation of Resistance, Identity &amp; Diversity through Integrated Analysis of Nanopore sequencing</w:t>
       </w:r>
       <w:r>
-        <w:t xml:space="preserve">), a modular R workflow that standardises and automates downstream analysis of long-read metagenomic datasets. Consolidating outputs from established tools, it delivers a Quarto HTML dashboard, publication-ready figures and supplementary tables. Supported analyses span decontamination, TPM normalisation, taxonomic profiling, alpha and beta diversity with PERMANOVA, two-level ALDEx2 differential abundance testing, and functional profiling of antimicrobial resistance (AMR), virulence and mobile genetic element repertoires, together with a tripartite sample × taxon × gene network linking taxonomic composition to functional gene distributions. Execution is controlled through a single YAML configuration </w:t>
+        <w:t xml:space="preserve">), a modular R workflow designed to standardise and automate downstream analysis of long-read metagenomic sequencing datasets. By consolidating outputs from multiple bioinformatics tools, MERIDIAN delivers a comprehensive Quarto HTML dashboard, publication-ready figures and supplementary result tables. The workflow supports end-to-end metagenomic characterisation, encompassing decontamination, TPM normalisation, taxonomic profiling, alpha and beta diversity analysis with PERMANOVA, two-level ALDEx2 differential abundance testing, and functional profiling of antimicrobial resistance (AMR), virulence and mobile genetic element repertoires. In addition, MERIDIAN infers a tripartite sample × taxon × gene network, </w:t>
       </w:r>
       <w:r>
         <w:lastRenderedPageBreak/>
-        <w:t xml:space="preserve">file without modifying source code, and each run emits a </w:t>
+        <w:t xml:space="preserve">enabling integrated interrogation of taxonomic composition and functional gene distributions. Workflow execution is controlled through a single YAML configuration file, ensuring reproducible execution without modification of source code. Each analysis automatically generates a </w:t>
       </w:r>
       <w:r>
         <w:rPr>
@@ -219,7 +286,7 @@
         <w:t>manifest.json</w:t>
       </w:r>
       <w:r>
-        <w:t xml:space="preserve"> artefact catalogue supporting reproducibility and downstream integration.</w:t>
+        <w:t xml:space="preserve"> artefact catalogue, thereby supporting reproducibility and downstream computational integration.</w:t>
       </w:r>
     </w:p>
     <w:p>
@@ -232,61 +299,44 @@
           <w:b/>
           <w:bCs/>
         </w:rPr>
-        <w:t xml:space="preserve">Availability and Implementation.</w:t>
-      </w:r>
-      <w:r>
-        <w:t xml:space="preserve"> MERIDIAN is implemented in R and distributed under the </w:t>
-      </w:r>
-      <w:del w:id="100001" w:author="Julio Cesar Ortega Cambara" w:date="2026-10-27T13:51:51Z">
-        <w:r>
-          <w:delText xml:space="preserve">MIT</w:delText>
-        </w:r>
-      </w:del>
-      <w:ins w:id="100002" w:author="Julio Cesar Ortega Cambara" w:date="2026-10-27T13:51:51Z">
-        <w:r>
-          <w:t xml:space="preserve">GNU</w:t>
-        </w:r>
-      </w:ins>
-      <w:r>
-        <w:t xml:space="preserve"> </w:t>
-      </w:r>
-      <w:del w:id="100003" w:author="Julio Cesar Ortega Cambara" w:date="2026-10-27T13:51:51Z">
-        <w:r>
-          <w:delText xml:space="preserve">licence,</w:delText>
-        </w:r>
-      </w:del>
-      <w:ins w:id="100004" w:author="Julio Cesar Ortega Cambara" w:date="2026-10-27T13:51:51Z">
-        <w:r>
-          <w:t xml:space="preserve">General Public Licence v3.0 (GPL-3.0),</w:t>
-        </w:r>
-      </w:ins>
-      <w:r>
-        <w:t xml:space="preserve"> with a Docker/Apptainer image for reproducible deployment. This note describes release </w:t>
+        <w:t>Availability and Implementation.</w:t>
+      </w:r>
+      <w:r>
+        <w:t xml:space="preserve"> MERIDIAN is implemented in R and distributed under the GNU General Public Licence v3.0 (GPL-3.0), with a Docker/Apptainer image for reproducible deployment. Source code and documentation are available at </w:t>
+      </w:r>
+      <w:r>
+        <w:rPr>
+          <w:rStyle w:val="Hyperlink"/>
+        </w:rPr>
+        <w:t>https://github.com/Julio92-C/meridian</w:t>
+      </w:r>
+      <w:r>
+        <w:t xml:space="preserve">. This note describes release </w:t>
       </w:r>
       <w:r>
         <w:rPr>
           <w:b/>
           <w:bCs/>
         </w:rPr>
-        <w:t xml:space="preserve">v1.0.0</w:t>
-      </w:r>
-      <w:r>
-        <w:t xml:space="preserve"> available at </w:t>
+        <w:t xml:space="preserve">v1.2.0</w:t>
+      </w:r>
+      <w:r>
+        <w:t xml:space="preserve"> (</w:t>
       </w:r>
       <w:r>
         <w:rPr>
           <w:rStyle w:val="Hyperlink"/>
         </w:rPr>
-        <w:t xml:space="preserve">https://github.com/Julio92-C/meridian/releases/tag/v1.0.0</w:t>
-      </w:r>
-      <w:r>
-        <w:t xml:space="preserve">. Reproducible execution is supported through the R environment package </w:t>
+        <w:t xml:space="preserve">https://github.com/Julio92-C/meridian/releases/tag/v1.2.0</w:t>
+      </w:r>
+      <w:r>
+        <w:t xml:space="preserve">). Reproducible execution is supported through the R environment package </w:t>
       </w:r>
       <w:r>
         <w:rPr>
           <w:rStyle w:val="VerbatimChar"/>
         </w:rPr>
-        <w:t xml:space="preserve">renv</w:t>
+        <w:t>renv</w:t>
       </w:r>
       <w:r>
         <w:t xml:space="preserve">; after restoring dependencies with </w:t>
@@ -295,7 +345,7 @@
         <w:rPr>
           <w:rStyle w:val="VerbatimChar"/>
         </w:rPr>
-        <w:t xml:space="preserve">renv::restore()</w:t>
+        <w:t>renv::restore()</w:t>
       </w:r>
       <w:r>
         <w:t xml:space="preserve">, the pipeline is launched with </w:t>
@@ -304,10 +354,10 @@
         <w:rPr>
           <w:rStyle w:val="VerbatimChar"/>
         </w:rPr>
-        <w:t xml:space="preserve">Rscript run_pipeline.R config.yaml</w:t>
-      </w:r>
-      <w:r>
-        <w:t xml:space="preserve">.</w:t>
+        <w:t>Rscript run_pipeline.R config.yaml</w:t>
+      </w:r>
+      <w:r>
+        <w:t>.</w:t>
       </w:r>
     </w:p>
     <w:p>
@@ -325,14 +375,12 @@
       <w:r>
         <w:t xml:space="preserve"> </w:t>
       </w:r>
-      <w:hyperlink r:id="rId6">
-        <w:r>
-          <w:rPr>
-            <w:rStyle w:val="Hyperlink"/>
-          </w:rPr>
-          <w:t>Hermine.Mkrtchyan@uwl.ac.uk</w:t>
-        </w:r>
-      </w:hyperlink>
+      <w:r>
+        <w:rPr>
+          <w:rStyle w:val="Hyperlink"/>
+        </w:rPr>
+        <w:t>Hermine.Mkrtchyan@uwl.ac.uk</w:t>
+      </w:r>
     </w:p>
     <w:p>
       <w:pPr>
@@ -347,15 +395,12 @@
         <w:t xml:space="preserve">Keywords: </w:t>
       </w:r>
       <w:r>
-        <w:t>long-read metagenomics, Oxford Nanopore sequencing, antimicrobial resistance, reproducible workflow, differential abundance analysis, microbial community analysis, One Health, R/Bioconductor</w:t>
-      </w:r>
-    </w:p>
-    <w:p>
-      <w:pPr>
-        <w:jc w:val="both"/>
-      </w:pPr>
-      <w:r>
-        <w:pict w14:anchorId="48E78BA9">
+        <w:t>long-read metagenomics, microbial community analysis, antimicrobial resistance, reproducible workflow, One Health continuum</w:t>
+      </w:r>
+    </w:p>
+    <w:p>
+      <w:r>
+        <w:pict w14:anchorId="7072A919">
           <v:rect id="_x0000_i1026" style="width:0;height:1.5pt" o:hralign="center" o:hrstd="t" o:hr="t"/>
         </w:pict>
       </w:r>
@@ -363,7 +408,6 @@
     <w:p>
       <w:pPr>
         <w:pStyle w:val="Heading2"/>
-        <w:jc w:val="both"/>
       </w:pPr>
       <w:bookmarkStart w:id="2" w:name="Xe3d0fc0bea9a42ce7605565d0964033d7f6ee47"/>
       <w:bookmarkEnd w:id="1"/>
@@ -377,7 +421,25 @@
         <w:jc w:val="both"/>
       </w:pPr>
       <w:r>
-        <w:t>Long-read shotgun metagenomics, enabled by Oxford Nanopore and PacBio sequencing technologies, is central to One Health surveillance, where the emergence and dissemination of biological threats occur at the interface of human, animal and environmental systems [1]. Unlike targeted approaches, shotgun metagenomics enables simultaneous characterisation of microbial community composition and functional genetic content, thereby linking taxonomic identity to antimicrobial resistance genes (ARGs), virulence factors (VFs) and mobile genetic elements (MGEs) within a single experiment. This capability is particularly valuable for tracking the ecology and transmission of high-risk microorganisms and their associated genetic determinants across clinical, agricultural and environmental reservoirs. The downstream analysis supporting long-read metagenomics is now well established. Widely adopted tools include Kraken2 [2] and Bracken [3] for taxonomic classification and abundance estimation, ABRicate [4] for screening ARGs, VFs and MGEs against databases such as CARD [5], VFDB [6] and PlasmidFinder [7], Re-centrifuge [8] for contamination assessment, and R packages including vegan [9] and ALDEx2 [10] for ecological and differential abundance analyses. However, while these tools are individually well established, their integration into reproducible and reusable workflows remains limited.</w:t>
+        <w:t xml:space="preserve">Long-read shotgun metagenomics, enabled by Oxford Nanopore and PacBio sequencing technologies, is central to One Health surveillance, where </w:t>
+      </w:r>
+      <w:r>
+        <w:t>biological threats emerge and spread at the interface of human, animal,</w:t>
+      </w:r>
+      <w:r>
+        <w:t xml:space="preserve"> and environmental systems [1]. Unlike targeted approaches, shotgun metagenomics enables simultaneous characterisation of microbial community composition and functional genetic content, </w:t>
+      </w:r>
+      <w:r>
+        <w:t>linking taxonomic identity to antimicrobial resistance genes (ARGs), virulence factors (VFs), and mobile genetic elements (MGEs) in</w:t>
+      </w:r>
+      <w:r>
+        <w:t xml:space="preserve"> a single experiment. This capability is particularly valuable for tracking the ecology and transmission of high-risk microorganisms and their associated genetic determinants across clinical, agricultural and environmental reservoirs. </w:t>
+      </w:r>
+      <w:r>
+        <w:t>Downstream analyses supporting long-read metagenomics are</w:t>
+      </w:r>
+      <w:r>
+        <w:t xml:space="preserve"> now well established. Widely adopted tools include Kraken2 [2] and Bracken [3] for taxonomic classification and abundance estimation, ABRicate [4] for screening ARGs, VFs and MGEs against databases such as CARD [5], VFDB [6] and PlasmidFinder [7], Re-centrifuge [8] for contamination assessment, and R packages including vegan [9] and ALDEx2 [10] for ecological and differential abundance analyses. However, while these tools are individually well established, their integration into reproducible and reusable workflows remains limited.</w:t>
       </w:r>
     </w:p>
     <w:p>
@@ -386,7 +448,17 @@
         <w:jc w:val="both"/>
       </w:pPr>
       <w:r>
-        <w:t>In practice, downstream analyses continue to rely on a set of bespoke R scripts that have evolved incrementally over successive projects. These scripts frequently contain hard-coded input paths, sample-identifier filters embedded as literal strings, per-study negative-control renames, and taxonomy fixes patched by row index. As a result, individual script copies diverge over time, reducing reproducibility and limiting portability, and the absence of a shared interface prevents automated output logging. Comparing different studies requires manual reconciliation of both code and data. The reference cohort for the present work (</w:t>
+        <w:t xml:space="preserve">In practice, downstream analyses </w:t>
+      </w:r>
+      <w:r>
+        <w:t>still rely on bespoke R scripts that have evolved incrementally across</w:t>
+      </w:r>
+      <w:r>
+        <w:t xml:space="preserve"> projects. These scripts frequently contain hard-coded input paths, sample-identifier filters embedded as literal strings, per-study negative-control renames, and taxonomy fixes patched by row index. As a result, individual script copies diverge over time, reducing reproducibility and limiting portability, and the absence of a shared interface prevents automated output logging. Comparing different studies requires manual </w:t>
+      </w:r>
+      <w:r>
+        <w:lastRenderedPageBreak/>
+        <w:t>reconciliation of both code and data. The reference cohort for the present work (</w:t>
       </w:r>
       <w:r>
         <w:rPr>
@@ -395,11 +467,31 @@
         <w:t>Chicken Batch 1</w:t>
       </w:r>
       <w:r>
-        <w:t>; ~46 hand-edited scripts) exemplifies this pattern. The L-</w:t>
-      </w:r>
-      <w:r>
-        <w:lastRenderedPageBreak/>
-        <w:t>ARRAP pipeline [11] provides a framework for long-read resistome risk assessment, while the rANOMALY workflow [12] demonstrates the advantages of a configuration-driven R workflow with auto-generated reports for amplicon data. To our knowledge, no integrated end-to-end R workflow covers long-read shotgun metagenomic data spanning taxonomic composition, microbial diversity, differential abundance, and comprehensive resistome–virulome–mobilome profiling in a single configurable run.</w:t>
+        <w:t>; ~46 hand-edited scripts) exemplifies this pattern</w:t>
+      </w:r>
+      <w:r>
+        <w:t xml:space="preserve"> [</w:t>
+      </w:r>
+      <w:r>
+        <w:t>11</w:t>
+      </w:r>
+      <w:r>
+        <w:t>]</w:t>
+      </w:r>
+      <w:r>
+        <w:t>. The L-ARRAP pipeline [1</w:t>
+      </w:r>
+      <w:r>
+        <w:t>2</w:t>
+      </w:r>
+      <w:r>
+        <w:t>] provides a framework for long-read resistome risk assessment, while the rANOMALY workflow [1</w:t>
+      </w:r>
+      <w:r>
+        <w:t>3</w:t>
+      </w:r>
+      <w:r>
+        <w:t>] demonstrates the advantages of a configuration-driven R workflow with auto-generated reports for amplicon data. To our knowledge, no integrated end-to-end R workflow covers long-read shotgun metagenomic data spanning taxonomic composition, microbial diversity, differential abundance, and comprehensive resistome–virulome–mobilome profiling in a single configurable run.</w:t>
       </w:r>
     </w:p>
     <w:p>
@@ -408,15 +500,30 @@
         <w:jc w:val="both"/>
       </w:pPr>
       <w:r>
-        <w:t>To address this gap, we have developed an alpha-stage R workflow. Here, we describe the workflow's design, current scope, and the real-data validation strategy enabling the assessment of its performance.</w:t>
+        <w:t xml:space="preserve">To address this gap, we have developed </w:t>
+      </w:r>
+      <w:commentRangeStart w:id="3"/>
+      <w:r>
+        <w:t>MERIDIAN, a configuration-driven</w:t>
+      </w:r>
+      <w:commentRangeEnd w:id="3"/>
+      <w:r>
+        <w:rPr>
+          <w:rStyle w:val="CommentReference"/>
+          <w:sz w:val="24"/>
+          <w:szCs w:val="24"/>
+        </w:rPr>
+        <w:commentReference w:id="3"/>
+      </w:r>
+      <w:r>
+        <w:t xml:space="preserve"> R workflow. Here, we describe the workflow's design, current scope, and the real-data validation strategy enabling the assessment of its performance.</w:t>
       </w:r>
     </w:p>
     <w:p>
       <w:pPr>
         <w:pStyle w:val="Heading2"/>
-        <w:jc w:val="both"/>
-      </w:pPr>
-      <w:bookmarkStart w:id="3" w:name="Xfab522e0c411179c01dd3c9a2a01395ade9eb38"/>
+      </w:pPr>
+      <w:bookmarkStart w:id="4" w:name="Xfab522e0c411179c01dd3c9a2a01395ade9eb38"/>
       <w:bookmarkEnd w:id="2"/>
       <w:r>
         <w:t>2 Implementation</w:t>
@@ -455,15 +562,7 @@
         <w:t>R/13_panels.R</w:t>
       </w:r>
       <w:r>
-        <w:t xml:space="preserve">; </w:t>
-      </w:r>
-      <w:proofErr w:type="gramStart"/>
-      <w:r>
-        <w:t>plus</w:t>
-      </w:r>
-      <w:proofErr w:type="gramEnd"/>
-      <w:r>
-        <w:t xml:space="preserve"> the manifest stage </w:t>
+        <w:t xml:space="preserve">; plus the manifest stage </w:t>
       </w:r>
       <w:r>
         <w:rPr>
@@ -510,13 +609,89 @@
       </w:pPr>
       <w:r>
         <w:rPr>
+          <w:b/>
+          <w:bCs/>
+        </w:rPr>
+        <w:t>Configuration-driven.</w:t>
+      </w:r>
+      <w:r>
+        <w:t xml:space="preserve"> All study-specific parameters — metadata file locations, sample grouping variables, negative-control identifiers, abundance filtering thresholds, and sample selection criteria — are defined in </w:t>
+      </w:r>
+      <w:r>
+        <w:rPr>
+          <w:rStyle w:val="VerbatimChar"/>
+        </w:rPr>
+        <w:t>config.yaml</w:t>
+      </w:r>
+      <w:r>
+        <w:t xml:space="preserve">. Consequently, module code remains invariant across projects, with dataset-specific customisation implemented exclusively through </w:t>
+      </w:r>
+      <w:r>
+        <w:rPr>
+          <w:rStyle w:val="VerbatimChar"/>
+        </w:rPr>
+        <w:t>config.yaml</w:t>
+      </w:r>
+      <w:r>
+        <w:t xml:space="preserve"> settings. R/00 (setup) and R/01 (input loading) are executed by default, whereas all downstream modules can be selectively enabled or disabled via </w:t>
+      </w:r>
+      <w:r>
+        <w:rPr>
+          <w:rStyle w:val="VerbatimChar"/>
+        </w:rPr>
+        <w:t>cfg$stages$*</w:t>
+      </w:r>
+      <w:r>
+        <w:t xml:space="preserve"> flags; for example, users can re-run only the resistome modules after revising thresholds. TPM normalisation (R/03) and all gene-element stages (R/09–R/11) are contingent upon ABRicate outputs and are automatically omitted when such inputs are absent. Study-specific corrections to NCBI taxonomy assignments, where required, are encoded in a structured </w:t>
+      </w:r>
+      <w:r>
+        <w:rPr>
+          <w:rStyle w:val="VerbatimChar"/>
+        </w:rPr>
+        <w:t>taxid_fixes.csv</w:t>
+      </w:r>
+      <w:r>
+        <w:t xml:space="preserve"> table rather than implemented as row-index edits. Multiple-testing correction is controlled through the </w:t>
+      </w:r>
+      <w:r>
+        <w:rPr>
+          <w:rStyle w:val="VerbatimChar"/>
+        </w:rPr>
+        <w:t>cfg$stats$padjust_method</w:t>
+      </w:r>
+      <w:r>
+        <w:t xml:space="preserve"> parameter, ensuring consistent application of the selected adjustment throughout the pipeline. The Benjamini-Hochberg false discovery rate is used by default, although alternative correction methods are supported and documented in </w:t>
+      </w:r>
+      <w:r>
+        <w:rPr>
+          <w:rStyle w:val="VerbatimChar"/>
+        </w:rPr>
+        <w:t>docs/STATISTICS.md</w:t>
+      </w:r>
+      <w:r>
+        <w:t>.</w:t>
+      </w:r>
+    </w:p>
+    <w:p>
+      <w:pPr>
+        <w:pStyle w:val="BodyText"/>
+      </w:pPr>
+    </w:p>
+    <w:p>
+      <w:pPr>
+        <w:pStyle w:val="BodyText"/>
+        <w:keepNext/>
+        <w:jc w:val="center"/>
+      </w:pPr>
+      <w:r>
+        <w:rPr>
           <w:noProof/>
         </w:rPr>
         <w:lastRenderedPageBreak/>
         <w:drawing>
-          <wp:inline distT="0" distB="0" distL="0" distR="0" wp14:anchorId="75E5BCA4" wp14:editId="0982CF26">
-            <wp:extent cx="5302908" cy="5620960"/>
-            <wp:effectExtent l="0" t="0" r="0" b="0"/>
+          <wp:inline distT="0" distB="0" distL="0" distR="0" wp14:anchorId="79CE228F" wp14:editId="2EDF15F9">
+            <wp:extent cx="5860472" cy="6553200"/>
+            <wp:effectExtent l="0" t="0" r="6985" b="0"/>
             <wp:docPr id="15" name="Picture" descr="Figure 1. MERIDIAN workflow. A single config.yaml drives fifteen R modules (R/00–R/14) that load Kraken2/Bracken, ABRicate, Re-centrifuge and sample metadata. After setup and decontamination (R/00–R/02), community analyses (R/04–R/08) and functional profiling against CARD, VFDB and PlasmidFinder (TPM in R/03, per-domain analyses in R/09–R/11) converge in a tripartite sample × taxon × gene network (R/12). R/12 fans out to a Quarto dashboard and a publication-panels stage (R/13); R/14 finally writes manifest.json (contract v1.2), a kind-tagged catalogue of every artefact. Source: generate_figure1.py."/>
             <wp:cNvGraphicFramePr/>
             <a:graphic xmlns:a="http://schemas.openxmlformats.org/drawingml/2006/main">
@@ -529,7 +704,7 @@
                     </pic:cNvPicPr>
                   </pic:nvPicPr>
                   <pic:blipFill>
-                    <a:blip r:embed="rId7"/>
+                    <a:blip r:embed="rId10"/>
                     <a:stretch>
                       <a:fillRect/>
                     </a:stretch>
@@ -537,7 +712,7 @@
                   <pic:spPr bwMode="auto">
                     <a:xfrm>
                       <a:off x="0" y="0"/>
-                      <a:ext cx="5302908" cy="5620960"/>
+                      <a:ext cx="5875055" cy="6569507"/>
                     </a:xfrm>
                     <a:prstGeom prst="rect">
                       <a:avLst/>
@@ -558,6 +733,99 @@
     </w:p>
     <w:p>
       <w:pPr>
+        <w:pStyle w:val="Caption"/>
+        <w:jc w:val="both"/>
+        <w:rPr>
+          <w:i w:val="0"/>
+          <w:iCs/>
+        </w:rPr>
+      </w:pPr>
+      <w:r>
+        <w:rPr>
+          <w:b/>
+          <w:bCs/>
+          <w:i w:val="0"/>
+          <w:iCs/>
+        </w:rPr>
+        <w:t xml:space="preserve">Figure </w:t>
+      </w:r>
+      <w:r>
+        <w:rPr>
+          <w:b/>
+          <w:bCs/>
+          <w:i w:val="0"/>
+          <w:iCs/>
+        </w:rPr>
+        <w:fldChar w:fldCharType="begin"/>
+      </w:r>
+      <w:r>
+        <w:rPr>
+          <w:b/>
+          <w:bCs/>
+          <w:i w:val="0"/>
+          <w:iCs/>
+        </w:rPr>
+        <w:instrText xml:space="preserve"> SEQ Figure \* ARABIC </w:instrText>
+      </w:r>
+      <w:r>
+        <w:rPr>
+          <w:b/>
+          <w:bCs/>
+          <w:i w:val="0"/>
+          <w:iCs/>
+        </w:rPr>
+        <w:fldChar w:fldCharType="separate"/>
+      </w:r>
+      <w:r>
+        <w:rPr>
+          <w:b/>
+          <w:bCs/>
+          <w:i w:val="0"/>
+          <w:iCs/>
+          <w:noProof/>
+        </w:rPr>
+        <w:t>1</w:t>
+      </w:r>
+      <w:r>
+        <w:rPr>
+          <w:b/>
+          <w:bCs/>
+          <w:i w:val="0"/>
+          <w:iCs/>
+        </w:rPr>
+        <w:fldChar w:fldCharType="end"/>
+      </w:r>
+      <w:r>
+        <w:rPr>
+          <w:i w:val="0"/>
+          <w:iCs/>
+        </w:rPr>
+        <w:t xml:space="preserve">. </w:t>
+      </w:r>
+      <w:r>
+        <w:rPr>
+          <w:i w:val="0"/>
+          <w:iCs/>
+        </w:rPr>
+        <w:t>MERIDIAN workflow. A single config.yaml drives fifteen R modules (R/00–R/14) that load</w:t>
+      </w:r>
+      <w:r>
+        <w:rPr>
+          <w:i w:val="0"/>
+          <w:iCs/>
+        </w:rPr>
+        <w:t xml:space="preserve"> upstream</w:t>
+      </w:r>
+      <w:r>
+        <w:rPr>
+          <w:i w:val="0"/>
+          <w:iCs/>
+        </w:rPr>
+        <w:t xml:space="preserve"> Kraken2/Bracken, ABRicate, Re-centrifuge and sample metadata. After setup and decontamination (R/00–R/02), community analyses (R/04–R/08) and functional profiling against CARD, VFDB and PlasmidFinder (TPM in R/03, per-domain analyses in R/09–R/11) converge in a tripartite sample × taxon × gene network (R/12). R/12 fans out to a Quarto dashboard and a publication-panels stage (R/13); R/14 finally writes manifest.json (contract v1.2), a kind-tagged catalogue of every artefact.</w:t>
+      </w:r>
+    </w:p>
+    <w:p>
+      <w:pPr>
         <w:pStyle w:val="BodyText"/>
         <w:jc w:val="both"/>
       </w:pPr>
@@ -566,68 +834,11 @@
           <w:b/>
           <w:bCs/>
         </w:rPr>
-        <w:t>Configuration-driven.</w:t>
-      </w:r>
-      <w:r>
-        <w:t xml:space="preserve"> All study-specific parameters — metadata file locations, sample grouping variables, negative-control identifiers, abundance filtering thresholds, and sample selection criteria — are defined in </w:t>
-      </w:r>
-      <w:r>
-        <w:rPr>
-          <w:rStyle w:val="VerbatimChar"/>
-        </w:rPr>
-        <w:t>config.yaml</w:t>
-      </w:r>
-      <w:r>
-        <w:t xml:space="preserve">. Consequently, module code remains invariant across projects, with dataset-specific customisation implemented exclusively through </w:t>
-      </w:r>
-      <w:r>
-        <w:rPr>
-          <w:rStyle w:val="VerbatimChar"/>
-        </w:rPr>
-        <w:t>config.yaml</w:t>
-      </w:r>
-      <w:r>
-        <w:t xml:space="preserve"> settings or the structured fix tables it references. R/00 (setup) and R/01 (input loading) are executed by default, whereas all downstream modules can be selectively enabled or disabled via </w:t>
-      </w:r>
-      <w:r>
-        <w:rPr>
-          <w:rStyle w:val="VerbatimChar"/>
-        </w:rPr>
-        <w:t>cfg$stages$*</w:t>
-      </w:r>
-      <w:r>
-        <w:t xml:space="preserve"> flags; for example, users can re-run only the resistome modules after revising thresholds. TPM normalisation (R/03) and all gene-element stages (R/09–R/11) are contingent upon ABRicate outputs and are automatically omitted when such inputs are absent. Study-specific corrections to NCBI taxonomy assignments, where required, are encoded in a structured </w:t>
-      </w:r>
-      <w:r>
-        <w:rPr>
-          <w:rStyle w:val="VerbatimChar"/>
-        </w:rPr>
-        <w:t>taxid_fixes.csv</w:t>
-      </w:r>
-      <w:r>
-        <w:t xml:space="preserve"> table rather than implemented as row-index edits. Multiple-testing correction is controlled through the </w:t>
-      </w:r>
-      <w:r>
-        <w:rPr>
-          <w:rStyle w:val="VerbatimChar"/>
-        </w:rPr>
-        <w:t>cfg$stats$padjust_method</w:t>
-      </w:r>
-      <w:r>
-        <w:t xml:space="preserve"> parameter, ensuring consistent application of the </w:t>
-      </w:r>
-      <w:r>
         <w:lastRenderedPageBreak/>
-        <w:t xml:space="preserve">selected adjustment throughout the pipeline. The Benjamini-Hochberg false discovery rate is used by default, although alternative correction methods are supported and documented in </w:t>
-      </w:r>
-      <w:r>
-        <w:rPr>
-          <w:rStyle w:val="VerbatimChar"/>
-        </w:rPr>
-        <w:t>docs/STATISTICS.md</w:t>
-      </w:r>
-      <w:r>
-        <w:t>.</w:t>
+        <w:t>Stages.</w:t>
+      </w:r>
+      <w:r>
+        <w:t xml:space="preserve"> The pipeline is organised into five conceptual stages.</w:t>
       </w:r>
     </w:p>
     <w:p>
@@ -636,14 +847,351 @@
         <w:jc w:val="both"/>
       </w:pPr>
       <w:r>
+        <w:t xml:space="preserve">(1) </w:t>
+      </w:r>
+      <w:r>
+        <w:rPr>
+          <w:i/>
+          <w:iCs/>
+        </w:rPr>
+        <w:t>Data input and decontamination</w:t>
+      </w:r>
+      <w:r>
+        <w:t xml:space="preserve"> (R/00–R/02). The pipeline imports upstream outputs — Kraken2/Bracken, ABRicate, Re-centrifuge contamination tags and study metadata tables — accommodating per-project input shapes rather than assuming a fixed column layout, applies optional negative-control subtraction, merges Bracken counts with the metadata covariates declared in </w:t>
+      </w:r>
+      <w:r>
+        <w:rPr>
+          <w:rStyle w:val="VerbatimChar"/>
+        </w:rPr>
+        <w:t>cfg$metadata$fixed_effects</w:t>
+      </w:r>
+      <w:r>
+        <w:t xml:space="preserve"> / </w:t>
+      </w:r>
+      <w:r>
+        <w:rPr>
+          <w:rStyle w:val="VerbatimChar"/>
+        </w:rPr>
+        <w:t>random_effect</w:t>
+      </w:r>
+      <w:r>
+        <w:t xml:space="preserve">, and links ABRicate calls to taxonomic assignments. Per-study taxonomy patches are applied from </w:t>
+      </w:r>
+      <w:r>
+        <w:rPr>
+          <w:rStyle w:val="VerbatimChar"/>
+        </w:rPr>
+        <w:t>taxid_fixes.csv</w:t>
+      </w:r>
+      <w:r>
+        <w:t xml:space="preserve"> when supplied.</w:t>
+      </w:r>
+    </w:p>
+    <w:p>
+      <w:pPr>
+        <w:pStyle w:val="BodyText"/>
+        <w:jc w:val="both"/>
+      </w:pPr>
+      <w:r>
+        <w:t xml:space="preserve">(2) </w:t>
+      </w:r>
+      <w:r>
+        <w:rPr>
+          <w:i/>
+          <w:iCs/>
+        </w:rPr>
+        <w:t>Gene-element normalisation</w:t>
+      </w:r>
+      <w:r>
+        <w:t xml:space="preserve"> (R/03) computes per-(sample, GENE) TPM based on ABRicate hit counts and annotated gene lengths.</w:t>
+      </w:r>
+    </w:p>
+    <w:p>
+      <w:pPr>
+        <w:pStyle w:val="BodyText"/>
+        <w:jc w:val="both"/>
+      </w:pPr>
+      <w:r>
+        <w:t xml:space="preserve">(3) </w:t>
+      </w:r>
+      <w:r>
+        <w:rPr>
+          <w:i/>
+          <w:iCs/>
+        </w:rPr>
+        <w:t>Community analyses</w:t>
+      </w:r>
+      <w:r>
+        <w:t xml:space="preserve"> (R/04–R/08) cover the standard taxonomic toolkit. Following standardisation and cleaning of shared taxon names, R/04–R/05 generate Venn diagrams, annotated heatmaps, and top-N stacked-bar relative-abundance plots (static PNG and interactive plotly HTML) with paired total-count and sample-prevalence panels. Alpha diversity (R/06) reports Shannon, Simpson, richness, Pielou, and Fisher metrics with Kruskal-Wallis tests and violin/bar plots, preferring a pre-computed indices CSV (e.g., Oxford Nanopore wf-metagenomics output) and falling back to the vegan R package. Beta diversity (R/07) assesses between-sample community differences on the decontaminated community taxa table using PCoA on Hellinger-transformed Bray-Curtis distances with PERMANOVA (</w:t>
+      </w:r>
+      <w:r>
+        <w:rPr>
+          <w:rStyle w:val="VerbatimChar"/>
+        </w:rPr>
+        <w:t>adonis2</w:t>
+      </w:r>
+      <w:r>
+        <w:t>, 9999 permutations) and PERMDISP (</w:t>
+      </w:r>
+      <w:r>
+        <w:rPr>
+          <w:rStyle w:val="VerbatimChar"/>
+        </w:rPr>
+        <w:t>betadisper</w:t>
+      </w:r>
+      <w:r>
+        <w:t xml:space="preserve">) overlaid on the ordination. When a random effect is declared (e.g. pen or patient), Kruskal-Wallis, PERMANOVA and PERMDISP p-values can instead be obtained by cluster-respecting permutation. Differential abundance analysis (R/08) is performed at both the taxonomic and functional level using ALDEx2: taxonomic analysis uses the decontaminated community taxa table, whereas gene-level analysis uses ABRicate contig hits per (sample, GENE). The workflow combines an omnibus Kruskal-Wallis test with pairwise Welch's t-tests, with an optional </w:t>
+      </w:r>
+      <w:r>
+        <w:rPr>
+          <w:rStyle w:val="VerbatimChar"/>
+        </w:rPr>
+        <w:t>aldex.glm</w:t>
+      </w:r>
+      <w:r>
+        <w:t xml:space="preserve"> design path for covariate-adjusted models. This compositional approach is deliberate: ALDEx2 models counts through a centred log-ratio (CLR) transformation, which accounts for the compositional nature of sequencing data and avoids the spurious correlations that arise when raw or total counts are compared directly [10]; gene-level features are additionally length-normalised as TPM (R/03) so that genes of differing length remain comparable.</w:t>
+      </w:r>
+    </w:p>
+    <w:p>
+      <w:pPr>
+        <w:pStyle w:val="BodyText"/>
+        <w:jc w:val="both"/>
+      </w:pPr>
+      <w:r>
+        <w:t xml:space="preserve">(4) </w:t>
+      </w:r>
+      <w:r>
+        <w:rPr>
+          <w:i/>
+          <w:iCs/>
+        </w:rPr>
+        <w:t>Functional profiling</w:t>
+      </w:r>
+      <w:r>
+        <w:t xml:space="preserve"> (R/09–R/11) runs a shared analysis engine three times against domain-specific databases: (i) resistome profiling using ABRicate/CARD annotations</w:t>
+      </w:r>
+      <w:r>
+        <w:t xml:space="preserve"> [5]</w:t>
+      </w:r>
+      <w:r>
+        <w:t>, including drug-class classification; (ii) virulome profiling using VFDB</w:t>
+      </w:r>
+      <w:r>
+        <w:t xml:space="preserve"> [6]</w:t>
+      </w:r>
+      <w:r>
+        <w:t xml:space="preserve">, with functional categories extracted from the ABRicate </w:t>
+      </w:r>
+      <w:r>
+        <w:rPr>
+          <w:rStyle w:val="VerbatimChar"/>
+        </w:rPr>
+        <w:t>PRODUCT</w:t>
+      </w:r>
+      <w:r>
+        <w:t xml:space="preserve"> field; (iii) mobilome profiling using PlasmidFinder</w:t>
+      </w:r>
+      <w:r>
+        <w:t xml:space="preserve"> [7]</w:t>
+      </w:r>
+      <w:r>
+        <w:t>, incorporating configurable replicon-family classification (Col-like, IncF, IncX, other Inc). For each domain, the pipeline generates alpha diversity metrics, Venn diagrams, gene- and category-level heatmaps, relative-abundance and total-count panels, and a PCoA + PERMANOVA + PERMDISP suite.</w:t>
+      </w:r>
+    </w:p>
+    <w:p>
+      <w:pPr>
+        <w:pStyle w:val="BodyText"/>
+        <w:jc w:val="both"/>
+      </w:pPr>
+      <w:r>
+        <w:lastRenderedPageBreak/>
+        <w:t xml:space="preserve">(5) </w:t>
+      </w:r>
+      <w:r>
+        <w:rPr>
+          <w:i/>
+          <w:iCs/>
+        </w:rPr>
+        <w:t>Integration, reporting and manifest</w:t>
+      </w:r>
+      <w:r>
+        <w:t xml:space="preserve"> (R/12–R/14). The final stage integrates results across all domains and produces the reporting outputs. R/12 reports igraph topology metrics (degree, betweenness, Louvain modularity) alongside its network</w:t>
+      </w:r>
+      <w:r>
+        <w:t xml:space="preserve"> [14]</w:t>
+      </w:r>
+      <w:r>
+        <w:t xml:space="preserve">, chord and Sankey outputs, and exports Gephi-compatible node/edge tables. R/13 assembles main and supplementary composite figures (PNG and TIFF independently toggleable) driven by a slot-YAML layout, plus </w:t>
+      </w:r>
+      <w:r>
+        <w:rPr>
+          <w:rStyle w:val="VerbatimChar"/>
+        </w:rPr>
+        <w:t>supplementary_tables.xlsx</w:t>
+      </w:r>
+      <w:r>
+        <w:t xml:space="preserve">. R/14 writes </w:t>
+      </w:r>
+      <w:r>
+        <w:rPr>
+          <w:rStyle w:val="VerbatimChar"/>
+        </w:rPr>
+        <w:t>manifest.json</w:t>
+      </w:r>
+      <w:r>
+        <w:t xml:space="preserve"> (contract v1.2), a kind-tagged catalogue of every figure, table and intermediate artefact the pipeline produced, providing a stable contract for downstream integration.</w:t>
+      </w:r>
+    </w:p>
+    <w:p>
+      <w:pPr>
+        <w:pStyle w:val="BodyText"/>
+        <w:jc w:val="both"/>
+      </w:pPr>
+      <w:r>
         <w:rPr>
           <w:b/>
           <w:bCs/>
         </w:rPr>
-        <w:t>Stages.</w:t>
-      </w:r>
-      <w:r>
-        <w:t xml:space="preserve"> The pipeline is organised into five conceptual stages.</w:t>
+        <w:t>Reporting.</w:t>
+      </w:r>
+      <w:r>
+        <w:t xml:space="preserve"> Results are rendered through a Quarto template as a multi-page HTML dashboard</w:t>
+      </w:r>
+      <w:r>
+        <w:t xml:space="preserve"> [15],</w:t>
+      </w:r>
+      <w:r>
+        <w:t xml:space="preserve"> containing dedicated panels for taxonomy, diversity, differential abundance, resistome, virulome, mobilome and network, plus embedded download links. Dependencies are pinned via </w:t>
+      </w:r>
+      <w:r>
+        <w:rPr>
+          <w:rStyle w:val="VerbatimChar"/>
+        </w:rPr>
+        <w:t>renv</w:t>
+      </w:r>
+      <w:r>
+        <w:t>, and the project requires R</w:t>
+      </w:r>
+      <w:r>
+        <w:t xml:space="preserve"> version 4.5 or higher</w:t>
+      </w:r>
+      <w:r>
+        <w:t xml:space="preserve"> [1</w:t>
+      </w:r>
+      <w:r>
+        <w:t>6</w:t>
+      </w:r>
+      <w:r>
+        <w:t>]</w:t>
+      </w:r>
+      <w:r>
+        <w:t>; external command-line tools (Kraken2, Bracken, ABRicate, Re-centrifuge) are assumed to have been run upstream. Because MERIDIAN consumes these pre-computed outputs rather than the raw reads, its own footprint is modest and single-threaded (peaking at 1.6–3.5 GB across the four cohorts; Section 3), and is therefore decoupled from the substantial memory required by upstream taxonomic classification (for example, a full Kraken2 database), which can be run separately on high-memory or cloud infrastructure.</w:t>
+      </w:r>
+    </w:p>
+    <w:p>
+      <w:pPr>
+        <w:pStyle w:val="Heading2"/>
+      </w:pPr>
+      <w:bookmarkStart w:id="5" w:name="Xe535e7deb3457bf6891dfc100ac742aa591bc31"/>
+      <w:bookmarkEnd w:id="4"/>
+      <w:r>
+        <w:t>3 Application and Validation</w:t>
+      </w:r>
+    </w:p>
+    <w:p>
+      <w:pPr>
+        <w:pStyle w:val="FirstParagraph"/>
+        <w:jc w:val="both"/>
+      </w:pPr>
+      <w:r>
+        <w:t>We validated the pipeline against two long-read chicken caecum metagenomic studies. The primary dataset (</w:t>
+      </w:r>
+      <w:r>
+        <w:rPr>
+          <w:rStyle w:val="VerbatimChar"/>
+        </w:rPr>
+        <w:t>Chicken batch 1</w:t>
+      </w:r>
+      <w:r>
+        <w:t>, PC_JC_2024-11-29; 18 samples; 3 dietary groups — Dulse, Reference diet, Soyabean meal) is publicly available under NCBI BioProject PRJNA1406192 and has approximately 46 hand-edited R scripts with corresponding validated figures and tables</w:t>
+      </w:r>
+      <w:r>
+        <w:t xml:space="preserve"> [11]</w:t>
+      </w:r>
+      <w:r>
+        <w:t>, so each stage can be compared output-for-output against the corresponding ground-truth artefact. The second dataset (</w:t>
+      </w:r>
+      <w:r>
+        <w:rPr>
+          <w:rStyle w:val="VerbatimChar"/>
+        </w:rPr>
+        <w:t>Chicken batch 2</w:t>
+      </w:r>
+      <w:r>
+        <w:t xml:space="preserve">, JC_FL_2025-05-20; 32 samples; also deposited under PRJNA1406192) was used for scalability and feature coverage: samples were organised into a 4-level composite </w:t>
+      </w:r>
+      <w:r>
+        <w:rPr>
+          <w:rStyle w:val="VerbatimChar"/>
+        </w:rPr>
+        <w:t>Treatment_Bird</w:t>
+      </w:r>
+      <w:r>
+        <w:t xml:space="preserve"> grouping (Control_W4, Control_W5, Dulse_W4, Dulse_W5) with a random effect (</w:t>
+      </w:r>
+      <w:r>
+        <w:rPr>
+          <w:rStyle w:val="VerbatimChar"/>
+        </w:rPr>
+        <w:t>block</w:t>
+      </w:r>
+      <w:r>
+        <w:t>, pens 1–8), two declared negative controls (CTRL1, CTRL2), and a larger per-stage feature load. Two purpose-built validation scripts (</w:t>
+      </w:r>
+      <w:r>
+        <w:rPr>
+          <w:rStyle w:val="VerbatimChar"/>
+        </w:rPr>
+        <w:t>scripts/diff_normdata.R</w:t>
+      </w:r>
+      <w:r>
+        <w:t xml:space="preserve"> and </w:t>
+      </w:r>
+      <w:r>
+        <w:rPr>
+          <w:rStyle w:val="VerbatimChar"/>
+        </w:rPr>
+        <w:t>scripts/probe_taxid_parse.R</w:t>
+      </w:r>
+      <w:r>
+        <w:t xml:space="preserve">) provide numerical-diff and regression checks on the most error-prone intermediates, and </w:t>
+      </w:r>
+      <w:r>
+        <w:rPr>
+          <w:rStyle w:val="VerbatimChar"/>
+        </w:rPr>
+        <w:t>run_pipeline.R</w:t>
+      </w:r>
+      <w:r>
+        <w:t xml:space="preserve"> auto-instruments per-stage wall time and peak R-process memory (via a </w:t>
+      </w:r>
+      <w:r>
+        <w:rPr>
+          <w:rStyle w:val="VerbatimChar"/>
+        </w:rPr>
+        <w:t>gc()</w:t>
+      </w:r>
+      <w:r>
+        <w:t xml:space="preserve">-bracketed wrapper equivalent to the </w:t>
+      </w:r>
+      <w:r>
+        <w:rPr>
+          <w:rStyle w:val="VerbatimChar"/>
+        </w:rPr>
+        <w:t>peakRAM</w:t>
+      </w:r>
+      <w:r>
+        <w:t xml:space="preserve"> methodology) and prints a slowest-first breakdown to the run log.</w:t>
       </w:r>
     </w:p>
     <w:p>
@@ -652,1314 +1200,105 @@
         <w:jc w:val="both"/>
       </w:pPr>
       <w:r>
-        <w:t xml:space="preserve">(1) </w:t>
-      </w:r>
-      <w:r>
-        <w:rPr>
-          <w:i/>
-          <w:iCs/>
-        </w:rPr>
-        <w:t>Data input and decontamination</w:t>
-      </w:r>
-      <w:r>
-        <w:t xml:space="preserve"> (R/00–R/02). The pipeline imports upstream outputs — Kraken2/Bracken, ABRicate, Re-centrifuge contamination tags and study metadata tables — accommodating per-project input shapes rather than assuming a fixed column layout, applies optional negative-control subtraction, merges Bracken counts with the metadata covariates declared in </w:t>
-      </w:r>
-      <w:r>
-        <w:rPr>
-          <w:rStyle w:val="VerbatimChar"/>
-        </w:rPr>
-        <w:t>cfg$metadata$fixed_effects</w:t>
-      </w:r>
-      <w:r>
-        <w:t xml:space="preserve"> / </w:t>
-      </w:r>
-      <w:r>
-        <w:rPr>
-          <w:rStyle w:val="VerbatimChar"/>
-        </w:rPr>
-        <w:t>random_effect</w:t>
-      </w:r>
-      <w:r>
-        <w:t xml:space="preserve">, and links ABRicate calls to taxonomic assignments. Per-study taxonomy patches are applied from </w:t>
-      </w:r>
-      <w:r>
-        <w:rPr>
-          <w:rStyle w:val="VerbatimChar"/>
-        </w:rPr>
-        <w:t>taxid_fixes.csv</w:t>
-      </w:r>
-      <w:r>
-        <w:t xml:space="preserve"> when supplied.</w:t>
-      </w:r>
-    </w:p>
-    <w:p>
-      <w:pPr>
-        <w:pStyle w:val="BodyText"/>
-        <w:jc w:val="both"/>
-      </w:pPr>
-      <w:r>
-        <w:t xml:space="preserve">(2) </w:t>
-      </w:r>
-      <w:r>
-        <w:rPr>
-          <w:i/>
-          <w:iCs/>
-        </w:rPr>
-        <w:t>Gene-element normalisation</w:t>
-      </w:r>
-      <w:r>
-        <w:t xml:space="preserve"> (R/03) computes per-(sample, GENE) TPM based on ABRicate hit counts and annotated gene lengths.</w:t>
-      </w:r>
-    </w:p>
-    <w:p>
-      <w:pPr>
-        <w:pStyle w:val="BodyText"/>
-        <w:jc w:val="both"/>
-      </w:pPr>
-      <w:r>
-        <w:t xml:space="preserve">(3) </w:t>
-      </w:r>
-      <w:r>
-        <w:rPr>
-          <w:i/>
-          <w:iCs/>
-        </w:rPr>
-        <w:t>Community analyses</w:t>
-      </w:r>
-      <w:r>
-        <w:t xml:space="preserve"> (R/04–R/08) cover the standard taxonomic toolkit. Following standardisation and cleaning of shared taxon names, R/04–R/05 generate Venn diagrams, annotated heatmaps, and top-N stacked-bar relative-abundance plots (static PNG and interactive plotly HTML) with paired total-count and sample-prevalence panels. Alpha diversity (R/06) reports Shannon, Simpson, richness, Pielou, and Fisher metrics with Kruskal-Wallis tests and violin/bar plots, preferring </w:t>
-      </w:r>
-      <w:proofErr w:type="gramStart"/>
-      <w:r>
-        <w:t>a pre</w:t>
-      </w:r>
-      <w:proofErr w:type="gramEnd"/>
-      <w:r>
-        <w:t>-computed indices CSV (e.g., Oxford Nanopore wf-metagenomics output) and falling back to the vegan R package. Beta diversity (R/07) assesses between-sample community differences using PCoA on Hellinger-transformed Bray-Curtis distances with PERMANOVA (</w:t>
-      </w:r>
-      <w:r>
-        <w:rPr>
-          <w:rStyle w:val="VerbatimChar"/>
-        </w:rPr>
-        <w:t>adonis2</w:t>
-      </w:r>
-      <w:r>
-        <w:t>, 9999 permutations) and PERMDISP (</w:t>
-      </w:r>
-      <w:r>
-        <w:rPr>
-          <w:rStyle w:val="VerbatimChar"/>
-        </w:rPr>
-        <w:t>betadisper</w:t>
-      </w:r>
-      <w:r>
-        <w:t xml:space="preserve">) overlaid on the ordination. Differential abundance analysis (R/08) is performed at both the taxonomic and functional level using ALDEx2: taxonomic analysis uses Bracken counts, whereas gene-level analysis uses ABRicate contig hits per (sample, GENE). The workflow combines an omnibus Kruskal-Wallis test with pairwise Welch's t-tests, with an optional </w:t>
-      </w:r>
-      <w:r>
-        <w:rPr>
-          <w:rStyle w:val="VerbatimChar"/>
-        </w:rPr>
-        <w:t>aldex.glm</w:t>
-      </w:r>
-      <w:r>
-        <w:t xml:space="preserve"> design path for covariate-adjusted models. This compositional approach is deliberate: ALDEx2 models counts through a centred log-ratio (CLR) transformation, which accounts for the compositional nature of sequencing data and avoids the spurious correlations that arise when raw or total counts are compared directly [10]; gene-level features are additionally length-normalised as TPM (R/03) so that genes of differing length remain comparable.</w:t>
-      </w:r>
-    </w:p>
-    <w:p>
-      <w:pPr>
-        <w:pStyle w:val="BodyText"/>
-        <w:jc w:val="both"/>
-      </w:pPr>
-      <w:r>
-        <w:t xml:space="preserve">(4) </w:t>
-      </w:r>
-      <w:r>
-        <w:rPr>
-          <w:i/>
-          <w:iCs/>
-        </w:rPr>
-        <w:t>Functional profiling</w:t>
-      </w:r>
-      <w:r>
-        <w:t xml:space="preserve"> (R/09–R/11) runs a shared analysis engine three times against domain-specific databases: (i) resistome profiling using ABRicate/CARD annotations, including drug-class classification; (ii) virulome profiling using VFDB, with functional categories extracted from the ABRicate </w:t>
-      </w:r>
-      <w:r>
-        <w:rPr>
-          <w:rStyle w:val="VerbatimChar"/>
-        </w:rPr>
-        <w:t>PRODUCT</w:t>
-      </w:r>
-      <w:r>
-        <w:t xml:space="preserve"> field; (iii) mobilome profiling using PlasmidFinder, incorporating configurable replicon-family classification (Col-like, IncF, IncX, other Inc). For each domain, the pipeline generates alpha diversity metrics, Venn diagrams, gene- and category-level heatmaps, relative-abundance and total-count panels, and a PCoA + PERMANOVA + PERMDISP suite.</w:t>
-      </w:r>
-    </w:p>
-    <w:p>
-      <w:pPr>
-        <w:pStyle w:val="BodyText"/>
-        <w:jc w:val="both"/>
-      </w:pPr>
-      <w:r>
-        <w:lastRenderedPageBreak/>
-        <w:t xml:space="preserve">(5) </w:t>
-      </w:r>
-      <w:r>
-        <w:rPr>
-          <w:i/>
-          <w:iCs/>
-        </w:rPr>
-        <w:t>Integration, reporting and manifest</w:t>
-      </w:r>
-      <w:r>
-        <w:t xml:space="preserve"> (R/12–R/14). The final stage integrates results across all domains and produces the reporting outputs. R/12 reports igraph topology metrics (degree, betweenness, Louvain modularity) alongside its network, chord and Sankey outputs, and exports Gephi-compatible node/edge tables. R/13 assembles main and supplementary composite figures (PNG and TIFF independently toggleable) driven by a slot-YAML layout, plus </w:t>
-      </w:r>
-      <w:r>
-        <w:rPr>
-          <w:rStyle w:val="VerbatimChar"/>
-        </w:rPr>
-        <w:t>supplementary_tables.xlsx</w:t>
-      </w:r>
-      <w:r>
-        <w:t xml:space="preserve">. R/14 writes </w:t>
-      </w:r>
-      <w:r>
-        <w:rPr>
-          <w:rStyle w:val="VerbatimChar"/>
-        </w:rPr>
-        <w:t>manifest.json</w:t>
-      </w:r>
-      <w:r>
-        <w:t xml:space="preserve"> (contract v1.2), a kind-tagged catalogue of every figure, table and intermediate artefact the pipeline produced, providing a stable contract for downstream integration.</w:t>
-      </w:r>
-    </w:p>
-    <w:p>
-      <w:pPr>
-        <w:pStyle w:val="BodyText"/>
-        <w:jc w:val="both"/>
-      </w:pPr>
+        <w:t xml:space="preserve">Across both datasets, every enabled stage produced its expected primary artefact under identical settings (</w:t>
+      </w:r>
       <w:r>
         <w:rPr>
           <w:b/>
           <w:bCs/>
         </w:rPr>
-        <w:t>Reporting.</w:t>
-      </w:r>
-      <w:r>
-        <w:t xml:space="preserve"> Results are rendered through a Quarto template as a multi-page HTML dashboard containing dedicated panels for taxonomy, diversity, differential abundance, resistome, virulome, mobilome and network, plus embedded download links. Dependencies are pinned via </w:t>
+        <w:t xml:space="preserve">Table S2</w:t>
+      </w:r>
+      <w:r>
+        <w:t xml:space="preserve">), and both runs closed with a contract-v1.2 </w:t>
       </w:r>
       <w:r>
         <w:rPr>
           <w:rStyle w:val="VerbatimChar"/>
         </w:rPr>
-        <w:t>renv</w:t>
-      </w:r>
-      <w:r>
-        <w:t>, and the project requires R ≥ 4.5; external command-line tools (Kraken2, Bracken, ABRicate, Re-centrifuge) are assumed to have been run upstream. For portable, reproducible deployment the analysis layer is also distributed as a versioned Docker/Apptainer image built on the Bioconductor base, bundling the pinned renv environment and Quarto so the workflow runs identically on a laptop or a root-free HPC node. Because MERIDIAN consumes these pre-computed outputs rather than the raw reads, its own footprint is modest and single-threaded (peaking at ~1.5 GB; Section 3</w:t>
-      </w:r>
-      <w:proofErr w:type="gramStart"/>
-      <w:r>
-        <w:t>), and</w:t>
-      </w:r>
-      <w:proofErr w:type="gramEnd"/>
-      <w:r>
-        <w:t xml:space="preserve"> is therefore decoupled from the substantial memory required by upstream taxonomic classification (for example, a full Kraken2 database), which can be run separately on high-memory or cloud infrastructure.</w:t>
-      </w:r>
-    </w:p>
-    <w:p>
-      <w:pPr>
-        <w:pStyle w:val="Heading2"/>
-        <w:jc w:val="both"/>
-      </w:pPr>
-      <w:bookmarkStart w:id="4" w:name="Xe535e7deb3457bf6891dfc100ac742aa591bc31"/>
-      <w:bookmarkEnd w:id="3"/>
-      <w:r>
-        <w:t>3 Application and Validation</w:t>
-      </w:r>
-    </w:p>
-    <w:p>
-      <w:pPr>
-        <w:pStyle w:val="FirstParagraph"/>
-        <w:jc w:val="both"/>
-      </w:pPr>
-      <w:r>
-        <w:t>We validated the pipeline against two long-read chicken caecum metagenomic studies. The primary dataset (</w:t>
-      </w:r>
-      <w:r>
-        <w:rPr>
-          <w:rStyle w:val="VerbatimChar"/>
-        </w:rPr>
-        <w:t>Chicken batch 1</w:t>
-      </w:r>
-      <w:r>
-        <w:t>, PC_JC_2024-11-29; 18 samples; 3 dietary groups — Dulse, Reference diet, Soyabean meal) is publicly available under NCBI BioProject PRJNA1406192 and has approximately 46 hand-edited R scripts with corresponding validated figures and tables, so each stage can be compared output-for-output against the corresponding ground-truth artefact. The second dataset (</w:t>
-      </w:r>
-      <w:r>
-        <w:rPr>
-          <w:rStyle w:val="VerbatimChar"/>
-        </w:rPr>
-        <w:t>Chicken batch 2</w:t>
-      </w:r>
-      <w:r>
-        <w:t xml:space="preserve">, JC_FL_2025-05-20; 32 samples), for which public release is pending publication of the associated study, was used for scalability and feature coverage: samples were organised into a 4-level composite </w:t>
-      </w:r>
-      <w:r>
-        <w:rPr>
-          <w:rStyle w:val="VerbatimChar"/>
-        </w:rPr>
-        <w:t>Treatment_Bird</w:t>
-      </w:r>
-      <w:r>
-        <w:t xml:space="preserve"> grouping (Control_W4, Control_W5, Dulse_W4, Dulse_W5) with a random effect (</w:t>
-      </w:r>
-      <w:r>
-        <w:rPr>
-          <w:rStyle w:val="VerbatimChar"/>
-        </w:rPr>
-        <w:t>block</w:t>
-      </w:r>
-      <w:r>
-        <w:t>, pens 1–8), two declared negative controls (CTRL1, CTRL2), and a larger per-stage feature load. Two purpose-built validation scripts (</w:t>
-      </w:r>
-      <w:r>
-        <w:rPr>
-          <w:rStyle w:val="VerbatimChar"/>
-        </w:rPr>
-        <w:t>scripts/diff_normdata.R</w:t>
-      </w:r>
-      <w:r>
-        <w:t xml:space="preserve"> and </w:t>
-      </w:r>
-      <w:r>
-        <w:rPr>
-          <w:rStyle w:val="VerbatimChar"/>
-        </w:rPr>
-        <w:t>scripts/probe_taxid_parse.R</w:t>
-      </w:r>
-      <w:r>
-        <w:t xml:space="preserve">) provide numerical-diff and regression checks on the most error-prone </w:t>
-      </w:r>
-      <w:proofErr w:type="gramStart"/>
-      <w:r>
-        <w:t>intermediates, and</w:t>
-      </w:r>
-      <w:proofErr w:type="gramEnd"/>
-      <w:r>
-        <w:t xml:space="preserve"> </w:t>
-      </w:r>
-      <w:r>
-        <w:rPr>
-          <w:rStyle w:val="VerbatimChar"/>
-        </w:rPr>
-        <w:t>run_pipeline.R</w:t>
-      </w:r>
-      <w:r>
-        <w:t xml:space="preserve"> auto-instruments per-stage wall time and peak R-process memory (via a </w:t>
-      </w:r>
-      <w:r>
-        <w:rPr>
-          <w:rStyle w:val="VerbatimChar"/>
-        </w:rPr>
-        <w:t>gc()</w:t>
-      </w:r>
-      <w:r>
-        <w:t xml:space="preserve">-bracketed wrapper equivalent to the </w:t>
-      </w:r>
-      <w:r>
-        <w:rPr>
-          <w:rStyle w:val="VerbatimChar"/>
-        </w:rPr>
-        <w:t>peakRAM</w:t>
-      </w:r>
-      <w:r>
-        <w:t xml:space="preserve"> methodology) and prints a slowest-first breakdown to the run log.</w:t>
-      </w:r>
-    </w:p>
-    <w:p>
-      <w:pPr>
-        <w:pStyle w:val="BodyText"/>
-        <w:jc w:val="both"/>
-      </w:pPr>
+        <w:t xml:space="preserve">manifest.json</w:t>
+      </w:r>
+      <w:r>
+        <w:t xml:space="preserve"> and a Quarto HTML dashboard. The outputs were also biologically coherent. In B1, MERIDIAN reproduced the diet effect on caecal community structure reported in the published analysis of this cohort [11] (Bray–Curtis PERMANOVA R² = 0.19, p = 0.012, with homogeneous dispersion, PERMDISP p = 0.092; published R² = 0.19, p = 0.028), together with non-significant resistome, virulome and mobilome PERMANOVAs (R² = 0.13–0.15, p ≥ </w:t>
+      </w:r>
+      <w:r>
+        <w:lastRenderedPageBreak/>
+        <w:t xml:space="preserve">0.09), a plasmid repertoire dominated by Col-like replicons ahead of IncF and IncX, and the same integrated-network hubs: </w:t>
+      </w:r>
+      <w:r>
+        <w:rPr>
+          <w:i/>
+        </w:rPr>
+        <w:t>Escherichia coli</w:t>
+      </w:r>
+      <w:r>
+        <w:t xml:space="preserve"> (degree 32) and </w:t>
+      </w:r>
+      <w:r>
+        <w:rPr>
+          <w:i/>
+        </w:rPr>
+        <w:t>Clostridioides difficile</w:t>
+      </w:r>
+      <w:r>
+        <w:t xml:space="preserve"> (22) as the most connected taxa, and tet(W) and lnuC as the most connected genes. In B2, the composite diet × week contrast did not structure the community (PERMANOVA R² = 0.12, p = 0.23; PERMDISP p = 0.86), consistent with a core of 211 species shared by all four groups, while the denser integrated network (576 edges and 210 nodes; modularity 0.40 vs 0.31 in B1) again placed </w:t>
+      </w:r>
+      <w:r>
+        <w:rPr>
+          <w:i/>
+        </w:rPr>
+        <w:t>E. coli</w:t>
+      </w:r>
+      <w:r>
+        <w:t xml:space="preserve"> at the centre of the cross-domain network (degree 85). The performance profile (</w:t>
+      </w:r>
       <w:r>
         <w:rPr>
           <w:b/>
           <w:bCs/>
         </w:rPr>
-        <w:t>Table 1.</w:t>
-      </w:r>
-      <w:r>
-        <w:t xml:space="preserve"> Per-stage primary output on the two validation cohorts (B1 = Chicken batch 1, n=18; B2 = Chicken batch 2, n=32). Same statistical settings (PERMANOVA 9999 permutations, ALDEx2 </w:t>
+        <w:t xml:space="preserve">Figure 2</w:t>
+      </w:r>
+      <w:r>
+        <w:t xml:space="preserve">) showed that the end-to-end runtime grew from 8m 08s on B1 to 11m 46s on B2 (+45 %, sublinear in both sample count and pairwise-contrast count), dominated on both cohorts by ALDEx2 differential abundance on the full community taxa table (57 % of B1 total, 62 % of B2). Peak R-process memory climbs through the gene-element domains as the joint long-form (sample × gene) tables grow (~1 GB plateau) and tops out during R/13 panel assembly (1.73 GB on B1, 1.57 GB on B2), where every domain's PNGs and tables are loaded simultaneously to lay out; the </w:t>
       </w:r>
       <w:r>
         <w:rPr>
           <w:rStyle w:val="VerbatimChar"/>
         </w:rPr>
-        <w:t>mc.samples</w:t>
-      </w:r>
-      <w:r>
-        <w:t xml:space="preserve"> = 128); 2026-06-23 sequential run.</w:t>
-      </w:r>
-      <w:ins w:id="9109" w:author="Claude" w:date="2026-10-19T12:00:00Z">
-        <w:r>
-          <w:t xml:space="preserve"> The beta_diversity row is from a 2026-10-19 rerun of that stage after R/07 was changed to ordinate the community taxa table instead of the gene-hit subset.</w:t>
-        </w:r>
-      </w:ins>
-    </w:p>
-    <w:tbl>
-      <w:tblPr>
-        <w:tblStyle w:val="Table"/>
-        <w:tblW w:w="0" w:type="auto"/>
-        <w:tblLook w:val="0020" w:firstRow="1" w:lastRow="0" w:firstColumn="0" w:lastColumn="0" w:noHBand="0" w:noVBand="0"/>
-      </w:tblPr>
-      <w:tblGrid>
-        <w:gridCol w:w="2642"/>
-        <w:gridCol w:w="3467"/>
-        <w:gridCol w:w="3467"/>
-      </w:tblGrid>
-      <w:tr>
-        <w:trPr>
-          <w:cnfStyle w:val="100000000000" w:firstRow="1" w:lastRow="0" w:firstColumn="0" w:lastColumn="0" w:oddVBand="0" w:evenVBand="0" w:oddHBand="0" w:evenHBand="0" w:firstRowFirstColumn="0" w:firstRowLastColumn="0" w:lastRowFirstColumn="0" w:lastRowLastColumn="0"/>
-          <w:tblHeader/>
-        </w:trPr>
-        <w:tc>
-          <w:tcPr>
-            <w:tcW w:w="0" w:type="auto"/>
-          </w:tcPr>
-          <w:p>
-            <w:pPr>
-              <w:pStyle w:val="Compact"/>
-              <w:jc w:val="both"/>
-            </w:pPr>
-            <w:r>
-              <w:lastRenderedPageBreak/>
-              <w:t>Stage</w:t>
-            </w:r>
-          </w:p>
-        </w:tc>
-        <w:tc>
-          <w:tcPr>
-            <w:tcW w:w="0" w:type="auto"/>
-          </w:tcPr>
-          <w:p>
-            <w:pPr>
-              <w:pStyle w:val="Compact"/>
-              <w:jc w:val="both"/>
-            </w:pPr>
-            <w:r>
-              <w:t>B1 primary output</w:t>
-            </w:r>
-          </w:p>
-        </w:tc>
-        <w:tc>
-          <w:tcPr>
-            <w:tcW w:w="0" w:type="auto"/>
-          </w:tcPr>
-          <w:p>
-            <w:pPr>
-              <w:pStyle w:val="Compact"/>
-              <w:jc w:val="both"/>
-            </w:pPr>
-            <w:r>
-              <w:t>B2 primary output</w:t>
-            </w:r>
-          </w:p>
-        </w:tc>
-      </w:tr>
-      <w:tr>
-        <w:tc>
-          <w:tcPr>
-            <w:tcW w:w="0" w:type="auto"/>
-          </w:tcPr>
-          <w:p>
-            <w:pPr>
-              <w:pStyle w:val="Compact"/>
-              <w:jc w:val="both"/>
-            </w:pPr>
-            <w:r>
-              <w:t>load_inputs</w:t>
-            </w:r>
-          </w:p>
-        </w:tc>
-        <w:tc>
-          <w:tcPr>
-            <w:tcW w:w="0" w:type="auto"/>
-          </w:tcPr>
-          <w:p>
-            <w:pPr>
-              <w:pStyle w:val="Compact"/>
-              <w:jc w:val="both"/>
-            </w:pPr>
-            <w:r>
-              <w:t>5 upstream tables parsed</w:t>
-            </w:r>
-          </w:p>
-        </w:tc>
-        <w:tc>
-          <w:tcPr>
-            <w:tcW w:w="0" w:type="auto"/>
-          </w:tcPr>
-          <w:p>
-            <w:pPr>
-              <w:pStyle w:val="Compact"/>
-              <w:jc w:val="both"/>
-            </w:pPr>
-            <w:r>
-              <w:t>5 upstream tables parsed</w:t>
-            </w:r>
-          </w:p>
-        </w:tc>
-      </w:tr>
-      <w:tr>
-        <w:tc>
-          <w:tcPr>
-            <w:tcW w:w="0" w:type="auto"/>
-          </w:tcPr>
-          <w:p>
-            <w:pPr>
-              <w:pStyle w:val="Compact"/>
-              <w:jc w:val="both"/>
-            </w:pPr>
-            <w:r>
-              <w:t>clean_data</w:t>
-            </w:r>
-          </w:p>
-        </w:tc>
-        <w:tc>
-          <w:tcPr>
-            <w:tcW w:w="0" w:type="auto"/>
-          </w:tcPr>
-          <w:p>
-            <w:pPr>
-              <w:pStyle w:val="Compact"/>
-              <w:jc w:val="both"/>
-            </w:pPr>
-            <w:r>
-              <w:rPr>
-                <w:rStyle w:val="VerbatimChar"/>
-              </w:rPr>
-              <w:t>taxid_fixes.csv</w:t>
-            </w:r>
-            <w:r>
-              <w:t xml:space="preserve"> applied; no controls declared</w:t>
-            </w:r>
-          </w:p>
-        </w:tc>
-        <w:tc>
-          <w:tcPr>
-            <w:tcW w:w="0" w:type="auto"/>
-          </w:tcPr>
-          <w:p>
-            <w:pPr>
-              <w:pStyle w:val="Compact"/>
-              <w:jc w:val="both"/>
-            </w:pPr>
-            <w:r>
-              <w:t xml:space="preserve">no </w:t>
-            </w:r>
-            <w:r>
-              <w:rPr>
-                <w:rStyle w:val="VerbatimChar"/>
-              </w:rPr>
-              <w:t>taxid_fixes.csv</w:t>
-            </w:r>
-            <w:r>
-              <w:t>; 2 controls (CTRL1, CTRL2) subtracted</w:t>
-            </w:r>
-          </w:p>
-        </w:tc>
-      </w:tr>
-      <w:tr>
-        <w:tc>
-          <w:tcPr>
-            <w:tcW w:w="0" w:type="auto"/>
-          </w:tcPr>
-          <w:p>
-            <w:pPr>
-              <w:pStyle w:val="Compact"/>
-              <w:jc w:val="both"/>
-            </w:pPr>
-            <w:r>
-              <w:t>normalisation</w:t>
-            </w:r>
-          </w:p>
-        </w:tc>
-        <w:tc>
-          <w:tcPr>
-            <w:tcW w:w="0" w:type="auto"/>
-          </w:tcPr>
-          <w:p>
-            <w:pPr>
-              <w:pStyle w:val="Compact"/>
-              <w:jc w:val="both"/>
-            </w:pPr>
-            <w:r>
-              <w:t>gene-element TPM table written</w:t>
-            </w:r>
-          </w:p>
-        </w:tc>
-        <w:tc>
-          <w:tcPr>
-            <w:tcW w:w="0" w:type="auto"/>
-          </w:tcPr>
-          <w:p>
-            <w:pPr>
-              <w:pStyle w:val="Compact"/>
-              <w:jc w:val="both"/>
-            </w:pPr>
-            <w:r>
-              <w:t>gene-element TPM table written</w:t>
-            </w:r>
-          </w:p>
-        </w:tc>
-      </w:tr>
-      <w:tr>
-        <w:tc>
-          <w:tcPr>
-            <w:tcW w:w="0" w:type="auto"/>
-          </w:tcPr>
-          <w:p>
-            <w:pPr>
-              <w:pStyle w:val="Compact"/>
-              <w:jc w:val="both"/>
-            </w:pPr>
-            <w:r>
-              <w:t>taxonomy</w:t>
-            </w:r>
-          </w:p>
-        </w:tc>
-        <w:tc>
-          <w:tcPr>
-            <w:tcW w:w="0" w:type="auto"/>
-          </w:tcPr>
-          <w:p>
-            <w:pPr>
-              <w:pStyle w:val="Compact"/>
-              <w:jc w:val="both"/>
-            </w:pPr>
-            <w:r>
-              <w:t>2,971 / 11,196 (taxon, sample) rows kept (count ≥ 5)</w:t>
-            </w:r>
-          </w:p>
-        </w:tc>
-        <w:tc>
-          <w:tcPr>
-            <w:tcW w:w="0" w:type="auto"/>
-          </w:tcPr>
-          <w:p>
-            <w:pPr>
-              <w:pStyle w:val="Compact"/>
-              <w:jc w:val="both"/>
-            </w:pPr>
-            <w:r>
-              <w:t>5,570 / 6,549 (taxon, sample) rows kept</w:t>
-            </w:r>
-          </w:p>
-        </w:tc>
-      </w:tr>
-      <w:tr>
-        <w:tc>
-          <w:tcPr>
-            <w:tcW w:w="0" w:type="auto"/>
-          </w:tcPr>
-          <w:p>
-            <w:pPr>
-              <w:pStyle w:val="Compact"/>
-              <w:jc w:val="both"/>
-            </w:pPr>
-            <w:r>
-              <w:t>relative_abundance</w:t>
-            </w:r>
-          </w:p>
-        </w:tc>
-        <w:tc>
-          <w:tcPr>
-            <w:tcW w:w="0" w:type="auto"/>
-          </w:tcPr>
-          <w:p>
-            <w:pPr>
-              <w:pStyle w:val="Compact"/>
-              <w:jc w:val="both"/>
-            </w:pPr>
-            <w:r>
-              <w:t>1,700 / 72,152 rows kept (count &gt; 17); top-50 + Others</w:t>
-            </w:r>
-          </w:p>
-        </w:tc>
-        <w:tc>
-          <w:tcPr>
-            <w:tcW w:w="0" w:type="auto"/>
-          </w:tcPr>
-          <w:p>
-            <w:pPr>
-              <w:pStyle w:val="Compact"/>
-              <w:jc w:val="both"/>
-            </w:pPr>
-            <w:r>
-              <w:t>7,557 / 18,073 rows kept; top-50 + Others</w:t>
-            </w:r>
-          </w:p>
-        </w:tc>
-      </w:tr>
-      <w:tr>
-        <w:tc>
-          <w:tcPr>
-            <w:tcW w:w="0" w:type="auto"/>
-          </w:tcPr>
-          <w:p>
-            <w:pPr>
-              <w:pStyle w:val="Compact"/>
-              <w:jc w:val="both"/>
-            </w:pPr>
-            <w:r>
-              <w:t>alpha_diversity</w:t>
-            </w:r>
-          </w:p>
-        </w:tc>
-        <w:tc>
-          <w:tcPr>
-            <w:tcW w:w="0" w:type="auto"/>
-          </w:tcPr>
-          <w:p>
-            <w:pPr>
-              <w:pStyle w:val="Compact"/>
-              <w:jc w:val="both"/>
-            </w:pPr>
-            <w:r>
-              <w:t>9 metrics × 18 samples; KW per metric</w:t>
-            </w:r>
-          </w:p>
-        </w:tc>
-        <w:tc>
-          <w:tcPr>
-            <w:tcW w:w="0" w:type="auto"/>
-          </w:tcPr>
-          <w:p>
-            <w:pPr>
-              <w:pStyle w:val="Compact"/>
-              <w:jc w:val="both"/>
-            </w:pPr>
-            <w:r>
-              <w:t>9 metrics × 32 samples; KW per metric</w:t>
-            </w:r>
-          </w:p>
-        </w:tc>
-      </w:tr>
-      <w:tr>
-        <w:tc>
-          <w:tcPr>
-            <w:tcW w:w="0" w:type="auto"/>
-          </w:tcPr>
-          <w:p>
-            <w:pPr>
-              <w:pStyle w:val="Compact"/>
-              <w:jc w:val="both"/>
-            </w:pPr>
-            <w:r>
-              <w:t>beta_diversity</w:t>
-            </w:r>
-          </w:p>
-        </w:tc>
-        <w:tc>
-          <w:tcPr>
-            <w:tcW w:w="0" w:type="auto"/>
-          </w:tcPr>
-          <w:p>
-            <w:pPr>
-              <w:pStyle w:val="Compact"/>
-              <w:jc w:val="both"/>
-              <w:rPr>
-                <w:lang w:val="es-ES"/>
-              </w:rPr>
-            </w:pPr>
-            <w:r>
-              <w:rPr>
-                <w:lang w:val="es-ES"/>
-              </w:rPr>
-              <w:t xml:space="preserve">PERMANOVA R² = </w:t>
-            </w:r>
-            <w:del w:id="9101" w:author="Claude" w:date="2026-10-19T12:00:00Z">
-              <w:r>
-                <w:rPr>
-                  <w:lang w:val="es-ES"/>
-                </w:rPr>
-                <w:delText xml:space="preserve">0.145, p = 0.22</w:delText>
-              </w:r>
-            </w:del>
-            <w:ins w:id="9102" w:author="Claude" w:date="2026-10-19T12:00:00Z">
-              <w:r>
-                <w:rPr>
-                  <w:lang w:val="es-ES"/>
-                </w:rPr>
-                <w:t xml:space="preserve">0.192, p = 0.015</w:t>
-              </w:r>
-            </w:ins>
-            <w:r>
-              <w:rPr>
-                <w:lang w:val="es-ES"/>
-              </w:rPr>
-              <w:t xml:space="preserve">; PERMDISP p = </w:t>
-            </w:r>
-            <w:del w:id="9103" w:author="Claude" w:date="2026-10-19T12:00:00Z">
-              <w:r>
-                <w:rPr>
-                  <w:lang w:val="es-ES"/>
-                </w:rPr>
-                <w:delText xml:space="preserve">0.027</w:delText>
-              </w:r>
-            </w:del>
-            <w:ins w:id="9104" w:author="Claude" w:date="2026-10-19T12:00:00Z">
-              <w:r>
-                <w:rPr>
-                  <w:lang w:val="es-ES"/>
-                </w:rPr>
-                <w:t xml:space="preserve">0.095</w:t>
-              </w:r>
-            </w:ins>
-          </w:p>
-        </w:tc>
-        <w:tc>
-          <w:tcPr>
-            <w:tcW w:w="0" w:type="auto"/>
-          </w:tcPr>
-          <w:p>
-            <w:pPr>
-              <w:pStyle w:val="Compact"/>
-              <w:jc w:val="both"/>
-              <w:rPr>
-                <w:lang w:val="es-ES"/>
-              </w:rPr>
-            </w:pPr>
-            <w:r>
-              <w:rPr>
-                <w:lang w:val="es-ES"/>
-              </w:rPr>
-              <w:t xml:space="preserve">PERMANOVA R² = </w:t>
-            </w:r>
-            <w:del w:id="9105" w:author="Claude" w:date="2026-10-19T12:00:00Z">
-              <w:r>
-                <w:rPr>
-                  <w:lang w:val="es-ES"/>
-                </w:rPr>
-                <w:delText xml:space="preserve">0.121, p = 0.15</w:delText>
-              </w:r>
-            </w:del>
-            <w:ins w:id="9106" w:author="Claude" w:date="2026-10-19T12:00:00Z">
-              <w:r>
-                <w:rPr>
-                  <w:lang w:val="es-ES"/>
-                </w:rPr>
-                <w:t xml:space="preserve">0.118, p = 0.23</w:t>
-              </w:r>
-            </w:ins>
-            <w:r>
-              <w:rPr>
-                <w:lang w:val="es-ES"/>
-              </w:rPr>
-              <w:t xml:space="preserve">; PERMDISP p = </w:t>
-            </w:r>
-            <w:del w:id="9107" w:author="Claude" w:date="2026-10-19T12:00:00Z">
-              <w:r>
-                <w:rPr>
-                  <w:lang w:val="es-ES"/>
-                </w:rPr>
-                <w:delText xml:space="preserve">0.053</w:delText>
-              </w:r>
-            </w:del>
-            <w:ins w:id="9108" w:author="Claude" w:date="2026-10-19T12:00:00Z">
-              <w:r>
-                <w:rPr>
-                  <w:lang w:val="es-ES"/>
-                </w:rPr>
-                <w:t xml:space="preserve">0.86</w:t>
-              </w:r>
-            </w:ins>
-          </w:p>
-        </w:tc>
-      </w:tr>
-      <w:tr>
-        <w:tc>
-          <w:tcPr>
-            <w:tcW w:w="0" w:type="auto"/>
-          </w:tcPr>
-          <w:p>
-            <w:pPr>
-              <w:pStyle w:val="Compact"/>
-              <w:jc w:val="both"/>
-            </w:pPr>
-            <w:r>
-              <w:t>differential_abundance</w:t>
-            </w:r>
-          </w:p>
-        </w:tc>
-        <w:tc>
-          <w:tcPr>
-            <w:tcW w:w="0" w:type="auto"/>
-          </w:tcPr>
-          <w:p>
-            <w:pPr>
-              <w:pStyle w:val="Compact"/>
-              <w:jc w:val="both"/>
-            </w:pPr>
-            <w:r>
-              <w:t>31 taxa + 157 gene features; 3 pairwise contrasts</w:t>
-            </w:r>
-          </w:p>
-        </w:tc>
-        <w:tc>
-          <w:tcPr>
-            <w:tcW w:w="0" w:type="auto"/>
-          </w:tcPr>
-          <w:p>
-            <w:pPr>
-              <w:pStyle w:val="Compact"/>
-              <w:jc w:val="both"/>
-            </w:pPr>
-            <w:r>
-              <w:t>53 taxa + 221 gene features; 6 pairwise contrasts</w:t>
-            </w:r>
-          </w:p>
-        </w:tc>
-      </w:tr>
-      <w:tr>
-        <w:tc>
-          <w:tcPr>
-            <w:tcW w:w="0" w:type="auto"/>
-          </w:tcPr>
-          <w:p>
-            <w:pPr>
-              <w:pStyle w:val="Compact"/>
-              <w:jc w:val="both"/>
-            </w:pPr>
-            <w:r>
-              <w:t>resistome (CARD)</w:t>
-            </w:r>
-          </w:p>
-        </w:tc>
-        <w:tc>
-          <w:tcPr>
-            <w:tcW w:w="0" w:type="auto"/>
-          </w:tcPr>
-          <w:p>
-            <w:pPr>
-              <w:pStyle w:val="Compact"/>
-              <w:jc w:val="both"/>
-            </w:pPr>
-            <w:r>
-              <w:t>348 rows / 85 genes / 18 drug classes</w:t>
-            </w:r>
-          </w:p>
-        </w:tc>
-        <w:tc>
-          <w:tcPr>
-            <w:tcW w:w="0" w:type="auto"/>
-          </w:tcPr>
-          <w:p>
-            <w:pPr>
-              <w:pStyle w:val="Compact"/>
-              <w:jc w:val="both"/>
-            </w:pPr>
-            <w:r>
-              <w:t>648 rows / 99 genes / 20 drug classes</w:t>
-            </w:r>
-          </w:p>
-        </w:tc>
-      </w:tr>
-      <w:tr>
-        <w:tc>
-          <w:tcPr>
-            <w:tcW w:w="0" w:type="auto"/>
-          </w:tcPr>
-          <w:p>
-            <w:pPr>
-              <w:pStyle w:val="Compact"/>
-              <w:jc w:val="both"/>
-            </w:pPr>
-            <w:r>
-              <w:t>virulome (VFDB)</w:t>
-            </w:r>
-          </w:p>
-        </w:tc>
-        <w:tc>
-          <w:tcPr>
-            <w:tcW w:w="0" w:type="auto"/>
-          </w:tcPr>
-          <w:p>
-            <w:pPr>
-              <w:pStyle w:val="Compact"/>
-              <w:jc w:val="both"/>
-            </w:pPr>
-            <w:r>
-              <w:t>320 rows / 140 genes / 6 VF functions (17 / 18 samples)</w:t>
-            </w:r>
-          </w:p>
-        </w:tc>
-        <w:tc>
-          <w:tcPr>
-            <w:tcW w:w="0" w:type="auto"/>
-          </w:tcPr>
-          <w:p>
-            <w:pPr>
-              <w:pStyle w:val="Compact"/>
-              <w:jc w:val="both"/>
-            </w:pPr>
-            <w:r>
-              <w:t>492 rows / 156 genes / 8 VF functions (26 / 32 samples)</w:t>
-            </w:r>
-          </w:p>
-        </w:tc>
-      </w:tr>
-      <w:tr>
-        <w:tc>
-          <w:tcPr>
-            <w:tcW w:w="0" w:type="auto"/>
-          </w:tcPr>
-          <w:p>
-            <w:pPr>
-              <w:pStyle w:val="Compact"/>
-              <w:jc w:val="both"/>
-            </w:pPr>
-            <w:r>
-              <w:t>mobilome (PlasmidFinder)</w:t>
-            </w:r>
-          </w:p>
-        </w:tc>
-        <w:tc>
-          <w:tcPr>
-            <w:tcW w:w="0" w:type="auto"/>
-          </w:tcPr>
-          <w:p>
-            <w:pPr>
-              <w:pStyle w:val="Compact"/>
-              <w:jc w:val="both"/>
-            </w:pPr>
-            <w:r>
-              <w:t>65 rows / 10 replicons / 3 families</w:t>
-            </w:r>
-          </w:p>
-        </w:tc>
-        <w:tc>
-          <w:tcPr>
-            <w:tcW w:w="0" w:type="auto"/>
-          </w:tcPr>
-          <w:p>
-            <w:pPr>
-              <w:pStyle w:val="Compact"/>
-              <w:jc w:val="both"/>
-            </w:pPr>
-            <w:r>
-              <w:t>137 rows / 25 replicons / 5 families</w:t>
-            </w:r>
-          </w:p>
-        </w:tc>
-      </w:tr>
-      <w:tr>
-        <w:tc>
-          <w:tcPr>
-            <w:tcW w:w="0" w:type="auto"/>
-          </w:tcPr>
-          <w:p>
-            <w:pPr>
-              <w:pStyle w:val="Compact"/>
-              <w:jc w:val="both"/>
-            </w:pPr>
-            <w:r>
-              <w:t>network</w:t>
-            </w:r>
-          </w:p>
-        </w:tc>
-        <w:tc>
-          <w:tcPr>
-            <w:tcW w:w="0" w:type="auto"/>
-          </w:tcPr>
-          <w:p>
-            <w:pPr>
-              <w:pStyle w:val="Compact"/>
-              <w:jc w:val="both"/>
-            </w:pPr>
-            <w:r>
-              <w:t>247 edges, 100 nodes (18 + 42 + 40); modularity = 0.31</w:t>
-            </w:r>
-          </w:p>
-        </w:tc>
-        <w:tc>
-          <w:tcPr>
-            <w:tcW w:w="0" w:type="auto"/>
-          </w:tcPr>
-          <w:p>
-            <w:pPr>
-              <w:pStyle w:val="Compact"/>
-              <w:jc w:val="both"/>
-            </w:pPr>
-            <w:r>
-              <w:t>576 edges, 210 nodes (32 + 77 + 101); modularity = 0.40</w:t>
-            </w:r>
-          </w:p>
-        </w:tc>
-      </w:tr>
-      <w:tr>
-        <w:tc>
-          <w:tcPr>
-            <w:tcW w:w="0" w:type="auto"/>
-          </w:tcPr>
-          <w:p>
-            <w:pPr>
-              <w:pStyle w:val="Compact"/>
-              <w:jc w:val="both"/>
-            </w:pPr>
-            <w:r>
-              <w:t>panels</w:t>
-            </w:r>
-          </w:p>
-        </w:tc>
-        <w:tc>
-          <w:tcPr>
-            <w:tcW w:w="0" w:type="auto"/>
-          </w:tcPr>
-          <w:p>
-            <w:pPr>
-              <w:pStyle w:val="Compact"/>
-              <w:jc w:val="both"/>
-            </w:pPr>
-            <w:r>
-              <w:t xml:space="preserve">main + supplementary composite figures (PNG / TIFF) + </w:t>
-            </w:r>
-            <w:r>
-              <w:rPr>
-                <w:rStyle w:val="VerbatimChar"/>
-              </w:rPr>
-              <w:t>supplementary_tables.xlsx</w:t>
-            </w:r>
-          </w:p>
-        </w:tc>
-        <w:tc>
-          <w:tcPr>
-            <w:tcW w:w="0" w:type="auto"/>
-          </w:tcPr>
-          <w:p>
-            <w:pPr>
-              <w:pStyle w:val="Compact"/>
-              <w:jc w:val="both"/>
-            </w:pPr>
-            <w:r>
-              <w:t xml:space="preserve">main + supplementary composite figures (PNG / TIFF) + </w:t>
-            </w:r>
-            <w:r>
-              <w:rPr>
-                <w:rStyle w:val="VerbatimChar"/>
-              </w:rPr>
-              <w:t>supplementary_tables.xlsx</w:t>
-            </w:r>
-          </w:p>
-        </w:tc>
-      </w:tr>
-      <w:tr>
-        <w:tc>
-          <w:tcPr>
-            <w:tcW w:w="0" w:type="auto"/>
-          </w:tcPr>
-          <w:p>
-            <w:pPr>
-              <w:pStyle w:val="Compact"/>
-              <w:jc w:val="both"/>
-            </w:pPr>
-            <w:r>
-              <w:t>manifest</w:t>
-            </w:r>
-          </w:p>
-        </w:tc>
-        <w:tc>
-          <w:tcPr>
-            <w:tcW w:w="0" w:type="auto"/>
-          </w:tcPr>
-          <w:p>
-            <w:pPr>
-              <w:pStyle w:val="Compact"/>
-              <w:jc w:val="both"/>
-              <w:rPr>
-                <w:lang w:val="es-ES"/>
-              </w:rPr>
-            </w:pPr>
-            <w:r>
-              <w:rPr>
-                <w:rStyle w:val="VerbatimChar"/>
-                <w:lang w:val="es-ES"/>
-              </w:rPr>
-              <w:t>manifest.json</w:t>
-            </w:r>
-            <w:r>
-              <w:rPr>
-                <w:lang w:val="es-ES"/>
-              </w:rPr>
-              <w:t xml:space="preserve"> (contract v1.2; 85 kB)</w:t>
-            </w:r>
-          </w:p>
-        </w:tc>
-        <w:tc>
-          <w:tcPr>
-            <w:tcW w:w="0" w:type="auto"/>
-          </w:tcPr>
-          <w:p>
-            <w:pPr>
-              <w:pStyle w:val="Compact"/>
-              <w:jc w:val="both"/>
-              <w:rPr>
-                <w:lang w:val="es-ES"/>
-              </w:rPr>
-            </w:pPr>
-            <w:r>
-              <w:rPr>
-                <w:rStyle w:val="VerbatimChar"/>
-                <w:lang w:val="es-ES"/>
-              </w:rPr>
-              <w:t>manifest.json</w:t>
-            </w:r>
-            <w:r>
-              <w:rPr>
-                <w:lang w:val="es-ES"/>
-              </w:rPr>
-              <w:t xml:space="preserve"> (contract v1.2; 80 kB)</w:t>
-            </w:r>
-          </w:p>
-        </w:tc>
-      </w:tr>
-      <w:tr>
-        <w:tc>
-          <w:tcPr>
-            <w:tcW w:w="0" w:type="auto"/>
-          </w:tcPr>
-          <w:p>
-            <w:pPr>
-              <w:pStyle w:val="Compact"/>
-              <w:jc w:val="both"/>
-            </w:pPr>
-            <w:r>
-              <w:t>report</w:t>
-            </w:r>
-          </w:p>
-        </w:tc>
-        <w:tc>
-          <w:tcPr>
-            <w:tcW w:w="0" w:type="auto"/>
-          </w:tcPr>
-          <w:p>
-            <w:pPr>
-              <w:pStyle w:val="Compact"/>
-              <w:jc w:val="both"/>
-            </w:pPr>
-            <w:r>
-              <w:t>Quarto dashboard HTML (~14 MB)</w:t>
-            </w:r>
-          </w:p>
-        </w:tc>
-        <w:tc>
-          <w:tcPr>
-            <w:tcW w:w="0" w:type="auto"/>
-          </w:tcPr>
-          <w:p>
-            <w:pPr>
-              <w:pStyle w:val="Compact"/>
-              <w:jc w:val="both"/>
-            </w:pPr>
-            <w:r>
-              <w:t>Quarto dashboard HTML (~18 MB)</w:t>
-            </w:r>
-          </w:p>
-        </w:tc>
-      </w:tr>
-    </w:tbl>
+        <w:t>report</w:t>
+      </w:r>
+      <w:r>
+        <w:t xml:space="preserve"> stage's modest peak (~0.6 GB) reflects work delegated to the external Quarto process.</w:t>
+      </w:r>
+    </w:p>
     <w:p>
       <w:pPr>
         <w:pStyle w:val="BodyText"/>
-        <w:jc w:val="both"/>
-      </w:pPr>
-      <w:r>
-        <w:t>Across both datasets (</w:t>
-      </w:r>
-      <w:r>
-        <w:rPr>
-          <w:b/>
-          <w:bCs/>
-        </w:rPr>
-        <w:t>Table 1</w:t>
-      </w:r>
-      <w:r>
-        <w:t xml:space="preserve">), every enabled stage produced its expected primary artefact under identical settings. Feature counts scale with cohort size and grouping complexity: B2 (n=32, 4-level </w:t>
-      </w:r>
-      <w:r>
-        <w:rPr>
-          <w:rStyle w:val="VerbatimChar"/>
-        </w:rPr>
-        <w:t>Treatment_Bird</w:t>
-      </w:r>
-      <w:r>
-        <w:t xml:space="preserve">) yields ~1.5–2× the resistome (648 vs 348 rows), virulome (492 vs 320) and mobilome (137 vs 65) rows of B1, with 53 vs 31 differentially abundant taxa across 6 vs 3 pairwise contrasts and a denser integrated network (576 edges/210 nodes/modularity 0.40 vs 247/100/0.31). The pipeline closes cleanly on both runs, producing a contract-v1.2 </w:t>
-      </w:r>
-      <w:r>
-        <w:rPr>
-          <w:rStyle w:val="VerbatimChar"/>
-        </w:rPr>
-        <w:t>manifest.json</w:t>
-      </w:r>
-      <w:r>
-        <w:t xml:space="preserve"> (~80–85 kB) and a Quarto </w:t>
-      </w:r>
-      <w:r>
+        <w:keepNext/>
+      </w:pPr>
+      <w:r>
+        <w:rPr>
+          <w:noProof/>
+        </w:rPr>
         <w:lastRenderedPageBreak/>
-        <w:t>HTML dashboard (~14–18 MB). The performance profile (</w:t>
-      </w:r>
-      <w:r>
-        <w:rPr>
-          <w:b/>
-          <w:bCs/>
-        </w:rPr>
-        <w:t>Figure 2</w:t>
-      </w:r>
-      <w:r>
-        <w:t xml:space="preserve">) illustrated that the end-to-end runtime grew from 6m 41s on B1 to 8m 19s on B2 (+24 %, sublinear in both sample count and pairwise-contrast count), dominated on both cohorts by ALDEx2 differential abundance (32 % of B1 total, 40 % of B2). Peak R-process memory tracks the same monotone profile, climbing through the gene-element domains as the joint long-form </w:t>
-      </w:r>
-      <w:r>
-        <w:rPr>
-          <w:rStyle w:val="VerbatimChar"/>
-        </w:rPr>
-        <w:t>(sample × gene)</w:t>
-      </w:r>
-      <w:r>
-        <w:t xml:space="preserve"> tables grow (~1 GB plateau) and tops out during R/13 panel assembly (1.33 GB on B1, 1.51 GB on B2), where every domain's PNGs and tables are loaded simultaneously to lay out; the </w:t>
-      </w:r>
-      <w:r>
-        <w:rPr>
-          <w:rStyle w:val="VerbatimChar"/>
-        </w:rPr>
-        <w:t>report</w:t>
-      </w:r>
-      <w:r>
-        <w:t xml:space="preserve"> stage's modest peak (~0.6 GB) reflects work delegated to the external Quarto process.</w:t>
-      </w:r>
-    </w:p>
-    <w:p>
-      <w:pPr>
-        <w:pStyle w:val="BodyText"/>
-        <w:jc w:val="both"/>
-      </w:pPr>
-      <w:r>
-        <w:rPr>
-          <w:noProof/>
-        </w:rPr>
         <w:drawing>
-          <wp:inline distT="0" distB="0" distL="0" distR="0" wp14:anchorId="7A51AA1C" wp14:editId="29F7F50D">
-            <wp:extent cx="5334000" cy="5754729"/>
-            <wp:effectExtent l="0" t="0" r="0" b="0"/>
-            <wp:docPr id="19" name="Picture" descr="Figure 2. Pipeline performance across four long-read metagenomic cohorts. (A) Per-stage wall time (log scale) and (B) peak R-process heap, sorted by B2 runtime. (C) Cumulative wall time and (D) running peak memory in pipeline order. R 4.5.0 single-thread analysis, including PERMANOVA 9999 permutations, ALDEx2 mc.samples = 128. B1 = Chicken batch 1 (n=18, 3 dietary groups); B2 = Chicken batch 2 (n=32, 4-level Treatment_Bird, block random effect, two negative controls); HW = Egyptian hospital wastewater (n=20); WL = East Atlantic Flyway wetlands (n=24)."/>
+          <wp:inline distT="0" distB="0" distL="0" distR="0" wp14:anchorId="409C6BC8" wp14:editId="33B58D33">
+            <wp:extent cx="5839691" cy="6300308"/>
+            <wp:effectExtent l="0" t="0" r="8890" b="5715"/>
+            <wp:docPr id="9019" name="Picture" descr="Figure 2. Pipeline performance across four long-read metagenomic cohorts. (A) Per-stage wall time (log scale) and (B) peak R-process heap, sorted by runtime. (C) Cumulative wall time and (D) running peak memory in pipeline order. MERIDIAN v1.2.0 with each project's shipped config.yaml, run single-threaded and sequentially for each cohort: B1 = Chicken batch 1 (n=18, 3 dietary groups); B2 = Chicken batch 2 (n=32, 4-level Treatment_Bird, block random effect, two negative controls); HW = Egyptian hospital wastewater (n=20); WL = East Atlantic Flyway wetlands (n=24)."/>
             <wp:cNvGraphicFramePr/>
             <a:graphic xmlns:a="http://schemas.openxmlformats.org/drawingml/2006/main">
               <a:graphicData uri="http://schemas.openxmlformats.org/drawingml/2006/picture">
                 <pic:pic xmlns:pic="http://schemas.openxmlformats.org/drawingml/2006/picture">
                   <pic:nvPicPr>
-                    <pic:cNvPr id="20" name="Picture" descr="figure2_pipeline_performance.png"/>
+                    <pic:cNvPr id="9019" name="Picture" descr="figure2_pipeline_performance.png"/>
                     <pic:cNvPicPr>
                       <a:picLocks noChangeAspect="1" noChangeArrowheads="1"/>
                     </pic:cNvPicPr>
                   </pic:nvPicPr>
                   <pic:blipFill>
-                    <a:blip r:embed="rId8"/>
+                    <a:blip r:embed="rId11"/>
                     <a:stretch>
                       <a:fillRect/>
                     </a:stretch>
@@ -1967,7 +1306,7 @@
                   <pic:spPr bwMode="auto">
                     <a:xfrm>
                       <a:off x="0" y="0"/>
-                      <a:ext cx="5334000" cy="5754729"/>
+                      <a:ext cx="5852530" cy="6300308"/>
                     </a:xfrm>
                     <a:prstGeom prst="rect">
                       <a:avLst/>
@@ -1988,50 +1327,144 @@
     </w:p>
     <w:p>
       <w:pPr>
+        <w:pStyle w:val="Caption"/>
+        <w:jc w:val="both"/>
+        <w:rPr>
+          <w:i w:val="0"/>
+          <w:iCs/>
+        </w:rPr>
+      </w:pPr>
+      <w:r>
+        <w:rPr>
+          <w:b/>
+          <w:bCs/>
+          <w:i w:val="0"/>
+          <w:iCs/>
+        </w:rPr>
+        <w:t xml:space="preserve">Figure </w:t>
+      </w:r>
+      <w:r>
+        <w:rPr>
+          <w:b/>
+          <w:bCs/>
+          <w:i w:val="0"/>
+          <w:iCs/>
+        </w:rPr>
+        <w:fldChar w:fldCharType="begin"/>
+      </w:r>
+      <w:r>
+        <w:rPr>
+          <w:b/>
+          <w:bCs/>
+          <w:i w:val="0"/>
+          <w:iCs/>
+        </w:rPr>
+        <w:instrText xml:space="preserve"> SEQ Figure \* ARABIC </w:instrText>
+      </w:r>
+      <w:r>
+        <w:rPr>
+          <w:b/>
+          <w:bCs/>
+          <w:i w:val="0"/>
+          <w:iCs/>
+        </w:rPr>
+        <w:fldChar w:fldCharType="separate"/>
+      </w:r>
+      <w:r>
+        <w:rPr>
+          <w:b/>
+          <w:bCs/>
+          <w:i w:val="0"/>
+          <w:iCs/>
+          <w:noProof/>
+        </w:rPr>
+        <w:t>2</w:t>
+      </w:r>
+      <w:r>
+        <w:rPr>
+          <w:b/>
+          <w:bCs/>
+          <w:i w:val="0"/>
+          <w:iCs/>
+        </w:rPr>
+        <w:fldChar w:fldCharType="end"/>
+      </w:r>
+      <w:r>
+        <w:rPr>
+          <w:i w:val="0"/>
+          <w:iCs/>
+        </w:rPr>
+        <w:t xml:space="preserve">. Pipeline performance across four long-read metagenomic cohorts. (A) Per-stage wall time (log scale) and (B) peak R-process heap, sorted by runtime. (C) Cumulative wall time and (D) running peak memory in pipeline order. </w:t>
+      </w:r>
+      <w:r>
+        <w:rPr>
+          <w:i w:val="0"/>
+          <w:iCs/>
+        </w:rPr>
+        <w:t xml:space="preserve">MERIDIAN v1.2.0 with each project's shipped config.yaml, run single-threaded and sequentially for each cohort: </w:t>
+      </w:r>
+      <w:r>
+        <w:rPr>
+          <w:i w:val="0"/>
+          <w:iCs/>
+        </w:rPr>
+        <w:t>B1 = Chicken batch 1 (n=18, 3 dietary groups); B2 = Chicken batch 2 (n=32, 4-level Treatment_Bird, block random effect, two negative controls); HW = Egyptian hospital wastewater (n=20); WL = East Atlantic Flyway wetlands (n=24).</w:t>
+      </w:r>
+    </w:p>
+    <w:p>
+      <w:pPr>
         <w:pStyle w:val="BodyText"/>
         <w:jc w:val="both"/>
       </w:pPr>
       <w:r>
         <w:t xml:space="preserve">One anticipated and deliberate discrepancy arises at the resistome stage: the ground-truth </w:t>
       </w:r>
-      <w:proofErr w:type="gramStart"/>
       <w:r>
         <w:rPr>
           <w:rStyle w:val="VerbatimChar"/>
         </w:rPr>
-        <w:t>cleanData</w:t>
-      </w:r>
-      <w:proofErr w:type="gramEnd"/>
+        <w:t>cleanData.R</w:t>
+      </w:r>
+      <w:r>
+        <w:t xml:space="preserve"> misparses taxids carrying variant suffixes, dropping the corresponding </w:t>
+      </w:r>
+      <w:r>
+        <w:lastRenderedPageBreak/>
+        <w:t>ABRicate rows. R/02 corrects this parsing issue, so the pipeline retains 110 additional (sample, GENE) rows relative to the hand-edited output (</w:t>
+      </w:r>
       <w:r>
         <w:rPr>
           <w:rStyle w:val="VerbatimChar"/>
         </w:rPr>
-        <w:t>.R</w:t>
-      </w:r>
-      <w:r>
-        <w:t xml:space="preserve"> misparses taxids carrying variant suffixes, dropping the corresponding ABRicate rows. R/02 corrects this parsing issue, so the pipeline retains 110 additional </w:t>
-      </w:r>
-      <w:r>
-        <w:lastRenderedPageBreak/>
-        <w:t>(sample, GENE) rows relative to the hand-edited output (</w:t>
+        <w:t>scripts/diff_normdata.R</w:t>
+      </w:r>
+      <w:r>
+        <w:t xml:space="preserve"> on the v1.2.0 B1 run: pipeline = 733 rows, ground truth = 623; 121 rows recovered by the parsing correction, and 11 rows present in the ground truth that the pipeline currently drops, concentrated in a handful of plasmid replicon and accessory resistance calls, queued for inspection rather than treated as a regression). Jaccard agreement on the </w:t>
       </w:r>
       <w:r>
         <w:rPr>
           <w:rStyle w:val="VerbatimChar"/>
         </w:rPr>
-        <w:t>scripts/diff_normdata.R</w:t>
-      </w:r>
-      <w:r>
-        <w:t xml:space="preserve"> on the 2026-06-23 B1 run: pipeline = 733 rows, ground truth = 623; 121 rows recovered by the parsing correction, and 11 rows present in the ground truth that the pipeline currently drops, concentrated in a handful of plasmid replicon and accessory resistance calls, queued for inspection rather than treated as a regression). Jaccard agreement on the </w:t>
-      </w:r>
-      <w:r>
-        <w:rPr>
-          <w:rStyle w:val="VerbatimChar"/>
-        </w:rPr>
         <w:t>(sample, GENE)</w:t>
       </w:r>
       <w:r>
-        <w:t xml:space="preserve"> key set is 0.82. For other stages with directly comparable ground-truth artefacts, sample-set agreement is exact for alpha diversity (18/18), and Jaccard for the network Gephi exports against the most recent hand-edited snapshot is 0.85 (nodes) and 0.87 (edges). Per-stage comparisons against the remaining hand-edited artefacts — taxonomy, beta diversity, and differential abundance — are deferred to a separate validation effort. The Re-centrifuge column-slicing heuristic in R/02 is acknowledged as still coarse and is queued for rework.</w:t>
+        <w:t xml:space="preserve"> key set is 0.82. For other stages with directly comparable ground-truth artefacts, sample-set agreement is exact for alpha diversity (18/18), and Jaccard for the network Gephi exports against the most recent hand-edited snapshot is 0.85 (nodes) and 0.87 (edges). Per-stage comparisons against the remaining hand-edited artefacts — taxonomy, beta diversity, and differential abundance — are deferred to a separate validation effort. </w:t>
+      </w:r>
+      <w:commentRangeStart w:id="6"/>
+      <w:r>
+        <w:t>R/02 still parses Re-centrifuge reports with the original fixed-interval column slicing; a rank-aware parser is planned</w:t>
+      </w:r>
+      <w:commentRangeEnd w:id="6"/>
+      <w:r>
+        <w:rPr>
+          <w:rStyle w:val="CommentReference"/>
+          <w:sz w:val="24"/>
+          <w:szCs w:val="24"/>
+        </w:rPr>
+        <w:commentReference w:id="6"/>
+      </w:r>
+      <w:r>
+        <w:t>.</w:t>
       </w:r>
     </w:p>
     <w:p>
@@ -2049,7 +1482,31 @@
         <w:t>config.yaml</w:t>
       </w:r>
       <w:r>
-        <w:t xml:space="preserve"> — to two independent, publicly available long-read (ONT) metagenomic studies spanning the One Health continuum: hospital wastewater versus tap water from five Egyptian hospitals (NCBI BioProject PRJNA1266479; 20 samples) and anthropogenically impacted versus natural wetland sites along the East Atlantic Flyway (ENA BioProject PRJEB96272; 24 samples). Both cohorts completed all fifteen stages in a single run (4m 08s and 7m 37s; peak 2.0 and 3.6 GB), each emitting a Quarto dashboard, publication panels and a contract-v1.2 </w:t>
+        <w:t xml:space="preserve"> — to two independent, publicly available long-read (ONT) metagenomic studies spanning the One Health continuum: hospital wastewater versus tap water from five Egyptian hospitals (NCBI BioProject PRJNA1266479; 20 samples)</w:t>
+      </w:r>
+      <w:r>
+        <w:t>[1</w:t>
+      </w:r>
+      <w:r>
+        <w:t>7</w:t>
+      </w:r>
+      <w:r>
+        <w:t>]</w:t>
+      </w:r>
+      <w:r>
+        <w:t xml:space="preserve"> and anthropogenically impacted versus natural wetland sites along the East Atlantic Flyway (ENA BioProject PRJEB96272; 24 samples)</w:t>
+      </w:r>
+      <w:r>
+        <w:t>[1</w:t>
+      </w:r>
+      <w:r>
+        <w:t>8</w:t>
+      </w:r>
+      <w:r>
+        <w:t>]</w:t>
+      </w:r>
+      <w:r>
+        <w:t xml:space="preserve">. Both cohorts completed all fifteen stages in a single run (3m 23s and 6m 24s; peak 2.1 and 3.5 GB), each emitting a Quarto dashboard, publication panels and a contract-v1.2 </w:t>
       </w:r>
       <w:r>
         <w:rPr>
@@ -2058,7 +1515,44 @@
         <w:t>manifest.json</w:t>
       </w:r>
       <w:r>
-        <w:t>. The pipeline recovered biologically coherent structure: hospital wastewater was significantly richer and compositionally distinct from tap water (PERMANOVA R² = 0.18, p = 3 × 10⁻⁴), and wetland virulence-factor load was higher at anthropogenically impacted than natural sites across the flyway (PERMANOVA R² = 0.088, p_adj = 0.037; functional profiles available for 23 of 24 samples). Both datasets also exercised edge cases absent from the chicken cohorts — a single-group resistome/mobilome in the hospital cohort (tap water carried essentially no ARGs) and a near-absence of plasmid replicons in the wetland water (a single IncP1 hit via PlasmidFinder, too sparse to profile), consistent with the source study — which the pipeline handled by skipping the affected sub-analyses with logged notices rather than failing. As these datasets lack hand-curated ground-truth artefacts, they demonstrate portability and robustness across sample types rather than output-for-output correctness.</w:t>
+        <w:t xml:space="preserve"> (</w:t>
+      </w:r>
+      <w:r>
+        <w:rPr>
+          <w:b/>
+          <w:bCs/>
+        </w:rPr>
+        <w:t>Table S1</w:t>
+      </w:r>
+      <w:r>
+        <w:t>)</w:t>
+      </w:r>
+      <w:r>
+        <w:t>. The pipeline recovered biologically coherent structure: hospital wastewater was significantly richer and compositionally distinct from tap water (PERMANOVA R² = 0.18, p = 1 × 10⁻⁴), and wetland virulence-factor load was higher at anthropogenically impacted than natural sites across the flyway (PERMANOVA R² = 0.088, p_adj = 0.037; functional profiles available for 23 of 24 samples). Both datasets also exercised edge cases absent from the chicken cohorts — a single-group resistome/mobilome in the hospital cohort (tap water carried essentially no ARGs) and a near-absence of plasmid replicons in the wetland water (a single IncP1 hit via PlasmidFinder, too sparse to profile), consistent with the source study</w:t>
+      </w:r>
+      <w:r>
+        <w:t xml:space="preserve"> [1</w:t>
+      </w:r>
+      <w:r>
+        <w:t>7</w:t>
+      </w:r>
+      <w:r>
+        <w:t>, 1</w:t>
+      </w:r>
+      <w:r>
+        <w:t>8</w:t>
+      </w:r>
+      <w:r>
+        <w:t>]</w:t>
+      </w:r>
+      <w:r>
+        <w:t xml:space="preserve"> — which the pipeline handled by skipping the affected sub-analyses with logged notices rather than failing. </w:t>
+      </w:r>
+      <w:r>
+        <w:t>Despite the lack of hand-curated ground-truth artefacts in these datasets, MERIDIAN demonstrates high portability and robustness across four diverse shotgun metagenomics test cases</w:t>
+      </w:r>
+      <w:r>
+        <w:t>.</w:t>
       </w:r>
     </w:p>
     <w:p>
@@ -2084,12 +1578,12 @@
         <w:tblLook w:val="0020" w:firstRow="1" w:lastRow="0" w:firstColumn="0" w:lastColumn="0" w:noHBand="0" w:noVBand="0"/>
       </w:tblPr>
       <w:tblGrid>
-        <w:gridCol w:w="1556"/>
-        <w:gridCol w:w="1704"/>
+        <w:gridCol w:w="1494"/>
+        <w:gridCol w:w="1621"/>
         <w:gridCol w:w="473"/>
-        <w:gridCol w:w="1574"/>
+        <w:gridCol w:w="1522"/>
         <w:gridCol w:w="1094"/>
-        <w:gridCol w:w="766"/>
+        <w:gridCol w:w="747"/>
         <w:gridCol w:w="2409"/>
       </w:tblGrid>
       <w:tr>
@@ -2104,9 +1598,9 @@
           <w:p>
             <w:pPr>
               <w:pStyle w:val="Compact"/>
-              <w:jc w:val="both"/>
-            </w:pPr>
-            <w:r>
+            </w:pPr>
+            <w:r>
+              <w:lastRenderedPageBreak/>
               <w:t>Cohort</w:t>
             </w:r>
           </w:p>
@@ -2118,7 +1612,6 @@
           <w:p>
             <w:pPr>
               <w:pStyle w:val="Compact"/>
-              <w:jc w:val="both"/>
             </w:pPr>
             <w:r>
               <w:t>One Health axis</w:t>
@@ -2132,7 +1625,6 @@
           <w:p>
             <w:pPr>
               <w:pStyle w:val="Compact"/>
-              <w:jc w:val="both"/>
             </w:pPr>
             <w:r>
               <w:t>n</w:t>
@@ -2146,7 +1638,6 @@
           <w:p>
             <w:pPr>
               <w:pStyle w:val="Compact"/>
-              <w:jc w:val="both"/>
             </w:pPr>
             <w:r>
               <w:t>Primary contrast</w:t>
@@ -2160,7 +1651,6 @@
           <w:p>
             <w:pPr>
               <w:pStyle w:val="Compact"/>
-              <w:jc w:val="both"/>
             </w:pPr>
             <w:r>
               <w:t>Runtime</w:t>
@@ -2174,7 +1664,6 @@
           <w:p>
             <w:pPr>
               <w:pStyle w:val="Compact"/>
-              <w:jc w:val="both"/>
             </w:pPr>
             <w:r>
               <w:t>Peak RAM</w:t>
@@ -2188,7 +1677,6 @@
           <w:p>
             <w:pPr>
               <w:pStyle w:val="Compact"/>
-              <w:jc w:val="both"/>
             </w:pPr>
             <w:r>
               <w:t>Headline result</w:t>
@@ -2204,7 +1692,6 @@
           <w:p>
             <w:pPr>
               <w:pStyle w:val="Compact"/>
-              <w:jc w:val="both"/>
             </w:pPr>
             <w:r>
               <w:t>Chicken batch 1</w:t>
@@ -2218,7 +1705,6 @@
           <w:p>
             <w:pPr>
               <w:pStyle w:val="Compact"/>
-              <w:jc w:val="both"/>
             </w:pPr>
             <w:r>
               <w:t>Livestock (poultry caecum)</w:t>
@@ -2232,7 +1718,6 @@
           <w:p>
             <w:pPr>
               <w:pStyle w:val="Compact"/>
-              <w:jc w:val="both"/>
             </w:pPr>
             <w:r>
               <w:t>18</w:t>
@@ -2246,7 +1731,6 @@
           <w:p>
             <w:pPr>
               <w:pStyle w:val="Compact"/>
-              <w:jc w:val="both"/>
             </w:pPr>
             <w:r>
               <w:t>Diet (3 groups)</w:t>
@@ -2260,42 +1744,35 @@
           <w:p>
             <w:pPr>
               <w:pStyle w:val="Compact"/>
-              <w:jc w:val="both"/>
-            </w:pPr>
-            <w:r>
-              <w:t>6m 41s</w:t>
-            </w:r>
-          </w:p>
-        </w:tc>
-        <w:tc>
-          <w:tcPr>
-            <w:tcW w:w="0" w:type="auto"/>
-          </w:tcPr>
-          <w:p>
-            <w:pPr>
-              <w:pStyle w:val="Compact"/>
-              <w:jc w:val="both"/>
-            </w:pPr>
-            <w:r>
-              <w:t>1.33 GB</w:t>
-            </w:r>
-          </w:p>
-        </w:tc>
-        <w:tc>
-          <w:tcPr>
-            <w:tcW w:w="0" w:type="auto"/>
-          </w:tcPr>
-          <w:p>
-            <w:pPr>
-              <w:pStyle w:val="Compact"/>
-              <w:jc w:val="both"/>
-            </w:pPr>
-            <w:r>
-              <w:t xml:space="preserve">Ground-truth reference; R/02 parsing fix recovers 110 (sample, GENE) </w:t>
-            </w:r>
-            <w:r>
-              <w:lastRenderedPageBreak/>
-              <w:t>rows</w:t>
+            </w:pPr>
+            <w:r>
+              <w:t>8m 08s</w:t>
+            </w:r>
+          </w:p>
+        </w:tc>
+        <w:tc>
+          <w:tcPr>
+            <w:tcW w:w="0" w:type="auto"/>
+          </w:tcPr>
+          <w:p>
+            <w:pPr>
+              <w:pStyle w:val="Compact"/>
+            </w:pPr>
+            <w:r>
+              <w:t>1.73 GB</w:t>
+            </w:r>
+          </w:p>
+        </w:tc>
+        <w:tc>
+          <w:tcPr>
+            <w:tcW w:w="0" w:type="auto"/>
+          </w:tcPr>
+          <w:p>
+            <w:pPr>
+              <w:pStyle w:val="Compact"/>
+            </w:pPr>
+            <w:r>
+              <w:t>Ground-truth reference; published diet effect reproduced (PERMANOVA R² = 0.19, p = 0.012); R/02 parsing fix recovers 110 (sample, GENE) rows</w:t>
             </w:r>
           </w:p>
         </w:tc>
@@ -2308,10 +1785,8 @@
           <w:p>
             <w:pPr>
               <w:pStyle w:val="Compact"/>
-              <w:jc w:val="both"/>
-            </w:pPr>
-            <w:r>
-              <w:lastRenderedPageBreak/>
+            </w:pPr>
+            <w:r>
               <w:t>Chicken batch 2</w:t>
             </w:r>
           </w:p>
@@ -2323,7 +1798,6 @@
           <w:p>
             <w:pPr>
               <w:pStyle w:val="Compact"/>
-              <w:jc w:val="both"/>
             </w:pPr>
             <w:r>
               <w:t>Livestock (poultry caecum)</w:t>
@@ -2337,7 +1811,6 @@
           <w:p>
             <w:pPr>
               <w:pStyle w:val="Compact"/>
-              <w:jc w:val="both"/>
             </w:pPr>
             <w:r>
               <w:t>32</w:t>
@@ -2351,7 +1824,6 @@
           <w:p>
             <w:pPr>
               <w:pStyle w:val="Compact"/>
-              <w:jc w:val="both"/>
             </w:pPr>
             <w:r>
               <w:t>Treatment × week (4-level)</w:t>
@@ -2365,38 +1837,35 @@
           <w:p>
             <w:pPr>
               <w:pStyle w:val="Compact"/>
-              <w:jc w:val="both"/>
-            </w:pPr>
-            <w:r>
-              <w:t>8m 19s</w:t>
-            </w:r>
-          </w:p>
-        </w:tc>
-        <w:tc>
-          <w:tcPr>
-            <w:tcW w:w="0" w:type="auto"/>
-          </w:tcPr>
-          <w:p>
-            <w:pPr>
-              <w:pStyle w:val="Compact"/>
-              <w:jc w:val="both"/>
-            </w:pPr>
-            <w:r>
-              <w:t>1.51 GB</w:t>
-            </w:r>
-          </w:p>
-        </w:tc>
-        <w:tc>
-          <w:tcPr>
-            <w:tcW w:w="0" w:type="auto"/>
-          </w:tcPr>
-          <w:p>
-            <w:pPr>
-              <w:pStyle w:val="Compact"/>
-              <w:jc w:val="both"/>
-            </w:pPr>
-            <w:r>
-              <w:t>Sublinear scaling; denser integrated network</w:t>
+            </w:pPr>
+            <w:r>
+              <w:t>11m 46s</w:t>
+            </w:r>
+          </w:p>
+        </w:tc>
+        <w:tc>
+          <w:tcPr>
+            <w:tcW w:w="0" w:type="auto"/>
+          </w:tcPr>
+          <w:p>
+            <w:pPr>
+              <w:pStyle w:val="Compact"/>
+            </w:pPr>
+            <w:r>
+              <w:t>1.57 GB</w:t>
+            </w:r>
+          </w:p>
+        </w:tc>
+        <w:tc>
+          <w:tcPr>
+            <w:tcW w:w="0" w:type="auto"/>
+          </w:tcPr>
+          <w:p>
+            <w:pPr>
+              <w:pStyle w:val="Compact"/>
+            </w:pPr>
+            <w:r>
+              <w:t>No diet × week clustering (PERMANOVA R² = 0.12, p = 0.23); sublinear scaling; denser integrated network</w:t>
             </w:r>
           </w:p>
         </w:tc>
@@ -2409,7 +1878,6 @@
           <w:p>
             <w:pPr>
               <w:pStyle w:val="Compact"/>
-              <w:jc w:val="both"/>
             </w:pPr>
             <w:r>
               <w:t>Hospital wastewater (EG)</w:t>
@@ -2423,7 +1891,6 @@
           <w:p>
             <w:pPr>
               <w:pStyle w:val="Compact"/>
-              <w:jc w:val="both"/>
             </w:pPr>
             <w:r>
               <w:t>Human-clinical + built environment</w:t>
@@ -2437,7 +1904,6 @@
           <w:p>
             <w:pPr>
               <w:pStyle w:val="Compact"/>
-              <w:jc w:val="both"/>
             </w:pPr>
             <w:r>
               <w:t>20</w:t>
@@ -2451,7 +1917,6 @@
           <w:p>
             <w:pPr>
               <w:pStyle w:val="Compact"/>
-              <w:jc w:val="both"/>
             </w:pPr>
             <w:r>
               <w:t>Wastewater vs tap water</w:t>
@@ -2465,38 +1930,35 @@
           <w:p>
             <w:pPr>
               <w:pStyle w:val="Compact"/>
-              <w:jc w:val="both"/>
-            </w:pPr>
-            <w:r>
-              <w:t>4m 08s</w:t>
-            </w:r>
-          </w:p>
-        </w:tc>
-        <w:tc>
-          <w:tcPr>
-            <w:tcW w:w="0" w:type="auto"/>
-          </w:tcPr>
-          <w:p>
-            <w:pPr>
-              <w:pStyle w:val="Compact"/>
-              <w:jc w:val="both"/>
-            </w:pPr>
-            <w:r>
-              <w:t>1.98 GB</w:t>
-            </w:r>
-          </w:p>
-        </w:tc>
-        <w:tc>
-          <w:tcPr>
-            <w:tcW w:w="0" w:type="auto"/>
-          </w:tcPr>
-          <w:p>
-            <w:pPr>
-              <w:pStyle w:val="Compact"/>
-              <w:jc w:val="both"/>
-            </w:pPr>
-            <w:r>
-              <w:t>Wastewater richer and compositionally distinct (PERMANOVA R² = 0.18, p = 3 × 10⁻⁴)</w:t>
+            </w:pPr>
+            <w:r>
+              <w:t>3m 23s</w:t>
+            </w:r>
+          </w:p>
+        </w:tc>
+        <w:tc>
+          <w:tcPr>
+            <w:tcW w:w="0" w:type="auto"/>
+          </w:tcPr>
+          <w:p>
+            <w:pPr>
+              <w:pStyle w:val="Compact"/>
+            </w:pPr>
+            <w:r>
+              <w:t>2.09 GB</w:t>
+            </w:r>
+          </w:p>
+        </w:tc>
+        <w:tc>
+          <w:tcPr>
+            <w:tcW w:w="0" w:type="auto"/>
+          </w:tcPr>
+          <w:p>
+            <w:pPr>
+              <w:pStyle w:val="Compact"/>
+            </w:pPr>
+            <w:r>
+              <w:t>Wastewater richer and compositionally distinct (PERMANOVA R² = 0.18, p = 1 × 10⁻⁴)</w:t>
             </w:r>
           </w:p>
         </w:tc>
@@ -2509,7 +1971,6 @@
           <w:p>
             <w:pPr>
               <w:pStyle w:val="Compact"/>
-              <w:jc w:val="both"/>
             </w:pPr>
             <w:r>
               <w:t>Wetlands (E. Atlantic Flyway)</w:t>
@@ -2523,7 +1984,6 @@
           <w:p>
             <w:pPr>
               <w:pStyle w:val="Compact"/>
-              <w:jc w:val="both"/>
             </w:pPr>
             <w:r>
               <w:t>Wildlife + environment</w:t>
@@ -2537,7 +1997,6 @@
           <w:p>
             <w:pPr>
               <w:pStyle w:val="Compact"/>
-              <w:jc w:val="both"/>
             </w:pPr>
             <w:r>
               <w:t>24</w:t>
@@ -2551,7 +2010,6 @@
           <w:p>
             <w:pPr>
               <w:pStyle w:val="Compact"/>
-              <w:jc w:val="both"/>
             </w:pPr>
             <w:r>
               <w:t>Impacted vs natural</w:t>
@@ -2565,35 +2023,32 @@
           <w:p>
             <w:pPr>
               <w:pStyle w:val="Compact"/>
-              <w:jc w:val="both"/>
-            </w:pPr>
-            <w:r>
-              <w:t>7m 37s</w:t>
-            </w:r>
-          </w:p>
-        </w:tc>
-        <w:tc>
-          <w:tcPr>
-            <w:tcW w:w="0" w:type="auto"/>
-          </w:tcPr>
-          <w:p>
-            <w:pPr>
-              <w:pStyle w:val="Compact"/>
-              <w:jc w:val="both"/>
-            </w:pPr>
-            <w:r>
-              <w:t>3.59 GB</w:t>
-            </w:r>
-          </w:p>
-        </w:tc>
-        <w:tc>
-          <w:tcPr>
-            <w:tcW w:w="0" w:type="auto"/>
-          </w:tcPr>
-          <w:p>
-            <w:pPr>
-              <w:pStyle w:val="Compact"/>
-              <w:jc w:val="both"/>
+            </w:pPr>
+            <w:r>
+              <w:t>6m 24s</w:t>
+            </w:r>
+          </w:p>
+        </w:tc>
+        <w:tc>
+          <w:tcPr>
+            <w:tcW w:w="0" w:type="auto"/>
+          </w:tcPr>
+          <w:p>
+            <w:pPr>
+              <w:pStyle w:val="Compact"/>
+            </w:pPr>
+            <w:r>
+              <w:t>3.53 GB</w:t>
+            </w:r>
+          </w:p>
+        </w:tc>
+        <w:tc>
+          <w:tcPr>
+            <w:tcW w:w="0" w:type="auto"/>
+          </w:tcPr>
+          <w:p>
+            <w:pPr>
+              <w:pStyle w:val="Compact"/>
             </w:pPr>
             <w:r>
               <w:t>Higher virulome load at impacted sites (PERMANOVA R² = 0.088, p_adj = 0.037)</w:t>
@@ -2604,11 +2059,756 @@
     </w:tbl>
     <w:p>
       <w:pPr>
+        <w:pStyle w:val="BodyText"/>
+        <w:jc w:val="both"/>
+      </w:pPr>
+      <w:r>
+        <w:rPr>
+          <w:b/>
+          <w:bCs/>
+        </w:rPr>
+        <w:t xml:space="preserve">Table S2.</w:t>
+      </w:r>
+      <w:r>
+        <w:t xml:space="preserve"> Per-stage primary output on the two chicken cohorts (B1 = Chicken batch 1, n=18; B2 = Chicken batch 2, n=32). Same statistical settings (PERMANOVA 9999 permutations, ALDEx2 mc.samples = 128); MERIDIAN v1.2.0, shipped configs, sequential run (2026-10-29).</w:t>
+      </w:r>
+    </w:p>
+    <w:tbl>
+      <w:tblPr>
+        <w:tblStyle w:val="Table"/>
+        <w:tblW w:w="0" w:type="auto"/>
+        <w:tblLook w:val="0020" w:firstRow="1" w:lastRow="0" w:firstColumn="0" w:lastColumn="0" w:noHBand="0" w:noVBand="0"/>
+      </w:tblPr>
+      <w:tblGrid>
+        <w:gridCol w:w="2636"/>
+        <w:gridCol w:w="3362"/>
+        <w:gridCol w:w="3362"/>
+      </w:tblGrid>
+      <w:tr>
+        <w:trPr>
+          <w:cnfStyle w:val="100000000000" w:firstRow="1" w:lastRow="0" w:firstColumn="0" w:lastColumn="0" w:oddVBand="0" w:evenVBand="0" w:oddHBand="0" w:evenHBand="0" w:firstRowFirstColumn="0" w:firstRowLastColumn="0" w:lastRowFirstColumn="0" w:lastRowLastColumn="0"/>
+          <w:tblHeader/>
+        </w:trPr>
+        <w:tc>
+          <w:tcPr>
+            <w:tcW w:w="0" w:type="auto"/>
+          </w:tcPr>
+          <w:p>
+            <w:pPr>
+              <w:pStyle w:val="Compact"/>
+            </w:pPr>
+            <w:r>
+              <w:t>Stage</w:t>
+            </w:r>
+          </w:p>
+        </w:tc>
+        <w:tc>
+          <w:tcPr>
+            <w:tcW w:w="0" w:type="auto"/>
+          </w:tcPr>
+          <w:p>
+            <w:pPr>
+              <w:pStyle w:val="Compact"/>
+            </w:pPr>
+            <w:r>
+              <w:t>B1 primary output</w:t>
+            </w:r>
+          </w:p>
+        </w:tc>
+        <w:tc>
+          <w:tcPr>
+            <w:tcW w:w="0" w:type="auto"/>
+          </w:tcPr>
+          <w:p>
+            <w:pPr>
+              <w:pStyle w:val="Compact"/>
+            </w:pPr>
+            <w:r>
+              <w:t>B2 primary output</w:t>
+            </w:r>
+          </w:p>
+        </w:tc>
+      </w:tr>
+      <w:tr>
+        <w:tc>
+          <w:tcPr>
+            <w:tcW w:w="0" w:type="auto"/>
+          </w:tcPr>
+          <w:p>
+            <w:pPr>
+              <w:pStyle w:val="Compact"/>
+            </w:pPr>
+            <w:r>
+              <w:t>load_inputs</w:t>
+            </w:r>
+          </w:p>
+        </w:tc>
+        <w:tc>
+          <w:tcPr>
+            <w:tcW w:w="0" w:type="auto"/>
+          </w:tcPr>
+          <w:p>
+            <w:pPr>
+              <w:pStyle w:val="Compact"/>
+            </w:pPr>
+            <w:r>
+              <w:t>5 upstream tables parsed</w:t>
+            </w:r>
+          </w:p>
+        </w:tc>
+        <w:tc>
+          <w:tcPr>
+            <w:tcW w:w="0" w:type="auto"/>
+          </w:tcPr>
+          <w:p>
+            <w:pPr>
+              <w:pStyle w:val="Compact"/>
+            </w:pPr>
+            <w:r>
+              <w:t>5 upstream tables parsed</w:t>
+            </w:r>
+          </w:p>
+        </w:tc>
+      </w:tr>
+      <w:tr>
+        <w:tc>
+          <w:tcPr>
+            <w:tcW w:w="0" w:type="auto"/>
+          </w:tcPr>
+          <w:p>
+            <w:pPr>
+              <w:pStyle w:val="Compact"/>
+            </w:pPr>
+            <w:r>
+              <w:t>clean_data</w:t>
+            </w:r>
+          </w:p>
+        </w:tc>
+        <w:tc>
+          <w:tcPr>
+            <w:tcW w:w="0" w:type="auto"/>
+          </w:tcPr>
+          <w:p>
+            <w:pPr>
+              <w:pStyle w:val="Compact"/>
+            </w:pPr>
+            <w:r>
+              <w:rPr>
+                <w:rStyle w:val="VerbatimChar"/>
+              </w:rPr>
+              <w:t>taxid_fixes.csv</w:t>
+            </w:r>
+            <w:r>
+              <w:t xml:space="preserve"> applied; no controls declared</w:t>
+            </w:r>
+          </w:p>
+        </w:tc>
+        <w:tc>
+          <w:tcPr>
+            <w:tcW w:w="0" w:type="auto"/>
+          </w:tcPr>
+          <w:p>
+            <w:pPr>
+              <w:pStyle w:val="Compact"/>
+            </w:pPr>
+            <w:r>
+              <w:t xml:space="preserve">no </w:t>
+            </w:r>
+            <w:r>
+              <w:rPr>
+                <w:rStyle w:val="VerbatimChar"/>
+              </w:rPr>
+              <w:t>taxid_fixes.csv</w:t>
+            </w:r>
+            <w:r>
+              <w:t>; 2 controls (CTRL1, CTRL2) subtracted</w:t>
+            </w:r>
+          </w:p>
+        </w:tc>
+      </w:tr>
+      <w:tr>
+        <w:tc>
+          <w:tcPr>
+            <w:tcW w:w="0" w:type="auto"/>
+          </w:tcPr>
+          <w:p>
+            <w:pPr>
+              <w:pStyle w:val="Compact"/>
+            </w:pPr>
+            <w:r>
+              <w:t>normalisation</w:t>
+            </w:r>
+          </w:p>
+        </w:tc>
+        <w:tc>
+          <w:tcPr>
+            <w:tcW w:w="0" w:type="auto"/>
+          </w:tcPr>
+          <w:p>
+            <w:pPr>
+              <w:pStyle w:val="Compact"/>
+            </w:pPr>
+            <w:r>
+              <w:t>gene-element TPM table written</w:t>
+            </w:r>
+          </w:p>
+        </w:tc>
+        <w:tc>
+          <w:tcPr>
+            <w:tcW w:w="0" w:type="auto"/>
+          </w:tcPr>
+          <w:p>
+            <w:pPr>
+              <w:pStyle w:val="Compact"/>
+            </w:pPr>
+            <w:r>
+              <w:t>gene-element TPM table written</w:t>
+            </w:r>
+          </w:p>
+        </w:tc>
+      </w:tr>
+      <w:tr>
+        <w:tc>
+          <w:tcPr>
+            <w:tcW w:w="0" w:type="auto"/>
+          </w:tcPr>
+          <w:p>
+            <w:pPr>
+              <w:pStyle w:val="Compact"/>
+            </w:pPr>
+            <w:r>
+              <w:t>taxonomy</w:t>
+            </w:r>
+          </w:p>
+        </w:tc>
+        <w:tc>
+          <w:tcPr>
+            <w:tcW w:w="0" w:type="auto"/>
+          </w:tcPr>
+          <w:p>
+            <w:pPr>
+              <w:pStyle w:val="Compact"/>
+            </w:pPr>
+            <w:r>
+              <w:t>2,971 / 11,196 (taxon, sample) rows kept (count ≥ 5)</w:t>
+            </w:r>
+          </w:p>
+        </w:tc>
+        <w:tc>
+          <w:tcPr>
+            <w:tcW w:w="0" w:type="auto"/>
+          </w:tcPr>
+          <w:p>
+            <w:pPr>
+              <w:pStyle w:val="Compact"/>
+            </w:pPr>
+            <w:r>
+              <w:t>5,570 / 6,549 (taxon, sample) rows kept</w:t>
+            </w:r>
+          </w:p>
+        </w:tc>
+      </w:tr>
+      <w:tr>
+        <w:tc>
+          <w:tcPr>
+            <w:tcW w:w="0" w:type="auto"/>
+          </w:tcPr>
+          <w:p>
+            <w:pPr>
+              <w:pStyle w:val="Compact"/>
+            </w:pPr>
+            <w:r>
+              <w:lastRenderedPageBreak/>
+              <w:t>relative_abundance</w:t>
+            </w:r>
+          </w:p>
+        </w:tc>
+        <w:tc>
+          <w:tcPr>
+            <w:tcW w:w="0" w:type="auto"/>
+          </w:tcPr>
+          <w:p>
+            <w:pPr>
+              <w:pStyle w:val="Compact"/>
+            </w:pPr>
+            <w:r>
+              <w:t>1,383 / 61,132 rows kept (count &gt; 17); top-10 + Others</w:t>
+            </w:r>
+          </w:p>
+        </w:tc>
+        <w:tc>
+          <w:tcPr>
+            <w:tcW w:w="0" w:type="auto"/>
+          </w:tcPr>
+          <w:p>
+            <w:pPr>
+              <w:pStyle w:val="Compact"/>
+            </w:pPr>
+            <w:r>
+              <w:t>6,782 / 16,475 rows kept; top-10 + Others</w:t>
+            </w:r>
+          </w:p>
+        </w:tc>
+      </w:tr>
+      <w:tr>
+        <w:tc>
+          <w:tcPr>
+            <w:tcW w:w="0" w:type="auto"/>
+          </w:tcPr>
+          <w:p>
+            <w:pPr>
+              <w:pStyle w:val="Compact"/>
+            </w:pPr>
+            <w:r>
+              <w:t>alpha_diversity</w:t>
+            </w:r>
+          </w:p>
+        </w:tc>
+        <w:tc>
+          <w:tcPr>
+            <w:tcW w:w="0" w:type="auto"/>
+          </w:tcPr>
+          <w:p>
+            <w:pPr>
+              <w:pStyle w:val="Compact"/>
+            </w:pPr>
+            <w:r>
+              <w:t>9 metrics × 18 samples; KW per metric</w:t>
+            </w:r>
+          </w:p>
+        </w:tc>
+        <w:tc>
+          <w:tcPr>
+            <w:tcW w:w="0" w:type="auto"/>
+          </w:tcPr>
+          <w:p>
+            <w:pPr>
+              <w:pStyle w:val="Compact"/>
+            </w:pPr>
+            <w:r>
+              <w:t>9 metrics × 32 samples; KW per metric</w:t>
+            </w:r>
+          </w:p>
+        </w:tc>
+      </w:tr>
+      <w:tr>
+        <w:tc>
+          <w:tcPr>
+            <w:tcW w:w="0" w:type="auto"/>
+          </w:tcPr>
+          <w:p>
+            <w:pPr>
+              <w:pStyle w:val="Compact"/>
+            </w:pPr>
+            <w:r>
+              <w:t>beta_diversity</w:t>
+            </w:r>
+          </w:p>
+        </w:tc>
+        <w:tc>
+          <w:tcPr>
+            <w:tcW w:w="0" w:type="auto"/>
+          </w:tcPr>
+          <w:p>
+            <w:pPr>
+              <w:pStyle w:val="Compact"/>
+              <w:rPr>
+                <w:lang w:val="es-ES"/>
+              </w:rPr>
+            </w:pPr>
+            <w:r>
+              <w:rPr>
+                <w:lang w:val="es-ES"/>
+              </w:rPr>
+              <w:t>PERMANOVA R² = 0.192, p = 0.012; PERMDISP p = 0.092</w:t>
+            </w:r>
+          </w:p>
+        </w:tc>
+        <w:tc>
+          <w:tcPr>
+            <w:tcW w:w="0" w:type="auto"/>
+          </w:tcPr>
+          <w:p>
+            <w:pPr>
+              <w:pStyle w:val="Compact"/>
+              <w:rPr>
+                <w:lang w:val="es-ES"/>
+              </w:rPr>
+            </w:pPr>
+            <w:r>
+              <w:rPr>
+                <w:lang w:val="es-ES"/>
+              </w:rPr>
+              <w:t>PERMANOVA R² = 0.118, p = 0.23; PERMDISP p = 0.86</w:t>
+            </w:r>
+          </w:p>
+        </w:tc>
+      </w:tr>
+      <w:tr>
+        <w:tc>
+          <w:tcPr>
+            <w:tcW w:w="0" w:type="auto"/>
+          </w:tcPr>
+          <w:p>
+            <w:pPr>
+              <w:pStyle w:val="Compact"/>
+            </w:pPr>
+            <w:r>
+              <w:t>differential_abundance</w:t>
+            </w:r>
+          </w:p>
+        </w:tc>
+        <w:tc>
+          <w:tcPr>
+            <w:tcW w:w="0" w:type="auto"/>
+          </w:tcPr>
+          <w:p>
+            <w:pPr>
+              <w:pStyle w:val="Compact"/>
+            </w:pPr>
+            <w:r>
+              <w:t>330 taxa + 157 gene features; 3 pairwise contrasts</w:t>
+            </w:r>
+          </w:p>
+        </w:tc>
+        <w:tc>
+          <w:tcPr>
+            <w:tcW w:w="0" w:type="auto"/>
+          </w:tcPr>
+          <w:p>
+            <w:pPr>
+              <w:pStyle w:val="Compact"/>
+            </w:pPr>
+            <w:r>
+              <w:t>465 taxa + 221 gene features; 6 pairwise contrasts</w:t>
+            </w:r>
+          </w:p>
+        </w:tc>
+      </w:tr>
+      <w:tr>
+        <w:tc>
+          <w:tcPr>
+            <w:tcW w:w="0" w:type="auto"/>
+          </w:tcPr>
+          <w:p>
+            <w:pPr>
+              <w:pStyle w:val="Compact"/>
+            </w:pPr>
+            <w:r>
+              <w:t>resistome (CARD)</w:t>
+            </w:r>
+          </w:p>
+        </w:tc>
+        <w:tc>
+          <w:tcPr>
+            <w:tcW w:w="0" w:type="auto"/>
+          </w:tcPr>
+          <w:p>
+            <w:pPr>
+              <w:pStyle w:val="Compact"/>
+            </w:pPr>
+            <w:r>
+              <w:t>348 rows / 85 genes / 18 drug classes</w:t>
+            </w:r>
+          </w:p>
+        </w:tc>
+        <w:tc>
+          <w:tcPr>
+            <w:tcW w:w="0" w:type="auto"/>
+          </w:tcPr>
+          <w:p>
+            <w:pPr>
+              <w:pStyle w:val="Compact"/>
+            </w:pPr>
+            <w:r>
+              <w:t>648 rows / 99 genes / 20 drug classes</w:t>
+            </w:r>
+          </w:p>
+        </w:tc>
+      </w:tr>
+      <w:tr>
+        <w:tc>
+          <w:tcPr>
+            <w:tcW w:w="0" w:type="auto"/>
+          </w:tcPr>
+          <w:p>
+            <w:pPr>
+              <w:pStyle w:val="Compact"/>
+            </w:pPr>
+            <w:r>
+              <w:t>virulome (VFDB)</w:t>
+            </w:r>
+          </w:p>
+        </w:tc>
+        <w:tc>
+          <w:tcPr>
+            <w:tcW w:w="0" w:type="auto"/>
+          </w:tcPr>
+          <w:p>
+            <w:pPr>
+              <w:pStyle w:val="Compact"/>
+            </w:pPr>
+            <w:r>
+              <w:t>320 rows / 140 genes / 6 VF functions (17 / 18 samples)</w:t>
+            </w:r>
+          </w:p>
+        </w:tc>
+        <w:tc>
+          <w:tcPr>
+            <w:tcW w:w="0" w:type="auto"/>
+          </w:tcPr>
+          <w:p>
+            <w:pPr>
+              <w:pStyle w:val="Compact"/>
+            </w:pPr>
+            <w:r>
+              <w:t>492 rows / 156 genes / 8 VF functions (26 / 32 samples)</w:t>
+            </w:r>
+          </w:p>
+        </w:tc>
+      </w:tr>
+      <w:tr>
+        <w:tc>
+          <w:tcPr>
+            <w:tcW w:w="0" w:type="auto"/>
+          </w:tcPr>
+          <w:p>
+            <w:pPr>
+              <w:pStyle w:val="Compact"/>
+            </w:pPr>
+            <w:r>
+              <w:t>mobilome (PlasmidFinder)</w:t>
+            </w:r>
+          </w:p>
+        </w:tc>
+        <w:tc>
+          <w:tcPr>
+            <w:tcW w:w="0" w:type="auto"/>
+          </w:tcPr>
+          <w:p>
+            <w:pPr>
+              <w:pStyle w:val="Compact"/>
+            </w:pPr>
+            <w:r>
+              <w:t>65 rows / 10 replicons / 3 families</w:t>
+            </w:r>
+          </w:p>
+        </w:tc>
+        <w:tc>
+          <w:tcPr>
+            <w:tcW w:w="0" w:type="auto"/>
+          </w:tcPr>
+          <w:p>
+            <w:pPr>
+              <w:pStyle w:val="Compact"/>
+            </w:pPr>
+            <w:r>
+              <w:t>137 rows / 25 replicons / 5 families</w:t>
+            </w:r>
+          </w:p>
+        </w:tc>
+      </w:tr>
+      <w:tr>
+        <w:tc>
+          <w:tcPr>
+            <w:tcW w:w="0" w:type="auto"/>
+          </w:tcPr>
+          <w:p>
+            <w:pPr>
+              <w:pStyle w:val="Compact"/>
+            </w:pPr>
+            <w:r>
+              <w:t>network</w:t>
+            </w:r>
+          </w:p>
+        </w:tc>
+        <w:tc>
+          <w:tcPr>
+            <w:tcW w:w="0" w:type="auto"/>
+          </w:tcPr>
+          <w:p>
+            <w:pPr>
+              <w:pStyle w:val="Compact"/>
+            </w:pPr>
+            <w:r>
+              <w:t>247 edges, 100 nodes (18 + 42 + 40); modularity = 0.31</w:t>
+            </w:r>
+          </w:p>
+        </w:tc>
+        <w:tc>
+          <w:tcPr>
+            <w:tcW w:w="0" w:type="auto"/>
+          </w:tcPr>
+          <w:p>
+            <w:pPr>
+              <w:pStyle w:val="Compact"/>
+            </w:pPr>
+            <w:r>
+              <w:t>576 edges, 210 nodes (32 + 77 + 101); modularity = 0.40</w:t>
+            </w:r>
+          </w:p>
+        </w:tc>
+      </w:tr>
+      <w:tr>
+        <w:tc>
+          <w:tcPr>
+            <w:tcW w:w="0" w:type="auto"/>
+          </w:tcPr>
+          <w:p>
+            <w:pPr>
+              <w:pStyle w:val="Compact"/>
+            </w:pPr>
+            <w:r>
+              <w:t>panels</w:t>
+            </w:r>
+          </w:p>
+        </w:tc>
+        <w:tc>
+          <w:tcPr>
+            <w:tcW w:w="0" w:type="auto"/>
+          </w:tcPr>
+          <w:p>
+            <w:pPr>
+              <w:pStyle w:val="Compact"/>
+            </w:pPr>
+            <w:r>
+              <w:t xml:space="preserve">main + supplementary composite figures (PNG / TIFF) + </w:t>
+            </w:r>
+            <w:r>
+              <w:rPr>
+                <w:rStyle w:val="VerbatimChar"/>
+              </w:rPr>
+              <w:t>supplementary_tables.xlsx</w:t>
+            </w:r>
+          </w:p>
+        </w:tc>
+        <w:tc>
+          <w:tcPr>
+            <w:tcW w:w="0" w:type="auto"/>
+          </w:tcPr>
+          <w:p>
+            <w:pPr>
+              <w:pStyle w:val="Compact"/>
+            </w:pPr>
+            <w:r>
+              <w:t xml:space="preserve">main + supplementary composite figures (PNG / TIFF) + </w:t>
+            </w:r>
+            <w:r>
+              <w:rPr>
+                <w:rStyle w:val="VerbatimChar"/>
+              </w:rPr>
+              <w:t>supplementary_tables.xlsx</w:t>
+            </w:r>
+          </w:p>
+        </w:tc>
+      </w:tr>
+      <w:tr>
+        <w:tc>
+          <w:tcPr>
+            <w:tcW w:w="0" w:type="auto"/>
+          </w:tcPr>
+          <w:p>
+            <w:pPr>
+              <w:pStyle w:val="Compact"/>
+            </w:pPr>
+            <w:r>
+              <w:t>manifest</w:t>
+            </w:r>
+          </w:p>
+        </w:tc>
+        <w:tc>
+          <w:tcPr>
+            <w:tcW w:w="0" w:type="auto"/>
+          </w:tcPr>
+          <w:p>
+            <w:pPr>
+              <w:pStyle w:val="Compact"/>
+              <w:rPr>
+                <w:lang w:val="es-ES"/>
+              </w:rPr>
+            </w:pPr>
+            <w:r>
+              <w:rPr>
+                <w:rStyle w:val="VerbatimChar"/>
+              </w:rPr>
+              <w:t xml:space="preserve">manifest.json</w:t>
+            </w:r>
+            <w:r>
+              <w:t xml:space="preserve"> (contract v1.2; 69 kB)</w:t>
+            </w:r>
+          </w:p>
+        </w:tc>
+        <w:tc>
+          <w:tcPr>
+            <w:tcW w:w="0" w:type="auto"/>
+          </w:tcPr>
+          <w:p>
+            <w:pPr>
+              <w:pStyle w:val="Compact"/>
+              <w:rPr>
+                <w:lang w:val="es-ES"/>
+              </w:rPr>
+            </w:pPr>
+            <w:r>
+              <w:rPr>
+                <w:rStyle w:val="VerbatimChar"/>
+              </w:rPr>
+              <w:t xml:space="preserve">manifest.json</w:t>
+            </w:r>
+            <w:r>
+              <w:t xml:space="preserve"> (contract v1.2; 79 kB)</w:t>
+            </w:r>
+          </w:p>
+        </w:tc>
+      </w:tr>
+      <w:tr>
+        <w:tc>
+          <w:tcPr>
+            <w:tcW w:w="0" w:type="auto"/>
+          </w:tcPr>
+          <w:p>
+            <w:pPr>
+              <w:pStyle w:val="Compact"/>
+            </w:pPr>
+            <w:r>
+              <w:t>report</w:t>
+            </w:r>
+          </w:p>
+        </w:tc>
+        <w:tc>
+          <w:tcPr>
+            <w:tcW w:w="0" w:type="auto"/>
+          </w:tcPr>
+          <w:p>
+            <w:pPr>
+              <w:pStyle w:val="Compact"/>
+            </w:pPr>
+            <w:r>
+              <w:t>Quarto dashboard HTML (~12 MB)</w:t>
+            </w:r>
+          </w:p>
+        </w:tc>
+        <w:tc>
+          <w:tcPr>
+            <w:tcW w:w="0" w:type="auto"/>
+          </w:tcPr>
+          <w:p>
+            <w:pPr>
+              <w:pStyle w:val="Compact"/>
+            </w:pPr>
+            <w:r>
+              <w:t>Quarto dashboard HTML (~15 MB)</w:t>
+            </w:r>
+          </w:p>
+        </w:tc>
+      </w:tr>
+    </w:tbl>
+    <w:p>
+      <w:pPr>
         <w:pStyle w:val="Heading2"/>
-        <w:jc w:val="both"/>
-      </w:pPr>
-      <w:bookmarkStart w:id="5" w:name="X50c7748aa6d421f569a5daf2425c9e7043a6cad"/>
-      <w:bookmarkEnd w:id="4"/>
+      </w:pPr>
+      <w:bookmarkStart w:id="7" w:name="X50c7748aa6d421f569a5daf2425c9e7043a6cad"/>
+      <w:bookmarkEnd w:id="5"/>
       <w:r>
         <w:t>4 Conclusion</w:t>
       </w:r>
@@ -2619,15 +2819,12 @@
         <w:jc w:val="both"/>
       </w:pPr>
       <w:r>
-        <w:t>MERIDIAN integrates community analyses, functional profiling, and an integrated network reconstruction into a single configuration-driven R workflow for long-read shotgun metagenomics. Single-thread end-to-end execution completes in minutes with a low memory footprint, scaling sublinearly with cohort size and grouping complexity. Beyond the development cohorts, it has been applied without modification to two independent public cohorts spanning the One Health continuum (hospital wastewater and wetland surveillance). It remains under active development, and we are releasing this first tagged version (v1.0.0) to solicit feedback from researchers conducting comparable long-read metagenomic studies and to guide future development of the workflow.</w:t>
-      </w:r>
-    </w:p>
-    <w:p>
-      <w:pPr>
-        <w:jc w:val="both"/>
-      </w:pPr>
-      <w:r>
-        <w:pict w14:anchorId="2880B762">
+        <w:t>MERIDIAN integrates community analyses, functional profiling, and an integrated network reconstruction into a single configuration-driven R workflow for long-read shotgun metagenomics. Single-thread end-to-end execution completes in minutes with a low memory footprint, scaling sublinearly with cohort size and grouping complexity. Beyond the development cohorts, we applied it without modification to two independent public cohorts spanning the One Health continuum (hospital wastewater and wetland surveillance). We release MERIDIAN v1.2.0 for researchers conducting comparable long-read metagenomic studies and to guide future workflow development.</w:t>
+      </w:r>
+    </w:p>
+    <w:p>
+      <w:r>
+        <w:pict w14:anchorId="5DAF3D92">
           <v:rect id="_x0000_i1027" style="width:0;height:1.5pt" o:hralign="center" o:hrstd="t" o:hr="t"/>
         </w:pict>
       </w:r>
@@ -2658,21 +2855,78 @@
         <w:t xml:space="preserve">, which generated the chicken caecum metagenomics datasets used to develop and validate the pipeline. We are grateful to </w:t>
       </w:r>
       <w:r>
+        <w:t>colleagues</w:t>
+      </w:r>
+      <w:r>
+        <w:t xml:space="preserve"> for </w:t>
+      </w:r>
+      <w:r>
+        <w:lastRenderedPageBreak/>
+        <w:t xml:space="preserve">feedback on the configuration interface and Quarto report layout, and to the School of Medicine and Bioscience at the University of West London for hosting the project. </w:t>
+      </w:r>
+    </w:p>
+    <w:p>
+      <w:pPr>
+        <w:pStyle w:val="BodyText"/>
+        <w:jc w:val="both"/>
+      </w:pPr>
+      <w:r>
         <w:rPr>
           <w:b/>
           <w:bCs/>
         </w:rPr>
-        <w:t>colleagues</w:t>
-      </w:r>
-      <w:r>
-        <w:t xml:space="preserve"> for feedback on the configuration interface and Quarto report layout, and to the School of Medicine and Bioscience at the University of West London for hosting the project. </w:t>
-      </w:r>
+        <w:t xml:space="preserve">Ethics Statement. </w:t>
+      </w:r>
+      <w:r>
+        <w:t>The metagenomic datasets used to develop and validate MERIDIAN were generated in prior animal studies; MERIDIAN performs only secondary computational analysis of previously generated sequence data and involved no new animal, human or clinical sampling. All animal procedures were conducted in accordance with the UK Animals (Scientific Procedures) Act 1986. The primary validation cohort (</w:t>
+      </w:r>
+      <w:r>
+        <w:rPr>
+          <w:rStyle w:val="VerbatimChar"/>
+        </w:rPr>
+        <w:t>Chicken batch 1</w:t>
+      </w:r>
+      <w:r>
+        <w:t>) was approved by the SRUC Ethical Review Committee (Scotland's Rural College, Edinburgh; approval AEX 2024-021POU), and the second cohort (</w:t>
+      </w:r>
+      <w:r>
+        <w:rPr>
+          <w:rStyle w:val="VerbatimChar"/>
+        </w:rPr>
+        <w:t>Chicken batch 2</w:t>
+      </w:r>
+      <w:r>
+        <w:t>) under SRUC approval AEX2025-006 POU; birds were humanely euthanised in accordance with UK Home Office Schedule 1 procedures.</w:t>
+      </w:r>
+    </w:p>
+    <w:p>
+      <w:pPr>
+        <w:pStyle w:val="BodyText"/>
+      </w:pPr>
       <w:r>
         <w:rPr>
           <w:b/>
           <w:bCs/>
         </w:rPr>
-        <w:t>[Optional: compute providers — e.g. UWL / UCL HPC, cloud credits.]</w:t>
+        <w:t>Funding.</w:t>
+      </w:r>
+      <w:r>
+        <w:t xml:space="preserve"> This study was funded by a Vice-Chancellor scholarship provided by the University of West London.</w:t>
+      </w:r>
+    </w:p>
+    <w:p>
+      <w:pPr>
+        <w:pStyle w:val="BodyText"/>
+      </w:pPr>
+      <w:r>
+        <w:rPr>
+          <w:b/>
+          <w:bCs/>
+        </w:rPr>
+        <w:t>Conflict of Interest.</w:t>
+      </w:r>
+      <w:r>
+        <w:t xml:space="preserve"> The authors declare that they have no competing interests.</w:t>
       </w:r>
     </w:p>
     <w:p>
@@ -2680,82 +2934,31 @@
         <w:pStyle w:val="BodyText"/>
         <w:jc w:val="both"/>
       </w:pPr>
+      <w:commentRangeStart w:id="8"/>
       <w:r>
         <w:rPr>
           <w:b/>
           <w:bCs/>
         </w:rPr>
-        <w:t xml:space="preserve">Ethics Statement. </w:t>
-      </w:r>
-      <w:r>
-        <w:t>The metagenomic datasets used to develop and validate MERIDIAN were generated in prior animal studies; MERIDIAN performs only secondary computational analysis of previously generated sequence data and involved no new animal, human or clinical sampling. All animal procedures were conducted in accordance with the UK Animals (Scientific Procedures) Act 1986. The primary validation cohort (</w:t>
-      </w:r>
-      <w:r>
-        <w:rPr>
-          <w:rStyle w:val="VerbatimChar"/>
-        </w:rPr>
-        <w:t>Chicken batch 1</w:t>
-      </w:r>
-      <w:r>
-        <w:t>) was approved by the SRUC Ethical Review Committee (Scotland's Rural College, Edinburgh; approval AEX 2024-021POU), and the second cohort (</w:t>
-      </w:r>
-      <w:r>
-        <w:rPr>
-          <w:rStyle w:val="VerbatimChar"/>
-        </w:rPr>
-        <w:t>Chicken batch 2</w:t>
-      </w:r>
-      <w:r>
-        <w:t xml:space="preserve">) under </w:t>
-      </w:r>
-      <w:r>
-        <w:lastRenderedPageBreak/>
-        <w:t>SRUC approval AEX2025-006 POU; birds were humanely euthanised in accordance with UK Home Office Schedule 1 procedures.</w:t>
-      </w:r>
-    </w:p>
-    <w:p>
-      <w:pPr>
-        <w:pStyle w:val="BodyText"/>
-        <w:jc w:val="both"/>
-      </w:pPr>
-      <w:r>
-        <w:rPr>
+        <w:t>Data Availability</w:t>
+      </w:r>
+      <w:commentRangeEnd w:id="8"/>
+      <w:r>
+        <w:rPr>
+          <w:rStyle w:val="CommentReference"/>
           <w:b/>
           <w:bCs/>
-        </w:rPr>
-        <w:t>Funding.</w:t>
-      </w:r>
-      <w:r>
-        <w:t xml:space="preserve"> This study was funded by a Vice-Chancellor scholarship provided by the University of West London.</w:t>
-      </w:r>
-    </w:p>
-    <w:p>
-      <w:pPr>
-        <w:pStyle w:val="BodyText"/>
-        <w:jc w:val="both"/>
-      </w:pPr>
+          <w:sz w:val="24"/>
+          <w:szCs w:val="24"/>
+        </w:rPr>
+        <w:commentReference w:id="8"/>
+      </w:r>
       <w:r>
         <w:rPr>
           <w:b/>
           <w:bCs/>
         </w:rPr>
-        <w:t>Conflict of Interest.</w:t>
-      </w:r>
-      <w:r>
-        <w:t xml:space="preserve"> The authors declare that they have no competing interests.</w:t>
-      </w:r>
-    </w:p>
-    <w:p>
-      <w:pPr>
-        <w:pStyle w:val="BodyText"/>
-        <w:jc w:val="both"/>
-      </w:pPr>
-      <w:r>
-        <w:rPr>
-          <w:b/>
-          <w:bCs/>
-        </w:rPr>
-        <w:t>Data Availability.</w:t>
+        <w:t>.</w:t>
       </w:r>
       <w:r>
         <w:t xml:space="preserve"> Sequence data for the primary validation cohort (</w:t>
@@ -2767,16 +2970,40 @@
         <w:t>Chicken batch 1</w:t>
       </w:r>
       <w:r>
-        <w:t>) are available from NCBI under BioProject PRJNA1406192. Data for the second cohort (</w:t>
-      </w:r>
-      <w:r>
-        <w:rPr>
-          <w:rStyle w:val="VerbatimChar"/>
-        </w:rPr>
-        <w:t>Chicken batch 2</w:t>
-      </w:r>
-      <w:r>
-        <w:t xml:space="preserve">) will be released upon publication of the associated study. The MERIDIAN source code, documentation, container image and configuration examples are available at </w:t>
+        <w:t xml:space="preserve">) are available from NCBI under BioProject PRJNA1406192. </w:t>
+      </w:r>
+      <w:commentRangeStart w:id="9"/>
+      <w:r>
+        <w:t>Sequence data for the second cohort (Chicken batch 2) are deposited under the same BioProject</w:t>
+      </w:r>
+      <w:commentRangeEnd w:id="9"/>
+      <w:r>
+        <w:rPr>
+          <w:rStyle w:val="CommentReference"/>
+          <w:sz w:val="24"/>
+          <w:szCs w:val="24"/>
+        </w:rPr>
+        <w:commentReference w:id="9"/>
+      </w:r>
+      <w:r>
+        <w:t xml:space="preserve">.</w:t>
+      </w:r>
+      <w:ins w:id="300000" w:author="Julio Cesar Ortega Cambara" w:date="2026-10-30T12:30:00Z">
+        <w:r>
+          <w:t xml:space="preserve"> The two independent validation cohorts are publicly available from NCBI under BioProject PRJNA1266479 (hospital wastewater and tap water [17]) and from ENA under BioProject PRJEB96272 (East Atlantic Flyway wetlands [18]); the configuration files used for all four cohorts are distributed in the repository's </w:t>
+        </w:r>
+        <w:r>
+          <w:rPr>
+            <w:rStyle w:val="VerbatimChar"/>
+          </w:rPr>
+          <w:t xml:space="preserve">projects/</w:t>
+        </w:r>
+        <w:r>
+          <w:t xml:space="preserve"> directory.</w:t>
+        </w:r>
+      </w:ins>
+      <w:r>
+        <w:t xml:space="preserve"> The MERIDIAN source code, documentation, container image and configuration examples are available at </w:t>
       </w:r>
       <w:r>
         <w:rPr>
@@ -2785,15 +3012,12 @@
         <w:t>https://github.com/Julio92-C/meridian</w:t>
       </w:r>
       <w:r>
-        <w:t xml:space="preserve"> (release v1.0.0).</w:t>
-      </w:r>
-    </w:p>
-    <w:p>
-      <w:pPr>
-        <w:jc w:val="both"/>
-      </w:pPr>
-      <w:r>
-        <w:pict w14:anchorId="6D080543">
+        <w:t xml:space="preserve"> (release v1.2.0).</w:t>
+      </w:r>
+    </w:p>
+    <w:p>
+      <w:r>
+        <w:pict w14:anchorId="26D9DFD5">
           <v:rect id="_x0000_i1028" style="width:0;height:1.5pt" o:hralign="center" o:hrstd="t" o:hr="t"/>
         </w:pict>
       </w:r>
@@ -2801,10 +3025,9 @@
     <w:p>
       <w:pPr>
         <w:pStyle w:val="Heading2"/>
-        <w:jc w:val="both"/>
-      </w:pPr>
-      <w:bookmarkStart w:id="6" w:name="references"/>
-      <w:bookmarkEnd w:id="5"/>
+      </w:pPr>
+      <w:bookmarkStart w:id="10" w:name="references"/>
+      <w:bookmarkEnd w:id="7"/>
       <w:r>
         <w:t>References</w:t>
       </w:r>
@@ -2890,7 +3113,7 @@
       <w:r>
         <w:t xml:space="preserve">Seemann T. ABRicate: mass screening of contigs for antimicrobial and virulence genes. </w:t>
       </w:r>
-      <w:hyperlink r:id="rId9">
+      <w:hyperlink r:id="rId12">
         <w:r>
           <w:rPr>
             <w:rStyle w:val="Hyperlink"/>
@@ -2964,7 +3187,11 @@
         <w:t xml:space="preserve">Carattoli A, Zankari E, García-Fernández A, Voldby Larsen M, Lund O, Villa L, et al. </w:t>
       </w:r>
       <w:r>
-        <w:t xml:space="preserve">In silico detection and typing of plasmids using PlasmidFinder and plasmid multilocus sequence typing. </w:t>
+        <w:t xml:space="preserve">In silico detection and typing of plasmids using PlasmidFinder and plasmid multilocus </w:t>
+      </w:r>
+      <w:r>
+        <w:lastRenderedPageBreak/>
+        <w:t xml:space="preserve">sequence typing. </w:t>
       </w:r>
       <w:r>
         <w:rPr>
@@ -3023,7 +3250,6 @@
         <w:jc w:val="both"/>
       </w:pPr>
       <w:r>
-        <w:lastRenderedPageBreak/>
         <w:t xml:space="preserve">Fernandes AD, Reid JN, Macklaim JM, McMurrough TA, Edgell DR, Gloor GB. Unifying the analysis of high-throughput sequencing datasets: characterizing RNA-seq, 16S rRNA gene sequencing and selective growth experiments by compositional data analysis. </w:t>
       </w:r>
       <w:r>
@@ -3047,23 +3273,7 @@
         <w:jc w:val="both"/>
       </w:pPr>
       <w:r>
-        <w:rPr>
-          <w:lang w:val="es-ES"/>
-        </w:rPr>
-        <w:t xml:space="preserve">Li Y, Gao Y, Liu X, Mao Y, Wang M, Qin Y, et al. </w:t>
-      </w:r>
-      <w:r>
-        <w:t xml:space="preserve">Quantifying antibiotic resistome risks across environmental niches: the L-ARRAP for long-read metagenomic profiling. </w:t>
-      </w:r>
-      <w:r>
-        <w:rPr>
-          <w:i/>
-          <w:iCs/>
-        </w:rPr>
-        <w:t>Brief Bioinform</w:t>
-      </w:r>
-      <w:r>
-        <w:t xml:space="preserve"> 2025;26(5):bbaf535. doi:10.1093/bib/bbaf535.</w:t>
+        <w:t>Cambara JCO, Cuber P, Khattak F, Lebre PH, Galgano S, Houdijk J, Smallman D, Estridge P, Allen MJ, Short F, Sutcliffe M and Mkrtchyan HV (2026) Long-reads metagenomics reveals the effects of dulse supplementation on the poultry caecal bacteriome and its associated genetic repertoire. Front. Microbiol. 17:1868730. doi: 10.3389/fmicb.2026.1868730</w:t>
       </w:r>
     </w:p>
     <w:p>
@@ -3076,17 +3286,23 @@
         <w:jc w:val="both"/>
       </w:pPr>
       <w:r>
-        <w:t xml:space="preserve">Theil S, Rifa E. rANOMALY: AmplicoN wOrkflow for Microbial community AnaLYsis. </w:t>
+        <w:rPr>
+          <w:lang w:val="es-ES"/>
+        </w:rPr>
+        <w:t xml:space="preserve">Li Y, Gao Y, Liu X, Mao Y, Wang M, Qin Y, et al. </w:t>
+      </w:r>
+      <w:r>
+        <w:t xml:space="preserve">Quantifying antibiotic resistome risks across environmental niches: the L-ARRAP for long-read metagenomic profiling. </w:t>
       </w:r>
       <w:r>
         <w:rPr>
           <w:i/>
           <w:iCs/>
         </w:rPr>
-        <w:t>F1000Res</w:t>
-      </w:r>
-      <w:r>
-        <w:t xml:space="preserve"> 2021;10:7. doi:10.12688/f1000research.27268.1.</w:t>
+        <w:t>Brief Bioinform</w:t>
+      </w:r>
+      <w:r>
+        <w:t xml:space="preserve"> 2025;26(5):bbaf535. doi:10.1093/bib/bbaf535.</w:t>
       </w:r>
     </w:p>
     <w:p>
@@ -3099,18 +3315,17 @@
         <w:jc w:val="both"/>
       </w:pPr>
       <w:r>
-        <w:t xml:space="preserve">Allaire JJ, et al. Quarto. </w:t>
-      </w:r>
-      <w:hyperlink r:id="rId10">
-        <w:r>
-          <w:rPr>
-            <w:rStyle w:val="Hyperlink"/>
-          </w:rPr>
-          <w:t>https://quarto.org</w:t>
-        </w:r>
-      </w:hyperlink>
-      <w:r>
-        <w:t xml:space="preserve"> (accessed 2026-06-23).</w:t>
+        <w:t xml:space="preserve">Theil S, Rifa E. rANOMALY: AmplicoN wOrkflow for Microbial community AnaLYsis. </w:t>
+      </w:r>
+      <w:r>
+        <w:rPr>
+          <w:i/>
+          <w:iCs/>
+        </w:rPr>
+        <w:t>F1000Res</w:t>
+      </w:r>
+      <w:r>
+        <w:t xml:space="preserve"> 2021;10:7. doi:10.12688/f1000research.27268.1.</w:t>
       </w:r>
     </w:p>
     <w:p>
@@ -3123,9 +3338,56 @@
         <w:jc w:val="both"/>
       </w:pPr>
       <w:r>
+        <w:t xml:space="preserve">Csárdi G, Nepusz T. The igraph software package for complex network research. </w:t>
+      </w:r>
+      <w:r>
+        <w:rPr>
+          <w:i/>
+          <w:iCs/>
+        </w:rPr>
+        <w:t>InterJournal</w:t>
+      </w:r>
+      <w:r>
+        <w:t xml:space="preserve"> 2006;Complex Systems:1695. R package version 2.3.1; doi:10.5281/zenodo.7682609. </w:t>
+      </w:r>
+      <w:hyperlink r:id="rId13">
+        <w:r>
+          <w:rPr>
+            <w:rStyle w:val="Hyperlink"/>
+          </w:rPr>
+          <w:t>https://igraph.org</w:t>
+        </w:r>
+      </w:hyperlink>
+      <w:r>
+        <w:t>.</w:t>
+      </w:r>
+    </w:p>
+    <w:p>
+      <w:pPr>
+        <w:pStyle w:val="Compact"/>
+        <w:numPr>
+          <w:ilvl w:val="0"/>
+          <w:numId w:val="2"/>
+        </w:numPr>
+        <w:jc w:val="both"/>
+      </w:pPr>
+      <w:r>
+        <w:t>Allaire J, Teague C, Scheidegger C, Xie Y, Dervieux C. Quarto (v1.x). 2024. doi:10.5281/zenodo.5960048. https://quarto.org</w:t>
+      </w:r>
+    </w:p>
+    <w:p>
+      <w:pPr>
+        <w:pStyle w:val="Compact"/>
+        <w:numPr>
+          <w:ilvl w:val="0"/>
+          <w:numId w:val="2"/>
+        </w:numPr>
+        <w:jc w:val="both"/>
+      </w:pPr>
+      <w:r>
         <w:t xml:space="preserve">R Core Team. R: A Language and Environment for Statistical Computing (version 4.5.0). R Foundation for Statistical Computing, Vienna, 2025. </w:t>
       </w:r>
-      <w:hyperlink r:id="rId11">
+      <w:hyperlink r:id="rId14">
         <w:r>
           <w:rPr>
             <w:rStyle w:val="Hyperlink"/>
@@ -3147,16 +3409,16 @@
         <w:jc w:val="both"/>
       </w:pPr>
       <w:r>
-        <w:t xml:space="preserve">Pedersen TL. ggraph: An Implementation of </w:t>
-      </w:r>
-      <w:proofErr w:type="gramStart"/>
-      <w:r>
-        <w:t>Grammar of Graphics</w:t>
-      </w:r>
-      <w:proofErr w:type="gramEnd"/>
-      <w:r>
-        <w:t xml:space="preserve"> for Graphs and Networks. R package version 2.2.2, 2025. doi:10.32614/CRAN.package.ggraph.</w:t>
-      </w:r>
+        <w:t xml:space="preserve">Radwan, H. M., El Menofy, N. G., Tharwat, E. K., Mysara, M., &amp; Radwan, S. M. (2026). Metagenomic profiling of microbial communities and the resistome within Egyptian hospital wastewater and tap water. Scientific Reports, 16(1), 13894. </w:t>
+      </w:r>
+      <w:hyperlink r:id="rId15" w:history="1">
+        <w:r>
+          <w:rPr>
+            <w:rStyle w:val="Hyperlink"/>
+          </w:rPr>
+          <w:t>https://doi.org/10.1038/s41598-026-49481-4</w:t>
+        </w:r>
+      </w:hyperlink>
     </w:p>
     <w:p>
       <w:pPr>
@@ -3168,44 +3430,10 @@
         <w:jc w:val="both"/>
       </w:pPr>
       <w:r>
-        <w:t xml:space="preserve">Csárdi G, Nepusz T. The igraph software package for complex network research. </w:t>
-      </w:r>
-      <w:r>
-        <w:rPr>
-          <w:i/>
-          <w:iCs/>
-        </w:rPr>
-        <w:t>InterJournal</w:t>
-      </w:r>
-      <w:r>
-        <w:t xml:space="preserve"> 2006;Complex Systems:1695. R package version 2.3.1; doi:10.5281/zenodo.7682609. </w:t>
-      </w:r>
-      <w:hyperlink r:id="rId12">
-        <w:r>
-          <w:rPr>
-            <w:rStyle w:val="Hyperlink"/>
-          </w:rPr>
-          <w:t>https://igraph.org</w:t>
-        </w:r>
-      </w:hyperlink>
-      <w:r>
-        <w:t>.</w:t>
-      </w:r>
-    </w:p>
-    <w:p>
-      <w:pPr>
-        <w:pStyle w:val="Compact"/>
-        <w:numPr>
-          <w:ilvl w:val="0"/>
-          <w:numId w:val="2"/>
-        </w:numPr>
-        <w:jc w:val="both"/>
-      </w:pPr>
-      <w:r>
-        <w:t>Allaire JJ, Gandrud C, Russell K, Yetman C. networkD3: D3 JavaScript Network Graphs from R. R package version 0.4.1, 2025. doi:10.32614/CRAN.package.networkD3.</w:t>
+        <w:t>Perlas A, Reska T, Sánchez-Cano A, Mejías-Molina C, Gygax D, Martínez-Puchol S, Rusiñol M, Eger E, Schaufler K, Höfle U, Croville G, Le Loc'h G, Guérin J, Urban L.2026.Real-time genomic pathogen, resistance, and host range characterization from passive water sampling of wetland ecosystems. Appl Environ Microbiol92:e02543-25.https://doi.org/10.1128/aem.02543-25</w:t>
       </w:r>
       <w:bookmarkEnd w:id="0"/>
-      <w:bookmarkEnd w:id="6"/>
+      <w:bookmarkEnd w:id="10"/>
     </w:p>
     <w:sectPr>
       <w:footnotePr>
@@ -3213,10 +3441,107 @@
       </w:footnotePr>
       <w:pgSz w:w="12240" w:h="15840"/>
       <w:pgMar w:top="1440" w:right="1440" w:bottom="1440" w:left="1440" w:header="720" w:footer="720" w:gutter="0"/>
+      <w:lnNumType w:countBy="1" w:restart="continuous"/>
       <w:cols w:space="720"/>
     </w:sectPr>
   </w:body>
 </w:document>
+</file>
+
+<file path=word/comments.xml><?xml version="1.0" encoding="utf-8"?>
+<w:comments xmlns:wpc="http://schemas.microsoft.com/office/word/2010/wordprocessingCanvas" xmlns:cx="http://schemas.microsoft.com/office/drawing/2014/chartex" xmlns:cx1="http://schemas.microsoft.com/office/drawing/2015/9/8/chartex" xmlns:cx2="http://schemas.microsoft.com/office/drawing/2015/10/21/chartex" xmlns:cx3="http://schemas.microsoft.com/office/drawing/2016/5/9/chartex" xmlns:cx4="http://schemas.microsoft.com/office/drawing/2016/5/10/chartex" xmlns:cx5="http://schemas.microsoft.com/office/drawing/2016/5/11/chartex" xmlns:cx6="http://schemas.microsoft.com/office/drawing/2016/5/12/chartex" xmlns:cx7="http://schemas.microsoft.com/office/drawing/2016/5/13/chartex" xmlns:cx8="http://schemas.microsoft.com/office/drawing/2016/5/14/chartex" xmlns:mc="http://schemas.openxmlformats.org/markup-compatibility/2006" xmlns:aink="http://schemas.microsoft.com/office/drawing/2016/ink" xmlns:am3d="http://schemas.microsoft.com/office/drawing/2017/model3d" xmlns:o="urn:schemas-microsoft-com:office:office" xmlns:oel="http://schemas.microsoft.com/office/2019/extlst" xmlns:r="http://schemas.openxmlformats.org/officeDocument/2006/relationships" xmlns:m="http://schemas.openxmlformats.org/officeDocument/2006/math" xmlns:v="urn:schemas-microsoft-com:vml" xmlns:wp14="http://schemas.microsoft.com/office/word/2010/wordprocessingDrawing" xmlns:wp="http://schemas.openxmlformats.org/drawingml/2006/wordprocessingDrawing" xmlns:w10="urn:schemas-microsoft-com:office:word" xmlns:w="http://schemas.openxmlformats.org/wordprocessingml/2006/main" xmlns:w14="http://schemas.microsoft.com/office/word/2010/wordml" xmlns:w15="http://schemas.microsoft.com/office/word/2012/wordml" xmlns:w16cex="http://schemas.microsoft.com/office/word/2018/wordml/cex" xmlns:w16cid="http://schemas.microsoft.com/office/word/2016/wordml/cid" xmlns:w16="http://schemas.microsoft.com/office/word/2018/wordml" xmlns:w16du="http://schemas.microsoft.com/office/word/2023/wordml/word16du" xmlns:w16sdtdh="http://schemas.microsoft.com/office/word/2020/wordml/sdtdatahash" xmlns:w16sdtfl="http://schemas.microsoft.com/office/word/2024/wordml/sdtformatlock" xmlns:w16se="http://schemas.microsoft.com/office/word/2015/wordml/symex" xmlns:wpg="http://schemas.microsoft.com/office/word/2010/wordprocessingGroup" xmlns:wpi="http://schemas.microsoft.com/office/word/2010/wordprocessingInk" xmlns:wne="http://schemas.microsoft.com/office/word/2006/wordml" xmlns:wps="http://schemas.microsoft.com/office/word/2010/wordprocessingShape" mc:Ignorable="w14 w15 w16se w16cid w16 w16cex w16sdtdh w16sdtfl w16du wp14">
+  <w:comment w:id="3" w:author="Julio Cesar Ortega Cambara" w:date="2026-10-28T10:55:00Z" w:initials="JO">
+    <w:p>
+      <w:pPr>
+        <w:pStyle w:val="CommentText"/>
+      </w:pPr>
+      <w:r>
+        <w:rPr>
+          <w:rStyle w:val="CommentReference"/>
+        </w:rPr>
+        <w:annotationRef/>
+      </w:r>
+      <w:r>
+        <w:t>Does not match the rest of the document?</w:t>
+      </w:r>
+    </w:p>
+  </w:comment>
+  <w:comment w:id="6" w:author="Julio Cesar Ortega Cambara" w:date="2026-10-28T11:02:00Z" w:initials="JO">
+    <w:p>
+      <w:pPr>
+        <w:pStyle w:val="CommentText"/>
+      </w:pPr>
+      <w:r>
+        <w:rPr>
+          <w:rStyle w:val="CommentReference"/>
+        </w:rPr>
+        <w:annotationRef/>
+      </w:r>
+      <w:r>
+        <w:t>Is this not fixed already?</w:t>
+      </w:r>
+    </w:p>
+  </w:comment>
+  <w:comment w:id="8" w:author="Julio Cesar Ortega Cambara" w:date="2026-10-30T12:14:00Z" w:initials="JO">
+    <w:p>
+      <w:pPr>
+        <w:pStyle w:val="CommentText"/>
+      </w:pPr>
+      <w:r>
+        <w:rPr>
+          <w:rStyle w:val="CommentReference"/>
+        </w:rPr>
+        <w:annotationRef/>
+      </w:r>
+      <w:r>
+        <w:t>The validation cohort is missing from this statement</w:t>
+      </w:r>
+    </w:p>
+  </w:comment>
+  <w:comment w:id="9" w:author="Julio Cesar Ortega Cambara" w:date="2026-10-28T11:05:00Z" w:initials="JO">
+    <w:p>
+      <w:pPr>
+        <w:pStyle w:val="CommentText"/>
+      </w:pPr>
+      <w:r>
+        <w:rPr>
+          <w:rStyle w:val="CommentReference"/>
+        </w:rPr>
+        <w:annotationRef/>
+      </w:r>
+      <w:r>
+        <w:t>Check my comment above</w:t>
+      </w:r>
+    </w:p>
+  </w:comment>
+</w:comments>
+</file>
+
+<file path=word/commentsExtended.xml><?xml version="1.0" encoding="utf-8"?>
+<w15:commentsEx xmlns:wpc="http://schemas.microsoft.com/office/word/2010/wordprocessingCanvas" xmlns:cx="http://schemas.microsoft.com/office/drawing/2014/chartex" xmlns:cx1="http://schemas.microsoft.com/office/drawing/2015/9/8/chartex" xmlns:cx2="http://schemas.microsoft.com/office/drawing/2015/10/21/chartex" xmlns:cx3="http://schemas.microsoft.com/office/drawing/2016/5/9/chartex" xmlns:cx4="http://schemas.microsoft.com/office/drawing/2016/5/10/chartex" xmlns:cx5="http://schemas.microsoft.com/office/drawing/2016/5/11/chartex" xmlns:cx6="http://schemas.microsoft.com/office/drawing/2016/5/12/chartex" xmlns:cx7="http://schemas.microsoft.com/office/drawing/2016/5/13/chartex" xmlns:cx8="http://schemas.microsoft.com/office/drawing/2016/5/14/chartex" xmlns:mc="http://schemas.openxmlformats.org/markup-compatibility/2006" xmlns:aink="http://schemas.microsoft.com/office/drawing/2016/ink" xmlns:am3d="http://schemas.microsoft.com/office/drawing/2017/model3d" xmlns:o="urn:schemas-microsoft-com:office:office" xmlns:oel="http://schemas.microsoft.com/office/2019/extlst" xmlns:r="http://schemas.openxmlformats.org/officeDocument/2006/relationships" xmlns:m="http://schemas.openxmlformats.org/officeDocument/2006/math" xmlns:v="urn:schemas-microsoft-com:vml" xmlns:wp14="http://schemas.microsoft.com/office/word/2010/wordprocessingDrawing" xmlns:wp="http://schemas.openxmlformats.org/drawingml/2006/wordprocessingDrawing" xmlns:w10="urn:schemas-microsoft-com:office:word" xmlns:w="http://schemas.openxmlformats.org/wordprocessingml/2006/main" xmlns:w14="http://schemas.microsoft.com/office/word/2010/wordml" xmlns:w15="http://schemas.microsoft.com/office/word/2012/wordml" xmlns:w16cex="http://schemas.microsoft.com/office/word/2018/wordml/cex" xmlns:w16cid="http://schemas.microsoft.com/office/word/2016/wordml/cid" xmlns:w16="http://schemas.microsoft.com/office/word/2018/wordml" xmlns:w16du="http://schemas.microsoft.com/office/word/2023/wordml/word16du" xmlns:w16sdtdh="http://schemas.microsoft.com/office/word/2020/wordml/sdtdatahash" xmlns:w16sdtfl="http://schemas.microsoft.com/office/word/2024/wordml/sdtformatlock" xmlns:w16se="http://schemas.microsoft.com/office/word/2015/wordml/symex" xmlns:wpg="http://schemas.microsoft.com/office/word/2010/wordprocessingGroup" xmlns:wpi="http://schemas.microsoft.com/office/word/2010/wordprocessingInk" xmlns:wne="http://schemas.microsoft.com/office/word/2006/wordml" xmlns:wps="http://schemas.microsoft.com/office/word/2010/wordprocessingShape" mc:Ignorable="w14 w15 w16se w16cid w16 w16cex w16sdtdh w16sdtfl w16du wp14">
+  <w15:commentEx w15:paraId="74B9A283" w15:done="0"/>
+  <w15:commentEx w15:paraId="062BC674" w15:done="0"/>
+  <w15:commentEx w15:paraId="214B1A70" w15:done="0"/>
+  <w15:commentEx w15:paraId="1081C0A6" w15:done="0"/>
+</w15:commentsEx>
+</file>
+
+<file path=word/commentsExtensible.xml><?xml version="1.0" encoding="utf-8"?>
+<w16cex:commentsExtensible xmlns:wpc="http://schemas.microsoft.com/office/word/2010/wordprocessingCanvas" xmlns:cx="http://schemas.microsoft.com/office/drawing/2014/chartex" xmlns:cx1="http://schemas.microsoft.com/office/drawing/2015/9/8/chartex" xmlns:cx2="http://schemas.microsoft.com/office/drawing/2015/10/21/chartex" xmlns:cx3="http://schemas.microsoft.com/office/drawing/2016/5/9/chartex" xmlns:cx4="http://schemas.microsoft.com/office/drawing/2016/5/10/chartex" xmlns:cx5="http://schemas.microsoft.com/office/drawing/2016/5/11/chartex" xmlns:cx6="http://schemas.microsoft.com/office/drawing/2016/5/12/chartex" xmlns:cx7="http://schemas.microsoft.com/office/drawing/2016/5/13/chartex" xmlns:cx8="http://schemas.microsoft.com/office/drawing/2016/5/14/chartex" xmlns:cr="http://schemas.microsoft.com/office/comments/2020/reactions" xmlns:mc="http://schemas.openxmlformats.org/markup-compatibility/2006" xmlns:aink="http://schemas.microsoft.com/office/drawing/2016/ink" xmlns:am3d="http://schemas.microsoft.com/office/drawing/2017/model3d" xmlns:o="urn:schemas-microsoft-com:office:office" xmlns:oel="http://schemas.microsoft.com/office/2019/extlst" xmlns:r="http://schemas.openxmlformats.org/officeDocument/2006/relationships" xmlns:m="http://schemas.openxmlformats.org/officeDocument/2006/math" xmlns:rd="http://schemas.microsoft.com/office/reactions/2026/reactionDetails" xmlns:v="urn:schemas-microsoft-com:vml" xmlns:wp14="http://schemas.microsoft.com/office/word/2010/wordprocessingDrawing" xmlns:wp="http://schemas.openxmlformats.org/drawingml/2006/wordprocessingDrawing" xmlns:w10="urn:schemas-microsoft-com:office:word" xmlns:w="http://schemas.openxmlformats.org/wordprocessingml/2006/main" xmlns:w14="http://schemas.microsoft.com/office/word/2010/wordml" xmlns:w15="http://schemas.microsoft.com/office/word/2012/wordml" xmlns:w16cei="http://schemas.microsoft.com/office/word/2026/wordml/cei" xmlns:w16cex="http://schemas.microsoft.com/office/word/2018/wordml/cex" xmlns:w16cid="http://schemas.microsoft.com/office/word/2016/wordml/cid" xmlns:w16="http://schemas.microsoft.com/office/word/2018/wordml" xmlns:w16du="http://schemas.microsoft.com/office/word/2023/wordml/word16du" xmlns:w16sdtdh="http://schemas.microsoft.com/office/word/2020/wordml/sdtdatahash" xmlns:w16sdtfl="http://schemas.microsoft.com/office/word/2024/wordml/sdtformatlock" xmlns:w16se="http://schemas.microsoft.com/office/word/2015/wordml/symex" xmlns:wpg="http://schemas.microsoft.com/office/word/2010/wordprocessingGroup" xmlns:wpi="http://schemas.microsoft.com/office/word/2010/wordprocessingInk" xmlns:wne="http://schemas.microsoft.com/office/word/2006/wordml" xmlns:wps="http://schemas.microsoft.com/office/word/2010/wordprocessingShape" mc:Ignorable="w14 w15 w16se w16cid w16 w16cex w16sdtdh w16sdtfl cr w16cei rd w16du wp14">
+  <w16cex:commentExtensible w16cex:durableId="7F314DEE" w16cex:dateUtc="2026-10-28T10:55:00Z"/>
+  <w16cex:commentExtensible w16cex:durableId="7C60D37D" w16cex:dateUtc="2026-10-28T11:02:00Z"/>
+  <w16cex:commentExtensible w16cex:durableId="2B144E78" w16cex:dateUtc="2026-10-30T12:14:00Z"/>
+  <w16cex:commentExtensible w16cex:durableId="2E8D0A25" w16cex:dateUtc="2026-10-28T11:05:00Z"/>
+</w16cex:commentsExtensible>
+</file>
+
+<file path=word/commentsIds.xml><?xml version="1.0" encoding="utf-8"?>
+<w16cid:commentsIds xmlns:wpc="http://schemas.microsoft.com/office/word/2010/wordprocessingCanvas" xmlns:cx="http://schemas.microsoft.com/office/drawing/2014/chartex" xmlns:cx1="http://schemas.microsoft.com/office/drawing/2015/9/8/chartex" xmlns:cx2="http://schemas.microsoft.com/office/drawing/2015/10/21/chartex" xmlns:cx3="http://schemas.microsoft.com/office/drawing/2016/5/9/chartex" xmlns:cx4="http://schemas.microsoft.com/office/drawing/2016/5/10/chartex" xmlns:cx5="http://schemas.microsoft.com/office/drawing/2016/5/11/chartex" xmlns:cx6="http://schemas.microsoft.com/office/drawing/2016/5/12/chartex" xmlns:cx7="http://schemas.microsoft.com/office/drawing/2016/5/13/chartex" xmlns:cx8="http://schemas.microsoft.com/office/drawing/2016/5/14/chartex" xmlns:mc="http://schemas.openxmlformats.org/markup-compatibility/2006" xmlns:aink="http://schemas.microsoft.com/office/drawing/2016/ink" xmlns:am3d="http://schemas.microsoft.com/office/drawing/2017/model3d" xmlns:o="urn:schemas-microsoft-com:office:office" xmlns:oel="http://schemas.microsoft.com/office/2019/extlst" xmlns:r="http://schemas.openxmlformats.org/officeDocument/2006/relationships" xmlns:m="http://schemas.openxmlformats.org/officeDocument/2006/math" xmlns:v="urn:schemas-microsoft-com:vml" xmlns:wp14="http://schemas.microsoft.com/office/word/2010/wordprocessingDrawing" xmlns:wp="http://schemas.openxmlformats.org/drawingml/2006/wordprocessingDrawing" xmlns:w10="urn:schemas-microsoft-com:office:word" xmlns:w="http://schemas.openxmlformats.org/wordprocessingml/2006/main" xmlns:w14="http://schemas.microsoft.com/office/word/2010/wordml" xmlns:w15="http://schemas.microsoft.com/office/word/2012/wordml" xmlns:w16cex="http://schemas.microsoft.com/office/word/2018/wordml/cex" xmlns:w16cid="http://schemas.microsoft.com/office/word/2016/wordml/cid" xmlns:w16="http://schemas.microsoft.com/office/word/2018/wordml" xmlns:w16du="http://schemas.microsoft.com/office/word/2023/wordml/word16du" xmlns:w16sdtdh="http://schemas.microsoft.com/office/word/2020/wordml/sdtdatahash" xmlns:w16sdtfl="http://schemas.microsoft.com/office/word/2024/wordml/sdtformatlock" xmlns:w16se="http://schemas.microsoft.com/office/word/2015/wordml/symex" xmlns:wpg="http://schemas.microsoft.com/office/word/2010/wordprocessingGroup" xmlns:wpi="http://schemas.microsoft.com/office/word/2010/wordprocessingInk" xmlns:wne="http://schemas.microsoft.com/office/word/2006/wordml" xmlns:wps="http://schemas.microsoft.com/office/word/2010/wordprocessingShape" mc:Ignorable="w14 w15 w16se w16cid w16 w16cex w16sdtdh w16sdtfl w16du wp14">
+  <w16cid:commentId w16cid:paraId="74B9A283" w16cid:durableId="7F314DEE"/>
+  <w16cid:commentId w16cid:paraId="062BC674" w16cid:durableId="7C60D37D"/>
+  <w16cid:commentId w16cid:paraId="214B1A70" w16cid:durableId="2B144E78"/>
+  <w16cid:commentId w16cid:paraId="1081C0A6" w16cid:durableId="2E8D0A25"/>
+</w16cid:commentsIds>
 </file>
 
 <file path=word/numbering.xml><?xml version="1.0" encoding="utf-8"?>
@@ -3224,7 +3549,7 @@
   <w:abstractNum w:abstractNumId="0" w15:restartNumberingAfterBreak="0">
     <w:nsid w:val="0000A990"/>
     <w:multiLevelType w:val="multilevel"/>
-    <w:tmpl w:val="A5ECC000"/>
+    <w:tmpl w:val="AB8CC32C"/>
     <w:lvl w:ilvl="0">
       <w:numFmt w:val="bullet"/>
       <w:lvlText w:val=" "/>
@@ -3301,7 +3626,7 @@
   <w:abstractNum w:abstractNumId="1" w15:restartNumberingAfterBreak="0">
     <w:nsid w:val="00A99411"/>
     <w:multiLevelType w:val="multilevel"/>
-    <w:tmpl w:val="BCB62A2E"/>
+    <w:tmpl w:val="34445F52"/>
     <w:lvl w:ilvl="0">
       <w:start w:val="1"/>
       <w:numFmt w:val="decimal"/>
@@ -3384,10 +3709,10 @@
       </w:pPr>
     </w:lvl>
   </w:abstractNum>
-  <w:num w:numId="1" w16cid:durableId="1388723488">
+  <w:num w:numId="1" w16cid:durableId="1096632700">
     <w:abstractNumId w:val="0"/>
   </w:num>
-  <w:num w:numId="2" w16cid:durableId="147523807">
+  <w:num w:numId="2" w16cid:durableId="68239326">
     <w:abstractNumId w:val="1"/>
     <w:lvlOverride w:ilvl="0">
       <w:startOverride w:val="1"/>
@@ -3418,6 +3743,14 @@
     </w:lvlOverride>
   </w:num>
 </w:numbering>
+</file>
+
+<file path=word/people.xml><?xml version="1.0" encoding="utf-8"?>
+<w15:people xmlns:wpc="http://schemas.microsoft.com/office/word/2010/wordprocessingCanvas" xmlns:cx="http://schemas.microsoft.com/office/drawing/2014/chartex" xmlns:cx1="http://schemas.microsoft.com/office/drawing/2015/9/8/chartex" xmlns:cx2="http://schemas.microsoft.com/office/drawing/2015/10/21/chartex" xmlns:cx3="http://schemas.microsoft.com/office/drawing/2016/5/9/chartex" xmlns:cx4="http://schemas.microsoft.com/office/drawing/2016/5/10/chartex" xmlns:cx5="http://schemas.microsoft.com/office/drawing/2016/5/11/chartex" xmlns:cx6="http://schemas.microsoft.com/office/drawing/2016/5/12/chartex" xmlns:cx7="http://schemas.microsoft.com/office/drawing/2016/5/13/chartex" xmlns:cx8="http://schemas.microsoft.com/office/drawing/2016/5/14/chartex" xmlns:mc="http://schemas.openxmlformats.org/markup-compatibility/2006" xmlns:aink="http://schemas.microsoft.com/office/drawing/2016/ink" xmlns:am3d="http://schemas.microsoft.com/office/drawing/2017/model3d" xmlns:o="urn:schemas-microsoft-com:office:office" xmlns:oel="http://schemas.microsoft.com/office/2019/extlst" xmlns:r="http://schemas.openxmlformats.org/officeDocument/2006/relationships" xmlns:m="http://schemas.openxmlformats.org/officeDocument/2006/math" xmlns:v="urn:schemas-microsoft-com:vml" xmlns:wp14="http://schemas.microsoft.com/office/word/2010/wordprocessingDrawing" xmlns:wp="http://schemas.openxmlformats.org/drawingml/2006/wordprocessingDrawing" xmlns:w10="urn:schemas-microsoft-com:office:word" xmlns:w="http://schemas.openxmlformats.org/wordprocessingml/2006/main" xmlns:w14="http://schemas.microsoft.com/office/word/2010/wordml" xmlns:w15="http://schemas.microsoft.com/office/word/2012/wordml" xmlns:w16cex="http://schemas.microsoft.com/office/word/2018/wordml/cex" xmlns:w16cid="http://schemas.microsoft.com/office/word/2016/wordml/cid" xmlns:w16="http://schemas.microsoft.com/office/word/2018/wordml" xmlns:w16du="http://schemas.microsoft.com/office/word/2023/wordml/word16du" xmlns:w16sdtdh="http://schemas.microsoft.com/office/word/2020/wordml/sdtdatahash" xmlns:w16sdtfl="http://schemas.microsoft.com/office/word/2024/wordml/sdtformatlock" xmlns:w16se="http://schemas.microsoft.com/office/word/2015/wordml/symex" xmlns:wpg="http://schemas.microsoft.com/office/word/2010/wordprocessingGroup" xmlns:wpi="http://schemas.microsoft.com/office/word/2010/wordprocessingInk" xmlns:wne="http://schemas.microsoft.com/office/word/2006/wordml" xmlns:wps="http://schemas.microsoft.com/office/word/2010/wordprocessingShape" mc:Ignorable="w14 w15 w16se w16cid w16 w16cex w16sdtdh w16sdtfl w16du wp14">
+  <w15:person w15:author="Julio Cesar Ortega Cambara">
+    <w15:presenceInfo w15:providerId="Windows Live" w15:userId="db8dff144a5e8650"/>
+  </w15:person>
+</w15:people>
 </file>
 
 <file path=word/styles.xml><?xml version="1.0" encoding="utf-8"?>
@@ -4629,13 +4962,82 @@
       <w:sz w:val="22"/>
     </w:rPr>
   </w:style>
+  <w:style w:type="character" w:styleId="UnresolvedMention">
+    <w:name w:val="Unresolved Mention"/>
+    <w:basedOn w:val="DefaultParagraphFont"/>
+    <w:uiPriority w:val="99"/>
+    <w:semiHidden/>
+    <w:unhideWhenUsed/>
+    <w:rsid w:val="0097703B"/>
+    <w:rPr>
+      <w:color w:val="605E5C"/>
+      <w:shd w:val="clear" w:color="auto" w:fill="E1DFDD"/>
+    </w:rPr>
+  </w:style>
+  <w:style w:type="character" w:styleId="LineNumber">
+    <w:name w:val="line number"/>
+    <w:basedOn w:val="DefaultParagraphFont"/>
+    <w:rsid w:val="00CE17CE"/>
+  </w:style>
   <w:style w:type="paragraph" w:styleId="Revision">
     <w:name w:val="Revision"/>
     <w:hidden/>
-    <w:rsid w:val="00F2255B"/>
+    <w:rsid w:val="00CE17CE"/>
     <w:pPr>
       <w:spacing w:after="0"/>
     </w:pPr>
+  </w:style>
+  <w:style w:type="character" w:styleId="CommentReference">
+    <w:name w:val="annotation reference"/>
+    <w:basedOn w:val="DefaultParagraphFont"/>
+    <w:rsid w:val="00CE17CE"/>
+    <w:rPr>
+      <w:sz w:val="16"/>
+      <w:szCs w:val="16"/>
+    </w:rPr>
+  </w:style>
+  <w:style w:type="paragraph" w:styleId="CommentText">
+    <w:name w:val="annotation text"/>
+    <w:basedOn w:val="Normal"/>
+    <w:link w:val="CommentTextChar"/>
+    <w:rsid w:val="00CE17CE"/>
+    <w:rPr>
+      <w:sz w:val="20"/>
+      <w:szCs w:val="20"/>
+    </w:rPr>
+  </w:style>
+  <w:style w:type="character" w:customStyle="1" w:styleId="CommentTextChar">
+    <w:name w:val="Comment Text Char"/>
+    <w:basedOn w:val="DefaultParagraphFont"/>
+    <w:link w:val="CommentText"/>
+    <w:rsid w:val="00CE17CE"/>
+    <w:rPr>
+      <w:sz w:val="20"/>
+      <w:szCs w:val="20"/>
+    </w:rPr>
+  </w:style>
+  <w:style w:type="paragraph" w:styleId="CommentSubject">
+    <w:name w:val="annotation subject"/>
+    <w:basedOn w:val="CommentText"/>
+    <w:next w:val="CommentText"/>
+    <w:link w:val="CommentSubjectChar"/>
+    <w:rsid w:val="00CE17CE"/>
+    <w:rPr>
+      <w:b/>
+      <w:bCs/>
+    </w:rPr>
+  </w:style>
+  <w:style w:type="character" w:customStyle="1" w:styleId="CommentSubjectChar">
+    <w:name w:val="Comment Subject Char"/>
+    <w:basedOn w:val="CommentTextChar"/>
+    <w:link w:val="CommentSubject"/>
+    <w:rsid w:val="00CE17CE"/>
+    <w:rPr>
+      <w:b/>
+      <w:bCs/>
+      <w:sz w:val="20"/>
+      <w:szCs w:val="20"/>
+    </w:rPr>
   </w:style>
 </w:styles>
 </file>

</xml_diff>

<commit_message>
docs(manuscript): accept Data Availability edit and clear resolved comments
Co-Authored-By: Claude Opus 5.5 <noreply@anthropic.com>
</commit_message>
<xml_diff>
--- a/docs/manuscript/applications_note.docx
+++ b/docs/manuscript/applications_note.docx
@@ -502,18 +502,8 @@
       <w:r>
         <w:t xml:space="preserve">To address this gap, we have developed </w:t>
       </w:r>
-      <w:commentRangeStart w:id="3"/>
       <w:r>
         <w:t>MERIDIAN, a configuration-driven</w:t>
-      </w:r>
-      <w:commentRangeEnd w:id="3"/>
-      <w:r>
-        <w:rPr>
-          <w:rStyle w:val="CommentReference"/>
-          <w:sz w:val="24"/>
-          <w:szCs w:val="24"/>
-        </w:rPr>
-        <w:commentReference w:id="3"/>
       </w:r>
       <w:r>
         <w:t xml:space="preserve"> R workflow. Here, we describe the workflow's design, current scope, and the real-data validation strategy enabling the assessment of its performance.</w:t>
@@ -1450,18 +1440,8 @@
       <w:r>
         <w:t xml:space="preserve"> key set is 0.82. For other stages with directly comparable ground-truth artefacts, sample-set agreement is exact for alpha diversity (18/18), and Jaccard for the network Gephi exports against the most recent hand-edited snapshot is 0.85 (nodes) and 0.87 (edges). Per-stage comparisons against the remaining hand-edited artefacts — taxonomy, beta diversity, and differential abundance — are deferred to a separate validation effort. </w:t>
       </w:r>
-      <w:commentRangeStart w:id="6"/>
       <w:r>
         <w:t>R/02 still parses Re-centrifuge reports with the original fixed-interval column slicing; a rank-aware parser is planned</w:t>
-      </w:r>
-      <w:commentRangeEnd w:id="6"/>
-      <w:r>
-        <w:rPr>
-          <w:rStyle w:val="CommentReference"/>
-          <w:sz w:val="24"/>
-          <w:szCs w:val="24"/>
-        </w:rPr>
-        <w:commentReference w:id="6"/>
       </w:r>
       <w:r>
         <w:t>.</w:t>
@@ -2934,7 +2914,6 @@
         <w:pStyle w:val="BodyText"/>
         <w:jc w:val="both"/>
       </w:pPr>
-      <w:commentRangeStart w:id="8"/>
       <w:r>
         <w:rPr>
           <w:b/>
@@ -2942,21 +2921,10 @@
         </w:rPr>
         <w:t>Data Availability</w:t>
       </w:r>
-      <w:commentRangeEnd w:id="8"/>
-      <w:r>
-        <w:rPr>
-          <w:rStyle w:val="CommentReference"/>
+      <w:r>
+        <w:rPr>
           <w:b/>
           <w:bCs/>
-          <w:sz w:val="24"/>
-          <w:szCs w:val="24"/>
-        </w:rPr>
-        <w:commentReference w:id="8"/>
-      </w:r>
-      <w:r>
-        <w:rPr>
-          <w:b/>
-          <w:bCs/>
         </w:rPr>
         <w:t>.</w:t>
       </w:r>
@@ -2972,36 +2940,24 @@
       <w:r>
         <w:t xml:space="preserve">) are available from NCBI under BioProject PRJNA1406192. </w:t>
       </w:r>
-      <w:commentRangeStart w:id="9"/>
       <w:r>
         <w:t>Sequence data for the second cohort (Chicken batch 2) are deposited under the same BioProject</w:t>
       </w:r>
-      <w:commentRangeEnd w:id="9"/>
-      <w:r>
-        <w:rPr>
-          <w:rStyle w:val="CommentReference"/>
-          <w:sz w:val="24"/>
-          <w:szCs w:val="24"/>
-        </w:rPr>
-        <w:commentReference w:id="9"/>
-      </w:r>
       <w:r>
         <w:t xml:space="preserve">.</w:t>
       </w:r>
-      <w:ins w:id="300000" w:author="Julio Cesar Ortega Cambara" w:date="2026-10-30T12:30:00Z">
-        <w:r>
-          <w:t xml:space="preserve"> The two independent validation cohorts are publicly available from NCBI under BioProject PRJNA1266479 (hospital wastewater and tap water [17]) and from ENA under BioProject PRJEB96272 (East Atlantic Flyway wetlands [18]); the configuration files used for all four cohorts are distributed in the repository's </w:t>
-        </w:r>
-        <w:r>
-          <w:rPr>
-            <w:rStyle w:val="VerbatimChar"/>
-          </w:rPr>
-          <w:t xml:space="preserve">projects/</w:t>
-        </w:r>
-        <w:r>
-          <w:t xml:space="preserve"> directory.</w:t>
-        </w:r>
-      </w:ins>
+      <w:r>
+        <w:t xml:space="preserve"> The two independent validation cohorts are publicly available from NCBI under BioProject PRJNA1266479 (hospital wastewater and tap water [17]) and from ENA under BioProject PRJEB96272 (East Atlantic Flyway wetlands [18]); the configuration files used for all four cohorts are distributed in the repository's </w:t>
+      </w:r>
+      <w:r>
+        <w:rPr>
+          <w:rStyle w:val="VerbatimChar"/>
+        </w:rPr>
+        <w:t xml:space="preserve">projects/</w:t>
+      </w:r>
+      <w:r>
+        <w:t xml:space="preserve"> directory.</w:t>
+      </w:r>
       <w:r>
         <w:t xml:space="preserve"> The MERIDIAN source code, documentation, container image and configuration examples are available at </w:t>
       </w:r>
@@ -3446,102 +3402,6 @@
     </w:sectPr>
   </w:body>
 </w:document>
-</file>
-
-<file path=word/comments.xml><?xml version="1.0" encoding="utf-8"?>
-<w:comments xmlns:wpc="http://schemas.microsoft.com/office/word/2010/wordprocessingCanvas" xmlns:cx="http://schemas.microsoft.com/office/drawing/2014/chartex" xmlns:cx1="http://schemas.microsoft.com/office/drawing/2015/9/8/chartex" xmlns:cx2="http://schemas.microsoft.com/office/drawing/2015/10/21/chartex" xmlns:cx3="http://schemas.microsoft.com/office/drawing/2016/5/9/chartex" xmlns:cx4="http://schemas.microsoft.com/office/drawing/2016/5/10/chartex" xmlns:cx5="http://schemas.microsoft.com/office/drawing/2016/5/11/chartex" xmlns:cx6="http://schemas.microsoft.com/office/drawing/2016/5/12/chartex" xmlns:cx7="http://schemas.microsoft.com/office/drawing/2016/5/13/chartex" xmlns:cx8="http://schemas.microsoft.com/office/drawing/2016/5/14/chartex" xmlns:mc="http://schemas.openxmlformats.org/markup-compatibility/2006" xmlns:aink="http://schemas.microsoft.com/office/drawing/2016/ink" xmlns:am3d="http://schemas.microsoft.com/office/drawing/2017/model3d" xmlns:o="urn:schemas-microsoft-com:office:office" xmlns:oel="http://schemas.microsoft.com/office/2019/extlst" xmlns:r="http://schemas.openxmlformats.org/officeDocument/2006/relationships" xmlns:m="http://schemas.openxmlformats.org/officeDocument/2006/math" xmlns:v="urn:schemas-microsoft-com:vml" xmlns:wp14="http://schemas.microsoft.com/office/word/2010/wordprocessingDrawing" xmlns:wp="http://schemas.openxmlformats.org/drawingml/2006/wordprocessingDrawing" xmlns:w10="urn:schemas-microsoft-com:office:word" xmlns:w="http://schemas.openxmlformats.org/wordprocessingml/2006/main" xmlns:w14="http://schemas.microsoft.com/office/word/2010/wordml" xmlns:w15="http://schemas.microsoft.com/office/word/2012/wordml" xmlns:w16cex="http://schemas.microsoft.com/office/word/2018/wordml/cex" xmlns:w16cid="http://schemas.microsoft.com/office/word/2016/wordml/cid" xmlns:w16="http://schemas.microsoft.com/office/word/2018/wordml" xmlns:w16du="http://schemas.microsoft.com/office/word/2023/wordml/word16du" xmlns:w16sdtdh="http://schemas.microsoft.com/office/word/2020/wordml/sdtdatahash" xmlns:w16sdtfl="http://schemas.microsoft.com/office/word/2024/wordml/sdtformatlock" xmlns:w16se="http://schemas.microsoft.com/office/word/2015/wordml/symex" xmlns:wpg="http://schemas.microsoft.com/office/word/2010/wordprocessingGroup" xmlns:wpi="http://schemas.microsoft.com/office/word/2010/wordprocessingInk" xmlns:wne="http://schemas.microsoft.com/office/word/2006/wordml" xmlns:wps="http://schemas.microsoft.com/office/word/2010/wordprocessingShape" mc:Ignorable="w14 w15 w16se w16cid w16 w16cex w16sdtdh w16sdtfl w16du wp14">
-  <w:comment w:id="3" w:author="Julio Cesar Ortega Cambara" w:date="2026-10-28T10:55:00Z" w:initials="JO">
-    <w:p>
-      <w:pPr>
-        <w:pStyle w:val="CommentText"/>
-      </w:pPr>
-      <w:r>
-        <w:rPr>
-          <w:rStyle w:val="CommentReference"/>
-        </w:rPr>
-        <w:annotationRef/>
-      </w:r>
-      <w:r>
-        <w:t>Does not match the rest of the document?</w:t>
-      </w:r>
-    </w:p>
-  </w:comment>
-  <w:comment w:id="6" w:author="Julio Cesar Ortega Cambara" w:date="2026-10-28T11:02:00Z" w:initials="JO">
-    <w:p>
-      <w:pPr>
-        <w:pStyle w:val="CommentText"/>
-      </w:pPr>
-      <w:r>
-        <w:rPr>
-          <w:rStyle w:val="CommentReference"/>
-        </w:rPr>
-        <w:annotationRef/>
-      </w:r>
-      <w:r>
-        <w:t>Is this not fixed already?</w:t>
-      </w:r>
-    </w:p>
-  </w:comment>
-  <w:comment w:id="8" w:author="Julio Cesar Ortega Cambara" w:date="2026-10-30T12:14:00Z" w:initials="JO">
-    <w:p>
-      <w:pPr>
-        <w:pStyle w:val="CommentText"/>
-      </w:pPr>
-      <w:r>
-        <w:rPr>
-          <w:rStyle w:val="CommentReference"/>
-        </w:rPr>
-        <w:annotationRef/>
-      </w:r>
-      <w:r>
-        <w:t>The validation cohort is missing from this statement</w:t>
-      </w:r>
-    </w:p>
-  </w:comment>
-  <w:comment w:id="9" w:author="Julio Cesar Ortega Cambara" w:date="2026-10-28T11:05:00Z" w:initials="JO">
-    <w:p>
-      <w:pPr>
-        <w:pStyle w:val="CommentText"/>
-      </w:pPr>
-      <w:r>
-        <w:rPr>
-          <w:rStyle w:val="CommentReference"/>
-        </w:rPr>
-        <w:annotationRef/>
-      </w:r>
-      <w:r>
-        <w:t>Check my comment above</w:t>
-      </w:r>
-    </w:p>
-  </w:comment>
-</w:comments>
-</file>
-
-<file path=word/commentsExtended.xml><?xml version="1.0" encoding="utf-8"?>
-<w15:commentsEx xmlns:wpc="http://schemas.microsoft.com/office/word/2010/wordprocessingCanvas" xmlns:cx="http://schemas.microsoft.com/office/drawing/2014/chartex" xmlns:cx1="http://schemas.microsoft.com/office/drawing/2015/9/8/chartex" xmlns:cx2="http://schemas.microsoft.com/office/drawing/2015/10/21/chartex" xmlns:cx3="http://schemas.microsoft.com/office/drawing/2016/5/9/chartex" xmlns:cx4="http://schemas.microsoft.com/office/drawing/2016/5/10/chartex" xmlns:cx5="http://schemas.microsoft.com/office/drawing/2016/5/11/chartex" xmlns:cx6="http://schemas.microsoft.com/office/drawing/2016/5/12/chartex" xmlns:cx7="http://schemas.microsoft.com/office/drawing/2016/5/13/chartex" xmlns:cx8="http://schemas.microsoft.com/office/drawing/2016/5/14/chartex" xmlns:mc="http://schemas.openxmlformats.org/markup-compatibility/2006" xmlns:aink="http://schemas.microsoft.com/office/drawing/2016/ink" xmlns:am3d="http://schemas.microsoft.com/office/drawing/2017/model3d" xmlns:o="urn:schemas-microsoft-com:office:office" xmlns:oel="http://schemas.microsoft.com/office/2019/extlst" xmlns:r="http://schemas.openxmlformats.org/officeDocument/2006/relationships" xmlns:m="http://schemas.openxmlformats.org/officeDocument/2006/math" xmlns:v="urn:schemas-microsoft-com:vml" xmlns:wp14="http://schemas.microsoft.com/office/word/2010/wordprocessingDrawing" xmlns:wp="http://schemas.openxmlformats.org/drawingml/2006/wordprocessingDrawing" xmlns:w10="urn:schemas-microsoft-com:office:word" xmlns:w="http://schemas.openxmlformats.org/wordprocessingml/2006/main" xmlns:w14="http://schemas.microsoft.com/office/word/2010/wordml" xmlns:w15="http://schemas.microsoft.com/office/word/2012/wordml" xmlns:w16cex="http://schemas.microsoft.com/office/word/2018/wordml/cex" xmlns:w16cid="http://schemas.microsoft.com/office/word/2016/wordml/cid" xmlns:w16="http://schemas.microsoft.com/office/word/2018/wordml" xmlns:w16du="http://schemas.microsoft.com/office/word/2023/wordml/word16du" xmlns:w16sdtdh="http://schemas.microsoft.com/office/word/2020/wordml/sdtdatahash" xmlns:w16sdtfl="http://schemas.microsoft.com/office/word/2024/wordml/sdtformatlock" xmlns:w16se="http://schemas.microsoft.com/office/word/2015/wordml/symex" xmlns:wpg="http://schemas.microsoft.com/office/word/2010/wordprocessingGroup" xmlns:wpi="http://schemas.microsoft.com/office/word/2010/wordprocessingInk" xmlns:wne="http://schemas.microsoft.com/office/word/2006/wordml" xmlns:wps="http://schemas.microsoft.com/office/word/2010/wordprocessingShape" mc:Ignorable="w14 w15 w16se w16cid w16 w16cex w16sdtdh w16sdtfl w16du wp14">
-  <w15:commentEx w15:paraId="74B9A283" w15:done="0"/>
-  <w15:commentEx w15:paraId="062BC674" w15:done="0"/>
-  <w15:commentEx w15:paraId="214B1A70" w15:done="0"/>
-  <w15:commentEx w15:paraId="1081C0A6" w15:done="0"/>
-</w15:commentsEx>
-</file>
-
-<file path=word/commentsExtensible.xml><?xml version="1.0" encoding="utf-8"?>
-<w16cex:commentsExtensible xmlns:wpc="http://schemas.microsoft.com/office/word/2010/wordprocessingCanvas" xmlns:cx="http://schemas.microsoft.com/office/drawing/2014/chartex" xmlns:cx1="http://schemas.microsoft.com/office/drawing/2015/9/8/chartex" xmlns:cx2="http://schemas.microsoft.com/office/drawing/2015/10/21/chartex" xmlns:cx3="http://schemas.microsoft.com/office/drawing/2016/5/9/chartex" xmlns:cx4="http://schemas.microsoft.com/office/drawing/2016/5/10/chartex" xmlns:cx5="http://schemas.microsoft.com/office/drawing/2016/5/11/chartex" xmlns:cx6="http://schemas.microsoft.com/office/drawing/2016/5/12/chartex" xmlns:cx7="http://schemas.microsoft.com/office/drawing/2016/5/13/chartex" xmlns:cx8="http://schemas.microsoft.com/office/drawing/2016/5/14/chartex" xmlns:cr="http://schemas.microsoft.com/office/comments/2020/reactions" xmlns:mc="http://schemas.openxmlformats.org/markup-compatibility/2006" xmlns:aink="http://schemas.microsoft.com/office/drawing/2016/ink" xmlns:am3d="http://schemas.microsoft.com/office/drawing/2017/model3d" xmlns:o="urn:schemas-microsoft-com:office:office" xmlns:oel="http://schemas.microsoft.com/office/2019/extlst" xmlns:r="http://schemas.openxmlformats.org/officeDocument/2006/relationships" xmlns:m="http://schemas.openxmlformats.org/officeDocument/2006/math" xmlns:rd="http://schemas.microsoft.com/office/reactions/2026/reactionDetails" xmlns:v="urn:schemas-microsoft-com:vml" xmlns:wp14="http://schemas.microsoft.com/office/word/2010/wordprocessingDrawing" xmlns:wp="http://schemas.openxmlformats.org/drawingml/2006/wordprocessingDrawing" xmlns:w10="urn:schemas-microsoft-com:office:word" xmlns:w="http://schemas.openxmlformats.org/wordprocessingml/2006/main" xmlns:w14="http://schemas.microsoft.com/office/word/2010/wordml" xmlns:w15="http://schemas.microsoft.com/office/word/2012/wordml" xmlns:w16cei="http://schemas.microsoft.com/office/word/2026/wordml/cei" xmlns:w16cex="http://schemas.microsoft.com/office/word/2018/wordml/cex" xmlns:w16cid="http://schemas.microsoft.com/office/word/2016/wordml/cid" xmlns:w16="http://schemas.microsoft.com/office/word/2018/wordml" xmlns:w16du="http://schemas.microsoft.com/office/word/2023/wordml/word16du" xmlns:w16sdtdh="http://schemas.microsoft.com/office/word/2020/wordml/sdtdatahash" xmlns:w16sdtfl="http://schemas.microsoft.com/office/word/2024/wordml/sdtformatlock" xmlns:w16se="http://schemas.microsoft.com/office/word/2015/wordml/symex" xmlns:wpg="http://schemas.microsoft.com/office/word/2010/wordprocessingGroup" xmlns:wpi="http://schemas.microsoft.com/office/word/2010/wordprocessingInk" xmlns:wne="http://schemas.microsoft.com/office/word/2006/wordml" xmlns:wps="http://schemas.microsoft.com/office/word/2010/wordprocessingShape" mc:Ignorable="w14 w15 w16se w16cid w16 w16cex w16sdtdh w16sdtfl cr w16cei rd w16du wp14">
-  <w16cex:commentExtensible w16cex:durableId="7F314DEE" w16cex:dateUtc="2026-10-28T10:55:00Z"/>
-  <w16cex:commentExtensible w16cex:durableId="7C60D37D" w16cex:dateUtc="2026-10-28T11:02:00Z"/>
-  <w16cex:commentExtensible w16cex:durableId="2B144E78" w16cex:dateUtc="2026-10-30T12:14:00Z"/>
-  <w16cex:commentExtensible w16cex:durableId="2E8D0A25" w16cex:dateUtc="2026-10-28T11:05:00Z"/>
-</w16cex:commentsExtensible>
-</file>
-
-<file path=word/commentsIds.xml><?xml version="1.0" encoding="utf-8"?>
-<w16cid:commentsIds xmlns:wpc="http://schemas.microsoft.com/office/word/2010/wordprocessingCanvas" xmlns:cx="http://schemas.microsoft.com/office/drawing/2014/chartex" xmlns:cx1="http://schemas.microsoft.com/office/drawing/2015/9/8/chartex" xmlns:cx2="http://schemas.microsoft.com/office/drawing/2015/10/21/chartex" xmlns:cx3="http://schemas.microsoft.com/office/drawing/2016/5/9/chartex" xmlns:cx4="http://schemas.microsoft.com/office/drawing/2016/5/10/chartex" xmlns:cx5="http://schemas.microsoft.com/office/drawing/2016/5/11/chartex" xmlns:cx6="http://schemas.microsoft.com/office/drawing/2016/5/12/chartex" xmlns:cx7="http://schemas.microsoft.com/office/drawing/2016/5/13/chartex" xmlns:cx8="http://schemas.microsoft.com/office/drawing/2016/5/14/chartex" xmlns:mc="http://schemas.openxmlformats.org/markup-compatibility/2006" xmlns:aink="http://schemas.microsoft.com/office/drawing/2016/ink" xmlns:am3d="http://schemas.microsoft.com/office/drawing/2017/model3d" xmlns:o="urn:schemas-microsoft-com:office:office" xmlns:oel="http://schemas.microsoft.com/office/2019/extlst" xmlns:r="http://schemas.openxmlformats.org/officeDocument/2006/relationships" xmlns:m="http://schemas.openxmlformats.org/officeDocument/2006/math" xmlns:v="urn:schemas-microsoft-com:vml" xmlns:wp14="http://schemas.microsoft.com/office/word/2010/wordprocessingDrawing" xmlns:wp="http://schemas.openxmlformats.org/drawingml/2006/wordprocessingDrawing" xmlns:w10="urn:schemas-microsoft-com:office:word" xmlns:w="http://schemas.openxmlformats.org/wordprocessingml/2006/main" xmlns:w14="http://schemas.microsoft.com/office/word/2010/wordml" xmlns:w15="http://schemas.microsoft.com/office/word/2012/wordml" xmlns:w16cex="http://schemas.microsoft.com/office/word/2018/wordml/cex" xmlns:w16cid="http://schemas.microsoft.com/office/word/2016/wordml/cid" xmlns:w16="http://schemas.microsoft.com/office/word/2018/wordml" xmlns:w16du="http://schemas.microsoft.com/office/word/2023/wordml/word16du" xmlns:w16sdtdh="http://schemas.microsoft.com/office/word/2020/wordml/sdtdatahash" xmlns:w16sdtfl="http://schemas.microsoft.com/office/word/2024/wordml/sdtformatlock" xmlns:w16se="http://schemas.microsoft.com/office/word/2015/wordml/symex" xmlns:wpg="http://schemas.microsoft.com/office/word/2010/wordprocessingGroup" xmlns:wpi="http://schemas.microsoft.com/office/word/2010/wordprocessingInk" xmlns:wne="http://schemas.microsoft.com/office/word/2006/wordml" xmlns:wps="http://schemas.microsoft.com/office/word/2010/wordprocessingShape" mc:Ignorable="w14 w15 w16se w16cid w16 w16cex w16sdtdh w16sdtfl w16du wp14">
-  <w16cid:commentId w16cid:paraId="74B9A283" w16cid:durableId="7F314DEE"/>
-  <w16cid:commentId w16cid:paraId="062BC674" w16cid:durableId="7C60D37D"/>
-  <w16cid:commentId w16cid:paraId="214B1A70" w16cid:durableId="2B144E78"/>
-  <w16cid:commentId w16cid:paraId="1081C0A6" w16cid:durableId="2E8D0A25"/>
-</w16cid:commentsIds>
 </file>
 
 <file path=word/numbering.xml><?xml version="1.0" encoding="utf-8"?>

</xml_diff>